<commit_message>
Wrote the BLDC control algorithms chapter
</commit_message>
<xml_diff>
--- a/Documentation/DR_Iliyan_Antov_101324019.docx
+++ b/Documentation/DR_Iliyan_Antov_101324019.docx
@@ -2474,6 +2474,9 @@
         <w:t xml:space="preserve">Ще бъдат сравнени различните видове </w:t>
       </w:r>
       <w:r>
+        <w:t xml:space="preserve">трифазни </w:t>
+      </w:r>
+      <w:r>
         <w:t xml:space="preserve">безчеткови постояннотокови </w:t>
       </w:r>
       <w:r>
@@ -2599,7 +2602,16 @@
         </w:numPr>
       </w:pPr>
       <w:r>
-        <w:t>Видът безчетков мотор, който ще бъде управляван;</w:t>
+        <w:t>Параметрите на</w:t>
+      </w:r>
+      <w:r>
+        <w:t xml:space="preserve"> безчетков</w:t>
+      </w:r>
+      <w:r>
+        <w:t>ия</w:t>
+      </w:r>
+      <w:r>
+        <w:t xml:space="preserve"> мотор, който ще бъде управляван;</w:t>
       </w:r>
     </w:p>
     <w:p>
@@ -2648,15 +2660,55 @@
       <w:r>
         <w:t xml:space="preserve"> са най-подходящи за целите на разработваното устройство. </w:t>
       </w:r>
-    </w:p>
-    <w:p/>
+      <w:r>
+        <w:t xml:space="preserve">Тъй като компресорната помпа, която трябва да бъде управлявана от проектираното устройство използва трифазен безчетков мотор, от </w:t>
+      </w:r>
+      <w:r>
+        <w:t>тук</w:t>
+      </w:r>
+      <w:r>
+        <w:t xml:space="preserve"> нататък всички описания</w:t>
+      </w:r>
+      <w:r>
+        <w:t xml:space="preserve"> и размишления</w:t>
+      </w:r>
+      <w:r>
+        <w:t xml:space="preserve"> ще </w:t>
+      </w:r>
+      <w:r>
+        <w:t>се отнасят</w:t>
+      </w:r>
+      <w:r>
+        <w:t xml:space="preserve"> единствено</w:t>
+      </w:r>
+      <w:r>
+        <w:t xml:space="preserve"> </w:t>
+      </w:r>
+      <w:r>
+        <w:t>за</w:t>
+      </w:r>
+      <w:r>
+        <w:t xml:space="preserve"> този тип мотори.</w:t>
+      </w:r>
+    </w:p>
+    <w:p>
+      <w:pPr>
+        <w:spacing w:line="276" w:lineRule="auto"/>
+      </w:pPr>
+    </w:p>
     <w:p>
       <w:pPr>
         <w:pStyle w:val="Heading2"/>
       </w:pPr>
       <w:bookmarkStart w:id="2" w:name="_Toc199009200"/>
       <w:r>
-        <w:t>Видове б</w:t>
+        <w:t xml:space="preserve">Видове </w:t>
+      </w:r>
+      <w:r>
+        <w:t xml:space="preserve">трифазни </w:t>
+      </w:r>
+      <w:r>
+        <w:t>б</w:t>
       </w:r>
       <w:r>
         <w:t>езчеткови</w:t>
@@ -2723,7 +2775,16 @@
         <w:spacing w:after="240"/>
       </w:pPr>
       <w:r>
-        <w:t xml:space="preserve">Безчетковите мотори могат да се разделят на различни видове според множество </w:t>
+        <w:t>Трифазните б</w:t>
+      </w:r>
+      <w:r>
+        <w:t>езчеткови</w:t>
+      </w:r>
+      <w:r>
+        <w:t xml:space="preserve"> </w:t>
+      </w:r>
+      <w:r>
+        <w:t xml:space="preserve">мотори могат да се разделят на различни видове според множество </w:t>
       </w:r>
       <w:r>
         <w:t>критерии</w:t>
@@ -2798,7 +2859,11 @@
         <w:t>във всеки един момент</w:t>
       </w:r>
       <w:r>
-        <w:t xml:space="preserve"> да се знае позицията на ротора. Моторите най-общо се разделят на два вида – с вградени </w:t>
+        <w:t xml:space="preserve"> да се знае позицията на ротора. Моторите най-общо се разделят на два вида – с </w:t>
+      </w:r>
+      <w:r>
+        <w:lastRenderedPageBreak/>
+        <w:t xml:space="preserve">вградени </w:t>
       </w:r>
       <w:r>
         <w:t xml:space="preserve">позиционни </w:t>
@@ -2850,7 +2915,6 @@
           <w:noProof/>
           <w:lang w:val="en-US"/>
         </w:rPr>
-        <w:lastRenderedPageBreak/>
         <w:drawing>
           <wp:inline distT="0" distB="0" distL="0" distR="0" wp14:anchorId="6DB53E94" wp14:editId="59F5BE41">
             <wp:extent cx="5760720" cy="1991360"/>
@@ -3138,21 +3202,6 @@
         <w:t>, което налага подбирането на управление, което може да работи с безсензорни безчеткови мотори.</w:t>
       </w:r>
       <w:bookmarkStart w:id="4" w:name="_Toc199009202"/>
-    </w:p>
-    <w:p>
-      <w:pPr>
-        <w:spacing w:line="276" w:lineRule="auto"/>
-        <w:ind w:firstLine="0"/>
-        <w:jc w:val="left"/>
-        <w:rPr>
-          <w:b/>
-          <w:sz w:val="32"/>
-          <w:szCs w:val="32"/>
-        </w:rPr>
-      </w:pPr>
-      <w:r>
-        <w:br w:type="page"/>
-      </w:r>
     </w:p>
     <w:p>
       <w:pPr>
@@ -3865,7 +3914,19 @@
         <w:t>с цел</w:t>
       </w:r>
       <w:r>
-        <w:t xml:space="preserve"> постигане на максимална ефективност е добре фазовите</w:t>
+        <w:t xml:space="preserve"> постигане на максимална ефективност</w:t>
+      </w:r>
+      <w:r>
+        <w:rPr>
+          <w:lang w:val="en-US"/>
+        </w:rPr>
+        <w:t xml:space="preserve"> </w:t>
+      </w:r>
+      <w:r>
+        <w:t>и въртящ момент,</w:t>
+      </w:r>
+      <w:r>
+        <w:t xml:space="preserve"> е добре фазовите</w:t>
       </w:r>
       <w:r>
         <w:t xml:space="preserve"> токове също </w:t>
@@ -3912,7 +3973,10 @@
     </w:p>
     <w:p>
       <w:r>
-        <w:t>Компресорната помпа, която трябва да бъде управлявана от проектираното устройство</w:t>
+        <w:t>Безчетковия мотор в к</w:t>
+      </w:r>
+      <w:r>
+        <w:t>омпресорната помпа, която трябва да бъде управлявана от проектираното устройство</w:t>
       </w:r>
       <w:r>
         <w:t>, е</w:t>
@@ -3943,6 +4007,7 @@
     </w:p>
     <w:p>
       <w:pPr>
+        <w:spacing w:line="276" w:lineRule="auto"/>
         <w:ind w:firstLine="0"/>
         <w:rPr>
           <w:b/>
@@ -3959,7 +4024,13 @@
         <w:t>Алгоритми за управление</w:t>
       </w:r>
       <w:r>
-        <w:t xml:space="preserve"> на безчеткови мотори</w:t>
+        <w:t xml:space="preserve"> на </w:t>
+      </w:r>
+      <w:r>
+        <w:t xml:space="preserve">трифазни </w:t>
+      </w:r>
+      <w:r>
+        <w:t>безчеткови мотори</w:t>
       </w:r>
       <w:bookmarkEnd w:id="4"/>
       <w:r>
@@ -3970,7 +4041,871 @@
         <w:t>[4]</w:t>
       </w:r>
     </w:p>
-    <w:p/>
+    <w:p>
+      <w:pPr>
+        <w:spacing w:after="240"/>
+        <w:rPr>
+          <w:lang w:val="en-US"/>
+        </w:rPr>
+      </w:pPr>
+      <w:r>
+        <w:t xml:space="preserve">Съществуват три основни вида управление на </w:t>
+      </w:r>
+      <w:r>
+        <w:t xml:space="preserve">трифазни </w:t>
+      </w:r>
+      <w:r>
+        <w:t xml:space="preserve">безчеткови мотори – трапецовидно, синусоидално и полево-ориентирано (т.нар. </w:t>
+      </w:r>
+      <w:r>
+        <w:rPr>
+          <w:lang w:val="en-US"/>
+        </w:rPr>
+        <w:t xml:space="preserve">FOC – Field Oriented Control). </w:t>
+      </w:r>
+      <w:r>
+        <w:t xml:space="preserve">Както беше споменато по-горе, добре е вида на управлението да съвпада с вида на мотора, за който е предназначено. </w:t>
+      </w:r>
+      <w:r>
+        <w:rPr>
+          <w:lang w:val="en-US"/>
+        </w:rPr>
+        <w:t xml:space="preserve">FOC </w:t>
+      </w:r>
+      <w:r>
+        <w:lastRenderedPageBreak/>
+        <w:t>управлението е изключение – то може да се използва както за трапецовидни, така и за синусоидални мотори. В следващите точки са разгледани особеностите на трите вида управление:</w:t>
+      </w:r>
+    </w:p>
+    <w:p>
+      <w:pPr>
+        <w:pStyle w:val="Heading3"/>
+      </w:pPr>
+      <w:r>
+        <w:t>Трапецовидно управление</w:t>
+      </w:r>
+    </w:p>
+    <w:p>
+      <w:r>
+        <w:t xml:space="preserve">Това представлява най-простият алгоритъм за управление на безчеткови мотори. При него </w:t>
+      </w:r>
+      <w:r>
+        <w:t>през намотките се пуска ток по фиксирана последователност от 6 стъпки</w:t>
+      </w:r>
+      <w:r>
+        <w:t xml:space="preserve"> през 60</w:t>
+      </w:r>
+      <w:r>
+        <w:t>°</w:t>
+      </w:r>
+      <w:r>
+        <w:t xml:space="preserve"> (на електрическото поле)</w:t>
+      </w:r>
+      <w:r>
+        <w:rPr>
+          <w:lang w:val="en-US"/>
+        </w:rPr>
+        <w:t xml:space="preserve">, </w:t>
+      </w:r>
+      <w:r>
+        <w:t>като при всяка стъпка</w:t>
+      </w:r>
+      <w:r>
+        <w:t xml:space="preserve"> една от</w:t>
+      </w:r>
+      <w:r>
+        <w:t xml:space="preserve"> фазите е източник на ток (+), друга е консуматор (-), а третата е в състояние на висок импеданс (</w:t>
+      </w:r>
+      <w:r>
+        <w:rPr>
+          <w:lang w:val="en-US"/>
+        </w:rPr>
+        <w:t>Z)</w:t>
+      </w:r>
+      <w:r>
+        <w:t>.</w:t>
+      </w:r>
+      <w:r>
+        <w:rPr>
+          <w:lang w:val="en-US"/>
+        </w:rPr>
+        <w:t xml:space="preserve"> </w:t>
+      </w:r>
+      <w:r>
+        <w:t>В резултат се получават фазови токове, които променят поляритета си на всеки 120</w:t>
+      </w:r>
+      <w:r>
+        <w:t>°</w:t>
+      </w:r>
+      <w:r>
+        <w:t xml:space="preserve">. </w:t>
+      </w:r>
+      <w:r>
+        <w:t>П</w:t>
+      </w:r>
+      <w:r>
+        <w:t>оследователност</w:t>
+      </w:r>
+      <w:r>
+        <w:t xml:space="preserve">та </w:t>
+      </w:r>
+      <w:r>
+        <w:t>зависи от желаната посока на въртене на мотора. На фиг. 2.2.1. са показани управляващите сигнали и токовете през намотките при такъв вид управление.</w:t>
+      </w:r>
+    </w:p>
+    <w:p>
+      <w:pPr>
+        <w:spacing w:line="276" w:lineRule="auto"/>
+        <w:ind w:firstLine="0"/>
+        <w:rPr>
+          <w:lang w:val="en-US"/>
+        </w:rPr>
+      </w:pPr>
+      <w:r>
+        <w:rPr>
+          <w:noProof/>
+        </w:rPr>
+        <w:drawing>
+          <wp:inline distT="0" distB="0" distL="0" distR="0" wp14:anchorId="644DBEEA" wp14:editId="1F0DAEBB">
+            <wp:extent cx="5760720" cy="1209040"/>
+            <wp:effectExtent l="0" t="0" r="0" b="0"/>
+            <wp:docPr id="241948999" name="Picture 1"/>
+            <wp:cNvGraphicFramePr>
+              <a:graphicFrameLocks xmlns:a="http://schemas.openxmlformats.org/drawingml/2006/main" noChangeAspect="1"/>
+            </wp:cNvGraphicFramePr>
+            <a:graphic xmlns:a="http://schemas.openxmlformats.org/drawingml/2006/main">
+              <a:graphicData uri="http://schemas.openxmlformats.org/drawingml/2006/picture">
+                <pic:pic xmlns:pic="http://schemas.openxmlformats.org/drawingml/2006/picture">
+                  <pic:nvPicPr>
+                    <pic:cNvPr id="241948999" name=""/>
+                    <pic:cNvPicPr/>
+                  </pic:nvPicPr>
+                  <pic:blipFill>
+                    <a:blip r:embed="rId12"/>
+                    <a:stretch>
+                      <a:fillRect/>
+                    </a:stretch>
+                  </pic:blipFill>
+                  <pic:spPr>
+                    <a:xfrm>
+                      <a:off x="0" y="0"/>
+                      <a:ext cx="5760720" cy="1209040"/>
+                    </a:xfrm>
+                    <a:prstGeom prst="rect">
+                      <a:avLst/>
+                    </a:prstGeom>
+                  </pic:spPr>
+                </pic:pic>
+              </a:graphicData>
+            </a:graphic>
+          </wp:inline>
+        </w:drawing>
+      </w:r>
+    </w:p>
+    <w:p>
+      <w:pPr>
+        <w:pStyle w:val="Caption"/>
+        <w:spacing w:after="0"/>
+        <w:ind w:firstLine="0"/>
+        <w:jc w:val="center"/>
+        <w:rPr>
+          <w:i w:val="0"/>
+          <w:iCs w:val="0"/>
+          <w:color w:val="auto"/>
+          <w:sz w:val="28"/>
+          <w:szCs w:val="28"/>
+        </w:rPr>
+      </w:pPr>
+      <w:r>
+        <w:rPr>
+          <w:b/>
+          <w:bCs/>
+          <w:i w:val="0"/>
+          <w:iCs w:val="0"/>
+          <w:color w:val="auto"/>
+          <w:sz w:val="28"/>
+          <w:szCs w:val="28"/>
+        </w:rPr>
+        <w:t xml:space="preserve">Фиг. </w:t>
+      </w:r>
+      <w:r>
+        <w:rPr>
+          <w:b/>
+          <w:bCs/>
+          <w:i w:val="0"/>
+          <w:iCs w:val="0"/>
+          <w:color w:val="auto"/>
+          <w:sz w:val="28"/>
+          <w:szCs w:val="28"/>
+        </w:rPr>
+        <w:fldChar w:fldCharType="begin"/>
+      </w:r>
+      <w:r>
+        <w:rPr>
+          <w:b/>
+          <w:bCs/>
+          <w:i w:val="0"/>
+          <w:iCs w:val="0"/>
+          <w:color w:val="auto"/>
+          <w:sz w:val="28"/>
+          <w:szCs w:val="28"/>
+        </w:rPr>
+        <w:instrText xml:space="preserve"> STYLEREF 2 \s </w:instrText>
+      </w:r>
+      <w:r>
+        <w:rPr>
+          <w:b/>
+          <w:bCs/>
+          <w:i w:val="0"/>
+          <w:iCs w:val="0"/>
+          <w:color w:val="auto"/>
+          <w:sz w:val="28"/>
+          <w:szCs w:val="28"/>
+        </w:rPr>
+        <w:fldChar w:fldCharType="separate"/>
+      </w:r>
+      <w:r>
+        <w:rPr>
+          <w:b/>
+          <w:bCs/>
+          <w:i w:val="0"/>
+          <w:iCs w:val="0"/>
+          <w:noProof/>
+          <w:color w:val="auto"/>
+          <w:sz w:val="28"/>
+          <w:szCs w:val="28"/>
+        </w:rPr>
+        <w:t>2.2</w:t>
+      </w:r>
+      <w:r>
+        <w:rPr>
+          <w:b/>
+          <w:bCs/>
+          <w:i w:val="0"/>
+          <w:iCs w:val="0"/>
+          <w:color w:val="auto"/>
+          <w:sz w:val="28"/>
+          <w:szCs w:val="28"/>
+        </w:rPr>
+        <w:fldChar w:fldCharType="end"/>
+      </w:r>
+      <w:r>
+        <w:rPr>
+          <w:b/>
+          <w:bCs/>
+          <w:i w:val="0"/>
+          <w:iCs w:val="0"/>
+          <w:color w:val="auto"/>
+          <w:sz w:val="28"/>
+          <w:szCs w:val="28"/>
+        </w:rPr>
+        <w:t>.</w:t>
+      </w:r>
+      <w:r>
+        <w:rPr>
+          <w:b/>
+          <w:bCs/>
+          <w:i w:val="0"/>
+          <w:iCs w:val="0"/>
+          <w:color w:val="auto"/>
+          <w:sz w:val="28"/>
+          <w:szCs w:val="28"/>
+        </w:rPr>
+        <w:fldChar w:fldCharType="begin"/>
+      </w:r>
+      <w:r>
+        <w:rPr>
+          <w:b/>
+          <w:bCs/>
+          <w:i w:val="0"/>
+          <w:iCs w:val="0"/>
+          <w:color w:val="auto"/>
+          <w:sz w:val="28"/>
+          <w:szCs w:val="28"/>
+        </w:rPr>
+        <w:instrText xml:space="preserve"> SEQ Фиг. \* ARABIC \s 2 </w:instrText>
+      </w:r>
+      <w:r>
+        <w:rPr>
+          <w:b/>
+          <w:bCs/>
+          <w:i w:val="0"/>
+          <w:iCs w:val="0"/>
+          <w:color w:val="auto"/>
+          <w:sz w:val="28"/>
+          <w:szCs w:val="28"/>
+        </w:rPr>
+        <w:fldChar w:fldCharType="separate"/>
+      </w:r>
+      <w:r>
+        <w:rPr>
+          <w:b/>
+          <w:bCs/>
+          <w:i w:val="0"/>
+          <w:iCs w:val="0"/>
+          <w:noProof/>
+          <w:color w:val="auto"/>
+          <w:sz w:val="28"/>
+          <w:szCs w:val="28"/>
+        </w:rPr>
+        <w:t>1</w:t>
+      </w:r>
+      <w:r>
+        <w:rPr>
+          <w:b/>
+          <w:bCs/>
+          <w:i w:val="0"/>
+          <w:iCs w:val="0"/>
+          <w:color w:val="auto"/>
+          <w:sz w:val="28"/>
+          <w:szCs w:val="28"/>
+        </w:rPr>
+        <w:fldChar w:fldCharType="end"/>
+      </w:r>
+      <w:r>
+        <w:rPr>
+          <w:b/>
+          <w:bCs/>
+          <w:i w:val="0"/>
+          <w:iCs w:val="0"/>
+          <w:color w:val="auto"/>
+          <w:sz w:val="28"/>
+          <w:szCs w:val="28"/>
+        </w:rPr>
+        <w:t xml:space="preserve">. </w:t>
+      </w:r>
+      <w:r>
+        <w:rPr>
+          <w:i w:val="0"/>
+          <w:iCs w:val="0"/>
+          <w:color w:val="auto"/>
+          <w:sz w:val="28"/>
+          <w:szCs w:val="28"/>
+        </w:rPr>
+        <w:t>Управляващи напрежения</w:t>
+      </w:r>
+      <w:r>
+        <w:rPr>
+          <w:i w:val="0"/>
+          <w:iCs w:val="0"/>
+          <w:color w:val="auto"/>
+          <w:sz w:val="28"/>
+          <w:szCs w:val="28"/>
+        </w:rPr>
+        <w:t xml:space="preserve"> (ляво) и </w:t>
+      </w:r>
+      <w:r>
+        <w:rPr>
+          <w:i w:val="0"/>
+          <w:iCs w:val="0"/>
+          <w:color w:val="auto"/>
+          <w:sz w:val="28"/>
+          <w:szCs w:val="28"/>
+        </w:rPr>
+        <w:t>фазови токове</w:t>
+      </w:r>
+      <w:r>
+        <w:rPr>
+          <w:i w:val="0"/>
+          <w:iCs w:val="0"/>
+          <w:color w:val="auto"/>
+          <w:sz w:val="28"/>
+          <w:szCs w:val="28"/>
+        </w:rPr>
+        <w:t xml:space="preserve"> (дясно)</w:t>
+      </w:r>
+      <w:r>
+        <w:rPr>
+          <w:i w:val="0"/>
+          <w:iCs w:val="0"/>
+          <w:color w:val="auto"/>
+          <w:sz w:val="28"/>
+          <w:szCs w:val="28"/>
+        </w:rPr>
+        <w:t xml:space="preserve"> при трапецовидно управление</w:t>
+      </w:r>
+    </w:p>
+    <w:p>
+      <w:pPr>
+        <w:spacing w:line="276" w:lineRule="auto"/>
+      </w:pPr>
+    </w:p>
+    <w:p>
+      <w:r>
+        <w:t>След изпълнението на 6-те стъпки, последователността се повтаря.</w:t>
+      </w:r>
+      <w:r>
+        <w:t xml:space="preserve"> Броят повторения за извършване на едно</w:t>
+      </w:r>
+      <w:r>
+        <w:t xml:space="preserve"> механично</w:t>
+      </w:r>
+      <w:r>
+        <w:t xml:space="preserve"> завъртане на мотора </w:t>
+      </w:r>
+      <w:r>
+        <w:t xml:space="preserve">(един оборот) </w:t>
+      </w:r>
+      <w:r>
+        <w:t>зависи от броя на полюсите му.</w:t>
+      </w:r>
+      <w:r>
+        <w:t xml:space="preserve"> </w:t>
+      </w:r>
+    </w:p>
+    <w:p>
+      <w:r>
+        <w:t>Предимств</w:t>
+      </w:r>
+      <w:r>
+        <w:t>а</w:t>
+      </w:r>
+      <w:r>
+        <w:t xml:space="preserve"> на този метод </w:t>
+      </w:r>
+      <w:r>
+        <w:t>са</w:t>
+      </w:r>
+      <w:r>
+        <w:t>:</w:t>
+      </w:r>
+      <w:r>
+        <w:t xml:space="preserve"> лесна имплементация и съответно ниска цена, ниски загуби от превключване на управляващите транзистори</w:t>
+      </w:r>
+      <w:r>
+        <w:t xml:space="preserve">, </w:t>
+      </w:r>
+      <w:r>
+        <w:t>висок въртящ момент (</w:t>
+      </w:r>
+      <w:r>
+        <w:t xml:space="preserve">особено </w:t>
+      </w:r>
+      <w:r>
+        <w:t>при трапецовиден мотор).</w:t>
+      </w:r>
+    </w:p>
+    <w:p>
+      <w:r>
+        <w:t>Недостатъци са</w:t>
+      </w:r>
+      <w:r>
+        <w:t>:</w:t>
+      </w:r>
+      <w:r>
+        <w:t xml:space="preserve"> ниска резолюция</w:t>
+      </w:r>
+      <w:r>
+        <w:t xml:space="preserve">, </w:t>
+      </w:r>
+      <w:r>
+        <w:t>пулсаци</w:t>
+      </w:r>
+      <w:r>
+        <w:t>и</w:t>
+      </w:r>
+      <w:r>
+        <w:t xml:space="preserve"> на въртящия момент на всеки 60</w:t>
+      </w:r>
+      <w:r>
+        <w:t>°</w:t>
+      </w:r>
+      <w:r>
+        <w:t>,</w:t>
+      </w:r>
+      <w:r>
+        <w:t xml:space="preserve"> </w:t>
+      </w:r>
+      <w:r>
+        <w:t xml:space="preserve">в някои случаи </w:t>
+      </w:r>
+      <w:r>
+        <w:t xml:space="preserve">– </w:t>
+      </w:r>
+      <w:r>
+        <w:t>генериране</w:t>
+      </w:r>
+      <w:r>
+        <w:t xml:space="preserve"> </w:t>
+      </w:r>
+      <w:r>
+        <w:t>на доловим шум от неидеално токово управление.</w:t>
+      </w:r>
+      <w:r>
+        <w:br w:type="page"/>
+      </w:r>
+    </w:p>
+    <w:p>
+      <w:pPr>
+        <w:pStyle w:val="Heading3"/>
+      </w:pPr>
+      <w:r>
+        <w:lastRenderedPageBreak/>
+        <w:t>Синусоидално</w:t>
+      </w:r>
+      <w:r>
+        <w:t xml:space="preserve"> управление</w:t>
+      </w:r>
+    </w:p>
+    <w:p>
+      <w:r>
+        <w:t xml:space="preserve">При този алгоритъм за управление през целия период на електрическото поле през всяка от фазите преминава ток в една от двете възможни посоки, като той се променя плавно (синусоидално). Магнитният поток, генериран от статора, е синусоидален и това води до плавно завъртане на ротора. </w:t>
+      </w:r>
+      <w:r>
+        <w:t>На фиг. 2.2.</w:t>
+      </w:r>
+      <w:r>
+        <w:t>2</w:t>
+      </w:r>
+      <w:r>
+        <w:t>. са показани управляващите сигнали и токовете през намотките при такъв вид управление.</w:t>
+      </w:r>
+    </w:p>
+    <w:p>
+      <w:pPr>
+        <w:spacing w:line="276" w:lineRule="auto"/>
+        <w:ind w:firstLine="0"/>
+        <w:rPr>
+          <w:lang w:val="en-US"/>
+        </w:rPr>
+      </w:pPr>
+      <w:r>
+        <w:rPr>
+          <w:noProof/>
+        </w:rPr>
+        <w:drawing>
+          <wp:inline distT="0" distB="0" distL="0" distR="0" wp14:anchorId="5F56E30D" wp14:editId="7589E003">
+            <wp:extent cx="5760720" cy="1290955"/>
+            <wp:effectExtent l="0" t="0" r="0" b="0"/>
+            <wp:docPr id="1866165691" name="Picture 1"/>
+            <wp:cNvGraphicFramePr>
+              <a:graphicFrameLocks xmlns:a="http://schemas.openxmlformats.org/drawingml/2006/main" noChangeAspect="1"/>
+            </wp:cNvGraphicFramePr>
+            <a:graphic xmlns:a="http://schemas.openxmlformats.org/drawingml/2006/main">
+              <a:graphicData uri="http://schemas.openxmlformats.org/drawingml/2006/picture">
+                <pic:pic xmlns:pic="http://schemas.openxmlformats.org/drawingml/2006/picture">
+                  <pic:nvPicPr>
+                    <pic:cNvPr id="1866165691" name=""/>
+                    <pic:cNvPicPr/>
+                  </pic:nvPicPr>
+                  <pic:blipFill>
+                    <a:blip r:embed="rId13"/>
+                    <a:stretch>
+                      <a:fillRect/>
+                    </a:stretch>
+                  </pic:blipFill>
+                  <pic:spPr>
+                    <a:xfrm>
+                      <a:off x="0" y="0"/>
+                      <a:ext cx="5760720" cy="1290955"/>
+                    </a:xfrm>
+                    <a:prstGeom prst="rect">
+                      <a:avLst/>
+                    </a:prstGeom>
+                  </pic:spPr>
+                </pic:pic>
+              </a:graphicData>
+            </a:graphic>
+          </wp:inline>
+        </w:drawing>
+      </w:r>
+    </w:p>
+    <w:p>
+      <w:pPr>
+        <w:pStyle w:val="Caption"/>
+        <w:spacing w:after="0"/>
+        <w:ind w:firstLine="0"/>
+        <w:jc w:val="center"/>
+        <w:rPr>
+          <w:i w:val="0"/>
+          <w:iCs w:val="0"/>
+          <w:color w:val="auto"/>
+          <w:sz w:val="28"/>
+          <w:szCs w:val="28"/>
+        </w:rPr>
+      </w:pPr>
+      <w:r>
+        <w:rPr>
+          <w:b/>
+          <w:bCs/>
+          <w:i w:val="0"/>
+          <w:iCs w:val="0"/>
+          <w:color w:val="auto"/>
+          <w:sz w:val="28"/>
+          <w:szCs w:val="28"/>
+        </w:rPr>
+        <w:t xml:space="preserve">Фиг. </w:t>
+      </w:r>
+      <w:r>
+        <w:rPr>
+          <w:b/>
+          <w:bCs/>
+          <w:i w:val="0"/>
+          <w:iCs w:val="0"/>
+          <w:color w:val="auto"/>
+          <w:sz w:val="28"/>
+          <w:szCs w:val="28"/>
+        </w:rPr>
+        <w:fldChar w:fldCharType="begin"/>
+      </w:r>
+      <w:r>
+        <w:rPr>
+          <w:b/>
+          <w:bCs/>
+          <w:i w:val="0"/>
+          <w:iCs w:val="0"/>
+          <w:color w:val="auto"/>
+          <w:sz w:val="28"/>
+          <w:szCs w:val="28"/>
+        </w:rPr>
+        <w:instrText xml:space="preserve"> STYLEREF 2 \s </w:instrText>
+      </w:r>
+      <w:r>
+        <w:rPr>
+          <w:b/>
+          <w:bCs/>
+          <w:i w:val="0"/>
+          <w:iCs w:val="0"/>
+          <w:color w:val="auto"/>
+          <w:sz w:val="28"/>
+          <w:szCs w:val="28"/>
+        </w:rPr>
+        <w:fldChar w:fldCharType="separate"/>
+      </w:r>
+      <w:r>
+        <w:rPr>
+          <w:b/>
+          <w:bCs/>
+          <w:i w:val="0"/>
+          <w:iCs w:val="0"/>
+          <w:noProof/>
+          <w:color w:val="auto"/>
+          <w:sz w:val="28"/>
+          <w:szCs w:val="28"/>
+        </w:rPr>
+        <w:t>2.2</w:t>
+      </w:r>
+      <w:r>
+        <w:rPr>
+          <w:b/>
+          <w:bCs/>
+          <w:i w:val="0"/>
+          <w:iCs w:val="0"/>
+          <w:color w:val="auto"/>
+          <w:sz w:val="28"/>
+          <w:szCs w:val="28"/>
+        </w:rPr>
+        <w:fldChar w:fldCharType="end"/>
+      </w:r>
+      <w:r>
+        <w:rPr>
+          <w:b/>
+          <w:bCs/>
+          <w:i w:val="0"/>
+          <w:iCs w:val="0"/>
+          <w:color w:val="auto"/>
+          <w:sz w:val="28"/>
+          <w:szCs w:val="28"/>
+        </w:rPr>
+        <w:t>.</w:t>
+      </w:r>
+      <w:r>
+        <w:rPr>
+          <w:b/>
+          <w:bCs/>
+          <w:i w:val="0"/>
+          <w:iCs w:val="0"/>
+          <w:color w:val="auto"/>
+          <w:sz w:val="28"/>
+          <w:szCs w:val="28"/>
+        </w:rPr>
+        <w:fldChar w:fldCharType="begin"/>
+      </w:r>
+      <w:r>
+        <w:rPr>
+          <w:b/>
+          <w:bCs/>
+          <w:i w:val="0"/>
+          <w:iCs w:val="0"/>
+          <w:color w:val="auto"/>
+          <w:sz w:val="28"/>
+          <w:szCs w:val="28"/>
+        </w:rPr>
+        <w:instrText xml:space="preserve"> SEQ Фиг. \* ARABIC \s 2 </w:instrText>
+      </w:r>
+      <w:r>
+        <w:rPr>
+          <w:b/>
+          <w:bCs/>
+          <w:i w:val="0"/>
+          <w:iCs w:val="0"/>
+          <w:color w:val="auto"/>
+          <w:sz w:val="28"/>
+          <w:szCs w:val="28"/>
+        </w:rPr>
+        <w:fldChar w:fldCharType="separate"/>
+      </w:r>
+      <w:r>
+        <w:rPr>
+          <w:b/>
+          <w:bCs/>
+          <w:i w:val="0"/>
+          <w:iCs w:val="0"/>
+          <w:noProof/>
+          <w:color w:val="auto"/>
+          <w:sz w:val="28"/>
+          <w:szCs w:val="28"/>
+        </w:rPr>
+        <w:t>2</w:t>
+      </w:r>
+      <w:r>
+        <w:rPr>
+          <w:b/>
+          <w:bCs/>
+          <w:i w:val="0"/>
+          <w:iCs w:val="0"/>
+          <w:color w:val="auto"/>
+          <w:sz w:val="28"/>
+          <w:szCs w:val="28"/>
+        </w:rPr>
+        <w:fldChar w:fldCharType="end"/>
+      </w:r>
+      <w:r>
+        <w:rPr>
+          <w:b/>
+          <w:bCs/>
+          <w:i w:val="0"/>
+          <w:iCs w:val="0"/>
+          <w:color w:val="auto"/>
+          <w:sz w:val="28"/>
+          <w:szCs w:val="28"/>
+        </w:rPr>
+        <w:t xml:space="preserve">. </w:t>
+      </w:r>
+      <w:r>
+        <w:rPr>
+          <w:i w:val="0"/>
+          <w:iCs w:val="0"/>
+          <w:color w:val="auto"/>
+          <w:sz w:val="28"/>
+          <w:szCs w:val="28"/>
+        </w:rPr>
+        <w:t xml:space="preserve">Управляващи напрежения (ляво) и фазови токове (дясно) при </w:t>
+      </w:r>
+      <w:r>
+        <w:rPr>
+          <w:i w:val="0"/>
+          <w:iCs w:val="0"/>
+          <w:color w:val="auto"/>
+          <w:sz w:val="28"/>
+          <w:szCs w:val="28"/>
+        </w:rPr>
+        <w:t>синусоидално</w:t>
+      </w:r>
+      <w:r>
+        <w:rPr>
+          <w:i w:val="0"/>
+          <w:iCs w:val="0"/>
+          <w:color w:val="auto"/>
+          <w:sz w:val="28"/>
+          <w:szCs w:val="28"/>
+        </w:rPr>
+        <w:t xml:space="preserve"> управление</w:t>
+      </w:r>
+    </w:p>
+    <w:p>
+      <w:pPr>
+        <w:spacing w:line="276" w:lineRule="auto"/>
+      </w:pPr>
+    </w:p>
+    <w:p>
+      <w:r>
+        <w:t>Както и при трапецовидното управление, б</w:t>
+      </w:r>
+      <w:r>
+        <w:t>роят повторения</w:t>
+      </w:r>
+      <w:r>
+        <w:t xml:space="preserve"> на тази последователност</w:t>
+      </w:r>
+      <w:r>
+        <w:t xml:space="preserve"> за извършване на едно</w:t>
+      </w:r>
+      <w:r>
+        <w:t xml:space="preserve"> </w:t>
+      </w:r>
+      <w:r>
+        <w:t>механично</w:t>
+      </w:r>
+      <w:r>
+        <w:t xml:space="preserve"> завъртане на мотора (един оборот) зависи от броя на полюсите му. </w:t>
+      </w:r>
+    </w:p>
+    <w:p>
+      <w:r>
+        <w:t>Предимства на този метод са</w:t>
+      </w:r>
+      <w:r>
+        <w:t xml:space="preserve">: плавно завъртане на ротора, константен въртящ момент, </w:t>
+      </w:r>
+      <w:r>
+        <w:t>добра ефективност</w:t>
+      </w:r>
+      <w:r>
+        <w:t>,</w:t>
+      </w:r>
+      <w:r>
+        <w:t xml:space="preserve"> </w:t>
+      </w:r>
+      <w:r>
+        <w:t xml:space="preserve">тих </w:t>
+      </w:r>
+      <w:r>
+        <w:t>по отношение</w:t>
+      </w:r>
+      <w:r>
+        <w:t xml:space="preserve"> на доловими шумове.</w:t>
+      </w:r>
+    </w:p>
+    <w:p>
+      <w:r>
+        <w:t>Недостатъци са</w:t>
+      </w:r>
+      <w:r>
+        <w:t>: по-сложен за имплементиране и съответно по-скъп</w:t>
+      </w:r>
+      <w:r>
+        <w:t xml:space="preserve">, </w:t>
+      </w:r>
+      <w:r>
+        <w:t xml:space="preserve">големи загуби от </w:t>
+      </w:r>
+      <w:r>
+        <w:t xml:space="preserve">превключване на управляващите транзистори </w:t>
+      </w:r>
+      <w:r>
+        <w:t xml:space="preserve">(не се преминава през </w:t>
+      </w:r>
+      <w:r>
+        <w:t>състояние на висок импеданс</w:t>
+      </w:r>
+      <w:r>
+        <w:t>)</w:t>
+      </w:r>
+      <w:r>
+        <w:t>.</w:t>
+      </w:r>
+    </w:p>
+    <w:p>
+      <w:pPr>
+        <w:rPr>
+          <w:b/>
+          <w:sz w:val="32"/>
+          <w:szCs w:val="32"/>
+          <w:lang w:val="en-US"/>
+        </w:rPr>
+      </w:pPr>
+    </w:p>
     <w:p>
       <w:pPr>
         <w:spacing w:line="276" w:lineRule="auto"/>
@@ -3980,12 +4915,1351 @@
           <w:b/>
           <w:sz w:val="32"/>
           <w:szCs w:val="32"/>
-        </w:rPr>
-      </w:pPr>
+          <w:lang w:val="en-US"/>
+        </w:rPr>
+      </w:pPr>
+      <w:r>
+        <w:rPr>
+          <w:lang w:val="en-US"/>
+        </w:rPr>
+        <w:br w:type="page"/>
+      </w:r>
+    </w:p>
+    <w:p>
+      <w:pPr>
+        <w:pStyle w:val="Heading3"/>
+      </w:pPr>
+      <w:r>
+        <w:rPr>
+          <w:lang w:val="en-US"/>
+        </w:rPr>
+        <w:lastRenderedPageBreak/>
+        <w:t>FOC</w:t>
+      </w:r>
+      <w:r>
+        <w:t xml:space="preserve"> управление</w:t>
+      </w:r>
+    </w:p>
+    <w:p>
+      <w:r>
+        <w:rPr>
+          <w:lang w:val="en-US"/>
+        </w:rPr>
+        <w:t xml:space="preserve">FOC </w:t>
+      </w:r>
+      <w:r>
+        <w:t xml:space="preserve">управлението е комплексен алгоритъм, който се използва за </w:t>
+      </w:r>
+      <w:r>
+        <w:t>прецизно</w:t>
+      </w:r>
+      <w:r>
+        <w:t xml:space="preserve"> и ефективно управление на скоростта и въртящия момент на безчетков мотор. Принципът се основава на ориентиране на статорното поле по такъв начин, че то да е перпендикулярно на магнитния поток на ротора, така че да се получи максимален въртящ момент</w:t>
+      </w:r>
+      <w:r>
+        <w:rPr>
+          <w:lang w:val="en-US"/>
+        </w:rPr>
+        <w:t xml:space="preserve"> </w:t>
+      </w:r>
+      <w:r>
+        <w:t xml:space="preserve">във </w:t>
+      </w:r>
+      <w:r>
+        <w:t>всяка позиция на</w:t>
+      </w:r>
+      <w:r>
+        <w:t xml:space="preserve"> мотора. </w:t>
+      </w:r>
+      <w:r>
+        <w:t>На фиг. 2.2.</w:t>
+      </w:r>
+      <w:r>
+        <w:t>3</w:t>
+      </w:r>
+      <w:r>
+        <w:t xml:space="preserve">. </w:t>
+      </w:r>
+      <w:r>
+        <w:t xml:space="preserve">е показана векторна диаграма, която показва ориентацията на статорното </w:t>
+      </w:r>
+      <w:r>
+        <w:t>електрическо</w:t>
+      </w:r>
+      <w:r>
+        <w:t xml:space="preserve"> поле (</w:t>
+      </w:r>
+      <w:r>
+        <w:rPr>
+          <w:lang w:val="en-US"/>
+        </w:rPr>
+        <w:t xml:space="preserve">q) </w:t>
+      </w:r>
+      <w:r>
+        <w:t>спрямо магнитния поток на ротора (</w:t>
+      </w:r>
+      <w:r>
+        <w:rPr>
+          <w:lang w:val="en-US"/>
+        </w:rPr>
+        <w:t>d)</w:t>
+      </w:r>
+      <w:r>
+        <w:t>.</w:t>
+      </w:r>
+    </w:p>
+    <w:p>
+      <w:pPr>
+        <w:spacing w:line="276" w:lineRule="auto"/>
+        <w:ind w:firstLine="0"/>
+        <w:jc w:val="center"/>
+        <w:rPr>
+          <w:lang w:val="en-US"/>
+        </w:rPr>
+      </w:pPr>
+      <w:r>
+        <w:rPr>
+          <w:noProof/>
+        </w:rPr>
+        <w:drawing>
+          <wp:inline distT="0" distB="0" distL="0" distR="0" wp14:anchorId="18A47E3B" wp14:editId="175C0728">
+            <wp:extent cx="2609850" cy="2567585"/>
+            <wp:effectExtent l="0" t="0" r="0" b="0"/>
+            <wp:docPr id="681091648" name="Picture 1"/>
+            <wp:cNvGraphicFramePr>
+              <a:graphicFrameLocks xmlns:a="http://schemas.openxmlformats.org/drawingml/2006/main" noChangeAspect="1"/>
+            </wp:cNvGraphicFramePr>
+            <a:graphic xmlns:a="http://schemas.openxmlformats.org/drawingml/2006/main">
+              <a:graphicData uri="http://schemas.openxmlformats.org/drawingml/2006/picture">
+                <pic:pic xmlns:pic="http://schemas.openxmlformats.org/drawingml/2006/picture">
+                  <pic:nvPicPr>
+                    <pic:cNvPr id="681091648" name=""/>
+                    <pic:cNvPicPr/>
+                  </pic:nvPicPr>
+                  <pic:blipFill>
+                    <a:blip r:embed="rId14"/>
+                    <a:stretch>
+                      <a:fillRect/>
+                    </a:stretch>
+                  </pic:blipFill>
+                  <pic:spPr>
+                    <a:xfrm>
+                      <a:off x="0" y="0"/>
+                      <a:ext cx="2614219" cy="2571883"/>
+                    </a:xfrm>
+                    <a:prstGeom prst="rect">
+                      <a:avLst/>
+                    </a:prstGeom>
+                  </pic:spPr>
+                </pic:pic>
+              </a:graphicData>
+            </a:graphic>
+          </wp:inline>
+        </w:drawing>
+      </w:r>
+    </w:p>
+    <w:p>
+      <w:pPr>
+        <w:pStyle w:val="Caption"/>
+        <w:spacing w:after="0"/>
+        <w:ind w:firstLine="0"/>
+        <w:jc w:val="center"/>
+        <w:rPr>
+          <w:i w:val="0"/>
+          <w:iCs w:val="0"/>
+          <w:color w:val="auto"/>
+          <w:sz w:val="28"/>
+          <w:szCs w:val="28"/>
+        </w:rPr>
+      </w:pPr>
+      <w:r>
+        <w:rPr>
+          <w:b/>
+          <w:bCs/>
+          <w:i w:val="0"/>
+          <w:iCs w:val="0"/>
+          <w:color w:val="auto"/>
+          <w:sz w:val="28"/>
+          <w:szCs w:val="28"/>
+        </w:rPr>
+        <w:t xml:space="preserve">Фиг. </w:t>
+      </w:r>
+      <w:r>
+        <w:rPr>
+          <w:b/>
+          <w:bCs/>
+          <w:i w:val="0"/>
+          <w:iCs w:val="0"/>
+          <w:color w:val="auto"/>
+          <w:sz w:val="28"/>
+          <w:szCs w:val="28"/>
+        </w:rPr>
+        <w:fldChar w:fldCharType="begin"/>
+      </w:r>
+      <w:r>
+        <w:rPr>
+          <w:b/>
+          <w:bCs/>
+          <w:i w:val="0"/>
+          <w:iCs w:val="0"/>
+          <w:color w:val="auto"/>
+          <w:sz w:val="28"/>
+          <w:szCs w:val="28"/>
+        </w:rPr>
+        <w:instrText xml:space="preserve"> STYLEREF 2 \s </w:instrText>
+      </w:r>
+      <w:r>
+        <w:rPr>
+          <w:b/>
+          <w:bCs/>
+          <w:i w:val="0"/>
+          <w:iCs w:val="0"/>
+          <w:color w:val="auto"/>
+          <w:sz w:val="28"/>
+          <w:szCs w:val="28"/>
+        </w:rPr>
+        <w:fldChar w:fldCharType="separate"/>
+      </w:r>
+      <w:r>
+        <w:rPr>
+          <w:b/>
+          <w:bCs/>
+          <w:i w:val="0"/>
+          <w:iCs w:val="0"/>
+          <w:noProof/>
+          <w:color w:val="auto"/>
+          <w:sz w:val="28"/>
+          <w:szCs w:val="28"/>
+        </w:rPr>
+        <w:t>2.2</w:t>
+      </w:r>
+      <w:r>
+        <w:rPr>
+          <w:b/>
+          <w:bCs/>
+          <w:i w:val="0"/>
+          <w:iCs w:val="0"/>
+          <w:color w:val="auto"/>
+          <w:sz w:val="28"/>
+          <w:szCs w:val="28"/>
+        </w:rPr>
+        <w:fldChar w:fldCharType="end"/>
+      </w:r>
+      <w:r>
+        <w:rPr>
+          <w:b/>
+          <w:bCs/>
+          <w:i w:val="0"/>
+          <w:iCs w:val="0"/>
+          <w:color w:val="auto"/>
+          <w:sz w:val="28"/>
+          <w:szCs w:val="28"/>
+        </w:rPr>
+        <w:t>.</w:t>
+      </w:r>
+      <w:r>
+        <w:rPr>
+          <w:b/>
+          <w:bCs/>
+          <w:i w:val="0"/>
+          <w:iCs w:val="0"/>
+          <w:color w:val="auto"/>
+          <w:sz w:val="28"/>
+          <w:szCs w:val="28"/>
+        </w:rPr>
+        <w:fldChar w:fldCharType="begin"/>
+      </w:r>
+      <w:r>
+        <w:rPr>
+          <w:b/>
+          <w:bCs/>
+          <w:i w:val="0"/>
+          <w:iCs w:val="0"/>
+          <w:color w:val="auto"/>
+          <w:sz w:val="28"/>
+          <w:szCs w:val="28"/>
+        </w:rPr>
+        <w:instrText xml:space="preserve"> SEQ Фиг. \* ARABIC \s 2 </w:instrText>
+      </w:r>
+      <w:r>
+        <w:rPr>
+          <w:b/>
+          <w:bCs/>
+          <w:i w:val="0"/>
+          <w:iCs w:val="0"/>
+          <w:color w:val="auto"/>
+          <w:sz w:val="28"/>
+          <w:szCs w:val="28"/>
+        </w:rPr>
+        <w:fldChar w:fldCharType="separate"/>
+      </w:r>
+      <w:r>
+        <w:rPr>
+          <w:b/>
+          <w:bCs/>
+          <w:i w:val="0"/>
+          <w:iCs w:val="0"/>
+          <w:noProof/>
+          <w:color w:val="auto"/>
+          <w:sz w:val="28"/>
+          <w:szCs w:val="28"/>
+        </w:rPr>
+        <w:t>3</w:t>
+      </w:r>
+      <w:r>
+        <w:rPr>
+          <w:b/>
+          <w:bCs/>
+          <w:i w:val="0"/>
+          <w:iCs w:val="0"/>
+          <w:color w:val="auto"/>
+          <w:sz w:val="28"/>
+          <w:szCs w:val="28"/>
+        </w:rPr>
+        <w:fldChar w:fldCharType="end"/>
+      </w:r>
+      <w:r>
+        <w:rPr>
+          <w:b/>
+          <w:bCs/>
+          <w:i w:val="0"/>
+          <w:iCs w:val="0"/>
+          <w:color w:val="auto"/>
+          <w:sz w:val="28"/>
+          <w:szCs w:val="28"/>
+        </w:rPr>
+        <w:t xml:space="preserve">. </w:t>
+      </w:r>
+      <w:r>
+        <w:rPr>
+          <w:i w:val="0"/>
+          <w:iCs w:val="0"/>
+          <w:color w:val="auto"/>
+          <w:sz w:val="28"/>
+          <w:szCs w:val="28"/>
+        </w:rPr>
+        <w:t xml:space="preserve">Векторна диаграма на </w:t>
+      </w:r>
+      <w:r>
+        <w:rPr>
+          <w:i w:val="0"/>
+          <w:iCs w:val="0"/>
+          <w:color w:val="auto"/>
+          <w:sz w:val="28"/>
+          <w:szCs w:val="28"/>
+          <w:lang w:val="en-US"/>
+        </w:rPr>
+        <w:t xml:space="preserve">FOC </w:t>
+      </w:r>
+      <w:r>
+        <w:rPr>
+          <w:i w:val="0"/>
+          <w:iCs w:val="0"/>
+          <w:color w:val="auto"/>
+          <w:sz w:val="28"/>
+          <w:szCs w:val="28"/>
+        </w:rPr>
+        <w:t>управление</w:t>
+      </w:r>
+    </w:p>
+    <w:p>
+      <w:pPr>
+        <w:spacing w:line="276" w:lineRule="auto"/>
+      </w:pPr>
+    </w:p>
+    <w:p>
+      <w:r>
+        <w:t xml:space="preserve">Предимства на този метод са: </w:t>
+      </w:r>
+      <w:r>
+        <w:t xml:space="preserve">максимална ефективност и въртящ момент на мотора, </w:t>
+      </w:r>
+      <w:r>
+        <w:t>константен въртящ момент</w:t>
+      </w:r>
+      <w:r>
+        <w:t>,</w:t>
+      </w:r>
+      <w:r>
+        <w:t xml:space="preserve"> тих по отношение на доловими шумове.</w:t>
+      </w:r>
+    </w:p>
+    <w:p>
+      <w:r>
+        <w:t xml:space="preserve">Недостатъци са: </w:t>
+      </w:r>
+      <w:r>
+        <w:t>най</w:t>
+      </w:r>
+      <w:r>
+        <w:t xml:space="preserve">-сложен за имплементиране и съответно </w:t>
+      </w:r>
+      <w:r>
+        <w:t>най</w:t>
+      </w:r>
+      <w:r>
+        <w:t>-скъп</w:t>
+      </w:r>
+      <w:r>
+        <w:t>,</w:t>
+      </w:r>
+      <w:r>
+        <w:t xml:space="preserve"> големи загуби от превключване на управляващите транзистори (не се преминава през състояние на висок импеданс).</w:t>
+      </w:r>
+    </w:p>
+    <w:p/>
+    <w:p>
+      <w:pPr>
+        <w:spacing w:line="276" w:lineRule="auto"/>
+        <w:ind w:firstLine="0"/>
+        <w:jc w:val="left"/>
+        <w:rPr>
+          <w:b/>
+          <w:sz w:val="32"/>
+          <w:szCs w:val="32"/>
+        </w:rPr>
+      </w:pPr>
+      <w:r>
+        <w:br w:type="page"/>
+      </w:r>
+    </w:p>
+    <w:p>
+      <w:pPr>
+        <w:pStyle w:val="Heading3"/>
+      </w:pPr>
+      <w:r>
+        <w:lastRenderedPageBreak/>
+        <w:t>Сравнение между трите вида управление</w:t>
+      </w:r>
+    </w:p>
+    <w:p>
+      <w:r>
+        <w:t xml:space="preserve">В табл. 2.2.1. е дадено сравнение между </w:t>
+      </w:r>
+      <w:r>
+        <w:t>трите алгоритъма за управление на трифазни безчеткови мотори.</w:t>
+      </w:r>
+    </w:p>
+    <w:p>
+      <w:pPr>
+        <w:spacing w:line="276" w:lineRule="auto"/>
+      </w:pPr>
+    </w:p>
+    <w:p>
+      <w:pPr>
+        <w:pStyle w:val="Caption"/>
+        <w:spacing w:after="0" w:line="360" w:lineRule="auto"/>
+        <w:ind w:firstLine="0"/>
+        <w:jc w:val="left"/>
+        <w:rPr>
+          <w:i w:val="0"/>
+          <w:iCs w:val="0"/>
+          <w:color w:val="auto"/>
+          <w:sz w:val="28"/>
+          <w:szCs w:val="28"/>
+        </w:rPr>
+      </w:pPr>
+      <w:r>
+        <w:rPr>
+          <w:b/>
+          <w:bCs/>
+          <w:i w:val="0"/>
+          <w:iCs w:val="0"/>
+          <w:color w:val="auto"/>
+          <w:sz w:val="28"/>
+          <w:szCs w:val="28"/>
+        </w:rPr>
+        <w:t xml:space="preserve">Табл. </w:t>
+      </w:r>
+      <w:r>
+        <w:rPr>
+          <w:b/>
+          <w:bCs/>
+          <w:i w:val="0"/>
+          <w:iCs w:val="0"/>
+          <w:color w:val="auto"/>
+          <w:sz w:val="28"/>
+          <w:szCs w:val="28"/>
+        </w:rPr>
+        <w:fldChar w:fldCharType="begin"/>
+      </w:r>
+      <w:r>
+        <w:rPr>
+          <w:b/>
+          <w:bCs/>
+          <w:i w:val="0"/>
+          <w:iCs w:val="0"/>
+          <w:color w:val="auto"/>
+          <w:sz w:val="28"/>
+          <w:szCs w:val="28"/>
+        </w:rPr>
+        <w:instrText xml:space="preserve"> STYLEREF 2 \s </w:instrText>
+      </w:r>
+      <w:r>
+        <w:rPr>
+          <w:b/>
+          <w:bCs/>
+          <w:i w:val="0"/>
+          <w:iCs w:val="0"/>
+          <w:color w:val="auto"/>
+          <w:sz w:val="28"/>
+          <w:szCs w:val="28"/>
+        </w:rPr>
+        <w:fldChar w:fldCharType="separate"/>
+      </w:r>
+      <w:r>
+        <w:rPr>
+          <w:b/>
+          <w:bCs/>
+          <w:i w:val="0"/>
+          <w:iCs w:val="0"/>
+          <w:noProof/>
+          <w:color w:val="auto"/>
+          <w:sz w:val="28"/>
+          <w:szCs w:val="28"/>
+        </w:rPr>
+        <w:t>2.2</w:t>
+      </w:r>
+      <w:r>
+        <w:rPr>
+          <w:b/>
+          <w:bCs/>
+          <w:i w:val="0"/>
+          <w:iCs w:val="0"/>
+          <w:color w:val="auto"/>
+          <w:sz w:val="28"/>
+          <w:szCs w:val="28"/>
+        </w:rPr>
+        <w:fldChar w:fldCharType="end"/>
+      </w:r>
+      <w:r>
+        <w:rPr>
+          <w:b/>
+          <w:bCs/>
+          <w:i w:val="0"/>
+          <w:iCs w:val="0"/>
+          <w:color w:val="auto"/>
+          <w:sz w:val="28"/>
+          <w:szCs w:val="28"/>
+        </w:rPr>
+        <w:t>.</w:t>
+      </w:r>
+      <w:r>
+        <w:rPr>
+          <w:b/>
+          <w:bCs/>
+          <w:i w:val="0"/>
+          <w:iCs w:val="0"/>
+          <w:color w:val="auto"/>
+          <w:sz w:val="28"/>
+          <w:szCs w:val="28"/>
+        </w:rPr>
+        <w:fldChar w:fldCharType="begin"/>
+      </w:r>
+      <w:r>
+        <w:rPr>
+          <w:b/>
+          <w:bCs/>
+          <w:i w:val="0"/>
+          <w:iCs w:val="0"/>
+          <w:color w:val="auto"/>
+          <w:sz w:val="28"/>
+          <w:szCs w:val="28"/>
+        </w:rPr>
+        <w:instrText xml:space="preserve"> SEQ Табл. \* ARABIC \s 2 </w:instrText>
+      </w:r>
+      <w:r>
+        <w:rPr>
+          <w:b/>
+          <w:bCs/>
+          <w:i w:val="0"/>
+          <w:iCs w:val="0"/>
+          <w:color w:val="auto"/>
+          <w:sz w:val="28"/>
+          <w:szCs w:val="28"/>
+        </w:rPr>
+        <w:fldChar w:fldCharType="separate"/>
+      </w:r>
+      <w:r>
+        <w:rPr>
+          <w:b/>
+          <w:bCs/>
+          <w:i w:val="0"/>
+          <w:iCs w:val="0"/>
+          <w:noProof/>
+          <w:color w:val="auto"/>
+          <w:sz w:val="28"/>
+          <w:szCs w:val="28"/>
+        </w:rPr>
+        <w:t>1</w:t>
+      </w:r>
+      <w:r>
+        <w:rPr>
+          <w:b/>
+          <w:bCs/>
+          <w:i w:val="0"/>
+          <w:iCs w:val="0"/>
+          <w:color w:val="auto"/>
+          <w:sz w:val="28"/>
+          <w:szCs w:val="28"/>
+        </w:rPr>
+        <w:fldChar w:fldCharType="end"/>
+      </w:r>
+      <w:r>
+        <w:rPr>
+          <w:b/>
+          <w:bCs/>
+          <w:i w:val="0"/>
+          <w:iCs w:val="0"/>
+          <w:color w:val="auto"/>
+          <w:sz w:val="28"/>
+          <w:szCs w:val="28"/>
+        </w:rPr>
+        <w:t xml:space="preserve">. </w:t>
+      </w:r>
+      <w:r>
+        <w:rPr>
+          <w:i w:val="0"/>
+          <w:iCs w:val="0"/>
+          <w:color w:val="auto"/>
+          <w:sz w:val="28"/>
+          <w:szCs w:val="28"/>
+        </w:rPr>
+        <w:t>Сравнение между алгоритмите за управление</w:t>
+      </w:r>
+    </w:p>
+    <w:tbl>
+      <w:tblPr>
+        <w:tblStyle w:val="TableGrid"/>
+        <w:tblW w:w="0" w:type="auto"/>
+        <w:tblBorders>
+          <w:top w:val="single" w:sz="12" w:space="0" w:color="auto"/>
+          <w:left w:val="single" w:sz="12" w:space="0" w:color="auto"/>
+          <w:bottom w:val="single" w:sz="12" w:space="0" w:color="auto"/>
+          <w:right w:val="single" w:sz="12" w:space="0" w:color="auto"/>
+        </w:tblBorders>
+        <w:tblLayout w:type="fixed"/>
+        <w:tblLook w:val="04A0" w:firstRow="1" w:lastRow="0" w:firstColumn="1" w:lastColumn="0" w:noHBand="0" w:noVBand="1"/>
+      </w:tblPr>
+      <w:tblGrid>
+        <w:gridCol w:w="3978"/>
+        <w:gridCol w:w="2070"/>
+        <w:gridCol w:w="2070"/>
+        <w:gridCol w:w="1170"/>
+      </w:tblGrid>
+      <w:tr>
+        <w:tc>
+          <w:tcPr>
+            <w:tcW w:w="3978" w:type="dxa"/>
+            <w:tcBorders>
+              <w:top w:val="single" w:sz="12" w:space="0" w:color="auto"/>
+              <w:bottom w:val="single" w:sz="12" w:space="0" w:color="auto"/>
+              <w:right w:val="single" w:sz="12" w:space="0" w:color="auto"/>
+            </w:tcBorders>
+            <w:shd w:val="clear" w:color="auto" w:fill="F2F2F2" w:themeFill="background1" w:themeFillShade="F2"/>
+          </w:tcPr>
+          <w:p>
+            <w:pPr>
+              <w:ind w:firstLine="0"/>
+              <w:rPr>
+                <w:lang w:val="en-US"/>
+              </w:rPr>
+            </w:pPr>
+          </w:p>
+        </w:tc>
+        <w:tc>
+          <w:tcPr>
+            <w:tcW w:w="2070" w:type="dxa"/>
+            <w:tcBorders>
+              <w:top w:val="single" w:sz="12" w:space="0" w:color="auto"/>
+              <w:left w:val="single" w:sz="12" w:space="0" w:color="auto"/>
+              <w:bottom w:val="single" w:sz="12" w:space="0" w:color="auto"/>
+              <w:right w:val="single" w:sz="12" w:space="0" w:color="auto"/>
+            </w:tcBorders>
+            <w:shd w:val="clear" w:color="auto" w:fill="F2F2F2" w:themeFill="background1" w:themeFillShade="F2"/>
+            <w:vAlign w:val="center"/>
+          </w:tcPr>
+          <w:p>
+            <w:pPr>
+              <w:spacing w:line="276" w:lineRule="auto"/>
+              <w:ind w:firstLine="0"/>
+              <w:jc w:val="center"/>
+              <w:rPr>
+                <w:b/>
+                <w:bCs/>
+              </w:rPr>
+            </w:pPr>
+            <w:r>
+              <w:rPr>
+                <w:b/>
+                <w:bCs/>
+              </w:rPr>
+              <w:t>Трапецовидно</w:t>
+            </w:r>
+          </w:p>
+        </w:tc>
+        <w:tc>
+          <w:tcPr>
+            <w:tcW w:w="2070" w:type="dxa"/>
+            <w:tcBorders>
+              <w:top w:val="single" w:sz="12" w:space="0" w:color="auto"/>
+              <w:left w:val="single" w:sz="12" w:space="0" w:color="auto"/>
+              <w:bottom w:val="single" w:sz="12" w:space="0" w:color="auto"/>
+              <w:right w:val="single" w:sz="12" w:space="0" w:color="auto"/>
+            </w:tcBorders>
+            <w:shd w:val="clear" w:color="auto" w:fill="F2F2F2" w:themeFill="background1" w:themeFillShade="F2"/>
+            <w:vAlign w:val="center"/>
+          </w:tcPr>
+          <w:p>
+            <w:pPr>
+              <w:spacing w:line="276" w:lineRule="auto"/>
+              <w:ind w:firstLine="0"/>
+              <w:jc w:val="center"/>
+              <w:rPr>
+                <w:b/>
+                <w:bCs/>
+              </w:rPr>
+            </w:pPr>
+            <w:r>
+              <w:rPr>
+                <w:b/>
+                <w:bCs/>
+              </w:rPr>
+              <w:t>Синусоидално</w:t>
+            </w:r>
+          </w:p>
+        </w:tc>
+        <w:tc>
+          <w:tcPr>
+            <w:tcW w:w="1170" w:type="dxa"/>
+            <w:tcBorders>
+              <w:top w:val="single" w:sz="12" w:space="0" w:color="auto"/>
+              <w:left w:val="single" w:sz="12" w:space="0" w:color="auto"/>
+              <w:bottom w:val="single" w:sz="12" w:space="0" w:color="auto"/>
+            </w:tcBorders>
+            <w:shd w:val="clear" w:color="auto" w:fill="F2F2F2" w:themeFill="background1" w:themeFillShade="F2"/>
+            <w:vAlign w:val="center"/>
+          </w:tcPr>
+          <w:p>
+            <w:pPr>
+              <w:spacing w:line="276" w:lineRule="auto"/>
+              <w:ind w:firstLine="0"/>
+              <w:jc w:val="center"/>
+              <w:rPr>
+                <w:b/>
+                <w:bCs/>
+                <w:lang w:val="en-US"/>
+              </w:rPr>
+            </w:pPr>
+            <w:r>
+              <w:rPr>
+                <w:b/>
+                <w:bCs/>
+                <w:lang w:val="en-US"/>
+              </w:rPr>
+              <w:t>FOC</w:t>
+            </w:r>
+          </w:p>
+        </w:tc>
+      </w:tr>
+      <w:tr>
+        <w:tc>
+          <w:tcPr>
+            <w:tcW w:w="3978" w:type="dxa"/>
+            <w:tcBorders>
+              <w:top w:val="single" w:sz="12" w:space="0" w:color="auto"/>
+              <w:bottom w:val="single" w:sz="4" w:space="0" w:color="auto"/>
+              <w:right w:val="single" w:sz="12" w:space="0" w:color="auto"/>
+            </w:tcBorders>
+            <w:shd w:val="clear" w:color="auto" w:fill="F2F2F2" w:themeFill="background1" w:themeFillShade="F2"/>
+          </w:tcPr>
+          <w:p>
+            <w:pPr>
+              <w:spacing w:line="276" w:lineRule="auto"/>
+              <w:ind w:firstLine="0"/>
+              <w:jc w:val="center"/>
+            </w:pPr>
+            <w:r>
+              <w:t xml:space="preserve">Сложност </w:t>
+            </w:r>
+            <w:r>
+              <w:t>на алгоритъма</w:t>
+            </w:r>
+          </w:p>
+        </w:tc>
+        <w:tc>
+          <w:tcPr>
+            <w:tcW w:w="2070" w:type="dxa"/>
+            <w:tcBorders>
+              <w:top w:val="single" w:sz="12" w:space="0" w:color="auto"/>
+              <w:left w:val="single" w:sz="12" w:space="0" w:color="auto"/>
+              <w:right w:val="single" w:sz="12" w:space="0" w:color="auto"/>
+            </w:tcBorders>
+            <w:shd w:val="clear" w:color="auto" w:fill="C2D69B" w:themeFill="accent3" w:themeFillTint="99"/>
+            <w:vAlign w:val="center"/>
+          </w:tcPr>
+          <w:p>
+            <w:pPr>
+              <w:spacing w:line="276" w:lineRule="auto"/>
+              <w:ind w:firstLine="0"/>
+              <w:jc w:val="center"/>
+            </w:pPr>
+            <w:r>
+              <w:t>Ниска</w:t>
+            </w:r>
+          </w:p>
+        </w:tc>
+        <w:tc>
+          <w:tcPr>
+            <w:tcW w:w="2070" w:type="dxa"/>
+            <w:tcBorders>
+              <w:top w:val="single" w:sz="12" w:space="0" w:color="auto"/>
+              <w:left w:val="single" w:sz="12" w:space="0" w:color="auto"/>
+              <w:right w:val="single" w:sz="12" w:space="0" w:color="auto"/>
+            </w:tcBorders>
+            <w:shd w:val="clear" w:color="auto" w:fill="FABF8F" w:themeFill="accent6" w:themeFillTint="99"/>
+            <w:vAlign w:val="center"/>
+          </w:tcPr>
+          <w:p>
+            <w:pPr>
+              <w:spacing w:line="276" w:lineRule="auto"/>
+              <w:ind w:firstLine="0"/>
+              <w:jc w:val="center"/>
+            </w:pPr>
+            <w:r>
+              <w:t>Средна</w:t>
+            </w:r>
+          </w:p>
+        </w:tc>
+        <w:tc>
+          <w:tcPr>
+            <w:tcW w:w="1170" w:type="dxa"/>
+            <w:tcBorders>
+              <w:top w:val="single" w:sz="12" w:space="0" w:color="auto"/>
+              <w:left w:val="single" w:sz="12" w:space="0" w:color="auto"/>
+            </w:tcBorders>
+            <w:shd w:val="clear" w:color="auto" w:fill="D99594" w:themeFill="accent2" w:themeFillTint="99"/>
+            <w:vAlign w:val="center"/>
+          </w:tcPr>
+          <w:p>
+            <w:pPr>
+              <w:spacing w:line="276" w:lineRule="auto"/>
+              <w:ind w:firstLine="0"/>
+              <w:jc w:val="center"/>
+            </w:pPr>
+            <w:r>
+              <w:t>Висока</w:t>
+            </w:r>
+          </w:p>
+        </w:tc>
+      </w:tr>
+      <w:tr>
+        <w:tc>
+          <w:tcPr>
+            <w:tcW w:w="3978" w:type="dxa"/>
+            <w:tcBorders>
+              <w:top w:val="single" w:sz="4" w:space="0" w:color="auto"/>
+              <w:bottom w:val="single" w:sz="4" w:space="0" w:color="auto"/>
+              <w:right w:val="single" w:sz="12" w:space="0" w:color="auto"/>
+            </w:tcBorders>
+            <w:shd w:val="clear" w:color="auto" w:fill="F2F2F2" w:themeFill="background1" w:themeFillShade="F2"/>
+          </w:tcPr>
+          <w:p>
+            <w:pPr>
+              <w:spacing w:line="276" w:lineRule="auto"/>
+              <w:ind w:firstLine="0"/>
+              <w:jc w:val="center"/>
+            </w:pPr>
+            <w:r>
+              <w:t>Ефективност на мотора</w:t>
+            </w:r>
+          </w:p>
+        </w:tc>
+        <w:tc>
+          <w:tcPr>
+            <w:tcW w:w="2070" w:type="dxa"/>
+            <w:tcBorders>
+              <w:left w:val="single" w:sz="12" w:space="0" w:color="auto"/>
+              <w:right w:val="single" w:sz="12" w:space="0" w:color="auto"/>
+            </w:tcBorders>
+            <w:shd w:val="clear" w:color="auto" w:fill="D99594" w:themeFill="accent2" w:themeFillTint="99"/>
+            <w:vAlign w:val="center"/>
+          </w:tcPr>
+          <w:p>
+            <w:pPr>
+              <w:spacing w:line="276" w:lineRule="auto"/>
+              <w:ind w:firstLine="0"/>
+              <w:jc w:val="center"/>
+            </w:pPr>
+            <w:r>
+              <w:t>Ниска</w:t>
+            </w:r>
+          </w:p>
+        </w:tc>
+        <w:tc>
+          <w:tcPr>
+            <w:tcW w:w="2070" w:type="dxa"/>
+            <w:tcBorders>
+              <w:left w:val="single" w:sz="12" w:space="0" w:color="auto"/>
+              <w:right w:val="single" w:sz="12" w:space="0" w:color="auto"/>
+            </w:tcBorders>
+            <w:shd w:val="clear" w:color="auto" w:fill="FABF8F" w:themeFill="accent6" w:themeFillTint="99"/>
+            <w:vAlign w:val="center"/>
+          </w:tcPr>
+          <w:p>
+            <w:pPr>
+              <w:spacing w:line="276" w:lineRule="auto"/>
+              <w:ind w:firstLine="0"/>
+              <w:jc w:val="center"/>
+            </w:pPr>
+            <w:r>
+              <w:t>Средна</w:t>
+            </w:r>
+          </w:p>
+        </w:tc>
+        <w:tc>
+          <w:tcPr>
+            <w:tcW w:w="1170" w:type="dxa"/>
+            <w:tcBorders>
+              <w:left w:val="single" w:sz="12" w:space="0" w:color="auto"/>
+            </w:tcBorders>
+            <w:shd w:val="clear" w:color="auto" w:fill="C2D69B" w:themeFill="accent3" w:themeFillTint="99"/>
+            <w:vAlign w:val="center"/>
+          </w:tcPr>
+          <w:p>
+            <w:pPr>
+              <w:spacing w:line="276" w:lineRule="auto"/>
+              <w:ind w:firstLine="0"/>
+              <w:jc w:val="center"/>
+            </w:pPr>
+            <w:r>
+              <w:t>Висока</w:t>
+            </w:r>
+          </w:p>
+        </w:tc>
+      </w:tr>
+      <w:tr>
+        <w:tc>
+          <w:tcPr>
+            <w:tcW w:w="3978" w:type="dxa"/>
+            <w:tcBorders>
+              <w:top w:val="single" w:sz="4" w:space="0" w:color="auto"/>
+              <w:bottom w:val="single" w:sz="4" w:space="0" w:color="auto"/>
+              <w:right w:val="single" w:sz="12" w:space="0" w:color="auto"/>
+            </w:tcBorders>
+            <w:shd w:val="clear" w:color="auto" w:fill="F2F2F2" w:themeFill="background1" w:themeFillShade="F2"/>
+          </w:tcPr>
+          <w:p>
+            <w:pPr>
+              <w:spacing w:line="276" w:lineRule="auto"/>
+              <w:ind w:firstLine="0"/>
+              <w:jc w:val="center"/>
+            </w:pPr>
+            <w:r>
+              <w:t>Максимална скорост на мотора</w:t>
+            </w:r>
+          </w:p>
+        </w:tc>
+        <w:tc>
+          <w:tcPr>
+            <w:tcW w:w="2070" w:type="dxa"/>
+            <w:tcBorders>
+              <w:left w:val="single" w:sz="12" w:space="0" w:color="auto"/>
+              <w:right w:val="single" w:sz="12" w:space="0" w:color="auto"/>
+            </w:tcBorders>
+            <w:shd w:val="clear" w:color="auto" w:fill="C2D69B" w:themeFill="accent3" w:themeFillTint="99"/>
+            <w:vAlign w:val="center"/>
+          </w:tcPr>
+          <w:p>
+            <w:pPr>
+              <w:spacing w:line="276" w:lineRule="auto"/>
+              <w:ind w:firstLine="0"/>
+              <w:jc w:val="center"/>
+            </w:pPr>
+            <w:r>
+              <w:t>Висока</w:t>
+            </w:r>
+          </w:p>
+        </w:tc>
+        <w:tc>
+          <w:tcPr>
+            <w:tcW w:w="2070" w:type="dxa"/>
+            <w:tcBorders>
+              <w:left w:val="single" w:sz="12" w:space="0" w:color="auto"/>
+              <w:right w:val="single" w:sz="12" w:space="0" w:color="auto"/>
+            </w:tcBorders>
+            <w:shd w:val="clear" w:color="auto" w:fill="D99594" w:themeFill="accent2" w:themeFillTint="99"/>
+            <w:vAlign w:val="center"/>
+          </w:tcPr>
+          <w:p>
+            <w:pPr>
+              <w:spacing w:line="276" w:lineRule="auto"/>
+              <w:ind w:firstLine="0"/>
+              <w:jc w:val="center"/>
+            </w:pPr>
+            <w:r>
+              <w:t>Ниска</w:t>
+            </w:r>
+          </w:p>
+        </w:tc>
+        <w:tc>
+          <w:tcPr>
+            <w:tcW w:w="1170" w:type="dxa"/>
+            <w:tcBorders>
+              <w:left w:val="single" w:sz="12" w:space="0" w:color="auto"/>
+            </w:tcBorders>
+            <w:shd w:val="clear" w:color="auto" w:fill="C2D69B" w:themeFill="accent3" w:themeFillTint="99"/>
+            <w:vAlign w:val="center"/>
+          </w:tcPr>
+          <w:p>
+            <w:pPr>
+              <w:spacing w:line="276" w:lineRule="auto"/>
+              <w:ind w:firstLine="0"/>
+              <w:jc w:val="center"/>
+            </w:pPr>
+            <w:r>
+              <w:t>Висока</w:t>
+            </w:r>
+          </w:p>
+        </w:tc>
+      </w:tr>
+      <w:tr>
+        <w:tc>
+          <w:tcPr>
+            <w:tcW w:w="3978" w:type="dxa"/>
+            <w:tcBorders>
+              <w:top w:val="single" w:sz="4" w:space="0" w:color="auto"/>
+              <w:bottom w:val="single" w:sz="4" w:space="0" w:color="auto"/>
+              <w:right w:val="single" w:sz="12" w:space="0" w:color="auto"/>
+            </w:tcBorders>
+            <w:shd w:val="clear" w:color="auto" w:fill="F2F2F2" w:themeFill="background1" w:themeFillShade="F2"/>
+          </w:tcPr>
+          <w:p>
+            <w:pPr>
+              <w:spacing w:line="276" w:lineRule="auto"/>
+              <w:ind w:firstLine="0"/>
+              <w:jc w:val="center"/>
+            </w:pPr>
+            <w:r>
+              <w:t>Загуби от превключване на управляващите транзистори</w:t>
+            </w:r>
+          </w:p>
+        </w:tc>
+        <w:tc>
+          <w:tcPr>
+            <w:tcW w:w="2070" w:type="dxa"/>
+            <w:tcBorders>
+              <w:left w:val="single" w:sz="12" w:space="0" w:color="auto"/>
+              <w:right w:val="single" w:sz="12" w:space="0" w:color="auto"/>
+            </w:tcBorders>
+            <w:shd w:val="clear" w:color="auto" w:fill="C2D69B" w:themeFill="accent3" w:themeFillTint="99"/>
+            <w:vAlign w:val="center"/>
+          </w:tcPr>
+          <w:p>
+            <w:pPr>
+              <w:spacing w:line="276" w:lineRule="auto"/>
+              <w:ind w:firstLine="0"/>
+              <w:jc w:val="center"/>
+            </w:pPr>
+            <w:r>
+              <w:t>Малки</w:t>
+            </w:r>
+          </w:p>
+        </w:tc>
+        <w:tc>
+          <w:tcPr>
+            <w:tcW w:w="2070" w:type="dxa"/>
+            <w:tcBorders>
+              <w:left w:val="single" w:sz="12" w:space="0" w:color="auto"/>
+              <w:right w:val="single" w:sz="12" w:space="0" w:color="auto"/>
+            </w:tcBorders>
+            <w:shd w:val="clear" w:color="auto" w:fill="D99594" w:themeFill="accent2" w:themeFillTint="99"/>
+            <w:vAlign w:val="center"/>
+          </w:tcPr>
+          <w:p>
+            <w:pPr>
+              <w:spacing w:line="276" w:lineRule="auto"/>
+              <w:ind w:firstLine="0"/>
+              <w:jc w:val="center"/>
+            </w:pPr>
+            <w:r>
+              <w:t>Големи</w:t>
+            </w:r>
+          </w:p>
+        </w:tc>
+        <w:tc>
+          <w:tcPr>
+            <w:tcW w:w="1170" w:type="dxa"/>
+            <w:tcBorders>
+              <w:left w:val="single" w:sz="12" w:space="0" w:color="auto"/>
+            </w:tcBorders>
+            <w:shd w:val="clear" w:color="auto" w:fill="D99594" w:themeFill="accent2" w:themeFillTint="99"/>
+            <w:vAlign w:val="center"/>
+          </w:tcPr>
+          <w:p>
+            <w:pPr>
+              <w:spacing w:line="276" w:lineRule="auto"/>
+              <w:ind w:firstLine="0"/>
+              <w:jc w:val="center"/>
+            </w:pPr>
+            <w:r>
+              <w:t>Големи</w:t>
+            </w:r>
+          </w:p>
+        </w:tc>
+      </w:tr>
+      <w:tr>
+        <w:tc>
+          <w:tcPr>
+            <w:tcW w:w="3978" w:type="dxa"/>
+            <w:tcBorders>
+              <w:top w:val="single" w:sz="4" w:space="0" w:color="auto"/>
+              <w:bottom w:val="single" w:sz="4" w:space="0" w:color="auto"/>
+              <w:right w:val="single" w:sz="12" w:space="0" w:color="auto"/>
+            </w:tcBorders>
+            <w:shd w:val="clear" w:color="auto" w:fill="F2F2F2" w:themeFill="background1" w:themeFillShade="F2"/>
+          </w:tcPr>
+          <w:p>
+            <w:pPr>
+              <w:spacing w:line="276" w:lineRule="auto"/>
+              <w:ind w:firstLine="0"/>
+              <w:jc w:val="center"/>
+            </w:pPr>
+            <w:r>
+              <w:t>Пулсации на въртящия момент</w:t>
+            </w:r>
+          </w:p>
+        </w:tc>
+        <w:tc>
+          <w:tcPr>
+            <w:tcW w:w="2070" w:type="dxa"/>
+            <w:tcBorders>
+              <w:left w:val="single" w:sz="12" w:space="0" w:color="auto"/>
+              <w:right w:val="single" w:sz="12" w:space="0" w:color="auto"/>
+            </w:tcBorders>
+            <w:shd w:val="clear" w:color="auto" w:fill="D99594" w:themeFill="accent2" w:themeFillTint="99"/>
+            <w:vAlign w:val="center"/>
+          </w:tcPr>
+          <w:p>
+            <w:pPr>
+              <w:spacing w:line="276" w:lineRule="auto"/>
+              <w:ind w:firstLine="0"/>
+              <w:jc w:val="center"/>
+            </w:pPr>
+            <w:r>
+              <w:t>Високи</w:t>
+            </w:r>
+          </w:p>
+        </w:tc>
+        <w:tc>
+          <w:tcPr>
+            <w:tcW w:w="2070" w:type="dxa"/>
+            <w:tcBorders>
+              <w:left w:val="single" w:sz="12" w:space="0" w:color="auto"/>
+              <w:right w:val="single" w:sz="12" w:space="0" w:color="auto"/>
+            </w:tcBorders>
+            <w:shd w:val="clear" w:color="auto" w:fill="FABF8F" w:themeFill="accent6" w:themeFillTint="99"/>
+            <w:vAlign w:val="center"/>
+          </w:tcPr>
+          <w:p>
+            <w:pPr>
+              <w:spacing w:line="276" w:lineRule="auto"/>
+              <w:ind w:firstLine="0"/>
+              <w:jc w:val="center"/>
+            </w:pPr>
+            <w:r>
+              <w:t>Средни</w:t>
+            </w:r>
+          </w:p>
+        </w:tc>
+        <w:tc>
+          <w:tcPr>
+            <w:tcW w:w="1170" w:type="dxa"/>
+            <w:tcBorders>
+              <w:left w:val="single" w:sz="12" w:space="0" w:color="auto"/>
+            </w:tcBorders>
+            <w:shd w:val="clear" w:color="auto" w:fill="C2D69B" w:themeFill="accent3" w:themeFillTint="99"/>
+            <w:vAlign w:val="center"/>
+          </w:tcPr>
+          <w:p>
+            <w:pPr>
+              <w:spacing w:line="276" w:lineRule="auto"/>
+              <w:ind w:firstLine="0"/>
+              <w:jc w:val="center"/>
+            </w:pPr>
+            <w:r>
+              <w:t>Ниски</w:t>
+            </w:r>
+          </w:p>
+        </w:tc>
+      </w:tr>
+      <w:tr>
+        <w:tc>
+          <w:tcPr>
+            <w:tcW w:w="3978" w:type="dxa"/>
+            <w:tcBorders>
+              <w:top w:val="single" w:sz="4" w:space="0" w:color="auto"/>
+              <w:bottom w:val="single" w:sz="12" w:space="0" w:color="auto"/>
+              <w:right w:val="single" w:sz="12" w:space="0" w:color="auto"/>
+            </w:tcBorders>
+            <w:shd w:val="clear" w:color="auto" w:fill="F2F2F2" w:themeFill="background1" w:themeFillShade="F2"/>
+          </w:tcPr>
+          <w:p>
+            <w:pPr>
+              <w:spacing w:line="276" w:lineRule="auto"/>
+              <w:ind w:firstLine="0"/>
+              <w:jc w:val="center"/>
+            </w:pPr>
+            <w:r>
+              <w:t>Уловим шум</w:t>
+            </w:r>
+          </w:p>
+        </w:tc>
+        <w:tc>
+          <w:tcPr>
+            <w:tcW w:w="2070" w:type="dxa"/>
+            <w:tcBorders>
+              <w:left w:val="single" w:sz="12" w:space="0" w:color="auto"/>
+              <w:bottom w:val="single" w:sz="12" w:space="0" w:color="auto"/>
+              <w:right w:val="single" w:sz="12" w:space="0" w:color="auto"/>
+            </w:tcBorders>
+            <w:shd w:val="clear" w:color="auto" w:fill="D99594" w:themeFill="accent2" w:themeFillTint="99"/>
+            <w:vAlign w:val="center"/>
+          </w:tcPr>
+          <w:p>
+            <w:pPr>
+              <w:spacing w:line="276" w:lineRule="auto"/>
+              <w:ind w:firstLine="0"/>
+              <w:jc w:val="center"/>
+            </w:pPr>
+            <w:r>
+              <w:t>Висок</w:t>
+            </w:r>
+          </w:p>
+        </w:tc>
+        <w:tc>
+          <w:tcPr>
+            <w:tcW w:w="2070" w:type="dxa"/>
+            <w:tcBorders>
+              <w:left w:val="single" w:sz="12" w:space="0" w:color="auto"/>
+              <w:bottom w:val="single" w:sz="12" w:space="0" w:color="auto"/>
+              <w:right w:val="single" w:sz="12" w:space="0" w:color="auto"/>
+            </w:tcBorders>
+            <w:shd w:val="clear" w:color="auto" w:fill="C2D69B" w:themeFill="accent3" w:themeFillTint="99"/>
+            <w:vAlign w:val="center"/>
+          </w:tcPr>
+          <w:p>
+            <w:pPr>
+              <w:spacing w:line="276" w:lineRule="auto"/>
+              <w:ind w:firstLine="0"/>
+              <w:jc w:val="center"/>
+            </w:pPr>
+            <w:r>
+              <w:t>Нисък</w:t>
+            </w:r>
+          </w:p>
+        </w:tc>
+        <w:tc>
+          <w:tcPr>
+            <w:tcW w:w="1170" w:type="dxa"/>
+            <w:tcBorders>
+              <w:left w:val="single" w:sz="12" w:space="0" w:color="auto"/>
+            </w:tcBorders>
+            <w:shd w:val="clear" w:color="auto" w:fill="C2D69B" w:themeFill="accent3" w:themeFillTint="99"/>
+            <w:vAlign w:val="center"/>
+          </w:tcPr>
+          <w:p>
+            <w:pPr>
+              <w:spacing w:line="276" w:lineRule="auto"/>
+              <w:ind w:firstLine="0"/>
+              <w:jc w:val="center"/>
+            </w:pPr>
+            <w:r>
+              <w:t>Нисък</w:t>
+            </w:r>
+          </w:p>
+        </w:tc>
+      </w:tr>
+    </w:tbl>
+    <w:p>
+      <w:pPr>
+        <w:spacing w:line="276" w:lineRule="auto"/>
+      </w:pPr>
+    </w:p>
+    <w:p>
+      <w:r>
+        <w:t xml:space="preserve">Както беше споменато в </w:t>
+      </w:r>
+      <w:r>
+        <w:t xml:space="preserve">т. </w:t>
+      </w:r>
+      <w:r>
+        <w:t>2.1.3.,</w:t>
+      </w:r>
+      <w:r>
+        <w:t xml:space="preserve"> компресорната помпа, която ще бъде управлявана от проектираното устройство, </w:t>
+      </w:r>
+      <w:r>
+        <w:t>използва безчетков мотор с трапецовидно обратно ЕДН</w:t>
+      </w:r>
+      <w:r>
+        <w:t xml:space="preserve">. Вземайки това предвид, подходящи за целите на дипломната работа са трапецовидното и </w:t>
+      </w:r>
+      <w:r>
+        <w:rPr>
+          <w:lang w:val="en-US"/>
+        </w:rPr>
+        <w:t>FOC</w:t>
+      </w:r>
+      <w:r>
+        <w:t xml:space="preserve"> управленията. </w:t>
+      </w:r>
+    </w:p>
+    <w:p>
+      <w:r>
+        <w:t>С това уточнение</w:t>
+      </w:r>
+      <w:r>
+        <w:t>,</w:t>
+      </w:r>
+      <w:r>
+        <w:t xml:space="preserve"> вече могат да бъдат разгледани наличните на пазара интегрирани драйвери за управление на безчеткови мотори, като фокусът ще бъде върху такива, предлагащи трапецовидно и</w:t>
+      </w:r>
+      <w:r>
+        <w:t>/или</w:t>
+      </w:r>
+      <w:r>
+        <w:t xml:space="preserve"> </w:t>
+      </w:r>
+      <w:r>
+        <w:rPr>
+          <w:lang w:val="en-US"/>
+        </w:rPr>
+        <w:t xml:space="preserve">FOC </w:t>
+      </w:r>
+      <w:r>
+        <w:t xml:space="preserve">управление. В следващата точка са дадени няколко варианта за такива драйвери и е избран един от тях, който най-добре </w:t>
+      </w:r>
+      <w:r>
+        <w:t>покрива</w:t>
+      </w:r>
+      <w:r>
+        <w:t xml:space="preserve"> изискванията </w:t>
+      </w:r>
       <w:bookmarkStart w:id="5" w:name="_Toc199009203"/>
       <w:r>
-        <w:br w:type="page"/>
-      </w:r>
+        <w:t>към устройството.</w:t>
+      </w:r>
+    </w:p>
+    <w:p>
+      <w:pPr>
+        <w:spacing w:line="276" w:lineRule="auto"/>
+        <w:rPr>
+          <w:b/>
+          <w:sz w:val="32"/>
+          <w:szCs w:val="32"/>
+        </w:rPr>
+      </w:pPr>
     </w:p>
     <w:p>
       <w:pPr>
@@ -3995,39 +6269,43 @@
         </w:rPr>
       </w:pPr>
       <w:r>
+        <w:t>Интегрирани</w:t>
+      </w:r>
+      <w:r>
+        <w:t xml:space="preserve"> драйвери за управление на </w:t>
+      </w:r>
+      <w:r>
+        <w:t xml:space="preserve">трифазни </w:t>
+      </w:r>
+      <w:r>
+        <w:t xml:space="preserve">безчеткови </w:t>
+      </w:r>
+      <w:r>
+        <w:t>мотори</w:t>
+      </w:r>
+      <w:bookmarkEnd w:id="5"/>
+    </w:p>
+    <w:p>
+      <w:bookmarkStart w:id="6" w:name="_Toc199009204"/>
+      <w:r>
+        <w:t>текст</w:t>
+      </w:r>
+    </w:p>
+    <w:p>
+      <w:pPr>
+        <w:pStyle w:val="Heading2"/>
+      </w:pPr>
+      <w:r>
+        <w:t>Превключване</w:t>
+      </w:r>
+      <w:r>
+        <w:t xml:space="preserve"> на постояннотоково захранване и управление на пусковия ток</w:t>
+      </w:r>
+      <w:bookmarkEnd w:id="6"/>
+    </w:p>
+    <w:p>
+      <w:r>
         <w:lastRenderedPageBreak/>
-        <w:t>Интегрирани</w:t>
-      </w:r>
-      <w:r>
-        <w:t xml:space="preserve"> драйвери за управление на безчеткови </w:t>
-      </w:r>
-      <w:r>
-        <w:t>мотори</w:t>
-      </w:r>
-      <w:bookmarkEnd w:id="5"/>
-    </w:p>
-    <w:p/>
-    <w:p/>
-    <w:p>
-      <w:r>
-        <w:t>текст</w:t>
-      </w:r>
-    </w:p>
-    <w:p>
-      <w:pPr>
-        <w:pStyle w:val="Heading2"/>
-      </w:pPr>
-      <w:bookmarkStart w:id="6" w:name="_Toc199009204"/>
-      <w:r>
-        <w:t>Превключване</w:t>
-      </w:r>
-      <w:r>
-        <w:t xml:space="preserve"> на постояннотоково захранване и управление на пусковия ток</w:t>
-      </w:r>
-      <w:bookmarkEnd w:id="6"/>
-    </w:p>
-    <w:p>
-      <w:r>
         <w:t>текст</w:t>
       </w:r>
     </w:p>
@@ -4177,7 +6455,6 @@
     </w:p>
     <w:p>
       <w:r>
-        <w:lastRenderedPageBreak/>
         <w:t>текст</w:t>
       </w:r>
     </w:p>
@@ -4224,6 +6501,7 @@
       <w:bookmarkStart w:id="25" w:name="_Toc199009216"/>
       <w:bookmarkEnd w:id="22"/>
       <w:r>
+        <w:lastRenderedPageBreak/>
         <w:t>Конфигурация на драйвера</w:t>
       </w:r>
       <w:bookmarkEnd w:id="25"/>
@@ -4317,68 +6595,12 @@
       <w:r>
         <w:t xml:space="preserve"> </w:t>
       </w:r>
-      <w:hyperlink r:id="rId12" w:history="1">
+      <w:hyperlink r:id="rId15" w:history="1">
         <w:r>
           <w:rPr>
             <w:rStyle w:val="Hyperlink"/>
           </w:rPr>
-          <w:t xml:space="preserve">DC </w:t>
-        </w:r>
-        <w:proofErr w:type="spellStart"/>
-        <w:r>
-          <w:rPr>
-            <w:rStyle w:val="Hyperlink"/>
-          </w:rPr>
-          <w:t>Motors</w:t>
-        </w:r>
-        <w:proofErr w:type="spellEnd"/>
-        <w:r>
-          <w:rPr>
-            <w:rStyle w:val="Hyperlink"/>
-          </w:rPr>
-          <w:t xml:space="preserve">: </w:t>
-        </w:r>
-        <w:proofErr w:type="spellStart"/>
-        <w:r>
-          <w:rPr>
-            <w:rStyle w:val="Hyperlink"/>
-          </w:rPr>
-          <w:t>Types</w:t>
-        </w:r>
-        <w:proofErr w:type="spellEnd"/>
-        <w:r>
-          <w:rPr>
-            <w:rStyle w:val="Hyperlink"/>
-          </w:rPr>
-          <w:t xml:space="preserve"> </w:t>
-        </w:r>
-        <w:proofErr w:type="spellStart"/>
-        <w:r>
-          <w:rPr>
-            <w:rStyle w:val="Hyperlink"/>
-          </w:rPr>
-          <w:t>and</w:t>
-        </w:r>
-        <w:proofErr w:type="spellEnd"/>
-        <w:r>
-          <w:rPr>
-            <w:rStyle w:val="Hyperlink"/>
-          </w:rPr>
-          <w:t xml:space="preserve"> </w:t>
-        </w:r>
-        <w:proofErr w:type="spellStart"/>
-        <w:r>
-          <w:rPr>
-            <w:rStyle w:val="Hyperlink"/>
-          </w:rPr>
-          <w:t>Uses</w:t>
-        </w:r>
-        <w:proofErr w:type="spellEnd"/>
-        <w:r>
-          <w:rPr>
-            <w:rStyle w:val="Hyperlink"/>
-          </w:rPr>
-          <w:t xml:space="preserve"> – IQS</w:t>
+          <w:t>DC Motors: Types and Uses – IQS</w:t>
         </w:r>
         <w:r>
           <w:rPr>
@@ -4387,14 +6609,12 @@
           </w:rPr>
           <w:t xml:space="preserve"> </w:t>
         </w:r>
-        <w:proofErr w:type="spellStart"/>
         <w:r>
           <w:rPr>
             <w:rStyle w:val="Hyperlink"/>
           </w:rPr>
           <w:t>Directory</w:t>
         </w:r>
-        <w:proofErr w:type="spellEnd"/>
       </w:hyperlink>
     </w:p>
     <w:p>
@@ -4422,7 +6642,7 @@
         </w:rPr>
         <w:t xml:space="preserve">] </w:t>
       </w:r>
-      <w:hyperlink r:id="rId13" w:history="1">
+      <w:hyperlink r:id="rId16" w:history="1">
         <w:r>
           <w:rPr>
             <w:rStyle w:val="Hyperlink"/>
@@ -4454,7 +6674,7 @@
         </w:rPr>
         <w:t xml:space="preserve">] </w:t>
       </w:r>
-      <w:hyperlink r:id="rId14" w:history="1">
+      <w:hyperlink r:id="rId17" w:history="1">
         <w:r>
           <w:rPr>
             <w:rStyle w:val="Hyperlink"/>
@@ -4494,90 +6714,12 @@
       <w:r>
         <w:t xml:space="preserve">] </w:t>
       </w:r>
-      <w:hyperlink r:id="rId15" w:history="1">
-        <w:proofErr w:type="spellStart"/>
+      <w:hyperlink r:id="rId18" w:history="1">
         <w:r>
           <w:rPr>
             <w:rStyle w:val="Hyperlink"/>
           </w:rPr>
-          <w:t>Brushless</w:t>
-        </w:r>
-        <w:proofErr w:type="spellEnd"/>
-        <w:r>
-          <w:rPr>
-            <w:rStyle w:val="Hyperlink"/>
-          </w:rPr>
-          <w:t xml:space="preserve">-DC </w:t>
-        </w:r>
-        <w:proofErr w:type="spellStart"/>
-        <w:r>
-          <w:rPr>
-            <w:rStyle w:val="Hyperlink"/>
-          </w:rPr>
-          <w:t>Motor</w:t>
-        </w:r>
-        <w:proofErr w:type="spellEnd"/>
-        <w:r>
-          <w:rPr>
-            <w:rStyle w:val="Hyperlink"/>
-          </w:rPr>
-          <w:t xml:space="preserve"> </w:t>
-        </w:r>
-        <w:proofErr w:type="spellStart"/>
-        <w:r>
-          <w:rPr>
-            <w:rStyle w:val="Hyperlink"/>
-          </w:rPr>
-          <w:t>Driver</w:t>
-        </w:r>
-        <w:proofErr w:type="spellEnd"/>
-        <w:r>
-          <w:rPr>
-            <w:rStyle w:val="Hyperlink"/>
-          </w:rPr>
-          <w:t xml:space="preserve"> </w:t>
-        </w:r>
-        <w:proofErr w:type="spellStart"/>
-        <w:r>
-          <w:rPr>
-            <w:rStyle w:val="Hyperlink"/>
-          </w:rPr>
-          <w:t>Considerations</w:t>
-        </w:r>
-        <w:proofErr w:type="spellEnd"/>
-        <w:r>
-          <w:rPr>
-            <w:rStyle w:val="Hyperlink"/>
-          </w:rPr>
-          <w:t xml:space="preserve"> </w:t>
-        </w:r>
-        <w:proofErr w:type="spellStart"/>
-        <w:r>
-          <w:rPr>
-            <w:rStyle w:val="Hyperlink"/>
-          </w:rPr>
-          <w:t>and</w:t>
-        </w:r>
-        <w:proofErr w:type="spellEnd"/>
-        <w:r>
-          <w:rPr>
-            <w:rStyle w:val="Hyperlink"/>
-          </w:rPr>
-          <w:t xml:space="preserve"> </w:t>
-        </w:r>
-        <w:proofErr w:type="spellStart"/>
-        <w:r>
-          <w:rPr>
-            <w:rStyle w:val="Hyperlink"/>
-          </w:rPr>
-          <w:t>Selection</w:t>
-        </w:r>
-        <w:proofErr w:type="spellEnd"/>
-        <w:r>
-          <w:rPr>
-            <w:rStyle w:val="Hyperlink"/>
-          </w:rPr>
-          <w:t xml:space="preserve"> </w:t>
+          <w:t xml:space="preserve">Brushless-DC Motor Driver Considerations and Selection </w:t>
         </w:r>
         <w:r>
           <w:rPr>
@@ -4626,11 +6768,11 @@
           <w:u w:val="none"/>
         </w:rPr>
         <w:sectPr>
-          <w:footerReference w:type="default" r:id="rId16"/>
+          <w:footerReference w:type="default" r:id="rId19"/>
           <w:pgSz w:w="11909" w:h="16834"/>
           <w:pgMar w:top="1411" w:right="1138" w:bottom="1411" w:left="1699" w:header="720" w:footer="720" w:gutter="0"/>
+          <w:pgNumType w:start="4"/>
           <w:cols w:space="720"/>
-          <w:titlePg/>
           <w:docGrid w:linePitch="381"/>
         </w:sectPr>
       </w:pPr>
@@ -5410,8 +7552,8 @@
     </w:p>
     <w:p/>
     <w:sectPr>
-      <w:footerReference w:type="default" r:id="rId17"/>
-      <w:footerReference w:type="first" r:id="rId18"/>
+      <w:footerReference w:type="default" r:id="rId20"/>
+      <w:footerReference w:type="first" r:id="rId21"/>
       <w:pgSz w:w="11909" w:h="16834"/>
       <w:pgMar w:top="1418" w:right="1134" w:bottom="1418" w:left="1701" w:header="720" w:footer="720" w:gutter="0"/>
       <w:cols w:space="720"/>

</xml_diff>

<commit_message>
Small fixes to the documentation
</commit_message>
<xml_diff>
--- a/Documentation/DR_Iliyan_Antov_101324019.docx
+++ b/Documentation/DR_Iliyan_Antov_101324019.docx
@@ -14,6 +14,7 @@
         <w:p>
           <w:pPr>
             <w:spacing w:line="276" w:lineRule="auto"/>
+            <w:ind w:firstLine="0"/>
             <w:jc w:val="center"/>
             <w:rPr>
               <w:b/>
@@ -32,22 +33,20 @@
             <w:t>Съдържание</w:t>
           </w:r>
         </w:p>
-        <w:p/>
+        <w:p>
+          <w:pPr>
+            <w:ind w:firstLine="0"/>
+          </w:pPr>
+        </w:p>
         <w:p>
           <w:pPr>
             <w:pStyle w:val="TOC1"/>
-            <w:tabs>
-              <w:tab w:val="left" w:pos="1200"/>
-              <w:tab w:val="right" w:leader="dot" w:pos="9062"/>
-            </w:tabs>
-            <w:spacing w:line="276" w:lineRule="auto"/>
             <w:rPr>
               <w:rFonts w:asciiTheme="minorHAnsi" w:eastAsiaTheme="minorEastAsia" w:hAnsiTheme="minorHAnsi" w:cstheme="minorBidi"/>
               <w:noProof/>
               <w:kern w:val="2"/>
               <w:sz w:val="24"/>
               <w:szCs w:val="24"/>
-              <w:lang/>
               <w14:ligatures w14:val="standardContextual"/>
             </w:rPr>
           </w:pPr>
@@ -66,7 +65,7 @@
             </w:rPr>
             <w:fldChar w:fldCharType="separate"/>
           </w:r>
-          <w:hyperlink w:anchor="_Toc199063411" w:history="1">
+          <w:hyperlink w:anchor="_Toc199088375" w:history="1">
             <w:r>
               <w:rPr>
                 <w:rStyle w:val="Hyperlink"/>
@@ -81,7 +80,6 @@
                 <w:kern w:val="2"/>
                 <w:sz w:val="24"/>
                 <w:szCs w:val="24"/>
-                <w:lang/>
                 <w14:ligatures w14:val="standardContextual"/>
               </w:rPr>
               <w:tab/>
@@ -112,7 +110,7 @@
                 <w:noProof/>
                 <w:webHidden/>
               </w:rPr>
-              <w:instrText xml:space="preserve"> PAGEREF _Toc199063411 \h </w:instrText>
+              <w:instrText xml:space="preserve"> PAGEREF _Toc199088375 \h </w:instrText>
             </w:r>
             <w:r>
               <w:rPr>
@@ -146,22 +144,16 @@
         <w:p>
           <w:pPr>
             <w:pStyle w:val="TOC1"/>
-            <w:tabs>
-              <w:tab w:val="left" w:pos="1200"/>
-              <w:tab w:val="right" w:leader="dot" w:pos="9062"/>
-            </w:tabs>
-            <w:spacing w:line="276" w:lineRule="auto"/>
             <w:rPr>
               <w:rFonts w:asciiTheme="minorHAnsi" w:eastAsiaTheme="minorEastAsia" w:hAnsiTheme="minorHAnsi" w:cstheme="minorBidi"/>
               <w:noProof/>
               <w:kern w:val="2"/>
               <w:sz w:val="24"/>
               <w:szCs w:val="24"/>
-              <w:lang/>
               <w14:ligatures w14:val="standardContextual"/>
             </w:rPr>
           </w:pPr>
-          <w:hyperlink w:anchor="_Toc199063412" w:history="1">
+          <w:hyperlink w:anchor="_Toc199088376" w:history="1">
             <w:r>
               <w:rPr>
                 <w:rStyle w:val="Hyperlink"/>
@@ -176,7 +168,6 @@
                 <w:kern w:val="2"/>
                 <w:sz w:val="24"/>
                 <w:szCs w:val="24"/>
-                <w:lang/>
                 <w14:ligatures w14:val="standardContextual"/>
               </w:rPr>
               <w:tab/>
@@ -207,7 +198,7 @@
                 <w:noProof/>
                 <w:webHidden/>
               </w:rPr>
-              <w:instrText xml:space="preserve"> PAGEREF _Toc199063412 \h </w:instrText>
+              <w:instrText xml:space="preserve"> PAGEREF _Toc199088376 \h </w:instrText>
             </w:r>
             <w:r>
               <w:rPr>
@@ -243,20 +234,17 @@
             <w:pStyle w:val="TOC2"/>
             <w:tabs>
               <w:tab w:val="left" w:pos="1680"/>
-              <w:tab w:val="right" w:leader="dot" w:pos="9062"/>
             </w:tabs>
-            <w:spacing w:line="276" w:lineRule="auto"/>
             <w:rPr>
               <w:rFonts w:asciiTheme="minorHAnsi" w:eastAsiaTheme="minorEastAsia" w:hAnsiTheme="minorHAnsi" w:cstheme="minorBidi"/>
               <w:noProof/>
               <w:kern w:val="2"/>
               <w:sz w:val="24"/>
               <w:szCs w:val="24"/>
-              <w:lang/>
               <w14:ligatures w14:val="standardContextual"/>
             </w:rPr>
           </w:pPr>
-          <w:hyperlink w:anchor="_Toc199063413" w:history="1">
+          <w:hyperlink w:anchor="_Toc199088377" w:history="1">
             <w:r>
               <w:rPr>
                 <w:rStyle w:val="Hyperlink"/>
@@ -271,7 +259,6 @@
                 <w:kern w:val="2"/>
                 <w:sz w:val="24"/>
                 <w:szCs w:val="24"/>
-                <w:lang/>
                 <w14:ligatures w14:val="standardContextual"/>
               </w:rPr>
               <w:tab/>
@@ -285,15 +272,6 @@
             </w:r>
             <w:r>
               <w:rPr>
-                <w:rStyle w:val="Hyperlink"/>
-                <w:noProof/>
-                <w:vertAlign w:val="superscript"/>
-                <w:lang w:val="en-US"/>
-              </w:rPr>
-              <w:t>[2][3][4]</w:t>
-            </w:r>
-            <w:r>
-              <w:rPr>
                 <w:noProof/>
                 <w:webHidden/>
               </w:rPr>
@@ -311,7 +289,7 @@
                 <w:noProof/>
                 <w:webHidden/>
               </w:rPr>
-              <w:instrText xml:space="preserve"> PAGEREF _Toc199063413 \h </w:instrText>
+              <w:instrText xml:space="preserve"> PAGEREF _Toc199088377 \h </w:instrText>
             </w:r>
             <w:r>
               <w:rPr>
@@ -349,18 +327,16 @@
               <w:tab w:val="left" w:pos="2150"/>
               <w:tab w:val="right" w:leader="dot" w:pos="9062"/>
             </w:tabs>
-            <w:spacing w:line="276" w:lineRule="auto"/>
             <w:rPr>
               <w:rFonts w:asciiTheme="minorHAnsi" w:eastAsiaTheme="minorEastAsia" w:hAnsiTheme="minorHAnsi" w:cstheme="minorBidi"/>
               <w:noProof/>
               <w:kern w:val="2"/>
               <w:sz w:val="24"/>
               <w:szCs w:val="24"/>
-              <w:lang/>
               <w14:ligatures w14:val="standardContextual"/>
             </w:rPr>
           </w:pPr>
-          <w:hyperlink w:anchor="_Toc199063414" w:history="1">
+          <w:hyperlink w:anchor="_Toc199088378" w:history="1">
             <w:r>
               <w:rPr>
                 <w:rStyle w:val="Hyperlink"/>
@@ -375,7 +351,6 @@
                 <w:kern w:val="2"/>
                 <w:sz w:val="24"/>
                 <w:szCs w:val="24"/>
-                <w:lang/>
                 <w14:ligatures w14:val="standardContextual"/>
               </w:rPr>
               <w:tab/>
@@ -406,7 +381,7 @@
                 <w:noProof/>
                 <w:webHidden/>
               </w:rPr>
-              <w:instrText xml:space="preserve"> PAGEREF _Toc199063414 \h </w:instrText>
+              <w:instrText xml:space="preserve"> PAGEREF _Toc199088378 \h </w:instrText>
             </w:r>
             <w:r>
               <w:rPr>
@@ -444,18 +419,16 @@
               <w:tab w:val="left" w:pos="2150"/>
               <w:tab w:val="right" w:leader="dot" w:pos="9062"/>
             </w:tabs>
-            <w:spacing w:line="276" w:lineRule="auto"/>
             <w:rPr>
               <w:rFonts w:asciiTheme="minorHAnsi" w:eastAsiaTheme="minorEastAsia" w:hAnsiTheme="minorHAnsi" w:cstheme="minorBidi"/>
               <w:noProof/>
               <w:kern w:val="2"/>
               <w:sz w:val="24"/>
               <w:szCs w:val="24"/>
-              <w:lang/>
               <w14:ligatures w14:val="standardContextual"/>
             </w:rPr>
           </w:pPr>
-          <w:hyperlink w:anchor="_Toc199063415" w:history="1">
+          <w:hyperlink w:anchor="_Toc199088379" w:history="1">
             <w:r>
               <w:rPr>
                 <w:rStyle w:val="Hyperlink"/>
@@ -470,7 +443,6 @@
                 <w:kern w:val="2"/>
                 <w:sz w:val="24"/>
                 <w:szCs w:val="24"/>
-                <w:lang/>
                 <w14:ligatures w14:val="standardContextual"/>
               </w:rPr>
               <w:tab/>
@@ -501,7 +473,7 @@
                 <w:noProof/>
                 <w:webHidden/>
               </w:rPr>
-              <w:instrText xml:space="preserve"> PAGEREF _Toc199063415 \h </w:instrText>
+              <w:instrText xml:space="preserve"> PAGEREF _Toc199088379 \h </w:instrText>
             </w:r>
             <w:r>
               <w:rPr>
@@ -539,18 +511,16 @@
               <w:tab w:val="left" w:pos="2150"/>
               <w:tab w:val="right" w:leader="dot" w:pos="9062"/>
             </w:tabs>
-            <w:spacing w:line="276" w:lineRule="auto"/>
             <w:rPr>
               <w:rFonts w:asciiTheme="minorHAnsi" w:eastAsiaTheme="minorEastAsia" w:hAnsiTheme="minorHAnsi" w:cstheme="minorBidi"/>
               <w:noProof/>
               <w:kern w:val="2"/>
               <w:sz w:val="24"/>
               <w:szCs w:val="24"/>
-              <w:lang/>
               <w14:ligatures w14:val="standardContextual"/>
             </w:rPr>
           </w:pPr>
-          <w:hyperlink w:anchor="_Toc199063416" w:history="1">
+          <w:hyperlink w:anchor="_Toc199088380" w:history="1">
             <w:r>
               <w:rPr>
                 <w:rStyle w:val="Hyperlink"/>
@@ -565,7 +535,6 @@
                 <w:kern w:val="2"/>
                 <w:sz w:val="24"/>
                 <w:szCs w:val="24"/>
-                <w:lang/>
                 <w14:ligatures w14:val="standardContextual"/>
               </w:rPr>
               <w:tab/>
@@ -596,7 +565,7 @@
                 <w:noProof/>
                 <w:webHidden/>
               </w:rPr>
-              <w:instrText xml:space="preserve"> PAGEREF _Toc199063416 \h </w:instrText>
+              <w:instrText xml:space="preserve"> PAGEREF _Toc199088380 \h </w:instrText>
             </w:r>
             <w:r>
               <w:rPr>
@@ -632,20 +601,17 @@
             <w:pStyle w:val="TOC2"/>
             <w:tabs>
               <w:tab w:val="left" w:pos="1680"/>
-              <w:tab w:val="right" w:leader="dot" w:pos="9062"/>
             </w:tabs>
-            <w:spacing w:line="276" w:lineRule="auto"/>
             <w:rPr>
               <w:rFonts w:asciiTheme="minorHAnsi" w:eastAsiaTheme="minorEastAsia" w:hAnsiTheme="minorHAnsi" w:cstheme="minorBidi"/>
               <w:noProof/>
               <w:kern w:val="2"/>
               <w:sz w:val="24"/>
               <w:szCs w:val="24"/>
-              <w:lang/>
               <w14:ligatures w14:val="standardContextual"/>
             </w:rPr>
           </w:pPr>
-          <w:hyperlink w:anchor="_Toc199063417" w:history="1">
+          <w:hyperlink w:anchor="_Toc199088381" w:history="1">
             <w:r>
               <w:rPr>
                 <w:rStyle w:val="Hyperlink"/>
@@ -660,7 +626,6 @@
                 <w:kern w:val="2"/>
                 <w:sz w:val="24"/>
                 <w:szCs w:val="24"/>
-                <w:lang/>
                 <w14:ligatures w14:val="standardContextual"/>
               </w:rPr>
               <w:tab/>
@@ -674,15 +639,6 @@
             </w:r>
             <w:r>
               <w:rPr>
-                <w:rStyle w:val="Hyperlink"/>
-                <w:noProof/>
-                <w:vertAlign w:val="superscript"/>
-                <w:lang w:val="en-US"/>
-              </w:rPr>
-              <w:t>[4]</w:t>
-            </w:r>
-            <w:r>
-              <w:rPr>
                 <w:noProof/>
                 <w:webHidden/>
               </w:rPr>
@@ -700,7 +656,7 @@
                 <w:noProof/>
                 <w:webHidden/>
               </w:rPr>
-              <w:instrText xml:space="preserve"> PAGEREF _Toc199063417 \h </w:instrText>
+              <w:instrText xml:space="preserve"> PAGEREF _Toc199088381 \h </w:instrText>
             </w:r>
             <w:r>
               <w:rPr>
@@ -738,18 +694,16 @@
               <w:tab w:val="left" w:pos="2150"/>
               <w:tab w:val="right" w:leader="dot" w:pos="9062"/>
             </w:tabs>
-            <w:spacing w:line="276" w:lineRule="auto"/>
             <w:rPr>
               <w:rFonts w:asciiTheme="minorHAnsi" w:eastAsiaTheme="minorEastAsia" w:hAnsiTheme="minorHAnsi" w:cstheme="minorBidi"/>
               <w:noProof/>
               <w:kern w:val="2"/>
               <w:sz w:val="24"/>
               <w:szCs w:val="24"/>
-              <w:lang/>
               <w14:ligatures w14:val="standardContextual"/>
             </w:rPr>
           </w:pPr>
-          <w:hyperlink w:anchor="_Toc199063418" w:history="1">
+          <w:hyperlink w:anchor="_Toc199088382" w:history="1">
             <w:r>
               <w:rPr>
                 <w:rStyle w:val="Hyperlink"/>
@@ -764,7 +718,6 @@
                 <w:kern w:val="2"/>
                 <w:sz w:val="24"/>
                 <w:szCs w:val="24"/>
-                <w:lang/>
                 <w14:ligatures w14:val="standardContextual"/>
               </w:rPr>
               <w:tab/>
@@ -795,7 +748,7 @@
                 <w:noProof/>
                 <w:webHidden/>
               </w:rPr>
-              <w:instrText xml:space="preserve"> PAGEREF _Toc199063418 \h </w:instrText>
+              <w:instrText xml:space="preserve"> PAGEREF _Toc199088382 \h </w:instrText>
             </w:r>
             <w:r>
               <w:rPr>
@@ -833,18 +786,16 @@
               <w:tab w:val="left" w:pos="2150"/>
               <w:tab w:val="right" w:leader="dot" w:pos="9062"/>
             </w:tabs>
-            <w:spacing w:line="276" w:lineRule="auto"/>
             <w:rPr>
               <w:rFonts w:asciiTheme="minorHAnsi" w:eastAsiaTheme="minorEastAsia" w:hAnsiTheme="minorHAnsi" w:cstheme="minorBidi"/>
               <w:noProof/>
               <w:kern w:val="2"/>
               <w:sz w:val="24"/>
               <w:szCs w:val="24"/>
-              <w:lang/>
               <w14:ligatures w14:val="standardContextual"/>
             </w:rPr>
           </w:pPr>
-          <w:hyperlink w:anchor="_Toc199063419" w:history="1">
+          <w:hyperlink w:anchor="_Toc199088383" w:history="1">
             <w:r>
               <w:rPr>
                 <w:rStyle w:val="Hyperlink"/>
@@ -859,7 +810,6 @@
                 <w:kern w:val="2"/>
                 <w:sz w:val="24"/>
                 <w:szCs w:val="24"/>
-                <w:lang/>
                 <w14:ligatures w14:val="standardContextual"/>
               </w:rPr>
               <w:tab/>
@@ -890,7 +840,7 @@
                 <w:noProof/>
                 <w:webHidden/>
               </w:rPr>
-              <w:instrText xml:space="preserve"> PAGEREF _Toc199063419 \h </w:instrText>
+              <w:instrText xml:space="preserve"> PAGEREF _Toc199088383 \h </w:instrText>
             </w:r>
             <w:r>
               <w:rPr>
@@ -928,18 +878,16 @@
               <w:tab w:val="left" w:pos="2150"/>
               <w:tab w:val="right" w:leader="dot" w:pos="9062"/>
             </w:tabs>
-            <w:spacing w:line="276" w:lineRule="auto"/>
             <w:rPr>
               <w:rFonts w:asciiTheme="minorHAnsi" w:eastAsiaTheme="minorEastAsia" w:hAnsiTheme="minorHAnsi" w:cstheme="minorBidi"/>
               <w:noProof/>
               <w:kern w:val="2"/>
               <w:sz w:val="24"/>
               <w:szCs w:val="24"/>
-              <w:lang/>
               <w14:ligatures w14:val="standardContextual"/>
             </w:rPr>
           </w:pPr>
-          <w:hyperlink w:anchor="_Toc199063420" w:history="1">
+          <w:hyperlink w:anchor="_Toc199088384" w:history="1">
             <w:r>
               <w:rPr>
                 <w:rStyle w:val="Hyperlink"/>
@@ -954,7 +902,6 @@
                 <w:kern w:val="2"/>
                 <w:sz w:val="24"/>
                 <w:szCs w:val="24"/>
-                <w:lang/>
                 <w14:ligatures w14:val="standardContextual"/>
               </w:rPr>
               <w:tab/>
@@ -993,7 +940,7 @@
                 <w:noProof/>
                 <w:webHidden/>
               </w:rPr>
-              <w:instrText xml:space="preserve"> PAGEREF _Toc199063420 \h </w:instrText>
+              <w:instrText xml:space="preserve"> PAGEREF _Toc199088384 \h </w:instrText>
             </w:r>
             <w:r>
               <w:rPr>
@@ -1031,18 +978,16 @@
               <w:tab w:val="left" w:pos="2150"/>
               <w:tab w:val="right" w:leader="dot" w:pos="9062"/>
             </w:tabs>
-            <w:spacing w:line="276" w:lineRule="auto"/>
             <w:rPr>
               <w:rFonts w:asciiTheme="minorHAnsi" w:eastAsiaTheme="minorEastAsia" w:hAnsiTheme="minorHAnsi" w:cstheme="minorBidi"/>
               <w:noProof/>
               <w:kern w:val="2"/>
               <w:sz w:val="24"/>
               <w:szCs w:val="24"/>
-              <w:lang/>
               <w14:ligatures w14:val="standardContextual"/>
             </w:rPr>
           </w:pPr>
-          <w:hyperlink w:anchor="_Toc199063421" w:history="1">
+          <w:hyperlink w:anchor="_Toc199088385" w:history="1">
             <w:r>
               <w:rPr>
                 <w:rStyle w:val="Hyperlink"/>
@@ -1057,7 +1002,6 @@
                 <w:kern w:val="2"/>
                 <w:sz w:val="24"/>
                 <w:szCs w:val="24"/>
-                <w:lang/>
                 <w14:ligatures w14:val="standardContextual"/>
               </w:rPr>
               <w:tab/>
@@ -1088,7 +1032,7 @@
                 <w:noProof/>
                 <w:webHidden/>
               </w:rPr>
-              <w:instrText xml:space="preserve"> PAGEREF _Toc199063421 \h </w:instrText>
+              <w:instrText xml:space="preserve"> PAGEREF _Toc199088385 \h </w:instrText>
             </w:r>
             <w:r>
               <w:rPr>
@@ -1124,20 +1068,17 @@
             <w:pStyle w:val="TOC2"/>
             <w:tabs>
               <w:tab w:val="left" w:pos="1680"/>
-              <w:tab w:val="right" w:leader="dot" w:pos="9062"/>
             </w:tabs>
-            <w:spacing w:line="276" w:lineRule="auto"/>
             <w:rPr>
               <w:rFonts w:asciiTheme="minorHAnsi" w:eastAsiaTheme="minorEastAsia" w:hAnsiTheme="minorHAnsi" w:cstheme="minorBidi"/>
               <w:noProof/>
               <w:kern w:val="2"/>
               <w:sz w:val="24"/>
               <w:szCs w:val="24"/>
-              <w:lang/>
               <w14:ligatures w14:val="standardContextual"/>
             </w:rPr>
           </w:pPr>
-          <w:hyperlink w:anchor="_Toc199063422" w:history="1">
+          <w:hyperlink w:anchor="_Toc199088386" w:history="1">
             <w:r>
               <w:rPr>
                 <w:rStyle w:val="Hyperlink"/>
@@ -1153,7 +1094,6 @@
                 <w:kern w:val="2"/>
                 <w:sz w:val="24"/>
                 <w:szCs w:val="24"/>
-                <w:lang/>
                 <w14:ligatures w14:val="standardContextual"/>
               </w:rPr>
               <w:tab/>
@@ -1184,7 +1124,7 @@
                 <w:noProof/>
                 <w:webHidden/>
               </w:rPr>
-              <w:instrText xml:space="preserve"> PAGEREF _Toc199063422 \h </w:instrText>
+              <w:instrText xml:space="preserve"> PAGEREF _Toc199088386 \h </w:instrText>
             </w:r>
             <w:r>
               <w:rPr>
@@ -1205,6 +1145,442 @@
                 <w:webHidden/>
               </w:rPr>
               <w:t>15</w:t>
+            </w:r>
+            <w:r>
+              <w:rPr>
+                <w:noProof/>
+                <w:webHidden/>
+              </w:rPr>
+              <w:fldChar w:fldCharType="end"/>
+            </w:r>
+          </w:hyperlink>
+        </w:p>
+        <w:p>
+          <w:pPr>
+            <w:pStyle w:val="TOC3"/>
+            <w:tabs>
+              <w:tab w:val="left" w:pos="2150"/>
+              <w:tab w:val="right" w:leader="dot" w:pos="9062"/>
+            </w:tabs>
+            <w:rPr>
+              <w:rFonts w:asciiTheme="minorHAnsi" w:eastAsiaTheme="minorEastAsia" w:hAnsiTheme="minorHAnsi" w:cstheme="minorBidi"/>
+              <w:noProof/>
+              <w:kern w:val="2"/>
+              <w:sz w:val="24"/>
+              <w:szCs w:val="24"/>
+              <w14:ligatures w14:val="standardContextual"/>
+            </w:rPr>
+          </w:pPr>
+          <w:hyperlink w:anchor="_Toc199088387" w:history="1">
+            <w:r>
+              <w:rPr>
+                <w:rStyle w:val="Hyperlink"/>
+                <w:noProof/>
+                <w:lang w:val="en-US"/>
+              </w:rPr>
+              <w:t>2.3.1.</w:t>
+            </w:r>
+            <w:r>
+              <w:rPr>
+                <w:rFonts w:asciiTheme="minorHAnsi" w:eastAsiaTheme="minorEastAsia" w:hAnsiTheme="minorHAnsi" w:cstheme="minorBidi"/>
+                <w:noProof/>
+                <w:kern w:val="2"/>
+                <w:sz w:val="24"/>
+                <w:szCs w:val="24"/>
+                <w14:ligatures w14:val="standardContextual"/>
+              </w:rPr>
+              <w:tab/>
+            </w:r>
+            <w:r>
+              <w:rPr>
+                <w:rStyle w:val="Hyperlink"/>
+                <w:noProof/>
+                <w:lang w:val="en-US"/>
+              </w:rPr>
+              <w:t xml:space="preserve">MCT8329A </w:t>
+            </w:r>
+            <w:r>
+              <w:rPr>
+                <w:rStyle w:val="Hyperlink"/>
+                <w:noProof/>
+              </w:rPr>
+              <w:t>(</w:t>
+            </w:r>
+            <w:r>
+              <w:rPr>
+                <w:rStyle w:val="Hyperlink"/>
+                <w:noProof/>
+                <w:lang w:val="en-US"/>
+              </w:rPr>
+              <w:t>Texas Instruments)</w:t>
+            </w:r>
+            <w:r>
+              <w:rPr>
+                <w:noProof/>
+                <w:webHidden/>
+              </w:rPr>
+              <w:tab/>
+            </w:r>
+            <w:r>
+              <w:rPr>
+                <w:noProof/>
+                <w:webHidden/>
+              </w:rPr>
+              <w:fldChar w:fldCharType="begin"/>
+            </w:r>
+            <w:r>
+              <w:rPr>
+                <w:noProof/>
+                <w:webHidden/>
+              </w:rPr>
+              <w:instrText xml:space="preserve"> PAGEREF _Toc199088387 \h </w:instrText>
+            </w:r>
+            <w:r>
+              <w:rPr>
+                <w:noProof/>
+                <w:webHidden/>
+              </w:rPr>
+            </w:r>
+            <w:r>
+              <w:rPr>
+                <w:noProof/>
+                <w:webHidden/>
+              </w:rPr>
+              <w:fldChar w:fldCharType="separate"/>
+            </w:r>
+            <w:r>
+              <w:rPr>
+                <w:noProof/>
+                <w:webHidden/>
+              </w:rPr>
+              <w:t>16</w:t>
+            </w:r>
+            <w:r>
+              <w:rPr>
+                <w:noProof/>
+                <w:webHidden/>
+              </w:rPr>
+              <w:fldChar w:fldCharType="end"/>
+            </w:r>
+          </w:hyperlink>
+        </w:p>
+        <w:p>
+          <w:pPr>
+            <w:pStyle w:val="TOC3"/>
+            <w:tabs>
+              <w:tab w:val="left" w:pos="2150"/>
+              <w:tab w:val="right" w:leader="dot" w:pos="9062"/>
+            </w:tabs>
+            <w:rPr>
+              <w:rFonts w:asciiTheme="minorHAnsi" w:eastAsiaTheme="minorEastAsia" w:hAnsiTheme="minorHAnsi" w:cstheme="minorBidi"/>
+              <w:noProof/>
+              <w:kern w:val="2"/>
+              <w:sz w:val="24"/>
+              <w:szCs w:val="24"/>
+              <w14:ligatures w14:val="standardContextual"/>
+            </w:rPr>
+          </w:pPr>
+          <w:hyperlink w:anchor="_Toc199088388" w:history="1">
+            <w:r>
+              <w:rPr>
+                <w:rStyle w:val="Hyperlink"/>
+                <w:noProof/>
+                <w:lang w:val="en-US"/>
+              </w:rPr>
+              <w:t>2.3.2.</w:t>
+            </w:r>
+            <w:r>
+              <w:rPr>
+                <w:rFonts w:asciiTheme="minorHAnsi" w:eastAsiaTheme="minorEastAsia" w:hAnsiTheme="minorHAnsi" w:cstheme="minorBidi"/>
+                <w:noProof/>
+                <w:kern w:val="2"/>
+                <w:sz w:val="24"/>
+                <w:szCs w:val="24"/>
+                <w14:ligatures w14:val="standardContextual"/>
+              </w:rPr>
+              <w:tab/>
+            </w:r>
+            <w:r>
+              <w:rPr>
+                <w:rStyle w:val="Hyperlink"/>
+                <w:noProof/>
+                <w:lang w:val="en-US"/>
+              </w:rPr>
+              <w:t xml:space="preserve">A89306 </w:t>
+            </w:r>
+            <w:r>
+              <w:rPr>
+                <w:rStyle w:val="Hyperlink"/>
+                <w:noProof/>
+              </w:rPr>
+              <w:t>(</w:t>
+            </w:r>
+            <w:r>
+              <w:rPr>
+                <w:rStyle w:val="Hyperlink"/>
+                <w:noProof/>
+                <w:lang w:val="en-US"/>
+              </w:rPr>
+              <w:t>Allegro)</w:t>
+            </w:r>
+            <w:r>
+              <w:rPr>
+                <w:noProof/>
+                <w:webHidden/>
+              </w:rPr>
+              <w:tab/>
+            </w:r>
+            <w:r>
+              <w:rPr>
+                <w:noProof/>
+                <w:webHidden/>
+              </w:rPr>
+              <w:fldChar w:fldCharType="begin"/>
+            </w:r>
+            <w:r>
+              <w:rPr>
+                <w:noProof/>
+                <w:webHidden/>
+              </w:rPr>
+              <w:instrText xml:space="preserve"> PAGEREF _Toc199088388 \h </w:instrText>
+            </w:r>
+            <w:r>
+              <w:rPr>
+                <w:noProof/>
+                <w:webHidden/>
+              </w:rPr>
+            </w:r>
+            <w:r>
+              <w:rPr>
+                <w:noProof/>
+                <w:webHidden/>
+              </w:rPr>
+              <w:fldChar w:fldCharType="separate"/>
+            </w:r>
+            <w:r>
+              <w:rPr>
+                <w:noProof/>
+                <w:webHidden/>
+              </w:rPr>
+              <w:t>17</w:t>
+            </w:r>
+            <w:r>
+              <w:rPr>
+                <w:noProof/>
+                <w:webHidden/>
+              </w:rPr>
+              <w:fldChar w:fldCharType="end"/>
+            </w:r>
+          </w:hyperlink>
+        </w:p>
+        <w:p>
+          <w:pPr>
+            <w:pStyle w:val="TOC3"/>
+            <w:tabs>
+              <w:tab w:val="left" w:pos="2150"/>
+              <w:tab w:val="right" w:leader="dot" w:pos="9062"/>
+            </w:tabs>
+            <w:rPr>
+              <w:rFonts w:asciiTheme="minorHAnsi" w:eastAsiaTheme="minorEastAsia" w:hAnsiTheme="minorHAnsi" w:cstheme="minorBidi"/>
+              <w:noProof/>
+              <w:kern w:val="2"/>
+              <w:sz w:val="24"/>
+              <w:szCs w:val="24"/>
+              <w14:ligatures w14:val="standardContextual"/>
+            </w:rPr>
+          </w:pPr>
+          <w:hyperlink w:anchor="_Toc199088389" w:history="1">
+            <w:r>
+              <w:rPr>
+                <w:rStyle w:val="Hyperlink"/>
+                <w:noProof/>
+                <w:lang w:val="en-US"/>
+              </w:rPr>
+              <w:t>2.3.3.</w:t>
+            </w:r>
+            <w:r>
+              <w:rPr>
+                <w:rFonts w:asciiTheme="minorHAnsi" w:eastAsiaTheme="minorEastAsia" w:hAnsiTheme="minorHAnsi" w:cstheme="minorBidi"/>
+                <w:noProof/>
+                <w:kern w:val="2"/>
+                <w:sz w:val="24"/>
+                <w:szCs w:val="24"/>
+                <w14:ligatures w14:val="standardContextual"/>
+              </w:rPr>
+              <w:tab/>
+            </w:r>
+            <w:r>
+              <w:rPr>
+                <w:rStyle w:val="Hyperlink"/>
+                <w:noProof/>
+                <w:lang w:val="en-US"/>
+              </w:rPr>
+              <w:t xml:space="preserve">STSPIN32G0B1 </w:t>
+            </w:r>
+            <w:r>
+              <w:rPr>
+                <w:rStyle w:val="Hyperlink"/>
+                <w:noProof/>
+              </w:rPr>
+              <w:t>(</w:t>
+            </w:r>
+            <w:r>
+              <w:rPr>
+                <w:rStyle w:val="Hyperlink"/>
+                <w:noProof/>
+                <w:lang w:val="en-US"/>
+              </w:rPr>
+              <w:t>STMicroelectronics)</w:t>
+            </w:r>
+            <w:r>
+              <w:rPr>
+                <w:noProof/>
+                <w:webHidden/>
+              </w:rPr>
+              <w:tab/>
+            </w:r>
+            <w:r>
+              <w:rPr>
+                <w:noProof/>
+                <w:webHidden/>
+              </w:rPr>
+              <w:fldChar w:fldCharType="begin"/>
+            </w:r>
+            <w:r>
+              <w:rPr>
+                <w:noProof/>
+                <w:webHidden/>
+              </w:rPr>
+              <w:instrText xml:space="preserve"> PAGEREF _Toc199088389 \h </w:instrText>
+            </w:r>
+            <w:r>
+              <w:rPr>
+                <w:noProof/>
+                <w:webHidden/>
+              </w:rPr>
+            </w:r>
+            <w:r>
+              <w:rPr>
+                <w:noProof/>
+                <w:webHidden/>
+              </w:rPr>
+              <w:fldChar w:fldCharType="separate"/>
+            </w:r>
+            <w:r>
+              <w:rPr>
+                <w:noProof/>
+                <w:webHidden/>
+              </w:rPr>
+              <w:t>18</w:t>
+            </w:r>
+            <w:r>
+              <w:rPr>
+                <w:noProof/>
+                <w:webHidden/>
+              </w:rPr>
+              <w:fldChar w:fldCharType="end"/>
+            </w:r>
+          </w:hyperlink>
+        </w:p>
+        <w:p>
+          <w:pPr>
+            <w:pStyle w:val="TOC3"/>
+            <w:tabs>
+              <w:tab w:val="left" w:pos="2150"/>
+              <w:tab w:val="right" w:leader="dot" w:pos="9062"/>
+            </w:tabs>
+            <w:rPr>
+              <w:rFonts w:asciiTheme="minorHAnsi" w:eastAsiaTheme="minorEastAsia" w:hAnsiTheme="minorHAnsi" w:cstheme="minorBidi"/>
+              <w:noProof/>
+              <w:kern w:val="2"/>
+              <w:sz w:val="24"/>
+              <w:szCs w:val="24"/>
+              <w14:ligatures w14:val="standardContextual"/>
+            </w:rPr>
+          </w:pPr>
+          <w:hyperlink w:anchor="_Toc199088390" w:history="1">
+            <w:r>
+              <w:rPr>
+                <w:rStyle w:val="Hyperlink"/>
+                <w:noProof/>
+                <w:lang w:val="en-US"/>
+              </w:rPr>
+              <w:t>2.3.4.</w:t>
+            </w:r>
+            <w:r>
+              <w:rPr>
+                <w:rFonts w:asciiTheme="minorHAnsi" w:eastAsiaTheme="minorEastAsia" w:hAnsiTheme="minorHAnsi" w:cstheme="minorBidi"/>
+                <w:noProof/>
+                <w:kern w:val="2"/>
+                <w:sz w:val="24"/>
+                <w:szCs w:val="24"/>
+                <w14:ligatures w14:val="standardContextual"/>
+              </w:rPr>
+              <w:tab/>
+            </w:r>
+            <w:r>
+              <w:rPr>
+                <w:rStyle w:val="Hyperlink"/>
+                <w:noProof/>
+                <w:lang w:val="en-US"/>
+              </w:rPr>
+              <w:t xml:space="preserve">IMD111T </w:t>
+            </w:r>
+            <w:r>
+              <w:rPr>
+                <w:rStyle w:val="Hyperlink"/>
+                <w:noProof/>
+              </w:rPr>
+              <w:t>(</w:t>
+            </w:r>
+            <w:r>
+              <w:rPr>
+                <w:rStyle w:val="Hyperlink"/>
+                <w:noProof/>
+                <w:lang w:val="en-US"/>
+              </w:rPr>
+              <w:t>Infineon)</w:t>
+            </w:r>
+            <w:r>
+              <w:rPr>
+                <w:noProof/>
+                <w:webHidden/>
+              </w:rPr>
+              <w:tab/>
+            </w:r>
+            <w:r>
+              <w:rPr>
+                <w:noProof/>
+                <w:webHidden/>
+              </w:rPr>
+              <w:fldChar w:fldCharType="begin"/>
+            </w:r>
+            <w:r>
+              <w:rPr>
+                <w:noProof/>
+                <w:webHidden/>
+              </w:rPr>
+              <w:instrText xml:space="preserve"> PAGEREF _Toc199088390 \h </w:instrText>
+            </w:r>
+            <w:r>
+              <w:rPr>
+                <w:noProof/>
+                <w:webHidden/>
+              </w:rPr>
+            </w:r>
+            <w:r>
+              <w:rPr>
+                <w:noProof/>
+                <w:webHidden/>
+              </w:rPr>
+              <w:fldChar w:fldCharType="separate"/>
+            </w:r>
+            <w:r>
+              <w:rPr>
+                <w:noProof/>
+                <w:webHidden/>
+              </w:rPr>
+              <w:t>19</w:t>
             </w:r>
             <w:r>
               <w:rPr>
@@ -1220,20 +1596,17 @@
             <w:pStyle w:val="TOC2"/>
             <w:tabs>
               <w:tab w:val="left" w:pos="1680"/>
-              <w:tab w:val="right" w:leader="dot" w:pos="9062"/>
             </w:tabs>
-            <w:spacing w:line="276" w:lineRule="auto"/>
             <w:rPr>
               <w:rFonts w:asciiTheme="minorHAnsi" w:eastAsiaTheme="minorEastAsia" w:hAnsiTheme="minorHAnsi" w:cstheme="minorBidi"/>
               <w:noProof/>
               <w:kern w:val="2"/>
               <w:sz w:val="24"/>
               <w:szCs w:val="24"/>
-              <w:lang/>
               <w14:ligatures w14:val="standardContextual"/>
             </w:rPr>
           </w:pPr>
-          <w:hyperlink w:anchor="_Toc199063423" w:history="1">
+          <w:hyperlink w:anchor="_Toc199088391" w:history="1">
             <w:r>
               <w:rPr>
                 <w:rStyle w:val="Hyperlink"/>
@@ -1248,7 +1621,6 @@
                 <w:kern w:val="2"/>
                 <w:sz w:val="24"/>
                 <w:szCs w:val="24"/>
-                <w:lang/>
                 <w14:ligatures w14:val="standardContextual"/>
               </w:rPr>
               <w:tab/>
@@ -1258,7 +1630,7 @@
                 <w:rStyle w:val="Hyperlink"/>
                 <w:noProof/>
               </w:rPr>
-              <w:t>Превключване на постояннотоково захранване и управление на пусковия ток</w:t>
+              <w:t>Съществуващи решения</w:t>
             </w:r>
             <w:r>
               <w:rPr>
@@ -1279,7 +1651,7 @@
                 <w:noProof/>
                 <w:webHidden/>
               </w:rPr>
-              <w:instrText xml:space="preserve"> PAGEREF _Toc199063423 \h </w:instrText>
+              <w:instrText xml:space="preserve"> PAGEREF _Toc199088391 \h </w:instrText>
             </w:r>
             <w:r>
               <w:rPr>
@@ -1299,7 +1671,7 @@
                 <w:noProof/>
                 <w:webHidden/>
               </w:rPr>
-              <w:t>15</w:t>
+              <w:t>21</w:t>
             </w:r>
             <w:r>
               <w:rPr>
@@ -1315,20 +1687,17 @@
             <w:pStyle w:val="TOC2"/>
             <w:tabs>
               <w:tab w:val="left" w:pos="1680"/>
-              <w:tab w:val="right" w:leader="dot" w:pos="9062"/>
             </w:tabs>
-            <w:spacing w:line="276" w:lineRule="auto"/>
             <w:rPr>
               <w:rFonts w:asciiTheme="minorHAnsi" w:eastAsiaTheme="minorEastAsia" w:hAnsiTheme="minorHAnsi" w:cstheme="minorBidi"/>
               <w:noProof/>
               <w:kern w:val="2"/>
               <w:sz w:val="24"/>
               <w:szCs w:val="24"/>
-              <w:lang/>
               <w14:ligatures w14:val="standardContextual"/>
             </w:rPr>
           </w:pPr>
-          <w:hyperlink w:anchor="_Toc199063424" w:history="1">
+          <w:hyperlink w:anchor="_Toc199088392" w:history="1">
             <w:r>
               <w:rPr>
                 <w:rStyle w:val="Hyperlink"/>
@@ -1343,7 +1712,6 @@
                 <w:kern w:val="2"/>
                 <w:sz w:val="24"/>
                 <w:szCs w:val="24"/>
-                <w:lang/>
                 <w14:ligatures w14:val="standardContextual"/>
               </w:rPr>
               <w:tab/>
@@ -1353,7 +1721,7 @@
                 <w:rStyle w:val="Hyperlink"/>
                 <w:noProof/>
               </w:rPr>
-              <w:t>Съществуващи решения</w:t>
+              <w:t>Заключение</w:t>
             </w:r>
             <w:r>
               <w:rPr>
@@ -1374,7 +1742,7 @@
                 <w:noProof/>
                 <w:webHidden/>
               </w:rPr>
-              <w:instrText xml:space="preserve"> PAGEREF _Toc199063424 \h </w:instrText>
+              <w:instrText xml:space="preserve"> PAGEREF _Toc199088392 \h </w:instrText>
             </w:r>
             <w:r>
               <w:rPr>
@@ -1394,7 +1762,95 @@
                 <w:noProof/>
                 <w:webHidden/>
               </w:rPr>
-              <w:t>16</w:t>
+              <w:t>23</w:t>
+            </w:r>
+            <w:r>
+              <w:rPr>
+                <w:noProof/>
+                <w:webHidden/>
+              </w:rPr>
+              <w:fldChar w:fldCharType="end"/>
+            </w:r>
+          </w:hyperlink>
+        </w:p>
+        <w:p>
+          <w:pPr>
+            <w:pStyle w:val="TOC1"/>
+            <w:rPr>
+              <w:rFonts w:asciiTheme="minorHAnsi" w:eastAsiaTheme="minorEastAsia" w:hAnsiTheme="minorHAnsi" w:cstheme="minorBidi"/>
+              <w:noProof/>
+              <w:kern w:val="2"/>
+              <w:sz w:val="24"/>
+              <w:szCs w:val="24"/>
+              <w14:ligatures w14:val="standardContextual"/>
+            </w:rPr>
+          </w:pPr>
+          <w:hyperlink w:anchor="_Toc199088393" w:history="1">
+            <w:r>
+              <w:rPr>
+                <w:rStyle w:val="Hyperlink"/>
+                <w:noProof/>
+              </w:rPr>
+              <w:t>3.</w:t>
+            </w:r>
+            <w:r>
+              <w:rPr>
+                <w:rFonts w:asciiTheme="minorHAnsi" w:eastAsiaTheme="minorEastAsia" w:hAnsiTheme="minorHAnsi" w:cstheme="minorBidi"/>
+                <w:noProof/>
+                <w:kern w:val="2"/>
+                <w:sz w:val="24"/>
+                <w:szCs w:val="24"/>
+                <w14:ligatures w14:val="standardContextual"/>
+              </w:rPr>
+              <w:tab/>
+            </w:r>
+            <w:r>
+              <w:rPr>
+                <w:rStyle w:val="Hyperlink"/>
+                <w:noProof/>
+              </w:rPr>
+              <w:t>Техническо задание</w:t>
+            </w:r>
+            <w:r>
+              <w:rPr>
+                <w:noProof/>
+                <w:webHidden/>
+              </w:rPr>
+              <w:tab/>
+            </w:r>
+            <w:r>
+              <w:rPr>
+                <w:noProof/>
+                <w:webHidden/>
+              </w:rPr>
+              <w:fldChar w:fldCharType="begin"/>
+            </w:r>
+            <w:r>
+              <w:rPr>
+                <w:noProof/>
+                <w:webHidden/>
+              </w:rPr>
+              <w:instrText xml:space="preserve"> PAGEREF _Toc199088393 \h </w:instrText>
+            </w:r>
+            <w:r>
+              <w:rPr>
+                <w:noProof/>
+                <w:webHidden/>
+              </w:rPr>
+            </w:r>
+            <w:r>
+              <w:rPr>
+                <w:noProof/>
+                <w:webHidden/>
+              </w:rPr>
+              <w:fldChar w:fldCharType="separate"/>
+            </w:r>
+            <w:r>
+              <w:rPr>
+                <w:noProof/>
+                <w:webHidden/>
+              </w:rPr>
+              <w:t>23</w:t>
             </w:r>
             <w:r>
               <w:rPr>
@@ -1410,26 +1866,23 @@
             <w:pStyle w:val="TOC2"/>
             <w:tabs>
               <w:tab w:val="left" w:pos="1680"/>
-              <w:tab w:val="right" w:leader="dot" w:pos="9062"/>
             </w:tabs>
-            <w:spacing w:line="276" w:lineRule="auto"/>
             <w:rPr>
               <w:rFonts w:asciiTheme="minorHAnsi" w:eastAsiaTheme="minorEastAsia" w:hAnsiTheme="minorHAnsi" w:cstheme="minorBidi"/>
               <w:noProof/>
               <w:kern w:val="2"/>
               <w:sz w:val="24"/>
               <w:szCs w:val="24"/>
-              <w:lang/>
               <w14:ligatures w14:val="standardContextual"/>
             </w:rPr>
           </w:pPr>
-          <w:hyperlink w:anchor="_Toc199063425" w:history="1">
+          <w:hyperlink w:anchor="_Toc199088394" w:history="1">
             <w:r>
               <w:rPr>
                 <w:rStyle w:val="Hyperlink"/>
                 <w:noProof/>
               </w:rPr>
-              <w:t>2.6.</w:t>
+              <w:t>3.1.</w:t>
             </w:r>
             <w:r>
               <w:rPr>
@@ -1438,7 +1891,6 @@
                 <w:kern w:val="2"/>
                 <w:sz w:val="24"/>
                 <w:szCs w:val="24"/>
-                <w:lang/>
                 <w14:ligatures w14:val="standardContextual"/>
               </w:rPr>
               <w:tab/>
@@ -1448,7 +1900,7 @@
                 <w:rStyle w:val="Hyperlink"/>
                 <w:noProof/>
               </w:rPr>
-              <w:t>Заключение:</w:t>
+              <w:t>Цел и предназначение</w:t>
             </w:r>
             <w:r>
               <w:rPr>
@@ -1469,7 +1921,7 @@
                 <w:noProof/>
                 <w:webHidden/>
               </w:rPr>
-              <w:instrText xml:space="preserve"> PAGEREF _Toc199063425 \h </w:instrText>
+              <w:instrText xml:space="preserve"> PAGEREF _Toc199088394 \h </w:instrText>
             </w:r>
             <w:r>
               <w:rPr>
@@ -1489,102 +1941,7 @@
                 <w:noProof/>
                 <w:webHidden/>
               </w:rPr>
-              <w:t>16</w:t>
-            </w:r>
-            <w:r>
-              <w:rPr>
-                <w:noProof/>
-                <w:webHidden/>
-              </w:rPr>
-              <w:fldChar w:fldCharType="end"/>
-            </w:r>
-          </w:hyperlink>
-        </w:p>
-        <w:p>
-          <w:pPr>
-            <w:pStyle w:val="TOC1"/>
-            <w:tabs>
-              <w:tab w:val="left" w:pos="1200"/>
-              <w:tab w:val="right" w:leader="dot" w:pos="9062"/>
-            </w:tabs>
-            <w:spacing w:line="276" w:lineRule="auto"/>
-            <w:rPr>
-              <w:rFonts w:asciiTheme="minorHAnsi" w:eastAsiaTheme="minorEastAsia" w:hAnsiTheme="minorHAnsi" w:cstheme="minorBidi"/>
-              <w:noProof/>
-              <w:kern w:val="2"/>
-              <w:sz w:val="24"/>
-              <w:szCs w:val="24"/>
-              <w:lang/>
-              <w14:ligatures w14:val="standardContextual"/>
-            </w:rPr>
-          </w:pPr>
-          <w:hyperlink w:anchor="_Toc199063426" w:history="1">
-            <w:r>
-              <w:rPr>
-                <w:rStyle w:val="Hyperlink"/>
-                <w:noProof/>
-              </w:rPr>
-              <w:t>3.</w:t>
-            </w:r>
-            <w:r>
-              <w:rPr>
-                <w:rFonts w:asciiTheme="minorHAnsi" w:eastAsiaTheme="minorEastAsia" w:hAnsiTheme="minorHAnsi" w:cstheme="minorBidi"/>
-                <w:noProof/>
-                <w:kern w:val="2"/>
-                <w:sz w:val="24"/>
-                <w:szCs w:val="24"/>
-                <w:lang/>
-                <w14:ligatures w14:val="standardContextual"/>
-              </w:rPr>
-              <w:tab/>
-            </w:r>
-            <w:r>
-              <w:rPr>
-                <w:rStyle w:val="Hyperlink"/>
-                <w:noProof/>
-              </w:rPr>
-              <w:t>Техническо задание</w:t>
-            </w:r>
-            <w:r>
-              <w:rPr>
-                <w:noProof/>
-                <w:webHidden/>
-              </w:rPr>
-              <w:tab/>
-            </w:r>
-            <w:r>
-              <w:rPr>
-                <w:noProof/>
-                <w:webHidden/>
-              </w:rPr>
-              <w:fldChar w:fldCharType="begin"/>
-            </w:r>
-            <w:r>
-              <w:rPr>
-                <w:noProof/>
-                <w:webHidden/>
-              </w:rPr>
-              <w:instrText xml:space="preserve"> PAGEREF _Toc199063426 \h </w:instrText>
-            </w:r>
-            <w:r>
-              <w:rPr>
-                <w:noProof/>
-                <w:webHidden/>
-              </w:rPr>
-            </w:r>
-            <w:r>
-              <w:rPr>
-                <w:noProof/>
-                <w:webHidden/>
-              </w:rPr>
-              <w:fldChar w:fldCharType="separate"/>
-            </w:r>
-            <w:r>
-              <w:rPr>
-                <w:noProof/>
-                <w:webHidden/>
-              </w:rPr>
-              <w:t>16</w:t>
+              <w:t>23</w:t>
             </w:r>
             <w:r>
               <w:rPr>
@@ -1600,26 +1957,23 @@
             <w:pStyle w:val="TOC2"/>
             <w:tabs>
               <w:tab w:val="left" w:pos="1680"/>
-              <w:tab w:val="right" w:leader="dot" w:pos="9062"/>
             </w:tabs>
-            <w:spacing w:line="276" w:lineRule="auto"/>
             <w:rPr>
               <w:rFonts w:asciiTheme="minorHAnsi" w:eastAsiaTheme="minorEastAsia" w:hAnsiTheme="minorHAnsi" w:cstheme="minorBidi"/>
               <w:noProof/>
               <w:kern w:val="2"/>
               <w:sz w:val="24"/>
               <w:szCs w:val="24"/>
-              <w:lang/>
               <w14:ligatures w14:val="standardContextual"/>
             </w:rPr>
           </w:pPr>
-          <w:hyperlink w:anchor="_Toc199063427" w:history="1">
+          <w:hyperlink w:anchor="_Toc199088395" w:history="1">
             <w:r>
               <w:rPr>
                 <w:rStyle w:val="Hyperlink"/>
                 <w:noProof/>
               </w:rPr>
-              <w:t>3.1.</w:t>
+              <w:t>3.2.</w:t>
             </w:r>
             <w:r>
               <w:rPr>
@@ -1628,7 +1982,6 @@
                 <w:kern w:val="2"/>
                 <w:sz w:val="24"/>
                 <w:szCs w:val="24"/>
-                <w:lang/>
                 <w14:ligatures w14:val="standardContextual"/>
               </w:rPr>
               <w:tab/>
@@ -1638,7 +1991,7 @@
                 <w:rStyle w:val="Hyperlink"/>
                 <w:noProof/>
               </w:rPr>
-              <w:t>Цел и предназначение</w:t>
+              <w:t>Принцип на работа</w:t>
             </w:r>
             <w:r>
               <w:rPr>
@@ -1659,7 +2012,7 @@
                 <w:noProof/>
                 <w:webHidden/>
               </w:rPr>
-              <w:instrText xml:space="preserve"> PAGEREF _Toc199063427 \h </w:instrText>
+              <w:instrText xml:space="preserve"> PAGEREF _Toc199088395 \h </w:instrText>
             </w:r>
             <w:r>
               <w:rPr>
@@ -1679,7 +2032,7 @@
                 <w:noProof/>
                 <w:webHidden/>
               </w:rPr>
-              <w:t>16</w:t>
+              <w:t>23</w:t>
             </w:r>
             <w:r>
               <w:rPr>
@@ -1695,26 +2048,23 @@
             <w:pStyle w:val="TOC2"/>
             <w:tabs>
               <w:tab w:val="left" w:pos="1680"/>
-              <w:tab w:val="right" w:leader="dot" w:pos="9062"/>
             </w:tabs>
-            <w:spacing w:line="276" w:lineRule="auto"/>
             <w:rPr>
               <w:rFonts w:asciiTheme="minorHAnsi" w:eastAsiaTheme="minorEastAsia" w:hAnsiTheme="minorHAnsi" w:cstheme="minorBidi"/>
               <w:noProof/>
               <w:kern w:val="2"/>
               <w:sz w:val="24"/>
               <w:szCs w:val="24"/>
-              <w:lang/>
               <w14:ligatures w14:val="standardContextual"/>
             </w:rPr>
           </w:pPr>
-          <w:hyperlink w:anchor="_Toc199063428" w:history="1">
+          <w:hyperlink w:anchor="_Toc199088396" w:history="1">
             <w:r>
               <w:rPr>
                 <w:rStyle w:val="Hyperlink"/>
                 <w:noProof/>
               </w:rPr>
-              <w:t>3.2.</w:t>
+              <w:t>3.3.</w:t>
             </w:r>
             <w:r>
               <w:rPr>
@@ -1723,7 +2073,6 @@
                 <w:kern w:val="2"/>
                 <w:sz w:val="24"/>
                 <w:szCs w:val="24"/>
-                <w:lang/>
                 <w14:ligatures w14:val="standardContextual"/>
               </w:rPr>
               <w:tab/>
@@ -1733,7 +2082,7 @@
                 <w:rStyle w:val="Hyperlink"/>
                 <w:noProof/>
               </w:rPr>
-              <w:t>Принцип на работа</w:t>
+              <w:t>Параметри (характеристики)</w:t>
             </w:r>
             <w:r>
               <w:rPr>
@@ -1754,7 +2103,7 @@
                 <w:noProof/>
                 <w:webHidden/>
               </w:rPr>
-              <w:instrText xml:space="preserve"> PAGEREF _Toc199063428 \h </w:instrText>
+              <w:instrText xml:space="preserve"> PAGEREF _Toc199088396 \h </w:instrText>
             </w:r>
             <w:r>
               <w:rPr>
@@ -1774,7 +2123,183 @@
                 <w:noProof/>
                 <w:webHidden/>
               </w:rPr>
-              <w:t>16</w:t>
+              <w:t>24</w:t>
+            </w:r>
+            <w:r>
+              <w:rPr>
+                <w:noProof/>
+                <w:webHidden/>
+              </w:rPr>
+              <w:fldChar w:fldCharType="end"/>
+            </w:r>
+          </w:hyperlink>
+        </w:p>
+        <w:p>
+          <w:pPr>
+            <w:pStyle w:val="TOC1"/>
+            <w:rPr>
+              <w:rFonts w:asciiTheme="minorHAnsi" w:eastAsiaTheme="minorEastAsia" w:hAnsiTheme="minorHAnsi" w:cstheme="minorBidi"/>
+              <w:noProof/>
+              <w:kern w:val="2"/>
+              <w:sz w:val="24"/>
+              <w:szCs w:val="24"/>
+              <w14:ligatures w14:val="standardContextual"/>
+            </w:rPr>
+          </w:pPr>
+          <w:hyperlink w:anchor="_Toc199088397" w:history="1">
+            <w:r>
+              <w:rPr>
+                <w:rStyle w:val="Hyperlink"/>
+                <w:noProof/>
+              </w:rPr>
+              <w:t>4.</w:t>
+            </w:r>
+            <w:r>
+              <w:rPr>
+                <w:rFonts w:asciiTheme="minorHAnsi" w:eastAsiaTheme="minorEastAsia" w:hAnsiTheme="minorHAnsi" w:cstheme="minorBidi"/>
+                <w:noProof/>
+                <w:kern w:val="2"/>
+                <w:sz w:val="24"/>
+                <w:szCs w:val="24"/>
+                <w14:ligatures w14:val="standardContextual"/>
+              </w:rPr>
+              <w:tab/>
+            </w:r>
+            <w:r>
+              <w:rPr>
+                <w:rStyle w:val="Hyperlink"/>
+                <w:noProof/>
+              </w:rPr>
+              <w:t>Блокова схема</w:t>
+            </w:r>
+            <w:r>
+              <w:rPr>
+                <w:noProof/>
+                <w:webHidden/>
+              </w:rPr>
+              <w:tab/>
+            </w:r>
+            <w:r>
+              <w:rPr>
+                <w:noProof/>
+                <w:webHidden/>
+              </w:rPr>
+              <w:fldChar w:fldCharType="begin"/>
+            </w:r>
+            <w:r>
+              <w:rPr>
+                <w:noProof/>
+                <w:webHidden/>
+              </w:rPr>
+              <w:instrText xml:space="preserve"> PAGEREF _Toc199088397 \h </w:instrText>
+            </w:r>
+            <w:r>
+              <w:rPr>
+                <w:noProof/>
+                <w:webHidden/>
+              </w:rPr>
+            </w:r>
+            <w:r>
+              <w:rPr>
+                <w:noProof/>
+                <w:webHidden/>
+              </w:rPr>
+              <w:fldChar w:fldCharType="separate"/>
+            </w:r>
+            <w:r>
+              <w:rPr>
+                <w:noProof/>
+                <w:webHidden/>
+              </w:rPr>
+              <w:t>25</w:t>
+            </w:r>
+            <w:r>
+              <w:rPr>
+                <w:noProof/>
+                <w:webHidden/>
+              </w:rPr>
+              <w:fldChar w:fldCharType="end"/>
+            </w:r>
+          </w:hyperlink>
+        </w:p>
+        <w:p>
+          <w:pPr>
+            <w:pStyle w:val="TOC1"/>
+            <w:rPr>
+              <w:rFonts w:asciiTheme="minorHAnsi" w:eastAsiaTheme="minorEastAsia" w:hAnsiTheme="minorHAnsi" w:cstheme="minorBidi"/>
+              <w:noProof/>
+              <w:kern w:val="2"/>
+              <w:sz w:val="24"/>
+              <w:szCs w:val="24"/>
+              <w14:ligatures w14:val="standardContextual"/>
+            </w:rPr>
+          </w:pPr>
+          <w:hyperlink w:anchor="_Toc199088398" w:history="1">
+            <w:r>
+              <w:rPr>
+                <w:rStyle w:val="Hyperlink"/>
+                <w:noProof/>
+              </w:rPr>
+              <w:t>5.</w:t>
+            </w:r>
+            <w:r>
+              <w:rPr>
+                <w:rFonts w:asciiTheme="minorHAnsi" w:eastAsiaTheme="minorEastAsia" w:hAnsiTheme="minorHAnsi" w:cstheme="minorBidi"/>
+                <w:noProof/>
+                <w:kern w:val="2"/>
+                <w:sz w:val="24"/>
+                <w:szCs w:val="24"/>
+                <w14:ligatures w14:val="standardContextual"/>
+              </w:rPr>
+              <w:tab/>
+            </w:r>
+            <w:r>
+              <w:rPr>
+                <w:rStyle w:val="Hyperlink"/>
+                <w:noProof/>
+              </w:rPr>
+              <w:t>Принципна електрическа схема</w:t>
+            </w:r>
+            <w:r>
+              <w:rPr>
+                <w:noProof/>
+                <w:webHidden/>
+              </w:rPr>
+              <w:tab/>
+            </w:r>
+            <w:r>
+              <w:rPr>
+                <w:noProof/>
+                <w:webHidden/>
+              </w:rPr>
+              <w:fldChar w:fldCharType="begin"/>
+            </w:r>
+            <w:r>
+              <w:rPr>
+                <w:noProof/>
+                <w:webHidden/>
+              </w:rPr>
+              <w:instrText xml:space="preserve"> PAGEREF _Toc199088398 \h </w:instrText>
+            </w:r>
+            <w:r>
+              <w:rPr>
+                <w:noProof/>
+                <w:webHidden/>
+              </w:rPr>
+            </w:r>
+            <w:r>
+              <w:rPr>
+                <w:noProof/>
+                <w:webHidden/>
+              </w:rPr>
+              <w:fldChar w:fldCharType="separate"/>
+            </w:r>
+            <w:r>
+              <w:rPr>
+                <w:noProof/>
+                <w:webHidden/>
+              </w:rPr>
+              <w:t>25</w:t>
             </w:r>
             <w:r>
               <w:rPr>
@@ -1790,26 +2315,23 @@
             <w:pStyle w:val="TOC2"/>
             <w:tabs>
               <w:tab w:val="left" w:pos="1680"/>
-              <w:tab w:val="right" w:leader="dot" w:pos="9062"/>
             </w:tabs>
-            <w:spacing w:line="276" w:lineRule="auto"/>
             <w:rPr>
               <w:rFonts w:asciiTheme="minorHAnsi" w:eastAsiaTheme="minorEastAsia" w:hAnsiTheme="minorHAnsi" w:cstheme="minorBidi"/>
               <w:noProof/>
               <w:kern w:val="2"/>
               <w:sz w:val="24"/>
               <w:szCs w:val="24"/>
-              <w:lang/>
               <w14:ligatures w14:val="standardContextual"/>
             </w:rPr>
           </w:pPr>
-          <w:hyperlink w:anchor="_Toc199063429" w:history="1">
+          <w:hyperlink w:anchor="_Toc199088399" w:history="1">
             <w:r>
               <w:rPr>
                 <w:rStyle w:val="Hyperlink"/>
                 <w:noProof/>
               </w:rPr>
-              <w:t>3.3.</w:t>
+              <w:t>5.1.</w:t>
             </w:r>
             <w:r>
               <w:rPr>
@@ -1818,7 +2340,6 @@
                 <w:kern w:val="2"/>
                 <w:sz w:val="24"/>
                 <w:szCs w:val="24"/>
-                <w:lang/>
                 <w14:ligatures w14:val="standardContextual"/>
               </w:rPr>
               <w:tab/>
@@ -1828,7 +2349,7 @@
                 <w:rStyle w:val="Hyperlink"/>
                 <w:noProof/>
               </w:rPr>
-              <w:t>Параметри (характеристики)</w:t>
+              <w:t>Принципна електрическа схема в обобщен вид</w:t>
             </w:r>
             <w:r>
               <w:rPr>
@@ -1849,7 +2370,7 @@
                 <w:noProof/>
                 <w:webHidden/>
               </w:rPr>
-              <w:instrText xml:space="preserve"> PAGEREF _Toc199063429 \h </w:instrText>
+              <w:instrText xml:space="preserve"> PAGEREF _Toc199088399 \h </w:instrText>
             </w:r>
             <w:r>
               <w:rPr>
@@ -1869,197 +2390,7 @@
                 <w:noProof/>
                 <w:webHidden/>
               </w:rPr>
-              <w:t>16</w:t>
-            </w:r>
-            <w:r>
-              <w:rPr>
-                <w:noProof/>
-                <w:webHidden/>
-              </w:rPr>
-              <w:fldChar w:fldCharType="end"/>
-            </w:r>
-          </w:hyperlink>
-        </w:p>
-        <w:p>
-          <w:pPr>
-            <w:pStyle w:val="TOC1"/>
-            <w:tabs>
-              <w:tab w:val="left" w:pos="1200"/>
-              <w:tab w:val="right" w:leader="dot" w:pos="9062"/>
-            </w:tabs>
-            <w:spacing w:line="276" w:lineRule="auto"/>
-            <w:rPr>
-              <w:rFonts w:asciiTheme="minorHAnsi" w:eastAsiaTheme="minorEastAsia" w:hAnsiTheme="minorHAnsi" w:cstheme="minorBidi"/>
-              <w:noProof/>
-              <w:kern w:val="2"/>
-              <w:sz w:val="24"/>
-              <w:szCs w:val="24"/>
-              <w:lang/>
-              <w14:ligatures w14:val="standardContextual"/>
-            </w:rPr>
-          </w:pPr>
-          <w:hyperlink w:anchor="_Toc199063430" w:history="1">
-            <w:r>
-              <w:rPr>
-                <w:rStyle w:val="Hyperlink"/>
-                <w:noProof/>
-              </w:rPr>
-              <w:t>4.</w:t>
-            </w:r>
-            <w:r>
-              <w:rPr>
-                <w:rFonts w:asciiTheme="minorHAnsi" w:eastAsiaTheme="minorEastAsia" w:hAnsiTheme="minorHAnsi" w:cstheme="minorBidi"/>
-                <w:noProof/>
-                <w:kern w:val="2"/>
-                <w:sz w:val="24"/>
-                <w:szCs w:val="24"/>
-                <w:lang/>
-                <w14:ligatures w14:val="standardContextual"/>
-              </w:rPr>
-              <w:tab/>
-            </w:r>
-            <w:r>
-              <w:rPr>
-                <w:rStyle w:val="Hyperlink"/>
-                <w:noProof/>
-              </w:rPr>
-              <w:t>Блокова схема</w:t>
-            </w:r>
-            <w:r>
-              <w:rPr>
-                <w:noProof/>
-                <w:webHidden/>
-              </w:rPr>
-              <w:tab/>
-            </w:r>
-            <w:r>
-              <w:rPr>
-                <w:noProof/>
-                <w:webHidden/>
-              </w:rPr>
-              <w:fldChar w:fldCharType="begin"/>
-            </w:r>
-            <w:r>
-              <w:rPr>
-                <w:noProof/>
-                <w:webHidden/>
-              </w:rPr>
-              <w:instrText xml:space="preserve"> PAGEREF _Toc199063430 \h </w:instrText>
-            </w:r>
-            <w:r>
-              <w:rPr>
-                <w:noProof/>
-                <w:webHidden/>
-              </w:rPr>
-            </w:r>
-            <w:r>
-              <w:rPr>
-                <w:noProof/>
-                <w:webHidden/>
-              </w:rPr>
-              <w:fldChar w:fldCharType="separate"/>
-            </w:r>
-            <w:r>
-              <w:rPr>
-                <w:noProof/>
-                <w:webHidden/>
-              </w:rPr>
-              <w:t>16</w:t>
-            </w:r>
-            <w:r>
-              <w:rPr>
-                <w:noProof/>
-                <w:webHidden/>
-              </w:rPr>
-              <w:fldChar w:fldCharType="end"/>
-            </w:r>
-          </w:hyperlink>
-        </w:p>
-        <w:p>
-          <w:pPr>
-            <w:pStyle w:val="TOC1"/>
-            <w:tabs>
-              <w:tab w:val="left" w:pos="1200"/>
-              <w:tab w:val="right" w:leader="dot" w:pos="9062"/>
-            </w:tabs>
-            <w:spacing w:line="276" w:lineRule="auto"/>
-            <w:rPr>
-              <w:rFonts w:asciiTheme="minorHAnsi" w:eastAsiaTheme="minorEastAsia" w:hAnsiTheme="minorHAnsi" w:cstheme="minorBidi"/>
-              <w:noProof/>
-              <w:kern w:val="2"/>
-              <w:sz w:val="24"/>
-              <w:szCs w:val="24"/>
-              <w:lang/>
-              <w14:ligatures w14:val="standardContextual"/>
-            </w:rPr>
-          </w:pPr>
-          <w:hyperlink w:anchor="_Toc199063431" w:history="1">
-            <w:r>
-              <w:rPr>
-                <w:rStyle w:val="Hyperlink"/>
-                <w:noProof/>
-              </w:rPr>
-              <w:t>5.</w:t>
-            </w:r>
-            <w:r>
-              <w:rPr>
-                <w:rFonts w:asciiTheme="minorHAnsi" w:eastAsiaTheme="minorEastAsia" w:hAnsiTheme="minorHAnsi" w:cstheme="minorBidi"/>
-                <w:noProof/>
-                <w:kern w:val="2"/>
-                <w:sz w:val="24"/>
-                <w:szCs w:val="24"/>
-                <w:lang/>
-                <w14:ligatures w14:val="standardContextual"/>
-              </w:rPr>
-              <w:tab/>
-            </w:r>
-            <w:r>
-              <w:rPr>
-                <w:rStyle w:val="Hyperlink"/>
-                <w:noProof/>
-              </w:rPr>
-              <w:t>Принципна електрическа схема</w:t>
-            </w:r>
-            <w:r>
-              <w:rPr>
-                <w:noProof/>
-                <w:webHidden/>
-              </w:rPr>
-              <w:tab/>
-            </w:r>
-            <w:r>
-              <w:rPr>
-                <w:noProof/>
-                <w:webHidden/>
-              </w:rPr>
-              <w:fldChar w:fldCharType="begin"/>
-            </w:r>
-            <w:r>
-              <w:rPr>
-                <w:noProof/>
-                <w:webHidden/>
-              </w:rPr>
-              <w:instrText xml:space="preserve"> PAGEREF _Toc199063431 \h </w:instrText>
-            </w:r>
-            <w:r>
-              <w:rPr>
-                <w:noProof/>
-                <w:webHidden/>
-              </w:rPr>
-            </w:r>
-            <w:r>
-              <w:rPr>
-                <w:noProof/>
-                <w:webHidden/>
-              </w:rPr>
-              <w:fldChar w:fldCharType="separate"/>
-            </w:r>
-            <w:r>
-              <w:rPr>
-                <w:noProof/>
-                <w:webHidden/>
-              </w:rPr>
-              <w:t>16</w:t>
+              <w:t>25</w:t>
             </w:r>
             <w:r>
               <w:rPr>
@@ -2075,26 +2406,23 @@
             <w:pStyle w:val="TOC2"/>
             <w:tabs>
               <w:tab w:val="left" w:pos="1680"/>
-              <w:tab w:val="right" w:leader="dot" w:pos="9062"/>
             </w:tabs>
-            <w:spacing w:line="276" w:lineRule="auto"/>
             <w:rPr>
               <w:rFonts w:asciiTheme="minorHAnsi" w:eastAsiaTheme="minorEastAsia" w:hAnsiTheme="minorHAnsi" w:cstheme="minorBidi"/>
               <w:noProof/>
               <w:kern w:val="2"/>
               <w:sz w:val="24"/>
               <w:szCs w:val="24"/>
-              <w:lang/>
               <w14:ligatures w14:val="standardContextual"/>
             </w:rPr>
           </w:pPr>
-          <w:hyperlink w:anchor="_Toc199063432" w:history="1">
+          <w:hyperlink w:anchor="_Toc199088400" w:history="1">
             <w:r>
               <w:rPr>
                 <w:rStyle w:val="Hyperlink"/>
                 <w:noProof/>
               </w:rPr>
-              <w:t>5.1.</w:t>
+              <w:t>5.2.</w:t>
             </w:r>
             <w:r>
               <w:rPr>
@@ -2103,7 +2431,6 @@
                 <w:kern w:val="2"/>
                 <w:sz w:val="24"/>
                 <w:szCs w:val="24"/>
-                <w:lang/>
                 <w14:ligatures w14:val="standardContextual"/>
               </w:rPr>
               <w:tab/>
@@ -2113,7 +2440,7 @@
                 <w:rStyle w:val="Hyperlink"/>
                 <w:noProof/>
               </w:rPr>
-              <w:t>Принципна електрическа схема в обобщен вид</w:t>
+              <w:t>Блок „“</w:t>
             </w:r>
             <w:r>
               <w:rPr>
@@ -2134,7 +2461,7 @@
                 <w:noProof/>
                 <w:webHidden/>
               </w:rPr>
-              <w:instrText xml:space="preserve"> PAGEREF _Toc199063432 \h </w:instrText>
+              <w:instrText xml:space="preserve"> PAGEREF _Toc199088400 \h </w:instrText>
             </w:r>
             <w:r>
               <w:rPr>
@@ -2154,7 +2481,183 @@
                 <w:noProof/>
                 <w:webHidden/>
               </w:rPr>
-              <w:t>16</w:t>
+              <w:t>25</w:t>
+            </w:r>
+            <w:r>
+              <w:rPr>
+                <w:noProof/>
+                <w:webHidden/>
+              </w:rPr>
+              <w:fldChar w:fldCharType="end"/>
+            </w:r>
+          </w:hyperlink>
+        </w:p>
+        <w:p>
+          <w:pPr>
+            <w:pStyle w:val="TOC1"/>
+            <w:rPr>
+              <w:rFonts w:asciiTheme="minorHAnsi" w:eastAsiaTheme="minorEastAsia" w:hAnsiTheme="minorHAnsi" w:cstheme="minorBidi"/>
+              <w:noProof/>
+              <w:kern w:val="2"/>
+              <w:sz w:val="24"/>
+              <w:szCs w:val="24"/>
+              <w14:ligatures w14:val="standardContextual"/>
+            </w:rPr>
+          </w:pPr>
+          <w:hyperlink w:anchor="_Toc199088401" w:history="1">
+            <w:r>
+              <w:rPr>
+                <w:rStyle w:val="Hyperlink"/>
+                <w:noProof/>
+              </w:rPr>
+              <w:t>6.</w:t>
+            </w:r>
+            <w:r>
+              <w:rPr>
+                <w:rFonts w:asciiTheme="minorHAnsi" w:eastAsiaTheme="minorEastAsia" w:hAnsiTheme="minorHAnsi" w:cstheme="minorBidi"/>
+                <w:noProof/>
+                <w:kern w:val="2"/>
+                <w:sz w:val="24"/>
+                <w:szCs w:val="24"/>
+                <w14:ligatures w14:val="standardContextual"/>
+              </w:rPr>
+              <w:tab/>
+            </w:r>
+            <w:r>
+              <w:rPr>
+                <w:rStyle w:val="Hyperlink"/>
+                <w:noProof/>
+              </w:rPr>
+              <w:t>Печатна платка</w:t>
+            </w:r>
+            <w:r>
+              <w:rPr>
+                <w:noProof/>
+                <w:webHidden/>
+              </w:rPr>
+              <w:tab/>
+            </w:r>
+            <w:r>
+              <w:rPr>
+                <w:noProof/>
+                <w:webHidden/>
+              </w:rPr>
+              <w:fldChar w:fldCharType="begin"/>
+            </w:r>
+            <w:r>
+              <w:rPr>
+                <w:noProof/>
+                <w:webHidden/>
+              </w:rPr>
+              <w:instrText xml:space="preserve"> PAGEREF _Toc199088401 \h </w:instrText>
+            </w:r>
+            <w:r>
+              <w:rPr>
+                <w:noProof/>
+                <w:webHidden/>
+              </w:rPr>
+            </w:r>
+            <w:r>
+              <w:rPr>
+                <w:noProof/>
+                <w:webHidden/>
+              </w:rPr>
+              <w:fldChar w:fldCharType="separate"/>
+            </w:r>
+            <w:r>
+              <w:rPr>
+                <w:noProof/>
+                <w:webHidden/>
+              </w:rPr>
+              <w:t>25</w:t>
+            </w:r>
+            <w:r>
+              <w:rPr>
+                <w:noProof/>
+                <w:webHidden/>
+              </w:rPr>
+              <w:fldChar w:fldCharType="end"/>
+            </w:r>
+          </w:hyperlink>
+        </w:p>
+        <w:p>
+          <w:pPr>
+            <w:pStyle w:val="TOC1"/>
+            <w:rPr>
+              <w:rFonts w:asciiTheme="minorHAnsi" w:eastAsiaTheme="minorEastAsia" w:hAnsiTheme="minorHAnsi" w:cstheme="minorBidi"/>
+              <w:noProof/>
+              <w:kern w:val="2"/>
+              <w:sz w:val="24"/>
+              <w:szCs w:val="24"/>
+              <w14:ligatures w14:val="standardContextual"/>
+            </w:rPr>
+          </w:pPr>
+          <w:hyperlink w:anchor="_Toc199088402" w:history="1">
+            <w:r>
+              <w:rPr>
+                <w:rStyle w:val="Hyperlink"/>
+                <w:noProof/>
+              </w:rPr>
+              <w:t>7.</w:t>
+            </w:r>
+            <w:r>
+              <w:rPr>
+                <w:rFonts w:asciiTheme="minorHAnsi" w:eastAsiaTheme="minorEastAsia" w:hAnsiTheme="minorHAnsi" w:cstheme="minorBidi"/>
+                <w:noProof/>
+                <w:kern w:val="2"/>
+                <w:sz w:val="24"/>
+                <w:szCs w:val="24"/>
+                <w14:ligatures w14:val="standardContextual"/>
+              </w:rPr>
+              <w:tab/>
+            </w:r>
+            <w:r>
+              <w:rPr>
+                <w:rStyle w:val="Hyperlink"/>
+                <w:noProof/>
+              </w:rPr>
+              <w:t>Конфигурация на драйвера</w:t>
+            </w:r>
+            <w:r>
+              <w:rPr>
+                <w:noProof/>
+                <w:webHidden/>
+              </w:rPr>
+              <w:tab/>
+            </w:r>
+            <w:r>
+              <w:rPr>
+                <w:noProof/>
+                <w:webHidden/>
+              </w:rPr>
+              <w:fldChar w:fldCharType="begin"/>
+            </w:r>
+            <w:r>
+              <w:rPr>
+                <w:noProof/>
+                <w:webHidden/>
+              </w:rPr>
+              <w:instrText xml:space="preserve"> PAGEREF _Toc199088402 \h </w:instrText>
+            </w:r>
+            <w:r>
+              <w:rPr>
+                <w:noProof/>
+                <w:webHidden/>
+              </w:rPr>
+            </w:r>
+            <w:r>
+              <w:rPr>
+                <w:noProof/>
+                <w:webHidden/>
+              </w:rPr>
+              <w:fldChar w:fldCharType="separate"/>
+            </w:r>
+            <w:r>
+              <w:rPr>
+                <w:noProof/>
+                <w:webHidden/>
+              </w:rPr>
+              <w:t>25</w:t>
             </w:r>
             <w:r>
               <w:rPr>
@@ -2170,26 +2673,23 @@
             <w:pStyle w:val="TOC2"/>
             <w:tabs>
               <w:tab w:val="left" w:pos="1680"/>
-              <w:tab w:val="right" w:leader="dot" w:pos="9062"/>
             </w:tabs>
-            <w:spacing w:line="276" w:lineRule="auto"/>
             <w:rPr>
               <w:rFonts w:asciiTheme="minorHAnsi" w:eastAsiaTheme="minorEastAsia" w:hAnsiTheme="minorHAnsi" w:cstheme="minorBidi"/>
               <w:noProof/>
               <w:kern w:val="2"/>
               <w:sz w:val="24"/>
               <w:szCs w:val="24"/>
-              <w:lang/>
               <w14:ligatures w14:val="standardContextual"/>
             </w:rPr>
           </w:pPr>
-          <w:hyperlink w:anchor="_Toc199063433" w:history="1">
+          <w:hyperlink w:anchor="_Toc199088403" w:history="1">
             <w:r>
               <w:rPr>
                 <w:rStyle w:val="Hyperlink"/>
                 <w:noProof/>
               </w:rPr>
-              <w:t>5.2.</w:t>
+              <w:t>7.1.</w:t>
             </w:r>
             <w:r>
               <w:rPr>
@@ -2198,7 +2698,6 @@
                 <w:kern w:val="2"/>
                 <w:sz w:val="24"/>
                 <w:szCs w:val="24"/>
-                <w:lang/>
                 <w14:ligatures w14:val="standardContextual"/>
               </w:rPr>
               <w:tab/>
@@ -2208,7 +2707,7 @@
                 <w:rStyle w:val="Hyperlink"/>
                 <w:noProof/>
               </w:rPr>
-              <w:t>Блок „“</w:t>
+              <w:t>Общ принцип на работа</w:t>
             </w:r>
             <w:r>
               <w:rPr>
@@ -2229,7 +2728,7 @@
                 <w:noProof/>
                 <w:webHidden/>
               </w:rPr>
-              <w:instrText xml:space="preserve"> PAGEREF _Toc199063433 \h </w:instrText>
+              <w:instrText xml:space="preserve"> PAGEREF _Toc199088403 \h </w:instrText>
             </w:r>
             <w:r>
               <w:rPr>
@@ -2249,7 +2748,7 @@
                 <w:noProof/>
                 <w:webHidden/>
               </w:rPr>
-              <w:t>16</w:t>
+              <w:t>25</w:t>
             </w:r>
             <w:r>
               <w:rPr>
@@ -2263,28 +2762,22 @@
         <w:p>
           <w:pPr>
             <w:pStyle w:val="TOC1"/>
-            <w:tabs>
-              <w:tab w:val="left" w:pos="1200"/>
-              <w:tab w:val="right" w:leader="dot" w:pos="9062"/>
-            </w:tabs>
-            <w:spacing w:line="276" w:lineRule="auto"/>
             <w:rPr>
               <w:rFonts w:asciiTheme="minorHAnsi" w:eastAsiaTheme="minorEastAsia" w:hAnsiTheme="minorHAnsi" w:cstheme="minorBidi"/>
               <w:noProof/>
               <w:kern w:val="2"/>
               <w:sz w:val="24"/>
               <w:szCs w:val="24"/>
-              <w:lang/>
               <w14:ligatures w14:val="standardContextual"/>
             </w:rPr>
           </w:pPr>
-          <w:hyperlink w:anchor="_Toc199063434" w:history="1">
+          <w:hyperlink w:anchor="_Toc199088404" w:history="1">
             <w:r>
               <w:rPr>
                 <w:rStyle w:val="Hyperlink"/>
                 <w:noProof/>
               </w:rPr>
-              <w:t>6.</w:t>
+              <w:t>8.</w:t>
             </w:r>
             <w:r>
               <w:rPr>
@@ -2293,7 +2786,6 @@
                 <w:kern w:val="2"/>
                 <w:sz w:val="24"/>
                 <w:szCs w:val="24"/>
-                <w:lang/>
                 <w14:ligatures w14:val="standardContextual"/>
               </w:rPr>
               <w:tab/>
@@ -2303,7 +2795,7 @@
                 <w:rStyle w:val="Hyperlink"/>
                 <w:noProof/>
               </w:rPr>
-              <w:t>Печатна платка</w:t>
+              <w:t>Експериментални резултати</w:t>
             </w:r>
             <w:r>
               <w:rPr>
@@ -2324,7 +2816,7 @@
                 <w:noProof/>
                 <w:webHidden/>
               </w:rPr>
-              <w:instrText xml:space="preserve"> PAGEREF _Toc199063434 \h </w:instrText>
+              <w:instrText xml:space="preserve"> PAGEREF _Toc199088404 \h </w:instrText>
             </w:r>
             <w:r>
               <w:rPr>
@@ -2344,7 +2836,7 @@
                 <w:noProof/>
                 <w:webHidden/>
               </w:rPr>
-              <w:t>16</w:t>
+              <w:t>25</w:t>
             </w:r>
             <w:r>
               <w:rPr>
@@ -2358,28 +2850,22 @@
         <w:p>
           <w:pPr>
             <w:pStyle w:val="TOC1"/>
-            <w:tabs>
-              <w:tab w:val="left" w:pos="1200"/>
-              <w:tab w:val="right" w:leader="dot" w:pos="9062"/>
-            </w:tabs>
-            <w:spacing w:line="276" w:lineRule="auto"/>
             <w:rPr>
               <w:rFonts w:asciiTheme="minorHAnsi" w:eastAsiaTheme="minorEastAsia" w:hAnsiTheme="minorHAnsi" w:cstheme="minorBidi"/>
               <w:noProof/>
               <w:kern w:val="2"/>
               <w:sz w:val="24"/>
               <w:szCs w:val="24"/>
-              <w:lang/>
               <w14:ligatures w14:val="standardContextual"/>
             </w:rPr>
           </w:pPr>
-          <w:hyperlink w:anchor="_Toc199063435" w:history="1">
+          <w:hyperlink w:anchor="_Toc199088405" w:history="1">
             <w:r>
               <w:rPr>
                 <w:rStyle w:val="Hyperlink"/>
                 <w:noProof/>
               </w:rPr>
-              <w:t>7.</w:t>
+              <w:t>9.</w:t>
             </w:r>
             <w:r>
               <w:rPr>
@@ -2388,7 +2874,6 @@
                 <w:kern w:val="2"/>
                 <w:sz w:val="24"/>
                 <w:szCs w:val="24"/>
-                <w:lang/>
                 <w14:ligatures w14:val="standardContextual"/>
               </w:rPr>
               <w:tab/>
@@ -2398,7 +2883,7 @@
                 <w:rStyle w:val="Hyperlink"/>
                 <w:noProof/>
               </w:rPr>
-              <w:t>Конфигурация на драйвера</w:t>
+              <w:t>Заключение</w:t>
             </w:r>
             <w:r>
               <w:rPr>
@@ -2419,7 +2904,7 @@
                 <w:noProof/>
                 <w:webHidden/>
               </w:rPr>
-              <w:instrText xml:space="preserve"> PAGEREF _Toc199063435 \h </w:instrText>
+              <w:instrText xml:space="preserve"> PAGEREF _Toc199088405 \h </w:instrText>
             </w:r>
             <w:r>
               <w:rPr>
@@ -2439,7 +2924,7 @@
                 <w:noProof/>
                 <w:webHidden/>
               </w:rPr>
-              <w:t>17</w:t>
+              <w:t>25</w:t>
             </w:r>
             <w:r>
               <w:rPr>
@@ -2452,29 +2937,23 @@
         </w:p>
         <w:p>
           <w:pPr>
-            <w:pStyle w:val="TOC2"/>
-            <w:tabs>
-              <w:tab w:val="left" w:pos="1680"/>
-              <w:tab w:val="right" w:leader="dot" w:pos="9062"/>
-            </w:tabs>
-            <w:spacing w:line="276" w:lineRule="auto"/>
+            <w:pStyle w:val="TOC1"/>
             <w:rPr>
               <w:rFonts w:asciiTheme="minorHAnsi" w:eastAsiaTheme="minorEastAsia" w:hAnsiTheme="minorHAnsi" w:cstheme="minorBidi"/>
               <w:noProof/>
               <w:kern w:val="2"/>
               <w:sz w:val="24"/>
               <w:szCs w:val="24"/>
-              <w:lang/>
               <w14:ligatures w14:val="standardContextual"/>
             </w:rPr>
           </w:pPr>
-          <w:hyperlink w:anchor="_Toc199063436" w:history="1">
+          <w:hyperlink w:anchor="_Toc199088406" w:history="1">
             <w:r>
               <w:rPr>
                 <w:rStyle w:val="Hyperlink"/>
                 <w:noProof/>
               </w:rPr>
-              <w:t>7.1.</w:t>
+              <w:t>10.</w:t>
             </w:r>
             <w:r>
               <w:rPr>
@@ -2483,7 +2962,6 @@
                 <w:kern w:val="2"/>
                 <w:sz w:val="24"/>
                 <w:szCs w:val="24"/>
-                <w:lang/>
                 <w14:ligatures w14:val="standardContextual"/>
               </w:rPr>
               <w:tab/>
@@ -2493,7 +2971,7 @@
                 <w:rStyle w:val="Hyperlink"/>
                 <w:noProof/>
               </w:rPr>
-              <w:t>Общ принцип на работа</w:t>
+              <w:t>Използвана литература</w:t>
             </w:r>
             <w:r>
               <w:rPr>
@@ -2514,7 +2992,7 @@
                 <w:noProof/>
                 <w:webHidden/>
               </w:rPr>
-              <w:instrText xml:space="preserve"> PAGEREF _Toc199063436 \h </w:instrText>
+              <w:instrText xml:space="preserve"> PAGEREF _Toc199088406 \h </w:instrText>
             </w:r>
             <w:r>
               <w:rPr>
@@ -2534,7 +3012,7 @@
                 <w:noProof/>
                 <w:webHidden/>
               </w:rPr>
-              <w:t>17</w:t>
+              <w:t>26</w:t>
             </w:r>
             <w:r>
               <w:rPr>
@@ -2548,292 +3026,7 @@
         <w:p>
           <w:pPr>
             <w:pStyle w:val="TOC1"/>
-            <w:tabs>
-              <w:tab w:val="left" w:pos="1200"/>
-              <w:tab w:val="right" w:leader="dot" w:pos="9062"/>
-            </w:tabs>
-            <w:spacing w:line="276" w:lineRule="auto"/>
-            <w:rPr>
-              <w:rFonts w:asciiTheme="minorHAnsi" w:eastAsiaTheme="minorEastAsia" w:hAnsiTheme="minorHAnsi" w:cstheme="minorBidi"/>
-              <w:noProof/>
-              <w:kern w:val="2"/>
-              <w:sz w:val="24"/>
-              <w:szCs w:val="24"/>
-              <w:lang/>
-              <w14:ligatures w14:val="standardContextual"/>
-            </w:rPr>
-          </w:pPr>
-          <w:hyperlink w:anchor="_Toc199063437" w:history="1">
-            <w:r>
-              <w:rPr>
-                <w:rStyle w:val="Hyperlink"/>
-                <w:noProof/>
-              </w:rPr>
-              <w:t>8.</w:t>
-            </w:r>
-            <w:r>
-              <w:rPr>
-                <w:rFonts w:asciiTheme="minorHAnsi" w:eastAsiaTheme="minorEastAsia" w:hAnsiTheme="minorHAnsi" w:cstheme="minorBidi"/>
-                <w:noProof/>
-                <w:kern w:val="2"/>
-                <w:sz w:val="24"/>
-                <w:szCs w:val="24"/>
-                <w:lang/>
-                <w14:ligatures w14:val="standardContextual"/>
-              </w:rPr>
-              <w:tab/>
-            </w:r>
-            <w:r>
-              <w:rPr>
-                <w:rStyle w:val="Hyperlink"/>
-                <w:noProof/>
-              </w:rPr>
-              <w:t>Експериментални резултати</w:t>
-            </w:r>
-            <w:r>
-              <w:rPr>
-                <w:noProof/>
-                <w:webHidden/>
-              </w:rPr>
-              <w:tab/>
-            </w:r>
-            <w:r>
-              <w:rPr>
-                <w:noProof/>
-                <w:webHidden/>
-              </w:rPr>
-              <w:fldChar w:fldCharType="begin"/>
-            </w:r>
-            <w:r>
-              <w:rPr>
-                <w:noProof/>
-                <w:webHidden/>
-              </w:rPr>
-              <w:instrText xml:space="preserve"> PAGEREF _Toc199063437 \h </w:instrText>
-            </w:r>
-            <w:r>
-              <w:rPr>
-                <w:noProof/>
-                <w:webHidden/>
-              </w:rPr>
-            </w:r>
-            <w:r>
-              <w:rPr>
-                <w:noProof/>
-                <w:webHidden/>
-              </w:rPr>
-              <w:fldChar w:fldCharType="separate"/>
-            </w:r>
-            <w:r>
-              <w:rPr>
-                <w:noProof/>
-                <w:webHidden/>
-              </w:rPr>
-              <w:t>17</w:t>
-            </w:r>
-            <w:r>
-              <w:rPr>
-                <w:noProof/>
-                <w:webHidden/>
-              </w:rPr>
-              <w:fldChar w:fldCharType="end"/>
-            </w:r>
-          </w:hyperlink>
-        </w:p>
-        <w:p>
-          <w:pPr>
-            <w:pStyle w:val="TOC1"/>
-            <w:tabs>
-              <w:tab w:val="left" w:pos="1200"/>
-              <w:tab w:val="right" w:leader="dot" w:pos="9062"/>
-            </w:tabs>
-            <w:spacing w:line="276" w:lineRule="auto"/>
-            <w:rPr>
-              <w:rFonts w:asciiTheme="minorHAnsi" w:eastAsiaTheme="minorEastAsia" w:hAnsiTheme="minorHAnsi" w:cstheme="minorBidi"/>
-              <w:noProof/>
-              <w:kern w:val="2"/>
-              <w:sz w:val="24"/>
-              <w:szCs w:val="24"/>
-              <w:lang/>
-              <w14:ligatures w14:val="standardContextual"/>
-            </w:rPr>
-          </w:pPr>
-          <w:hyperlink w:anchor="_Toc199063438" w:history="1">
-            <w:r>
-              <w:rPr>
-                <w:rStyle w:val="Hyperlink"/>
-                <w:noProof/>
-              </w:rPr>
-              <w:t>9.</w:t>
-            </w:r>
-            <w:r>
-              <w:rPr>
-                <w:rFonts w:asciiTheme="minorHAnsi" w:eastAsiaTheme="minorEastAsia" w:hAnsiTheme="minorHAnsi" w:cstheme="minorBidi"/>
-                <w:noProof/>
-                <w:kern w:val="2"/>
-                <w:sz w:val="24"/>
-                <w:szCs w:val="24"/>
-                <w:lang/>
-                <w14:ligatures w14:val="standardContextual"/>
-              </w:rPr>
-              <w:tab/>
-            </w:r>
-            <w:r>
-              <w:rPr>
-                <w:rStyle w:val="Hyperlink"/>
-                <w:noProof/>
-              </w:rPr>
-              <w:t>Заключение</w:t>
-            </w:r>
-            <w:r>
-              <w:rPr>
-                <w:noProof/>
-                <w:webHidden/>
-              </w:rPr>
-              <w:tab/>
-            </w:r>
-            <w:r>
-              <w:rPr>
-                <w:noProof/>
-                <w:webHidden/>
-              </w:rPr>
-              <w:fldChar w:fldCharType="begin"/>
-            </w:r>
-            <w:r>
-              <w:rPr>
-                <w:noProof/>
-                <w:webHidden/>
-              </w:rPr>
-              <w:instrText xml:space="preserve"> PAGEREF _Toc199063438 \h </w:instrText>
-            </w:r>
-            <w:r>
-              <w:rPr>
-                <w:noProof/>
-                <w:webHidden/>
-              </w:rPr>
-            </w:r>
-            <w:r>
-              <w:rPr>
-                <w:noProof/>
-                <w:webHidden/>
-              </w:rPr>
-              <w:fldChar w:fldCharType="separate"/>
-            </w:r>
-            <w:r>
-              <w:rPr>
-                <w:noProof/>
-                <w:webHidden/>
-              </w:rPr>
-              <w:t>17</w:t>
-            </w:r>
-            <w:r>
-              <w:rPr>
-                <w:noProof/>
-                <w:webHidden/>
-              </w:rPr>
-              <w:fldChar w:fldCharType="end"/>
-            </w:r>
-          </w:hyperlink>
-        </w:p>
-        <w:p>
-          <w:pPr>
-            <w:pStyle w:val="TOC1"/>
-            <w:tabs>
-              <w:tab w:val="left" w:pos="1440"/>
-              <w:tab w:val="right" w:leader="dot" w:pos="9062"/>
-            </w:tabs>
-            <w:spacing w:line="276" w:lineRule="auto"/>
-            <w:rPr>
-              <w:rFonts w:asciiTheme="minorHAnsi" w:eastAsiaTheme="minorEastAsia" w:hAnsiTheme="minorHAnsi" w:cstheme="minorBidi"/>
-              <w:noProof/>
-              <w:kern w:val="2"/>
-              <w:sz w:val="24"/>
-              <w:szCs w:val="24"/>
-              <w:lang/>
-              <w14:ligatures w14:val="standardContextual"/>
-            </w:rPr>
-          </w:pPr>
-          <w:hyperlink w:anchor="_Toc199063439" w:history="1">
-            <w:r>
-              <w:rPr>
-                <w:rStyle w:val="Hyperlink"/>
-                <w:noProof/>
-              </w:rPr>
-              <w:t>10.</w:t>
-            </w:r>
-            <w:r>
-              <w:rPr>
-                <w:rFonts w:asciiTheme="minorHAnsi" w:eastAsiaTheme="minorEastAsia" w:hAnsiTheme="minorHAnsi" w:cstheme="minorBidi"/>
-                <w:noProof/>
-                <w:kern w:val="2"/>
-                <w:sz w:val="24"/>
-                <w:szCs w:val="24"/>
-                <w:lang/>
-                <w14:ligatures w14:val="standardContextual"/>
-              </w:rPr>
-              <w:tab/>
-            </w:r>
-            <w:r>
-              <w:rPr>
-                <w:rStyle w:val="Hyperlink"/>
-                <w:noProof/>
-              </w:rPr>
-              <w:t>Използвана литература</w:t>
-            </w:r>
-            <w:r>
-              <w:rPr>
-                <w:noProof/>
-                <w:webHidden/>
-              </w:rPr>
-              <w:tab/>
-            </w:r>
-            <w:r>
-              <w:rPr>
-                <w:noProof/>
-                <w:webHidden/>
-              </w:rPr>
-              <w:fldChar w:fldCharType="begin"/>
-            </w:r>
-            <w:r>
-              <w:rPr>
-                <w:noProof/>
-                <w:webHidden/>
-              </w:rPr>
-              <w:instrText xml:space="preserve"> PAGEREF _Toc199063439 \h </w:instrText>
-            </w:r>
-            <w:r>
-              <w:rPr>
-                <w:noProof/>
-                <w:webHidden/>
-              </w:rPr>
-            </w:r>
-            <w:r>
-              <w:rPr>
-                <w:noProof/>
-                <w:webHidden/>
-              </w:rPr>
-              <w:fldChar w:fldCharType="separate"/>
-            </w:r>
-            <w:r>
-              <w:rPr>
-                <w:noProof/>
-                <w:webHidden/>
-              </w:rPr>
-              <w:t>18</w:t>
-            </w:r>
-            <w:r>
-              <w:rPr>
-                <w:noProof/>
-                <w:webHidden/>
-              </w:rPr>
-              <w:fldChar w:fldCharType="end"/>
-            </w:r>
-          </w:hyperlink>
-        </w:p>
-        <w:p>
-          <w:pPr>
-            <w:pStyle w:val="TOC1"/>
-            <w:spacing w:line="276" w:lineRule="auto"/>
+            <w:ind w:firstLine="0"/>
           </w:pPr>
           <w:r>
             <w:fldChar w:fldCharType="end"/>
@@ -2850,7 +3043,7 @@
       <w:pPr>
         <w:pStyle w:val="Heading1"/>
       </w:pPr>
-      <w:bookmarkStart w:id="0" w:name="_Toc199063411"/>
+      <w:bookmarkStart w:id="0" w:name="_Toc199088375"/>
       <w:r>
         <w:lastRenderedPageBreak/>
         <w:t>Увод</w:t>
@@ -2888,7 +3081,23 @@
     </w:p>
     <w:p>
       <w:r>
-        <w:t>Двата основни вида постояннотокови двигатели са т.нар. четкови и безчеткови мотори</w:t>
+        <w:t xml:space="preserve">Двата основни вида постояннотокови двигатели са т.нар. </w:t>
+      </w:r>
+      <w:proofErr w:type="spellStart"/>
+      <w:r>
+        <w:t>четкови</w:t>
+      </w:r>
+      <w:proofErr w:type="spellEnd"/>
+      <w:r>
+        <w:t xml:space="preserve"> и </w:t>
+      </w:r>
+      <w:proofErr w:type="spellStart"/>
+      <w:r>
+        <w:t>безчеткови</w:t>
+      </w:r>
+      <w:proofErr w:type="spellEnd"/>
+      <w:r>
+        <w:t xml:space="preserve"> мотори</w:t>
       </w:r>
       <w:r>
         <w:rPr>
@@ -2900,13 +3109,29 @@
         <w:t>.</w:t>
       </w:r>
       <w:r>
-        <w:t xml:space="preserve"> Основно предимство на четковите мотори е тяхната ниска цена и лесно управление. </w:t>
-      </w:r>
-      <w:r>
-        <w:t>От друга страна, б</w:t>
-      </w:r>
-      <w:r>
-        <w:t>езчетковите мотори са по-ефективни</w:t>
+        <w:t xml:space="preserve"> Основно предимство на </w:t>
+      </w:r>
+      <w:proofErr w:type="spellStart"/>
+      <w:r>
+        <w:t>четковите</w:t>
+      </w:r>
+      <w:proofErr w:type="spellEnd"/>
+      <w:r>
+        <w:t xml:space="preserve"> мотори е тяхната ниска цена и лесно управление. </w:t>
+      </w:r>
+      <w:r>
+        <w:t xml:space="preserve">От друга страна, </w:t>
+      </w:r>
+      <w:proofErr w:type="spellStart"/>
+      <w:r>
+        <w:t>б</w:t>
+      </w:r>
+      <w:r>
+        <w:t>езчетковите</w:t>
+      </w:r>
+      <w:proofErr w:type="spellEnd"/>
+      <w:r>
+        <w:t xml:space="preserve"> мотори са по-ефективни</w:t>
       </w:r>
       <w:r>
         <w:t>, по-компактни</w:t>
@@ -2918,13 +3143,29 @@
         <w:t>поддръжката им е по-лесна и имат по-дълъг живот. Всичко това обаче е за сметка на</w:t>
       </w:r>
       <w:r>
-        <w:t xml:space="preserve"> по-високата им цена, която до голяма степен е свързана с по-сложното управление. Докато при четковите мотори задвижването става чрез подаване на постоянно напрежение </w:t>
+        <w:t xml:space="preserve"> по-високата им цена, която до голяма степен е свързана с по-сложното управление. Докато при </w:t>
+      </w:r>
+      <w:proofErr w:type="spellStart"/>
+      <w:r>
+        <w:t>четковите</w:t>
+      </w:r>
+      <w:proofErr w:type="spellEnd"/>
+      <w:r>
+        <w:t xml:space="preserve"> мотори задвижването става чрез подаване на постоянно напрежение </w:t>
       </w:r>
       <w:r>
         <w:t>към</w:t>
       </w:r>
       <w:r>
-        <w:t xml:space="preserve"> две намотки, безчетковите мотори изискват синхронно управление </w:t>
+        <w:t xml:space="preserve"> две намотки, </w:t>
+      </w:r>
+      <w:proofErr w:type="spellStart"/>
+      <w:r>
+        <w:t>безчетковите</w:t>
+      </w:r>
+      <w:proofErr w:type="spellEnd"/>
+      <w:r>
+        <w:t xml:space="preserve"> мотори изискват синхронно управление </w:t>
       </w:r>
       <w:r>
         <w:t xml:space="preserve">(обикновено трифазно) </w:t>
@@ -2956,13 +3197,29 @@
         <w:t>те</w:t>
       </w:r>
       <w:r>
-        <w:t xml:space="preserve"> безчеткови </w:t>
+        <w:t xml:space="preserve"> </w:t>
+      </w:r>
+      <w:proofErr w:type="spellStart"/>
+      <w:r>
+        <w:t>безчеткови</w:t>
+      </w:r>
+      <w:proofErr w:type="spellEnd"/>
+      <w:r>
+        <w:t xml:space="preserve"> </w:t>
       </w:r>
       <w:r>
         <w:t xml:space="preserve">мотори продукти биват значително оскъпени и от </w:t>
       </w:r>
       <w:r>
-        <w:t>цената за развой на управляващия фърмуер.</w:t>
+        <w:t xml:space="preserve">цената за развой на управляващия </w:t>
+      </w:r>
+      <w:proofErr w:type="spellStart"/>
+      <w:r>
+        <w:t>фърмуер</w:t>
+      </w:r>
+      <w:proofErr w:type="spellEnd"/>
+      <w:r>
+        <w:t>.</w:t>
       </w:r>
       <w:r>
         <w:t xml:space="preserve"> </w:t>
@@ -2980,7 +3237,15 @@
         <w:t>по</w:t>
       </w:r>
       <w:r>
-        <w:t xml:space="preserve"> развой на фърмуера е един от начините цената на крайния продукт да бъде понижена.</w:t>
+        <w:t xml:space="preserve"> развой на </w:t>
+      </w:r>
+      <w:proofErr w:type="spellStart"/>
+      <w:r>
+        <w:t>фърмуера</w:t>
+      </w:r>
+      <w:proofErr w:type="spellEnd"/>
+      <w:r>
+        <w:t xml:space="preserve"> е един от начините цената на крайния продукт да бъде понижена.</w:t>
       </w:r>
     </w:p>
     <w:p>
@@ -3015,13 +3280,26 @@
         <w:t>свързана с</w:t>
       </w:r>
       <w:r>
-        <w:t xml:space="preserve"> по-голямо топлоотделяне</w:t>
-      </w:r>
+        <w:t xml:space="preserve"> по-голямо </w:t>
+      </w:r>
+      <w:proofErr w:type="spellStart"/>
+      <w:r>
+        <w:t>топлоотделяне</w:t>
+      </w:r>
+      <w:proofErr w:type="spellEnd"/>
       <w:r>
         <w:t>.</w:t>
       </w:r>
       <w:r>
-        <w:t xml:space="preserve"> По-сложното управление на безчетковите мотори </w:t>
+        <w:t xml:space="preserve"> По-сложното управление на </w:t>
+      </w:r>
+      <w:proofErr w:type="spellStart"/>
+      <w:r>
+        <w:t>безчетковите</w:t>
+      </w:r>
+      <w:proofErr w:type="spellEnd"/>
+      <w:r>
+        <w:t xml:space="preserve"> мотори </w:t>
       </w:r>
       <w:r>
         <w:t xml:space="preserve">има </w:t>
@@ -3034,16 +3312,48 @@
       </w:r>
       <w:r>
         <w:lastRenderedPageBreak/>
-        <w:t xml:space="preserve">хора, така и самите схеми, към които е свързан той. От друга страна обаче, грешки в управляващия фърмуер могат да доведат до нови рискове, които не са </w:t>
+        <w:t xml:space="preserve">хора, така и самите схеми, към които е свързан той. От друга страна обаче, грешки в управляващия </w:t>
+      </w:r>
+      <w:proofErr w:type="spellStart"/>
+      <w:r>
+        <w:t>фърмуер</w:t>
+      </w:r>
+      <w:proofErr w:type="spellEnd"/>
+      <w:r>
+        <w:t xml:space="preserve"> могат да доведат до нови рискове, които не са </w:t>
       </w:r>
       <w:r>
         <w:t>типични</w:t>
       </w:r>
       <w:r>
-        <w:t xml:space="preserve"> за четковите мотори – например късо съединение между захранващата шина и масата на схемата, което да доведе до възпламеняване.</w:t>
-      </w:r>
-      <w:r>
-        <w:t xml:space="preserve"> Поради тези причини се налага обстойно и внимателно изследване и валидация на управляващия фърмуер на безчетковите мотори. Това е още един фактор, допринасящ за повишената цена на този вид двигатели и още една причина да се търсят начини за</w:t>
+        <w:t xml:space="preserve"> за </w:t>
+      </w:r>
+      <w:proofErr w:type="spellStart"/>
+      <w:r>
+        <w:t>четковите</w:t>
+      </w:r>
+      <w:proofErr w:type="spellEnd"/>
+      <w:r>
+        <w:t xml:space="preserve"> мотори – например късо съединение между захранващата шина и масата на схемата, което да доведе до възпламеняване.</w:t>
+      </w:r>
+      <w:r>
+        <w:t xml:space="preserve"> Поради тези причини се налага обстойно и внимателно изследване и валидация на управляващия </w:t>
+      </w:r>
+      <w:proofErr w:type="spellStart"/>
+      <w:r>
+        <w:t>фърмуер</w:t>
+      </w:r>
+      <w:proofErr w:type="spellEnd"/>
+      <w:r>
+        <w:t xml:space="preserve"> на </w:t>
+      </w:r>
+      <w:proofErr w:type="spellStart"/>
+      <w:r>
+        <w:t>безчетковите</w:t>
+      </w:r>
+      <w:proofErr w:type="spellEnd"/>
+      <w:r>
+        <w:t xml:space="preserve"> мотори. Това е още един фактор, допринасящ за повишената цена на този вид двигатели и още една причина да се търсят начини за</w:t>
       </w:r>
       <w:r>
         <w:t xml:space="preserve"> опростяване</w:t>
@@ -3073,8 +3383,21 @@
       <w:r>
         <w:t xml:space="preserve">компресорна помпа с </w:t>
       </w:r>
-      <w:r>
-        <w:t>безчетков постояннотоков двигател без да се налага разработка на управляващ фърмуер.</w:t>
+      <w:proofErr w:type="spellStart"/>
+      <w:r>
+        <w:t>безчетков</w:t>
+      </w:r>
+      <w:proofErr w:type="spellEnd"/>
+      <w:r>
+        <w:t xml:space="preserve"> постояннотоков двигател без да се налага разработка на управляващ </w:t>
+      </w:r>
+      <w:proofErr w:type="spellStart"/>
+      <w:r>
+        <w:t>фърмуер</w:t>
+      </w:r>
+      <w:proofErr w:type="spellEnd"/>
+      <w:r>
+        <w:t>.</w:t>
       </w:r>
     </w:p>
     <w:p>
@@ -3084,8 +3407,13 @@
       <w:r>
         <w:t xml:space="preserve">трифазни </w:t>
       </w:r>
-      <w:r>
-        <w:t>безчеткови постояннотокови двигатели</w:t>
+      <w:proofErr w:type="spellStart"/>
+      <w:r>
+        <w:t>безчеткови</w:t>
+      </w:r>
+      <w:proofErr w:type="spellEnd"/>
+      <w:r>
+        <w:t xml:space="preserve"> постояннотокови двигатели</w:t>
       </w:r>
       <w:r>
         <w:rPr>
@@ -3135,13 +3463,29 @@
     </w:p>
     <w:p>
       <w:r>
-        <w:t xml:space="preserve">Ще бъдат дефинирани изисквания към разработваното устройство. Ще бъде проектирана електрическа схема за управление на безчетков постояннотоков </w:t>
+        <w:t xml:space="preserve">Ще бъдат дефинирани изисквания към разработваното устройство. Ще бъде проектирана електрическа схема за управление на </w:t>
+      </w:r>
+      <w:proofErr w:type="spellStart"/>
+      <w:r>
+        <w:t>безчетков</w:t>
+      </w:r>
+      <w:proofErr w:type="spellEnd"/>
+      <w:r>
+        <w:t xml:space="preserve"> постояннотоков </w:t>
       </w:r>
       <w:r>
         <w:t>двигател</w:t>
       </w:r>
       <w:r>
-        <w:t xml:space="preserve"> без нужда от разработка на фърмуер. Ще бъде проектирана печатна платк</w:t>
+        <w:t xml:space="preserve"> без нужда от разработка на </w:t>
+      </w:r>
+      <w:proofErr w:type="spellStart"/>
+      <w:r>
+        <w:t>фърмуер</w:t>
+      </w:r>
+      <w:proofErr w:type="spellEnd"/>
+      <w:r>
+        <w:t>. Ще бъде проектирана печатна платк</w:t>
       </w:r>
       <w:r>
         <w:t>а</w:t>
@@ -3172,7 +3516,6 @@
           <w:szCs w:val="36"/>
         </w:rPr>
       </w:pPr>
-      <w:bookmarkStart w:id="1" w:name="_Toc199063412"/>
       <w:r>
         <w:br w:type="page"/>
       </w:r>
@@ -3181,6 +3524,7 @@
       <w:pPr>
         <w:pStyle w:val="Heading1"/>
       </w:pPr>
+      <w:bookmarkStart w:id="1" w:name="_Toc199088376"/>
       <w:r>
         <w:lastRenderedPageBreak/>
         <w:t>Литературно проучване</w:t>
@@ -3207,11 +3551,16 @@
         <w:t>Параметрите на</w:t>
       </w:r>
       <w:r>
-        <w:t xml:space="preserve"> безчетков</w:t>
+        <w:t xml:space="preserve"> </w:t>
+      </w:r>
+      <w:proofErr w:type="spellStart"/>
+      <w:r>
+        <w:t>безчетков</w:t>
       </w:r>
       <w:r>
         <w:t>ия</w:t>
       </w:r>
+      <w:proofErr w:type="spellEnd"/>
       <w:r>
         <w:t xml:space="preserve"> мотор, който ще бъде управляван;</w:t>
       </w:r>
@@ -3237,7 +3586,15 @@
         </w:numPr>
       </w:pPr>
       <w:r>
-        <w:t>Подходящ интегриран драйвер, който елиминира нуждата от разработка на управляващ фърмуер;</w:t>
+        <w:t xml:space="preserve">Подходящ интегриран драйвер, който елиминира нуждата от разработка на управляващ </w:t>
+      </w:r>
+      <w:proofErr w:type="spellStart"/>
+      <w:r>
+        <w:t>фърмуер</w:t>
+      </w:r>
+      <w:proofErr w:type="spellEnd"/>
+      <w:r>
+        <w:t>;</w:t>
       </w:r>
     </w:p>
     <w:p>
@@ -3263,7 +3620,15 @@
         <w:t xml:space="preserve"> са най-подходящи за целите на разработваното устройство. </w:t>
       </w:r>
       <w:r>
-        <w:t xml:space="preserve">Тъй като компресорната помпа, която трябва да бъде управлявана от проектираното устройство използва трифазен безчетков мотор, от </w:t>
+        <w:t xml:space="preserve">Тъй като компресорната помпа, която трябва да бъде управлявана от проектираното устройство използва трифазен </w:t>
+      </w:r>
+      <w:proofErr w:type="spellStart"/>
+      <w:r>
+        <w:t>безчетков</w:t>
+      </w:r>
+      <w:proofErr w:type="spellEnd"/>
+      <w:r>
+        <w:t xml:space="preserve"> мотор, от </w:t>
       </w:r>
       <w:r>
         <w:t>тук</w:t>
@@ -3302,19 +3667,21 @@
       <w:pPr>
         <w:pStyle w:val="Heading2"/>
       </w:pPr>
-      <w:bookmarkStart w:id="2" w:name="_Toc199063413"/>
+      <w:bookmarkStart w:id="2" w:name="_Toc199088377"/>
       <w:r>
         <w:t xml:space="preserve">Видове </w:t>
       </w:r>
       <w:r>
         <w:t xml:space="preserve">трифазни </w:t>
       </w:r>
+      <w:proofErr w:type="spellStart"/>
       <w:r>
         <w:t>б</w:t>
       </w:r>
       <w:r>
         <w:t>езчеткови</w:t>
       </w:r>
+      <w:proofErr w:type="spellEnd"/>
       <w:r>
         <w:t xml:space="preserve"> </w:t>
       </w:r>
@@ -3377,11 +3744,16 @@
         <w:spacing w:after="240"/>
       </w:pPr>
       <w:r>
-        <w:t>Трифазните б</w:t>
+        <w:t xml:space="preserve">Трифазните </w:t>
+      </w:r>
+      <w:proofErr w:type="spellStart"/>
+      <w:r>
+        <w:t>б</w:t>
       </w:r>
       <w:r>
         <w:t>езчеткови</w:t>
       </w:r>
+      <w:proofErr w:type="spellEnd"/>
       <w:r>
         <w:t xml:space="preserve"> </w:t>
       </w:r>
@@ -3438,7 +3810,7 @@
       <w:pPr>
         <w:pStyle w:val="Heading3"/>
       </w:pPr>
-      <w:bookmarkStart w:id="3" w:name="_Toc199063414"/>
+      <w:bookmarkStart w:id="3" w:name="_Toc199088378"/>
       <w:r>
         <w:t>Спрямо наличието на сензори</w:t>
       </w:r>
@@ -3446,7 +3818,15 @@
     </w:p>
     <w:p>
       <w:r>
-        <w:t xml:space="preserve">При управлението на безчеткови мотори, за да се синхронизира  </w:t>
+        <w:t xml:space="preserve">При управлението на </w:t>
+      </w:r>
+      <w:proofErr w:type="spellStart"/>
+      <w:r>
+        <w:t>безчеткови</w:t>
+      </w:r>
+      <w:proofErr w:type="spellEnd"/>
+      <w:r>
+        <w:t xml:space="preserve"> мотори, за да се синхронизира  </w:t>
       </w:r>
       <w:r>
         <w:t xml:space="preserve">въртенето на </w:t>
@@ -3474,7 +3854,21 @@
         <w:rPr>
           <w:lang w:val="en-US"/>
         </w:rPr>
-        <w:t>(sensored)</w:t>
+        <w:t>(</w:t>
+      </w:r>
+      <w:proofErr w:type="spellStart"/>
+      <w:r>
+        <w:rPr>
+          <w:lang w:val="en-US"/>
+        </w:rPr>
+        <w:t>sensored</w:t>
+      </w:r>
+      <w:proofErr w:type="spellEnd"/>
+      <w:r>
+        <w:rPr>
+          <w:lang w:val="en-US"/>
+        </w:rPr>
+        <w:t>)</w:t>
       </w:r>
       <w:r>
         <w:t xml:space="preserve"> и без вградени сензори</w:t>
@@ -3483,7 +3877,21 @@
         <w:rPr>
           <w:lang w:val="en-US"/>
         </w:rPr>
-        <w:t xml:space="preserve"> (sensorless)</w:t>
+        <w:t xml:space="preserve"> (</w:t>
+      </w:r>
+      <w:proofErr w:type="spellStart"/>
+      <w:r>
+        <w:rPr>
+          <w:lang w:val="en-US"/>
+        </w:rPr>
+        <w:t>sensorless</w:t>
+      </w:r>
+      <w:proofErr w:type="spellEnd"/>
+      <w:r>
+        <w:rPr>
+          <w:lang w:val="en-US"/>
+        </w:rPr>
+        <w:t>)</w:t>
       </w:r>
       <w:r>
         <w:t xml:space="preserve">. На </w:t>
@@ -3512,7 +3920,7 @@
           <w:lang w:val="en-US"/>
         </w:rPr>
         <w:drawing>
-          <wp:inline distT="0" distB="0" distL="0" distR="0" wp14:anchorId="6DB53E94" wp14:editId="0328DF25">
+          <wp:inline distT="0" distB="0" distL="0" distR="0" wp14:anchorId="6DB53E94" wp14:editId="5054C9BE">
             <wp:extent cx="5760720" cy="1991360"/>
             <wp:effectExtent l="0" t="0" r="0" b="0"/>
             <wp:docPr id="139262390" name="Picture 1"/>
@@ -3734,7 +4142,29 @@
           <w:sz w:val="28"/>
           <w:szCs w:val="28"/>
         </w:rPr>
-        <w:t>Управление на безчетков мотор с Хол сензори (ляво) и без вградени сензори (дясно)</w:t>
+        <w:t xml:space="preserve">Управление на </w:t>
+      </w:r>
+      <w:proofErr w:type="spellStart"/>
+      <w:r>
+        <w:rPr>
+          <w:i w:val="0"/>
+          <w:iCs w:val="0"/>
+          <w:color w:val="auto"/>
+          <w:sz w:val="28"/>
+          <w:szCs w:val="28"/>
+        </w:rPr>
+        <w:t>безчетков</w:t>
+      </w:r>
+      <w:proofErr w:type="spellEnd"/>
+      <w:r>
+        <w:rPr>
+          <w:i w:val="0"/>
+          <w:iCs w:val="0"/>
+          <w:color w:val="auto"/>
+          <w:sz w:val="28"/>
+          <w:szCs w:val="28"/>
+        </w:rPr>
+        <w:t xml:space="preserve"> мотор с Хол сензори (ляво) и без вградени сензори (дясно)</w:t>
       </w:r>
     </w:p>
     <w:p>
@@ -3767,11 +4197,21 @@
         <w:t>оторите без вградени сензори</w:t>
       </w:r>
       <w:r>
-        <w:t xml:space="preserve">, позицията на ротора трябва да бъде установена от управлението по косвен начин. Най-често това става чрез използване на обратното електродвижещо напрежение (ЕДН), генерирано в намотките на статора. Недостатък на тази конструкция е невъзможността за работа при ниски скорости, когато обратното ЕДН е прекалено малко. Безсензорното управление също така е по-сложно за изпълнение от гледна точка </w:t>
-      </w:r>
+        <w:t xml:space="preserve">, позицията на ротора трябва да бъде установена от управлението по косвен начин. Най-често това става чрез използване на обратното електродвижещо напрежение (ЕДН), генерирано в намотките на статора. Недостатък на тази конструкция е невъзможността за работа при ниски скорости, когато обратното ЕДН е прекалено малко. </w:t>
+      </w:r>
+      <w:proofErr w:type="spellStart"/>
+      <w:r>
+        <w:t>Безсензорното</w:t>
+      </w:r>
+      <w:proofErr w:type="spellEnd"/>
+      <w:r>
+        <w:t xml:space="preserve"> управление също така е по-сложно за изпълнение от гледна точка </w:t>
+      </w:r>
+      <w:proofErr w:type="spellStart"/>
       <w:r>
         <w:t>фърмуер</w:t>
       </w:r>
+      <w:proofErr w:type="spellEnd"/>
       <w:r>
         <w:t>. За сметка на това този тип мотори обикновено са по-евтини и по-надеждни.</w:t>
       </w:r>
@@ -3795,14 +4235,30 @@
         <w:t>без вградени сензори</w:t>
       </w:r>
       <w:r>
-        <w:t>, което налага подбирането на управление, което може да работи с безсензорни безчеткови мотори.</w:t>
+        <w:t xml:space="preserve">, което налага подбирането на управление, което може да работи с </w:t>
+      </w:r>
+      <w:proofErr w:type="spellStart"/>
+      <w:r>
+        <w:t>безсензорни</w:t>
+      </w:r>
+      <w:proofErr w:type="spellEnd"/>
+      <w:r>
+        <w:t xml:space="preserve"> </w:t>
+      </w:r>
+      <w:proofErr w:type="spellStart"/>
+      <w:r>
+        <w:t>безчеткови</w:t>
+      </w:r>
+      <w:proofErr w:type="spellEnd"/>
+      <w:r>
+        <w:t xml:space="preserve"> мотори.</w:t>
       </w:r>
     </w:p>
     <w:p>
       <w:pPr>
         <w:pStyle w:val="Heading3"/>
       </w:pPr>
-      <w:bookmarkStart w:id="4" w:name="_Toc199063415"/>
+      <w:bookmarkStart w:id="4" w:name="_Toc199088379"/>
       <w:r>
         <w:lastRenderedPageBreak/>
         <w:t>Спрямо броя полюси</w:t>
@@ -3816,11 +4272,16 @@
         </w:rPr>
       </w:pPr>
       <w:r>
-        <w:t>Роторът на безчеткови</w:t>
+        <w:t xml:space="preserve">Роторът на </w:t>
+      </w:r>
+      <w:proofErr w:type="spellStart"/>
+      <w:r>
+        <w:t>безчеткови</w:t>
       </w:r>
       <w:r>
         <w:t>я</w:t>
       </w:r>
+      <w:proofErr w:type="spellEnd"/>
       <w:r>
         <w:t xml:space="preserve"> мотор</w:t>
       </w:r>
@@ -3861,7 +4322,23 @@
         <w:t xml:space="preserve">ите </w:t>
       </w:r>
       <w:r>
-        <w:t>на двуполюсен и четириполюсен безчетков мотор.</w:t>
+        <w:t xml:space="preserve">на двуполюсен и </w:t>
+      </w:r>
+      <w:proofErr w:type="spellStart"/>
+      <w:r>
+        <w:t>четириполюсен</w:t>
+      </w:r>
+      <w:proofErr w:type="spellEnd"/>
+      <w:r>
+        <w:t xml:space="preserve"> </w:t>
+      </w:r>
+      <w:proofErr w:type="spellStart"/>
+      <w:r>
+        <w:t>безчетков</w:t>
+      </w:r>
+      <w:proofErr w:type="spellEnd"/>
+      <w:r>
+        <w:t xml:space="preserve"> мотор.</w:t>
       </w:r>
       <w:r>
         <w:t xml:space="preserve"> </w:t>
@@ -4101,15 +4578,27 @@
         </w:rPr>
         <w:t xml:space="preserve">. </w:t>
       </w:r>
-      <w:r>
-        <w:rPr>
-          <w:i w:val="0"/>
-          <w:iCs w:val="0"/>
-          <w:color w:val="auto"/>
-          <w:sz w:val="28"/>
-          <w:szCs w:val="28"/>
-        </w:rPr>
-        <w:t>Безчетков мотор с 2 полюса (ляво) и с 4 полюса (дясно)</w:t>
+      <w:proofErr w:type="spellStart"/>
+      <w:r>
+        <w:rPr>
+          <w:i w:val="0"/>
+          <w:iCs w:val="0"/>
+          <w:color w:val="auto"/>
+          <w:sz w:val="28"/>
+          <w:szCs w:val="28"/>
+        </w:rPr>
+        <w:t>Безчетков</w:t>
+      </w:r>
+      <w:proofErr w:type="spellEnd"/>
+      <w:r>
+        <w:rPr>
+          <w:i w:val="0"/>
+          <w:iCs w:val="0"/>
+          <w:color w:val="auto"/>
+          <w:sz w:val="28"/>
+          <w:szCs w:val="28"/>
+        </w:rPr>
+        <w:t xml:space="preserve"> мотор с 2 полюса (ляво) и с 4 полюса (дясно)</w:t>
       </w:r>
     </w:p>
     <w:p>
@@ -4149,7 +4638,15 @@
         <w:t>За да се определи позицията на ротора при</w:t>
       </w:r>
       <w:r>
-        <w:t xml:space="preserve"> безчетков мотор без вградени сензори</w:t>
+        <w:t xml:space="preserve"> </w:t>
+      </w:r>
+      <w:proofErr w:type="spellStart"/>
+      <w:r>
+        <w:t>безчетков</w:t>
+      </w:r>
+      <w:proofErr w:type="spellEnd"/>
+      <w:r>
+        <w:t xml:space="preserve"> мотор без вградени сензори</w:t>
       </w:r>
       <w:r>
         <w:t>, броят полюси трябва да е известен предварително.</w:t>
@@ -4195,7 +4692,7 @@
       <w:pPr>
         <w:pStyle w:val="Heading3"/>
       </w:pPr>
-      <w:bookmarkStart w:id="5" w:name="_Toc199063416"/>
+      <w:bookmarkStart w:id="5" w:name="_Toc199088380"/>
       <w:r>
         <w:lastRenderedPageBreak/>
         <w:t>Спрямо формата на обратното ЕДН</w:t>
@@ -4204,7 +4701,15 @@
     </w:p>
     <w:p>
       <w:r>
-        <w:t>Според начина на навиване на намотките в статора, безчетковите мотори се разделят на такива с трапецовидно и със синусоидално обратно ЕДН. На фиг. 2.1.3. е показана разликата между двата вида.</w:t>
+        <w:t xml:space="preserve">Според начина на навиване на намотките в статора, </w:t>
+      </w:r>
+      <w:proofErr w:type="spellStart"/>
+      <w:r>
+        <w:t>безчетковите</w:t>
+      </w:r>
+      <w:proofErr w:type="spellEnd"/>
+      <w:r>
+        <w:t xml:space="preserve"> мотори се разделят на такива с трапецовидно и със синусоидално обратно ЕДН. На фиг. 2.1.3. е показана разликата между двата вида.</w:t>
       </w:r>
     </w:p>
     <w:tbl>
@@ -4475,7 +4980,29 @@
           <w:sz w:val="28"/>
           <w:szCs w:val="28"/>
         </w:rPr>
-        <w:t>Форма на обратното ЕДН на трапецовиден (ляво) и синусоидален (дясно) безчетков мотор</w:t>
+        <w:t xml:space="preserve">Форма на обратното ЕДН на трапецовиден (ляво) и синусоидален (дясно) </w:t>
+      </w:r>
+      <w:proofErr w:type="spellStart"/>
+      <w:r>
+        <w:rPr>
+          <w:i w:val="0"/>
+          <w:iCs w:val="0"/>
+          <w:color w:val="auto"/>
+          <w:sz w:val="28"/>
+          <w:szCs w:val="28"/>
+        </w:rPr>
+        <w:t>безчетков</w:t>
+      </w:r>
+      <w:proofErr w:type="spellEnd"/>
+      <w:r>
+        <w:rPr>
+          <w:i w:val="0"/>
+          <w:iCs w:val="0"/>
+          <w:color w:val="auto"/>
+          <w:sz w:val="28"/>
+          <w:szCs w:val="28"/>
+        </w:rPr>
+        <w:t xml:space="preserve"> мотор</w:t>
       </w:r>
     </w:p>
     <w:p>
@@ -4556,8 +5083,13 @@
       </w:r>
     </w:p>
     <w:p>
-      <w:r>
-        <w:t>Безчетковия мотор в к</w:t>
+      <w:proofErr w:type="spellStart"/>
+      <w:r>
+        <w:t>Безчетковия</w:t>
+      </w:r>
+      <w:proofErr w:type="spellEnd"/>
+      <w:r>
+        <w:t xml:space="preserve"> мотор в к</w:t>
       </w:r>
       <w:r>
         <w:t>омпресорната помпа, която трябва да бъде управлявана от проектираното устройство</w:t>
@@ -4601,7 +5133,7 @@
       <w:pPr>
         <w:pStyle w:val="Heading2"/>
       </w:pPr>
-      <w:bookmarkStart w:id="6" w:name="_Toc199063417"/>
+      <w:bookmarkStart w:id="6" w:name="_Toc199088381"/>
       <w:r>
         <w:t>Алгоритми за управление</w:t>
       </w:r>
@@ -4611,8 +5143,13 @@
       <w:r>
         <w:t xml:space="preserve">трифазни </w:t>
       </w:r>
-      <w:r>
-        <w:t>безчеткови мотори</w:t>
+      <w:proofErr w:type="spellStart"/>
+      <w:r>
+        <w:t>безчеткови</w:t>
+      </w:r>
+      <w:proofErr w:type="spellEnd"/>
+      <w:r>
+        <w:t xml:space="preserve"> мотори</w:t>
       </w:r>
       <w:r>
         <w:rPr>
@@ -4636,8 +5173,13 @@
       <w:r>
         <w:t xml:space="preserve">трифазни </w:t>
       </w:r>
-      <w:r>
-        <w:t xml:space="preserve">безчеткови мотори – трапецовидно, синусоидално и полево-ориентирано (т.нар. </w:t>
+      <w:proofErr w:type="spellStart"/>
+      <w:r>
+        <w:t>безчеткови</w:t>
+      </w:r>
+      <w:proofErr w:type="spellEnd"/>
+      <w:r>
+        <w:t xml:space="preserve"> мотори – трапецовидно, синусоидално и полево-ориентирано (т.нар. </w:t>
       </w:r>
       <w:r>
         <w:rPr>
@@ -4663,7 +5205,7 @@
       <w:pPr>
         <w:pStyle w:val="Heading3"/>
       </w:pPr>
-      <w:bookmarkStart w:id="7" w:name="_Toc199063418"/>
+      <w:bookmarkStart w:id="7" w:name="_Toc199088382"/>
       <w:r>
         <w:t>Трапецовидно управление</w:t>
       </w:r>
@@ -4671,7 +5213,15 @@
     </w:p>
     <w:p>
       <w:r>
-        <w:t xml:space="preserve">Това представлява най-простият алгоритъм за управление на безчеткови мотори. При него </w:t>
+        <w:t xml:space="preserve">Това представлява най-простият алгоритъм за управление на </w:t>
+      </w:r>
+      <w:proofErr w:type="spellStart"/>
+      <w:r>
+        <w:t>безчеткови</w:t>
+      </w:r>
+      <w:proofErr w:type="spellEnd"/>
+      <w:r>
+        <w:t xml:space="preserve"> мотори. При него </w:t>
       </w:r>
       <w:r>
         <w:t>през намотките се пуска ток по фиксирана последователност от 6 стъпки</w:t>
@@ -5083,7 +5633,7 @@
       <w:pPr>
         <w:pStyle w:val="Heading3"/>
       </w:pPr>
-      <w:bookmarkStart w:id="8" w:name="_Toc199063419"/>
+      <w:bookmarkStart w:id="8" w:name="_Toc199088383"/>
       <w:r>
         <w:lastRenderedPageBreak/>
         <w:t>Синусоидално управление</w:t>
@@ -5410,7 +5960,7 @@
       <w:pPr>
         <w:pStyle w:val="Heading3"/>
       </w:pPr>
-      <w:bookmarkStart w:id="9" w:name="_Toc199063420"/>
+      <w:bookmarkStart w:id="9" w:name="_Toc199088384"/>
       <w:r>
         <w:rPr>
           <w:lang w:val="en-US"/>
@@ -5437,7 +5987,15 @@
         <w:t>прецизно</w:t>
       </w:r>
       <w:r>
-        <w:t xml:space="preserve"> и ефективно управление на скоростта и въртящия момент на безчетков мотор. Принципът се основава на ориентиране на статорното поле по такъв начин, че то да е перпендикулярно на магнитния поток на ротора, така че да се получи максимален въртящ момент</w:t>
+        <w:t xml:space="preserve"> и ефективно управление на скоростта и въртящия момент на </w:t>
+      </w:r>
+      <w:proofErr w:type="spellStart"/>
+      <w:r>
+        <w:t>безчетков</w:t>
+      </w:r>
+      <w:proofErr w:type="spellEnd"/>
+      <w:r>
+        <w:t xml:space="preserve"> мотор. Принципът се основава на ориентиране на статорното поле по такъв начин, че то да е перпендикулярно на магнитния поток на ротора, така че да се получи максимален въртящ момент</w:t>
       </w:r>
       <w:r>
         <w:rPr>
@@ -5768,7 +6326,7 @@
       <w:pPr>
         <w:pStyle w:val="Heading3"/>
       </w:pPr>
-      <w:bookmarkStart w:id="10" w:name="_Toc199063421"/>
+      <w:bookmarkStart w:id="10" w:name="_Toc199088385"/>
       <w:r>
         <w:lastRenderedPageBreak/>
         <w:t>Сравнение между трите вида управление</w:t>
@@ -5777,7 +6335,15 @@
     </w:p>
     <w:p>
       <w:r>
-        <w:t>В табл. 2.2.1. е дадено сравнение между трите алгоритъма за управление на трифазни безчеткови мотори.</w:t>
+        <w:t xml:space="preserve">В табл. 2.2.1. е дадено сравнение между трите алгоритъма за управление на трифазни </w:t>
+      </w:r>
+      <w:proofErr w:type="spellStart"/>
+      <w:r>
+        <w:t>безчеткови</w:t>
+      </w:r>
+      <w:proofErr w:type="spellEnd"/>
+      <w:r>
+        <w:t xml:space="preserve"> мотори.</w:t>
       </w:r>
     </w:p>
     <w:p>
@@ -6640,7 +7206,15 @@
         <w:t xml:space="preserve"> компресорната помпа, която ще бъде управлявана от проектираното устройство, </w:t>
       </w:r>
       <w:r>
-        <w:t>използва безчетков мотор с трапецовидно обратно ЕДН</w:t>
+        <w:t xml:space="preserve">използва </w:t>
+      </w:r>
+      <w:proofErr w:type="spellStart"/>
+      <w:r>
+        <w:t>безчетков</w:t>
+      </w:r>
+      <w:proofErr w:type="spellEnd"/>
+      <w:r>
+        <w:t xml:space="preserve"> мотор с трапецовидно обратно ЕДН</w:t>
       </w:r>
       <w:r>
         <w:t xml:space="preserve">. Вземайки това предвид, подходящи за целите на дипломната работа са трапецовидното и </w:t>
@@ -6663,7 +7237,15 @@
         <w:t>,</w:t>
       </w:r>
       <w:r>
-        <w:t xml:space="preserve"> вече могат да бъдат разгледани наличните на пазара интегрирани драйвери за управление на безчеткови мотори, като фокусът ще бъде върху такива, предлагащи трапецовидно и</w:t>
+        <w:t xml:space="preserve"> вече могат да бъдат разгледани наличните на пазара интегрирани драйвери за управление на </w:t>
+      </w:r>
+      <w:proofErr w:type="spellStart"/>
+      <w:r>
+        <w:t>безчеткови</w:t>
+      </w:r>
+      <w:proofErr w:type="spellEnd"/>
+      <w:r>
+        <w:t xml:space="preserve"> мотори, като фокусът ще бъде върху такива, предлагащи трапецовидно и</w:t>
       </w:r>
       <w:r>
         <w:t>/или</w:t>
@@ -6707,7 +7289,7 @@
           <w:lang w:val="en-US"/>
         </w:rPr>
       </w:pPr>
-      <w:bookmarkStart w:id="11" w:name="_Toc199063422"/>
+      <w:bookmarkStart w:id="11" w:name="_Toc199088386"/>
       <w:r>
         <w:t>Интегрирани</w:t>
       </w:r>
@@ -6717,8 +7299,13 @@
       <w:r>
         <w:t xml:space="preserve">трифазни </w:t>
       </w:r>
-      <w:r>
-        <w:t xml:space="preserve">безчеткови </w:t>
+      <w:proofErr w:type="spellStart"/>
+      <w:r>
+        <w:t>безчеткови</w:t>
+      </w:r>
+      <w:proofErr w:type="spellEnd"/>
+      <w:r>
+        <w:t xml:space="preserve"> </w:t>
       </w:r>
       <w:r>
         <w:t>мотори</w:t>
@@ -6808,6 +7395,7 @@
           <w:lang w:val="en-US"/>
         </w:rPr>
       </w:pPr>
+      <w:bookmarkStart w:id="12" w:name="_Toc199088387"/>
       <w:r>
         <w:rPr>
           <w:lang w:val="en-US"/>
@@ -6830,6 +7418,7 @@
         </w:rPr>
         <w:t>[5]</w:t>
       </w:r>
+      <w:bookmarkEnd w:id="12"/>
     </w:p>
     <w:p>
       <w:r>
@@ -7185,7 +7774,15 @@
         <w:t>Много висок</w:t>
       </w:r>
       <w:r>
-        <w:t xml:space="preserve"> гейтов ток: 1</w:t>
+        <w:t xml:space="preserve"> </w:t>
+      </w:r>
+      <w:proofErr w:type="spellStart"/>
+      <w:r>
+        <w:t>гейтов</w:t>
+      </w:r>
+      <w:proofErr w:type="spellEnd"/>
+      <w:r>
+        <w:t xml:space="preserve"> ток: 1</w:t>
       </w:r>
       <w:r>
         <w:rPr>
@@ -7218,7 +7815,15 @@
         </w:numPr>
       </w:pPr>
       <w:r>
-        <w:t xml:space="preserve">Високо гейтово напрежение: </w:t>
+        <w:t xml:space="preserve">Високо </w:t>
+      </w:r>
+      <w:proofErr w:type="spellStart"/>
+      <w:r>
+        <w:t>гейтово</w:t>
+      </w:r>
+      <w:proofErr w:type="spellEnd"/>
+      <w:r>
+        <w:t xml:space="preserve"> напрежение: </w:t>
       </w:r>
       <w:r>
         <w:rPr>
@@ -7306,10 +7911,7 @@
         <w:t>Проблеми и недостатъци</w:t>
       </w:r>
       <w:r>
-        <w:t xml:space="preserve"> с оглед на конкретното приложение</w:t>
-      </w:r>
-      <w:r>
-        <w:t>:</w:t>
+        <w:t xml:space="preserve"> с оглед на конкретното приложение:</w:t>
       </w:r>
     </w:p>
     <w:p>
@@ -7373,7 +7975,6 @@
       <w:pPr>
         <w:spacing w:line="276" w:lineRule="auto"/>
       </w:pPr>
-      <w:bookmarkStart w:id="12" w:name="_Toc199063423"/>
     </w:p>
     <w:p>
       <w:pPr>
@@ -7382,6 +7983,7 @@
           <w:lang w:val="en-US"/>
         </w:rPr>
       </w:pPr>
+      <w:bookmarkStart w:id="13" w:name="_Toc199088388"/>
       <w:r>
         <w:rPr>
           <w:lang w:val="en-US"/>
@@ -7430,6 +8032,7 @@
         </w:rPr>
         <w:t>]</w:t>
       </w:r>
+      <w:bookmarkEnd w:id="13"/>
     </w:p>
     <w:p>
       <w:r>
@@ -7863,8 +8466,13 @@
           <w:lang w:val="en-US"/>
         </w:rPr>
       </w:pPr>
-      <w:r>
-        <w:t>Гейтовият ток е нисък: 55</w:t>
+      <w:proofErr w:type="spellStart"/>
+      <w:r>
+        <w:t>Гейтовият</w:t>
+      </w:r>
+      <w:proofErr w:type="spellEnd"/>
+      <w:r>
+        <w:t xml:space="preserve"> ток е нисък: 55</w:t>
       </w:r>
       <w:r>
         <w:rPr>
@@ -7885,8 +8493,13 @@
           <w:lang w:val="en-US"/>
         </w:rPr>
       </w:pPr>
-      <w:r>
-        <w:t>Гейтовото напрежение е ниско: 6.</w:t>
+      <w:proofErr w:type="spellStart"/>
+      <w:r>
+        <w:t>Гейтовото</w:t>
+      </w:r>
+      <w:proofErr w:type="spellEnd"/>
+      <w:r>
+        <w:t xml:space="preserve"> напрежение е ниско: 6.</w:t>
       </w:r>
       <w:r>
         <w:rPr>
@@ -7926,10 +8539,15 @@
         <w:t>Texas Instruments (MCF8329A)</w:t>
       </w:r>
       <w:r>
-        <w:t xml:space="preserve">, </w:t>
-      </w:r>
-      <w:r>
-        <w:t xml:space="preserve">но сравнително лошите характеристики на гейтовите драйвери </w:t>
+        <w:t xml:space="preserve">, но сравнително лошите характеристики на </w:t>
+      </w:r>
+      <w:proofErr w:type="spellStart"/>
+      <w:r>
+        <w:t>гейтовите</w:t>
+      </w:r>
+      <w:proofErr w:type="spellEnd"/>
+      <w:r>
+        <w:t xml:space="preserve"> драйвери </w:t>
       </w:r>
       <w:r>
         <w:t>я</w:t>
@@ -7980,6 +8598,7 @@
           <w:lang w:val="en-US"/>
         </w:rPr>
       </w:pPr>
+      <w:bookmarkStart w:id="14" w:name="_Toc199088389"/>
       <w:r>
         <w:rPr>
           <w:lang w:val="en-US"/>
@@ -8022,6 +8641,7 @@
         </w:rPr>
         <w:t>]</w:t>
       </w:r>
+      <w:bookmarkEnd w:id="14"/>
     </w:p>
     <w:p>
       <w:r>
@@ -8419,8 +9039,13 @@
         <w:t xml:space="preserve"> на </w:t>
       </w:r>
       <w:r>
-        <w:t>управляващия фърмуер</w:t>
-      </w:r>
+        <w:t xml:space="preserve">управляващия </w:t>
+      </w:r>
+      <w:proofErr w:type="spellStart"/>
+      <w:r>
+        <w:t>фърмуер</w:t>
+      </w:r>
+      <w:proofErr w:type="spellEnd"/>
       <w:r>
         <w:t>;</w:t>
       </w:r>
@@ -8452,7 +9077,15 @@
         <w:t>Висок</w:t>
       </w:r>
       <w:r>
-        <w:t xml:space="preserve"> гейтов ток: </w:t>
+        <w:t xml:space="preserve"> </w:t>
+      </w:r>
+      <w:proofErr w:type="spellStart"/>
+      <w:r>
+        <w:t>гейтов</w:t>
+      </w:r>
+      <w:proofErr w:type="spellEnd"/>
+      <w:r>
+        <w:t xml:space="preserve"> ток: </w:t>
       </w:r>
       <w:r>
         <w:rPr>
@@ -8485,7 +9118,15 @@
         </w:numPr>
       </w:pPr>
       <w:r>
-        <w:t xml:space="preserve">Високо гейтово напрежение: </w:t>
+        <w:t xml:space="preserve">Високо </w:t>
+      </w:r>
+      <w:proofErr w:type="spellStart"/>
+      <w:r>
+        <w:t>гейтово</w:t>
+      </w:r>
+      <w:proofErr w:type="spellEnd"/>
+      <w:r>
+        <w:t xml:space="preserve"> напрежение: </w:t>
       </w:r>
       <w:r>
         <w:rPr>
@@ -8566,32 +9207,21 @@
           <w:lang w:val="en-US"/>
         </w:rPr>
       </w:pPr>
+      <w:bookmarkStart w:id="15" w:name="_Toc199088390"/>
       <w:r>
         <w:rPr>
           <w:lang w:val="en-US"/>
         </w:rPr>
-        <w:t>IMD111T</w:t>
+        <w:t xml:space="preserve">IMD111T </w:t>
+      </w:r>
+      <w:r>
+        <w:t>(</w:t>
       </w:r>
       <w:r>
         <w:rPr>
           <w:lang w:val="en-US"/>
         </w:rPr>
-        <w:t xml:space="preserve"> </w:t>
-      </w:r>
-      <w:r>
-        <w:t>(</w:t>
-      </w:r>
-      <w:r>
-        <w:rPr>
-          <w:lang w:val="en-US"/>
-        </w:rPr>
-        <w:t>Infineon</w:t>
-      </w:r>
-      <w:r>
-        <w:rPr>
-          <w:lang w:val="en-US"/>
-        </w:rPr>
-        <w:t>)</w:t>
+        <w:t>Infineon)</w:t>
       </w:r>
       <w:r>
         <w:rPr>
@@ -8614,6 +9244,7 @@
         </w:rPr>
         <w:t>]</w:t>
       </w:r>
+      <w:bookmarkEnd w:id="15"/>
     </w:p>
     <w:p>
       <w:r>
@@ -8954,7 +9585,15 @@
         <w:t>Задоволителен</w:t>
       </w:r>
       <w:r>
-        <w:t xml:space="preserve"> гейтов ток: </w:t>
+        <w:t xml:space="preserve"> </w:t>
+      </w:r>
+      <w:proofErr w:type="spellStart"/>
+      <w:r>
+        <w:t>гейтов</w:t>
+      </w:r>
+      <w:proofErr w:type="spellEnd"/>
+      <w:r>
+        <w:t xml:space="preserve"> ток: </w:t>
       </w:r>
       <w:r>
         <w:t>240</w:t>
@@ -8990,7 +9629,15 @@
         </w:numPr>
       </w:pPr>
       <w:r>
-        <w:t>Високо гейтово напрежение: 1</w:t>
+        <w:t xml:space="preserve">Високо </w:t>
+      </w:r>
+      <w:proofErr w:type="spellStart"/>
+      <w:r>
+        <w:t>гейтово</w:t>
+      </w:r>
+      <w:proofErr w:type="spellEnd"/>
+      <w:r>
+        <w:t xml:space="preserve"> напрежение: 1</w:t>
       </w:r>
       <w:r>
         <w:rPr>
@@ -9105,7 +9752,15 @@
         </w:rPr>
       </w:pPr>
       <w:r>
-        <w:t xml:space="preserve">Вграденият в драйвера микроконтролер е специално разработен от </w:t>
+        <w:t xml:space="preserve">Вграденият в драйвера </w:t>
+      </w:r>
+      <w:proofErr w:type="spellStart"/>
+      <w:r>
+        <w:t>микроконтролер</w:t>
+      </w:r>
+      <w:proofErr w:type="spellEnd"/>
+      <w:r>
+        <w:t xml:space="preserve"> е специално разработен от </w:t>
       </w:r>
       <w:r>
         <w:rPr>
@@ -9122,8 +9777,13 @@
         </w:rPr>
         <w:t xml:space="preserve">STM </w:t>
       </w:r>
-      <w:r>
-        <w:t>микроконтролери и се извършва с различни инструменти</w:t>
+      <w:proofErr w:type="spellStart"/>
+      <w:r>
+        <w:t>микроконтролери</w:t>
+      </w:r>
+      <w:proofErr w:type="spellEnd"/>
+      <w:r>
+        <w:t xml:space="preserve"> и се извършва с различни инструменти</w:t>
       </w:r>
       <w:r>
         <w:t xml:space="preserve">. </w:t>
@@ -9203,11 +9863,16 @@
         <w:t xml:space="preserve">грешка </w:t>
       </w:r>
       <w:r>
-        <w:t>да се промени фърмуер</w:t>
+        <w:t xml:space="preserve">да се промени </w:t>
+      </w:r>
+      <w:proofErr w:type="spellStart"/>
+      <w:r>
+        <w:t>фърмуер</w:t>
       </w:r>
       <w:r>
         <w:t>ът</w:t>
       </w:r>
+      <w:proofErr w:type="spellEnd"/>
       <w:r>
         <w:t xml:space="preserve">, </w:t>
       </w:r>
@@ -9234,13 +9899,25 @@
         <w:rPr>
           <w:lang w:val="en-US"/>
         </w:rPr>
-        <w:t>STSPIN32G0B1</w:t>
+        <w:t xml:space="preserve">STSPIN32G0B1 </w:t>
+      </w:r>
+      <w:r>
+        <w:t xml:space="preserve">на </w:t>
       </w:r>
       <w:r>
         <w:rPr>
           <w:lang w:val="en-US"/>
         </w:rPr>
-        <w:t xml:space="preserve"> </w:t>
+        <w:t xml:space="preserve">STMicroelectronics </w:t>
+      </w:r>
+      <w:r>
+        <w:t xml:space="preserve">и </w:t>
+      </w:r>
+      <w:r>
+        <w:rPr>
+          <w:lang w:val="en-US"/>
+        </w:rPr>
+        <w:t xml:space="preserve">IMD111T </w:t>
       </w:r>
       <w:r>
         <w:t xml:space="preserve">на </w:t>
@@ -9249,35 +9926,17 @@
         <w:rPr>
           <w:lang w:val="en-US"/>
         </w:rPr>
-        <w:t xml:space="preserve">STMicroelectronics </w:t>
-      </w:r>
-      <w:r>
-        <w:t xml:space="preserve">и </w:t>
-      </w:r>
-      <w:r>
-        <w:rPr>
+        <w:t>Infineon</w:t>
+      </w:r>
+      <w:r>
+        <w:t xml:space="preserve">. Поради по-малката вероятност от допускане на грешки при програмирането и по-малкото инструменти, нужни за конфигурация, ще бъде използван драйверът </w:t>
+      </w:r>
+      <w:r>
+        <w:rPr>
+          <w:b/>
+          <w:bCs/>
           <w:lang w:val="en-US"/>
         </w:rPr>
-        <w:t xml:space="preserve">IMD111T </w:t>
-      </w:r>
-      <w:r>
-        <w:t xml:space="preserve">на </w:t>
-      </w:r>
-      <w:r>
-        <w:rPr>
-          <w:lang w:val="en-US"/>
-        </w:rPr>
-        <w:t>Infineon</w:t>
-      </w:r>
-      <w:r>
-        <w:t xml:space="preserve">. Поради по-малката вероятност от допускане на грешки при програмирането и по-малкото инструменти, нужни за конфигурация, ще бъде използван драйверът </w:t>
-      </w:r>
-      <w:r>
-        <w:rPr>
-          <w:b/>
-          <w:bCs/>
-          <w:lang w:val="en-US"/>
-        </w:rPr>
         <w:t>IMD111T</w:t>
       </w:r>
       <w:r>
@@ -9291,13 +9950,12 @@
       <w:pPr>
         <w:pStyle w:val="Heading2"/>
       </w:pPr>
-      <w:bookmarkStart w:id="13" w:name="_Toc199063424"/>
-      <w:bookmarkEnd w:id="12"/>
+      <w:bookmarkStart w:id="16" w:name="_Toc199088391"/>
       <w:r>
         <w:lastRenderedPageBreak/>
         <w:t>Съществуващи решения</w:t>
       </w:r>
-      <w:bookmarkEnd w:id="13"/>
+      <w:bookmarkEnd w:id="16"/>
     </w:p>
     <w:p>
       <w:pPr>
@@ -9312,7 +9970,15 @@
         <w:t>проектирането</w:t>
       </w:r>
       <w:r>
-        <w:t xml:space="preserve"> на специално устройство може да се разгледа използването на готови модули за управление на безчеткови мотори. На фиг. 2.4.1. е показан модулът </w:t>
+        <w:t xml:space="preserve"> на специално устройство може да се разгледа използването на готови модули за управление на </w:t>
+      </w:r>
+      <w:proofErr w:type="spellStart"/>
+      <w:r>
+        <w:t>безчеткови</w:t>
+      </w:r>
+      <w:proofErr w:type="spellEnd"/>
+      <w:r>
+        <w:t xml:space="preserve"> мотори. На фиг. 2.4.1. е показан модулът </w:t>
       </w:r>
       <w:r>
         <w:t>JYQD-V8.3B</w:t>
@@ -9591,7 +10257,49 @@
           <w:sz w:val="28"/>
           <w:szCs w:val="28"/>
         </w:rPr>
-        <w:t xml:space="preserve">Модул за упраление на безчеткови мотори </w:t>
+        <w:t xml:space="preserve">Модул за </w:t>
+      </w:r>
+      <w:r>
+        <w:rPr>
+          <w:i w:val="0"/>
+          <w:iCs w:val="0"/>
+          <w:color w:val="auto"/>
+          <w:sz w:val="28"/>
+          <w:szCs w:val="28"/>
+        </w:rPr>
+        <w:t>управление</w:t>
+      </w:r>
+      <w:r>
+        <w:rPr>
+          <w:i w:val="0"/>
+          <w:iCs w:val="0"/>
+          <w:color w:val="auto"/>
+          <w:sz w:val="28"/>
+          <w:szCs w:val="28"/>
+        </w:rPr>
+        <w:t xml:space="preserve"> на </w:t>
+      </w:r>
+      <w:proofErr w:type="spellStart"/>
+      <w:r>
+        <w:rPr>
+          <w:i w:val="0"/>
+          <w:iCs w:val="0"/>
+          <w:color w:val="auto"/>
+          <w:sz w:val="28"/>
+          <w:szCs w:val="28"/>
+        </w:rPr>
+        <w:t>безчеткови</w:t>
+      </w:r>
+      <w:proofErr w:type="spellEnd"/>
+      <w:r>
+        <w:rPr>
+          <w:i w:val="0"/>
+          <w:iCs w:val="0"/>
+          <w:color w:val="auto"/>
+          <w:sz w:val="28"/>
+          <w:szCs w:val="28"/>
+        </w:rPr>
+        <w:t xml:space="preserve"> мотори </w:t>
       </w:r>
       <w:r>
         <w:rPr>
@@ -9646,7 +10354,13 @@
         </w:numPr>
       </w:pPr>
       <w:r>
-        <w:t>Методът на управление е неизвестен и е възможно да се появят проблеми с устойчивостта на мотора в случай на натоварване.</w:t>
+        <w:t xml:space="preserve">Методът на управление е неизвестен и е възможно да се появят проблеми с устойчивостта на мотора </w:t>
+      </w:r>
+      <w:r>
+        <w:t>при</w:t>
+      </w:r>
+      <w:r>
+        <w:t xml:space="preserve"> натоварване.</w:t>
       </w:r>
     </w:p>
     <w:p>
@@ -9676,7 +10390,6 @@
           <w:lang w:val="en-US"/>
         </w:rPr>
       </w:pPr>
-      <w:bookmarkStart w:id="14" w:name="_Toc199063425"/>
     </w:p>
     <w:p>
       <w:pPr>
@@ -9691,7 +10404,15 @@
     <w:p>
       <w:r>
         <w:lastRenderedPageBreak/>
-        <w:t xml:space="preserve">Много от производителите на продукти, използващи безчеткови мотори, предлагат управляващи модули като допълнителна опция </w:t>
+        <w:t xml:space="preserve">Много от производителите на продукти, използващи </w:t>
+      </w:r>
+      <w:proofErr w:type="spellStart"/>
+      <w:r>
+        <w:t>безчеткови</w:t>
+      </w:r>
+      <w:proofErr w:type="spellEnd"/>
+      <w:r>
+        <w:t xml:space="preserve"> мотори, предлагат управляващи модули като допълнителна опция </w:t>
       </w:r>
       <w:r>
         <w:t>към</w:t>
@@ -10103,11 +10824,12 @@
       <w:pPr>
         <w:pStyle w:val="Heading2"/>
       </w:pPr>
+      <w:bookmarkStart w:id="17" w:name="_Toc199088392"/>
       <w:r>
         <w:lastRenderedPageBreak/>
         <w:t>Заключение</w:t>
       </w:r>
-      <w:bookmarkEnd w:id="14"/>
+      <w:bookmarkEnd w:id="17"/>
     </w:p>
     <w:p>
       <w:r>
@@ -10117,27 +10839,39 @@
         <w:t>специализиран модул за управление на компресорната помпа решава всички проблеми, изложени в предходната точка – могат да бъдат подбрани подходящи съединители, качествени компоненти с дълъг живот, могат да се обособят произволни сигнали според нуждите на устройството и може да се проектира печатна платка, съобразена с изискванията за електромагнитна съвместимост на средата.</w:t>
       </w:r>
       <w:r>
-        <w:t xml:space="preserve"> От друга страна, разработката на такъв модул може да се окаже доста скъпа, ако се налага и разработка на управляващ фърмуер.</w:t>
-      </w:r>
-    </w:p>
-    <w:p>
-      <w:r>
-        <w:t>Ето защо, за целите на дипломния</w:t>
-      </w:r>
-      <w:r>
-        <w:t xml:space="preserve"> </w:t>
-      </w:r>
-      <w:r>
-        <w:t>проект ще бъде проектирано специализирано устройство</w:t>
-      </w:r>
-      <w:r>
-        <w:t xml:space="preserve"> за управление на компресорна помпа без </w:t>
-      </w:r>
-      <w:r>
-        <w:t>разработка на управляващ фърмуер</w:t>
-      </w:r>
-      <w:r>
-        <w:t xml:space="preserve">. Ще бъде използван интегрирания драйвер за управление на трифазни безчеткови мотори </w:t>
+        <w:t xml:space="preserve"> От друга страна, разработката на такъв модул може да се окаже доста скъпа, ако се налага и разработка на управляващ </w:t>
+      </w:r>
+      <w:proofErr w:type="spellStart"/>
+      <w:r>
+        <w:t>фърмуер</w:t>
+      </w:r>
+      <w:proofErr w:type="spellEnd"/>
+      <w:r>
+        <w:t>.</w:t>
+      </w:r>
+    </w:p>
+    <w:p>
+      <w:r>
+        <w:t xml:space="preserve">Ето защо, за целите на дипломния проект ще бъде проектирано специализирано устройство за управление на компресорна помпа без </w:t>
+      </w:r>
+      <w:r>
+        <w:t xml:space="preserve">разработка на управляващ </w:t>
+      </w:r>
+      <w:proofErr w:type="spellStart"/>
+      <w:r>
+        <w:t>фърмуер</w:t>
+      </w:r>
+      <w:proofErr w:type="spellEnd"/>
+      <w:r>
+        <w:t xml:space="preserve">. Ще бъде използван интегрирания драйвер за управление на трифазни </w:t>
+      </w:r>
+      <w:proofErr w:type="spellStart"/>
+      <w:r>
+        <w:t>безчеткови</w:t>
+      </w:r>
+      <w:proofErr w:type="spellEnd"/>
+      <w:r>
+        <w:t xml:space="preserve"> мотори </w:t>
       </w:r>
       <w:r>
         <w:rPr>
@@ -10158,7 +10892,15 @@
         <w:t xml:space="preserve">. </w:t>
       </w:r>
       <w:r>
-        <w:t>Ще бъде експериментирано с различни скорости на въртене на безчетковия мотор в помпата и ще бъде избрана такава скорост, при която производителността и шума са добре балансирани.</w:t>
+        <w:t xml:space="preserve">Ще бъде експериментирано с различни скорости на въртене на </w:t>
+      </w:r>
+      <w:proofErr w:type="spellStart"/>
+      <w:r>
+        <w:t>безчетковия</w:t>
+      </w:r>
+      <w:proofErr w:type="spellEnd"/>
+      <w:r>
+        <w:t xml:space="preserve"> мотор в помпата и ще бъде избрана такава скорост, при която производителността и шума са добре балансирани.</w:t>
       </w:r>
     </w:p>
     <w:p>
@@ -10172,37 +10914,45 @@
           <w:szCs w:val="36"/>
         </w:rPr>
       </w:pPr>
-      <w:bookmarkStart w:id="15" w:name="_Toc153829731"/>
-      <w:bookmarkStart w:id="16" w:name="_Toc199063426"/>
+      <w:bookmarkStart w:id="18" w:name="_Toc153829731"/>
     </w:p>
     <w:p>
       <w:pPr>
         <w:pStyle w:val="Heading1"/>
       </w:pPr>
+      <w:bookmarkStart w:id="19" w:name="_Toc199088393"/>
       <w:r>
         <w:t>Техническо задание</w:t>
       </w:r>
-      <w:bookmarkStart w:id="17" w:name="_Toc153829732"/>
-      <w:bookmarkEnd w:id="15"/>
-      <w:bookmarkEnd w:id="16"/>
+      <w:bookmarkStart w:id="20" w:name="_Toc153829732"/>
+      <w:bookmarkEnd w:id="18"/>
+      <w:bookmarkEnd w:id="19"/>
     </w:p>
     <w:p>
       <w:pPr>
         <w:pStyle w:val="Heading2"/>
       </w:pPr>
-      <w:bookmarkStart w:id="18" w:name="_Toc199063427"/>
+      <w:bookmarkStart w:id="21" w:name="_Toc199088394"/>
       <w:r>
         <w:t>Цел и п</w:t>
       </w:r>
       <w:r>
         <w:t>редназначение</w:t>
       </w:r>
-      <w:bookmarkEnd w:id="17"/>
-      <w:bookmarkEnd w:id="18"/>
-    </w:p>
-    <w:p>
-      <w:r>
-        <w:t xml:space="preserve">Устройството трябва да може да се използва за управление на компресорна помпа без да се налага разработка на управляващ фърмуер. </w:t>
+      <w:bookmarkEnd w:id="20"/>
+      <w:bookmarkEnd w:id="21"/>
+    </w:p>
+    <w:p>
+      <w:r>
+        <w:t xml:space="preserve">Устройството трябва да може да се използва за управление на компресорна помпа без да се налага разработка на управляващ </w:t>
+      </w:r>
+      <w:proofErr w:type="spellStart"/>
+      <w:r>
+        <w:t>фърмуер</w:t>
+      </w:r>
+      <w:proofErr w:type="spellEnd"/>
+      <w:r>
+        <w:t xml:space="preserve">. </w:t>
       </w:r>
     </w:p>
     <w:p>
@@ -10214,23 +10964,17 @@
       <w:pPr>
         <w:pStyle w:val="Heading2"/>
       </w:pPr>
-      <w:bookmarkStart w:id="19" w:name="_Toc153829733"/>
-      <w:bookmarkStart w:id="20" w:name="_Toc199063428"/>
+      <w:bookmarkStart w:id="22" w:name="_Toc153829733"/>
+      <w:bookmarkStart w:id="23" w:name="_Toc199088395"/>
       <w:r>
         <w:t>Принцип на работа</w:t>
       </w:r>
-      <w:bookmarkEnd w:id="19"/>
-      <w:bookmarkEnd w:id="20"/>
-    </w:p>
-    <w:p>
-      <w:r>
-        <w:t xml:space="preserve">Устройството трябва да има два входни сигнала – за пускане и спиране на помпата и за </w:t>
-      </w:r>
-      <w:r>
-        <w:t>изчистване на записаните в драйвера грешки</w:t>
-      </w:r>
-      <w:r>
-        <w:t>, и един изходен сигнал – за обозначаване на настъпил проблем с управлението. Скоростта на помпата трябва да може да се задава конфигурационно, но да остава постоянна при нормална работа</w:t>
+      <w:bookmarkEnd w:id="22"/>
+      <w:bookmarkEnd w:id="23"/>
+    </w:p>
+    <w:p>
+      <w:r>
+        <w:t>Устройството трябва да има два входни сигнала – за пускане и спиране на помпата и за изчистване на записаните в драйвера грешки, и един изходен сигнал – за обозначаване на настъпил проблем с управлението. Скоростта на помпата трябва да може да се задава конфигурационно, но да остава постоянна при нормална работа</w:t>
       </w:r>
       <w:r>
         <w:t xml:space="preserve">. </w:t>
@@ -10261,13 +11005,13 @@
       <w:pPr>
         <w:pStyle w:val="Heading2"/>
       </w:pPr>
-      <w:bookmarkStart w:id="21" w:name="_Toc153829734"/>
-      <w:bookmarkStart w:id="22" w:name="_Toc199063429"/>
+      <w:bookmarkStart w:id="24" w:name="_Toc153829734"/>
+      <w:bookmarkStart w:id="25" w:name="_Toc199088396"/>
       <w:r>
         <w:t>Параметри (характеристики)</w:t>
       </w:r>
-      <w:bookmarkEnd w:id="21"/>
-      <w:bookmarkEnd w:id="22"/>
+      <w:bookmarkEnd w:id="24"/>
+      <w:bookmarkEnd w:id="25"/>
     </w:p>
     <w:p>
       <w:pPr>
@@ -10312,8 +11056,13 @@
       <w:r>
         <w:t xml:space="preserve">управлявания </w:t>
       </w:r>
-      <w:r>
-        <w:t xml:space="preserve">безчетковия мотор: </w:t>
+      <w:proofErr w:type="spellStart"/>
+      <w:r>
+        <w:t>безчетковия</w:t>
+      </w:r>
+      <w:proofErr w:type="spellEnd"/>
+      <w:r>
+        <w:t xml:space="preserve"> мотор: </w:t>
       </w:r>
       <w:r>
         <w:t>90</w:t>
@@ -10469,7 +11218,7 @@
         </w:numPr>
       </w:pPr>
       <w:r>
-        <w:t>Късо съединение ;</w:t>
+        <w:t>Късо съединение;</w:t>
       </w:r>
     </w:p>
     <w:p>
@@ -10508,13 +11257,17 @@
         <w:t xml:space="preserve">Проблем с изпълнението на </w:t>
       </w:r>
       <w:r>
-        <w:t>управляващия фърмуер</w:t>
-      </w:r>
+        <w:t xml:space="preserve">управляващия </w:t>
+      </w:r>
+      <w:proofErr w:type="spellStart"/>
+      <w:r>
+        <w:t>фърмуер</w:t>
+      </w:r>
+      <w:proofErr w:type="spellEnd"/>
       <w:r>
         <w:t>;</w:t>
       </w:r>
-      <w:bookmarkStart w:id="23" w:name="_Toc153829735"/>
-      <w:bookmarkStart w:id="24" w:name="_Toc199063430"/>
+      <w:bookmarkStart w:id="26" w:name="_Toc153829735"/>
     </w:p>
     <w:p>
       <w:pPr>
@@ -10586,12 +11339,13 @@
       <w:pPr>
         <w:pStyle w:val="Heading1"/>
       </w:pPr>
+      <w:bookmarkStart w:id="27" w:name="_Toc199088397"/>
       <w:r>
         <w:lastRenderedPageBreak/>
         <w:t>Блокова схема</w:t>
       </w:r>
-      <w:bookmarkEnd w:id="23"/>
-      <w:bookmarkEnd w:id="24"/>
+      <w:bookmarkEnd w:id="26"/>
+      <w:bookmarkEnd w:id="27"/>
     </w:p>
     <w:p>
       <w:r>
@@ -10599,18 +11353,18 @@
       </w:r>
     </w:p>
     <w:p>
-      <w:bookmarkStart w:id="25" w:name="_Toc153829736"/>
+      <w:bookmarkStart w:id="28" w:name="_Toc153829736"/>
     </w:p>
     <w:p>
       <w:pPr>
         <w:pStyle w:val="Heading1"/>
       </w:pPr>
-      <w:bookmarkStart w:id="26" w:name="_Toc199063431"/>
+      <w:bookmarkStart w:id="29" w:name="_Toc199088398"/>
       <w:r>
         <w:t>Принципна електрическа схема</w:t>
       </w:r>
-      <w:bookmarkEnd w:id="25"/>
-      <w:bookmarkEnd w:id="26"/>
+      <w:bookmarkEnd w:id="28"/>
+      <w:bookmarkEnd w:id="29"/>
     </w:p>
     <w:p>
       <w:r>
@@ -10621,11 +11375,11 @@
       <w:pPr>
         <w:pStyle w:val="Heading2"/>
       </w:pPr>
-      <w:bookmarkStart w:id="27" w:name="_Toc199063432"/>
+      <w:bookmarkStart w:id="30" w:name="_Toc199088399"/>
       <w:r>
         <w:t>Принципна електрическа схема в обобщен вид</w:t>
       </w:r>
-      <w:bookmarkEnd w:id="27"/>
+      <w:bookmarkEnd w:id="30"/>
     </w:p>
     <w:p>
       <w:r>
@@ -10639,12 +11393,12 @@
           <w:rStyle w:val="hgkelc"/>
         </w:rPr>
       </w:pPr>
-      <w:bookmarkStart w:id="28" w:name="_Toc153829745"/>
-      <w:bookmarkStart w:id="29" w:name="_Toc199063433"/>
+      <w:bookmarkStart w:id="31" w:name="_Toc199088400"/>
+      <w:bookmarkStart w:id="32" w:name="_Toc153829745"/>
       <w:r>
         <w:t>Блок „“</w:t>
       </w:r>
-      <w:bookmarkEnd w:id="29"/>
+      <w:bookmarkEnd w:id="31"/>
     </w:p>
     <w:p>
       <w:r>
@@ -10656,11 +11410,11 @@
       <w:pPr>
         <w:pStyle w:val="Heading1"/>
       </w:pPr>
-      <w:bookmarkStart w:id="30" w:name="_Toc199063434"/>
+      <w:bookmarkStart w:id="33" w:name="_Toc199088401"/>
       <w:r>
         <w:t>Печатна платка</w:t>
       </w:r>
-      <w:bookmarkEnd w:id="30"/>
+      <w:bookmarkEnd w:id="33"/>
     </w:p>
     <w:p>
       <w:r>
@@ -10672,25 +11426,25 @@
       <w:pPr>
         <w:pStyle w:val="Heading1"/>
       </w:pPr>
-      <w:bookmarkStart w:id="31" w:name="_Toc199063435"/>
-      <w:bookmarkEnd w:id="28"/>
+      <w:bookmarkStart w:id="34" w:name="_Toc199088402"/>
+      <w:bookmarkEnd w:id="32"/>
       <w:r>
         <w:t>Конфигурация на драйвера</w:t>
       </w:r>
-      <w:bookmarkEnd w:id="31"/>
+      <w:bookmarkEnd w:id="34"/>
     </w:p>
     <w:p>
       <w:pPr>
         <w:pStyle w:val="Heading2"/>
       </w:pPr>
-      <w:bookmarkStart w:id="32" w:name="_Toc199063436"/>
+      <w:bookmarkStart w:id="35" w:name="_Toc199088403"/>
       <w:r>
         <w:t>Общ принцип на работа</w:t>
       </w:r>
-      <w:bookmarkEnd w:id="32"/>
-    </w:p>
-    <w:p>
-      <w:bookmarkStart w:id="33" w:name="_Toc153829746"/>
+      <w:bookmarkEnd w:id="35"/>
+    </w:p>
+    <w:p>
+      <w:bookmarkStart w:id="36" w:name="_Toc153829746"/>
       <w:r>
         <w:t>текст</w:t>
       </w:r>
@@ -10700,18 +11454,18 @@
       <w:pPr>
         <w:pStyle w:val="Heading1"/>
       </w:pPr>
-      <w:bookmarkStart w:id="34" w:name="_Toc199063437"/>
+      <w:bookmarkStart w:id="37" w:name="_Toc199088404"/>
       <w:r>
         <w:t>Експериментални р</w:t>
       </w:r>
       <w:r>
         <w:t>езултати</w:t>
       </w:r>
-      <w:bookmarkEnd w:id="33"/>
-      <w:bookmarkEnd w:id="34"/>
-    </w:p>
-    <w:p>
-      <w:bookmarkStart w:id="35" w:name="_Toc153829747"/>
+      <w:bookmarkEnd w:id="36"/>
+      <w:bookmarkEnd w:id="37"/>
+    </w:p>
+    <w:p>
+      <w:bookmarkStart w:id="38" w:name="_Toc153829747"/>
       <w:r>
         <w:t>текст</w:t>
       </w:r>
@@ -10721,18 +11475,18 @@
       <w:pPr>
         <w:pStyle w:val="Heading1"/>
       </w:pPr>
-      <w:bookmarkStart w:id="36" w:name="_Toc199063438"/>
+      <w:bookmarkStart w:id="39" w:name="_Toc199088405"/>
       <w:r>
         <w:t>Заключение</w:t>
       </w:r>
-      <w:bookmarkEnd w:id="35"/>
-      <w:bookmarkEnd w:id="36"/>
+      <w:bookmarkEnd w:id="38"/>
+      <w:bookmarkEnd w:id="39"/>
     </w:p>
     <w:p>
       <w:r>
         <w:t>текст</w:t>
       </w:r>
-      <w:bookmarkStart w:id="37" w:name="_Toc153829748"/>
+      <w:bookmarkStart w:id="40" w:name="_Toc153829748"/>
     </w:p>
     <w:p/>
     <w:p>
@@ -10750,13 +11504,13 @@
       <w:pPr>
         <w:pStyle w:val="Heading1"/>
       </w:pPr>
-      <w:bookmarkStart w:id="38" w:name="_Toc199063439"/>
+      <w:bookmarkStart w:id="41" w:name="_Toc199088406"/>
       <w:r>
         <w:lastRenderedPageBreak/>
         <w:t>Използвана литература</w:t>
       </w:r>
-      <w:bookmarkEnd w:id="37"/>
-      <w:bookmarkEnd w:id="38"/>
+      <w:bookmarkEnd w:id="40"/>
+      <w:bookmarkEnd w:id="41"/>
     </w:p>
     <w:p>
       <w:pPr>
@@ -10773,7 +11527,63 @@
           <w:rPr>
             <w:rStyle w:val="Hyperlink"/>
           </w:rPr>
-          <w:t>DC Motors: Types and Uses – IQS</w:t>
+          <w:t xml:space="preserve">DC </w:t>
+        </w:r>
+        <w:proofErr w:type="spellStart"/>
+        <w:r>
+          <w:rPr>
+            <w:rStyle w:val="Hyperlink"/>
+          </w:rPr>
+          <w:t>Motors</w:t>
+        </w:r>
+        <w:proofErr w:type="spellEnd"/>
+        <w:r>
+          <w:rPr>
+            <w:rStyle w:val="Hyperlink"/>
+          </w:rPr>
+          <w:t xml:space="preserve">: </w:t>
+        </w:r>
+        <w:proofErr w:type="spellStart"/>
+        <w:r>
+          <w:rPr>
+            <w:rStyle w:val="Hyperlink"/>
+          </w:rPr>
+          <w:t>Types</w:t>
+        </w:r>
+        <w:proofErr w:type="spellEnd"/>
+        <w:r>
+          <w:rPr>
+            <w:rStyle w:val="Hyperlink"/>
+          </w:rPr>
+          <w:t xml:space="preserve"> </w:t>
+        </w:r>
+        <w:proofErr w:type="spellStart"/>
+        <w:r>
+          <w:rPr>
+            <w:rStyle w:val="Hyperlink"/>
+          </w:rPr>
+          <w:t>and</w:t>
+        </w:r>
+        <w:proofErr w:type="spellEnd"/>
+        <w:r>
+          <w:rPr>
+            <w:rStyle w:val="Hyperlink"/>
+          </w:rPr>
+          <w:t xml:space="preserve"> </w:t>
+        </w:r>
+        <w:proofErr w:type="spellStart"/>
+        <w:r>
+          <w:rPr>
+            <w:rStyle w:val="Hyperlink"/>
+          </w:rPr>
+          <w:t>Uses</w:t>
+        </w:r>
+        <w:proofErr w:type="spellEnd"/>
+        <w:r>
+          <w:rPr>
+            <w:rStyle w:val="Hyperlink"/>
+          </w:rPr>
+          <w:t xml:space="preserve"> – IQS</w:t>
         </w:r>
         <w:r>
           <w:rPr>
@@ -10782,12 +11592,14 @@
           </w:rPr>
           <w:t xml:space="preserve"> </w:t>
         </w:r>
+        <w:proofErr w:type="spellStart"/>
         <w:r>
           <w:rPr>
             <w:rStyle w:val="Hyperlink"/>
           </w:rPr>
           <w:t>Directory</w:t>
         </w:r>
+        <w:proofErr w:type="spellEnd"/>
       </w:hyperlink>
     </w:p>
     <w:p>
@@ -10871,11 +11683,89 @@
         <w:t xml:space="preserve">] </w:t>
       </w:r>
       <w:hyperlink r:id="rId24" w:history="1">
+        <w:proofErr w:type="spellStart"/>
         <w:r>
           <w:rPr>
             <w:rStyle w:val="Hyperlink"/>
           </w:rPr>
-          <w:t xml:space="preserve">Brushless-DC Motor Driver Considerations and Selection </w:t>
+          <w:t>Brushless</w:t>
+        </w:r>
+        <w:proofErr w:type="spellEnd"/>
+        <w:r>
+          <w:rPr>
+            <w:rStyle w:val="Hyperlink"/>
+          </w:rPr>
+          <w:t xml:space="preserve">-DC </w:t>
+        </w:r>
+        <w:proofErr w:type="spellStart"/>
+        <w:r>
+          <w:rPr>
+            <w:rStyle w:val="Hyperlink"/>
+          </w:rPr>
+          <w:t>Motor</w:t>
+        </w:r>
+        <w:proofErr w:type="spellEnd"/>
+        <w:r>
+          <w:rPr>
+            <w:rStyle w:val="Hyperlink"/>
+          </w:rPr>
+          <w:t xml:space="preserve"> </w:t>
+        </w:r>
+        <w:proofErr w:type="spellStart"/>
+        <w:r>
+          <w:rPr>
+            <w:rStyle w:val="Hyperlink"/>
+          </w:rPr>
+          <w:t>Driver</w:t>
+        </w:r>
+        <w:proofErr w:type="spellEnd"/>
+        <w:r>
+          <w:rPr>
+            <w:rStyle w:val="Hyperlink"/>
+          </w:rPr>
+          <w:t xml:space="preserve"> </w:t>
+        </w:r>
+        <w:proofErr w:type="spellStart"/>
+        <w:r>
+          <w:rPr>
+            <w:rStyle w:val="Hyperlink"/>
+          </w:rPr>
+          <w:t>Considerations</w:t>
+        </w:r>
+        <w:proofErr w:type="spellEnd"/>
+        <w:r>
+          <w:rPr>
+            <w:rStyle w:val="Hyperlink"/>
+          </w:rPr>
+          <w:t xml:space="preserve"> </w:t>
+        </w:r>
+        <w:proofErr w:type="spellStart"/>
+        <w:r>
+          <w:rPr>
+            <w:rStyle w:val="Hyperlink"/>
+          </w:rPr>
+          <w:t>and</w:t>
+        </w:r>
+        <w:proofErr w:type="spellEnd"/>
+        <w:r>
+          <w:rPr>
+            <w:rStyle w:val="Hyperlink"/>
+          </w:rPr>
+          <w:t xml:space="preserve"> </w:t>
+        </w:r>
+        <w:proofErr w:type="spellStart"/>
+        <w:r>
+          <w:rPr>
+            <w:rStyle w:val="Hyperlink"/>
+          </w:rPr>
+          <w:t>Selection</w:t>
+        </w:r>
+        <w:proofErr w:type="spellEnd"/>
+        <w:r>
+          <w:rPr>
+            <w:rStyle w:val="Hyperlink"/>
+          </w:rPr>
+          <w:t xml:space="preserve"> </w:t>
         </w:r>
         <w:r>
           <w:rPr>
@@ -10919,35 +11809,7 @@
             <w:rStyle w:val="Hyperlink"/>
             <w:lang w:val="en-US"/>
           </w:rPr>
-          <w:t>8</w:t>
-        </w:r>
-        <w:r>
-          <w:rPr>
-            <w:rStyle w:val="Hyperlink"/>
-            <w:lang w:val="en-US"/>
-          </w:rPr>
-          <w:t>23</w:t>
-        </w:r>
-        <w:r>
-          <w:rPr>
-            <w:rStyle w:val="Hyperlink"/>
-            <w:lang w:val="en-US"/>
-          </w:rPr>
-          <w:t>9</w:t>
-        </w:r>
-        <w:r>
-          <w:rPr>
-            <w:rStyle w:val="Hyperlink"/>
-            <w:lang w:val="en-US"/>
-          </w:rPr>
-          <w:t>A</w:t>
-        </w:r>
-        <w:r>
-          <w:rPr>
-            <w:rStyle w:val="Hyperlink"/>
-            <w:lang w:val="en-US"/>
-          </w:rPr>
-          <w:t xml:space="preserve"> – TI</w:t>
+          <w:t>8239A – TI</w:t>
         </w:r>
       </w:hyperlink>
     </w:p>
@@ -10970,14 +11832,7 @@
             <w:rStyle w:val="Hyperlink"/>
             <w:lang w:val="en-US"/>
           </w:rPr>
-          <w:t>A89306</w:t>
-        </w:r>
-        <w:r>
-          <w:rPr>
-            <w:rStyle w:val="Hyperlink"/>
-            <w:lang w:val="en-US"/>
-          </w:rPr>
-          <w:t xml:space="preserve"> – Allegro</w:t>
+          <w:t>A89306 – Allegro</w:t>
         </w:r>
       </w:hyperlink>
     </w:p>
@@ -11060,14 +11915,7 @@
             <w:rStyle w:val="Hyperlink"/>
             <w:lang w:val="en-US"/>
           </w:rPr>
-          <w:t>JYQD-V8.3B</w:t>
-        </w:r>
-        <w:r>
-          <w:rPr>
-            <w:rStyle w:val="Hyperlink"/>
-            <w:lang w:val="en-US"/>
-          </w:rPr>
-          <w:t xml:space="preserve"> – Juyi Tech</w:t>
+          <w:t>JYQD-V8.3B – Juyi Tech</w:t>
         </w:r>
       </w:hyperlink>
     </w:p>
@@ -11104,21 +11952,7 @@
             <w:rStyle w:val="Hyperlink"/>
             <w:lang w:val="en-US"/>
           </w:rPr>
-          <w:t xml:space="preserve"> - HC</w:t>
-        </w:r>
-        <w:r>
-          <w:rPr>
-            <w:rStyle w:val="Hyperlink"/>
-            <w:lang w:val="en-US"/>
-          </w:rPr>
-          <w:t>E</w:t>
-        </w:r>
-        <w:r>
-          <w:rPr>
-            <w:rStyle w:val="Hyperlink"/>
-            <w:lang w:val="en-US"/>
-          </w:rPr>
-          <w:t>M</w:t>
+          <w:t xml:space="preserve"> - HCEM</w:t>
         </w:r>
       </w:hyperlink>
     </w:p>
@@ -18737,8 +19571,12 @@
     <w:autoRedefine/>
     <w:uiPriority w:val="39"/>
     <w:unhideWhenUsed/>
-    <w:rsid w:val="004256D1"/>
+    <w:rsid w:val="0001598E"/>
     <w:pPr>
+      <w:tabs>
+        <w:tab w:val="left" w:pos="1200"/>
+        <w:tab w:val="right" w:leader="dot" w:pos="9062"/>
+      </w:tabs>
       <w:spacing w:after="100"/>
     </w:pPr>
   </w:style>
@@ -18749,8 +19587,11 @@
     <w:autoRedefine/>
     <w:uiPriority w:val="39"/>
     <w:unhideWhenUsed/>
-    <w:rsid w:val="004256D1"/>
+    <w:rsid w:val="004A7672"/>
     <w:pPr>
+      <w:tabs>
+        <w:tab w:val="right" w:leader="dot" w:pos="9062"/>
+      </w:tabs>
       <w:spacing w:after="100"/>
       <w:ind w:left="220"/>
     </w:pPr>
@@ -18871,7 +19712,6 @@
     <w:pPr>
       <w:tabs>
         <w:tab w:val="left" w:pos="560"/>
-        <w:tab w:val="right" w:leader="dot" w:pos="9062"/>
       </w:tabs>
     </w:pPr>
   </w:style>

</xml_diff>

<commit_message>
Created a block scheme of the device and wrote the Block scheme chapter
</commit_message>
<xml_diff>
--- a/Documentation/DR_Iliyan_Antov_101324019.docx
+++ b/Documentation/DR_Iliyan_Antov_101324019.docx
@@ -2299,7 +2299,7 @@
                 <w:noProof/>
                 <w:webHidden/>
               </w:rPr>
-              <w:t>25</w:t>
+              <w:t>26</w:t>
             </w:r>
             <w:r>
               <w:rPr>
@@ -2390,7 +2390,7 @@
                 <w:noProof/>
                 <w:webHidden/>
               </w:rPr>
-              <w:t>25</w:t>
+              <w:t>26</w:t>
             </w:r>
             <w:r>
               <w:rPr>
@@ -2481,7 +2481,7 @@
                 <w:noProof/>
                 <w:webHidden/>
               </w:rPr>
-              <w:t>25</w:t>
+              <w:t>26</w:t>
             </w:r>
             <w:r>
               <w:rPr>
@@ -2569,7 +2569,7 @@
                 <w:noProof/>
                 <w:webHidden/>
               </w:rPr>
-              <w:t>25</w:t>
+              <w:t>26</w:t>
             </w:r>
             <w:r>
               <w:rPr>
@@ -2657,7 +2657,7 @@
                 <w:noProof/>
                 <w:webHidden/>
               </w:rPr>
-              <w:t>25</w:t>
+              <w:t>26</w:t>
             </w:r>
             <w:r>
               <w:rPr>
@@ -2748,7 +2748,7 @@
                 <w:noProof/>
                 <w:webHidden/>
               </w:rPr>
-              <w:t>25</w:t>
+              <w:t>26</w:t>
             </w:r>
             <w:r>
               <w:rPr>
@@ -2836,7 +2836,7 @@
                 <w:noProof/>
                 <w:webHidden/>
               </w:rPr>
-              <w:t>25</w:t>
+              <w:t>26</w:t>
             </w:r>
             <w:r>
               <w:rPr>
@@ -2924,7 +2924,7 @@
                 <w:noProof/>
                 <w:webHidden/>
               </w:rPr>
-              <w:t>25</w:t>
+              <w:t>26</w:t>
             </w:r>
             <w:r>
               <w:rPr>
@@ -3012,7 +3012,7 @@
                 <w:noProof/>
                 <w:webHidden/>
               </w:rPr>
-              <w:t>26</w:t>
+              <w:t>27</w:t>
             </w:r>
             <w:r>
               <w:rPr>
@@ -3120,186 +3120,162 @@
         <w:t xml:space="preserve"> мотори е тяхната ниска цена и лесно управление. </w:t>
       </w:r>
       <w:r>
-        <w:t xml:space="preserve">От друга страна, </w:t>
+        <w:t>От друга страна, б</w:t>
+      </w:r>
+      <w:r>
+        <w:t>езчетковите мотори са по-ефективни</w:t>
+      </w:r>
+      <w:r>
+        <w:t>, по-компактни</w:t>
+      </w:r>
+      <w:r>
+        <w:t xml:space="preserve">, </w:t>
+      </w:r>
+      <w:r>
+        <w:t>поддръжката им е по-лесна и имат по-дълъг живот. Всичко това обаче е за сметка на</w:t>
+      </w:r>
+      <w:r>
+        <w:t xml:space="preserve"> по-високата им цена, която до голяма степен е свързана с по-сложното управление. Докато при </w:t>
       </w:r>
       <w:proofErr w:type="spellStart"/>
       <w:r>
-        <w:t>б</w:t>
-      </w:r>
-      <w:r>
-        <w:t>езчетковите</w:t>
+        <w:t>четковите</w:t>
       </w:r>
       <w:proofErr w:type="spellEnd"/>
       <w:r>
-        <w:t xml:space="preserve"> мотори са по-ефективни</w:t>
-      </w:r>
-      <w:r>
-        <w:t>, по-компактни</w:t>
+        <w:t xml:space="preserve"> мотори задвижването става чрез подаване на постоянно напрежение </w:t>
+      </w:r>
+      <w:r>
+        <w:t>към</w:t>
+      </w:r>
+      <w:r>
+        <w:t xml:space="preserve"> две намотки, безчетковите мотори изискват синхронно управление </w:t>
+      </w:r>
+      <w:r>
+        <w:t xml:space="preserve">(обикновено трифазно) </w:t>
+      </w:r>
+      <w:r>
+        <w:t>на няколко намотки</w:t>
+      </w:r>
+      <w:r>
+        <w:t xml:space="preserve"> спрямо позицията на ротора. </w:t>
+      </w:r>
+    </w:p>
+    <w:p>
+      <w:r>
+        <w:t>Освен</w:t>
+      </w:r>
+      <w:r>
+        <w:t xml:space="preserve"> от</w:t>
+      </w:r>
+      <w:r>
+        <w:t xml:space="preserve"> цената на допълнителните компоненти</w:t>
+      </w:r>
+      <w:r>
+        <w:t xml:space="preserve"> за управление</w:t>
+      </w:r>
+      <w:r>
+        <w:t>, имплементиращи</w:t>
+      </w:r>
+      <w:r>
+        <w:t>те</w:t>
+      </w:r>
+      <w:r>
+        <w:t xml:space="preserve"> </w:t>
+      </w:r>
+      <w:proofErr w:type="spellStart"/>
+      <w:r>
+        <w:t>безчеткови</w:t>
+      </w:r>
+      <w:proofErr w:type="spellEnd"/>
+      <w:r>
+        <w:t xml:space="preserve"> </w:t>
+      </w:r>
+      <w:r>
+        <w:t xml:space="preserve">мотори продукти биват значително оскъпени и от </w:t>
+      </w:r>
+      <w:r>
+        <w:t xml:space="preserve">цената за развой на управляващия </w:t>
+      </w:r>
+      <w:proofErr w:type="spellStart"/>
+      <w:r>
+        <w:t>фърмуер</w:t>
+      </w:r>
+      <w:proofErr w:type="spellEnd"/>
+      <w:r>
+        <w:t>.</w:t>
+      </w:r>
+      <w:r>
+        <w:t xml:space="preserve"> </w:t>
+      </w:r>
+      <w:r>
+        <w:t>Опростяването</w:t>
+      </w:r>
+      <w:r>
+        <w:t xml:space="preserve"> на </w:t>
+      </w:r>
+      <w:r>
+        <w:t xml:space="preserve">процеса </w:t>
+      </w:r>
+      <w:r>
+        <w:t>по</w:t>
+      </w:r>
+      <w:r>
+        <w:t xml:space="preserve"> развой на </w:t>
+      </w:r>
+      <w:proofErr w:type="spellStart"/>
+      <w:r>
+        <w:t>фърмуера</w:t>
+      </w:r>
+      <w:proofErr w:type="spellEnd"/>
+      <w:r>
+        <w:t xml:space="preserve"> е един от начините цената на крайния продукт да бъде понижена.</w:t>
+      </w:r>
+    </w:p>
+    <w:p>
+      <w:r>
+        <w:t>Управлението на</w:t>
+      </w:r>
+      <w:r>
+        <w:t xml:space="preserve"> постояннотокови двигатели</w:t>
+      </w:r>
+      <w:r>
+        <w:t xml:space="preserve"> е свързан</w:t>
+      </w:r>
+      <w:r>
+        <w:t>о</w:t>
+      </w:r>
+      <w:r>
+        <w:t xml:space="preserve"> с определени рискове. Колкото по-висок е въртящият момент на един двигател, толкова по-внимателна трябва да бъде работата с него – от една страна поради повишената опасност от механично нараняване, а от друга – поради</w:t>
+      </w:r>
+      <w:r>
+        <w:t xml:space="preserve"> високата мощност, която</w:t>
+      </w:r>
+      <w:r>
+        <w:t xml:space="preserve"> се</w:t>
+      </w:r>
+      <w:r>
+        <w:t xml:space="preserve"> консумира</w:t>
       </w:r>
       <w:r>
         <w:t xml:space="preserve">, </w:t>
       </w:r>
       <w:r>
-        <w:t>поддръжката им е по-лесна и имат по-дълъг живот. Всичко това обаче е за сметка на</w:t>
-      </w:r>
-      <w:r>
-        <w:t xml:space="preserve"> по-високата им цена, която до голяма степен е свързана с по-сложното управление. Докато при </w:t>
+        <w:t>свързана с</w:t>
+      </w:r>
+      <w:r>
+        <w:t xml:space="preserve"> по-голямо </w:t>
       </w:r>
       <w:proofErr w:type="spellStart"/>
       <w:r>
-        <w:t>четковите</w:t>
+        <w:t>топлоотделяне</w:t>
       </w:r>
       <w:proofErr w:type="spellEnd"/>
       <w:r>
-        <w:t xml:space="preserve"> мотори задвижването става чрез подаване на постоянно напрежение </w:t>
-      </w:r>
-      <w:r>
-        <w:t>към</w:t>
-      </w:r>
-      <w:r>
-        <w:t xml:space="preserve"> две намотки, </w:t>
-      </w:r>
-      <w:proofErr w:type="spellStart"/>
-      <w:r>
-        <w:t>безчетковите</w:t>
-      </w:r>
-      <w:proofErr w:type="spellEnd"/>
-      <w:r>
-        <w:t xml:space="preserve"> мотори изискват синхронно управление </w:t>
-      </w:r>
-      <w:r>
-        <w:t xml:space="preserve">(обикновено трифазно) </w:t>
-      </w:r>
-      <w:r>
-        <w:t>на няколко намотки</w:t>
-      </w:r>
-      <w:r>
-        <w:t xml:space="preserve"> спрямо позицията на ротора. </w:t>
-      </w:r>
-    </w:p>
-    <w:p>
-      <w:r>
-        <w:t>Освен</w:t>
-      </w:r>
-      <w:r>
-        <w:t xml:space="preserve"> от</w:t>
-      </w:r>
-      <w:r>
-        <w:t xml:space="preserve"> цената на допълнителните компоненти</w:t>
-      </w:r>
-      <w:r>
-        <w:t xml:space="preserve"> за управление</w:t>
-      </w:r>
-      <w:r>
-        <w:t>, имплементиращи</w:t>
-      </w:r>
-      <w:r>
-        <w:t>те</w:t>
-      </w:r>
-      <w:r>
-        <w:t xml:space="preserve"> </w:t>
-      </w:r>
-      <w:proofErr w:type="spellStart"/>
-      <w:r>
-        <w:t>безчеткови</w:t>
-      </w:r>
-      <w:proofErr w:type="spellEnd"/>
-      <w:r>
-        <w:t xml:space="preserve"> </w:t>
-      </w:r>
-      <w:r>
-        <w:t xml:space="preserve">мотори продукти биват значително оскъпени и от </w:t>
-      </w:r>
-      <w:r>
-        <w:t xml:space="preserve">цената за развой на управляващия </w:t>
-      </w:r>
-      <w:proofErr w:type="spellStart"/>
-      <w:r>
-        <w:t>фърмуер</w:t>
-      </w:r>
-      <w:proofErr w:type="spellEnd"/>
-      <w:r>
         <w:t>.</w:t>
       </w:r>
       <w:r>
-        <w:t xml:space="preserve"> </w:t>
-      </w:r>
-      <w:r>
-        <w:t>Опростяването</w:t>
-      </w:r>
-      <w:r>
-        <w:t xml:space="preserve"> на </w:t>
-      </w:r>
-      <w:r>
-        <w:t xml:space="preserve">процеса </w:t>
-      </w:r>
-      <w:r>
-        <w:t>по</w:t>
-      </w:r>
-      <w:r>
-        <w:t xml:space="preserve"> развой на </w:t>
-      </w:r>
-      <w:proofErr w:type="spellStart"/>
-      <w:r>
-        <w:t>фърмуера</w:t>
-      </w:r>
-      <w:proofErr w:type="spellEnd"/>
-      <w:r>
-        <w:t xml:space="preserve"> е един от начините цената на крайния продукт да бъде понижена.</w:t>
-      </w:r>
-    </w:p>
-    <w:p>
-      <w:r>
-        <w:t>Управлението на</w:t>
-      </w:r>
-      <w:r>
-        <w:t xml:space="preserve"> постояннотокови двигатели</w:t>
-      </w:r>
-      <w:r>
-        <w:t xml:space="preserve"> е свързан</w:t>
-      </w:r>
-      <w:r>
-        <w:t>о</w:t>
-      </w:r>
-      <w:r>
-        <w:t xml:space="preserve"> с определени рискове. Колкото по-висок е въртящият момент на един двигател, толкова по-внимателна трябва да бъде работата с него – от една страна поради повишената опасност от механично нараняване, а от друга – поради</w:t>
-      </w:r>
-      <w:r>
-        <w:t xml:space="preserve"> високата мощност, която</w:t>
-      </w:r>
-      <w:r>
-        <w:t xml:space="preserve"> се</w:t>
-      </w:r>
-      <w:r>
-        <w:t xml:space="preserve"> консумира</w:t>
-      </w:r>
-      <w:r>
-        <w:t xml:space="preserve">, </w:t>
-      </w:r>
-      <w:r>
-        <w:t>свързана с</w:t>
-      </w:r>
-      <w:r>
-        <w:t xml:space="preserve"> по-голямо </w:t>
-      </w:r>
-      <w:proofErr w:type="spellStart"/>
-      <w:r>
-        <w:t>топлоотделяне</w:t>
-      </w:r>
-      <w:proofErr w:type="spellEnd"/>
-      <w:r>
-        <w:t>.</w:t>
-      </w:r>
-      <w:r>
-        <w:t xml:space="preserve"> По-сложното управление на </w:t>
-      </w:r>
-      <w:proofErr w:type="spellStart"/>
-      <w:r>
-        <w:t>безчетковите</w:t>
-      </w:r>
-      <w:proofErr w:type="spellEnd"/>
-      <w:r>
-        <w:t xml:space="preserve"> мотори </w:t>
+        <w:t xml:space="preserve"> По-сложното управление на безчетковите мотори </w:t>
       </w:r>
       <w:r>
         <w:t xml:space="preserve">има </w:t>
@@ -3345,133 +3321,112 @@
       </w:r>
       <w:proofErr w:type="spellEnd"/>
       <w:r>
-        <w:t xml:space="preserve"> на </w:t>
+        <w:t xml:space="preserve"> на безчетковите мотори. Това е още един фактор, допринасящ за повишената цена на този вид двигатели и още една причина да се търсят начини за</w:t>
+      </w:r>
+      <w:r>
+        <w:t xml:space="preserve"> опростяване</w:t>
+      </w:r>
+      <w:r>
+        <w:t xml:space="preserve"> на тази стъпка от развоя.</w:t>
+      </w:r>
+    </w:p>
+    <w:p>
+      <w:pPr>
+        <w:rPr>
+          <w:lang w:val="en-US"/>
+        </w:rPr>
+      </w:pPr>
+      <w:r>
+        <w:t xml:space="preserve">Настоящата дипломна работа има за цел </w:t>
+      </w:r>
+      <w:r>
+        <w:t>проектирането</w:t>
+      </w:r>
+      <w:r>
+        <w:t xml:space="preserve"> на устройство</w:t>
+      </w:r>
+      <w:r>
+        <w:t xml:space="preserve"> за управление на </w:t>
+      </w:r>
+      <w:r>
+        <w:t xml:space="preserve">компресорна помпа с </w:t>
+      </w:r>
+      <w:r>
+        <w:t xml:space="preserve">безчетков постояннотоков двигател без да се налага разработка на управляващ </w:t>
       </w:r>
       <w:proofErr w:type="spellStart"/>
       <w:r>
-        <w:t>безчетковите</w:t>
+        <w:t>фърмуер</w:t>
       </w:r>
       <w:proofErr w:type="spellEnd"/>
       <w:r>
-        <w:t xml:space="preserve"> мотори. Това е още един фактор, допринасящ за повишената цена на този вид двигатели и още една причина да се търсят начини за</w:t>
-      </w:r>
-      <w:r>
-        <w:t xml:space="preserve"> опростяване</w:t>
-      </w:r>
-      <w:r>
-        <w:t xml:space="preserve"> на тази стъпка от развоя.</w:t>
-      </w:r>
-    </w:p>
-    <w:p>
-      <w:pPr>
+        <w:t>.</w:t>
+      </w:r>
+    </w:p>
+    <w:p>
+      <w:r>
+        <w:t xml:space="preserve">Ще бъдат сравнени различните видове </w:t>
+      </w:r>
+      <w:r>
+        <w:t xml:space="preserve">трифазни </w:t>
+      </w:r>
+      <w:proofErr w:type="spellStart"/>
+      <w:r>
+        <w:t>безчеткови</w:t>
+      </w:r>
+      <w:proofErr w:type="spellEnd"/>
+      <w:r>
+        <w:t xml:space="preserve"> постояннотокови двигатели</w:t>
+      </w:r>
+      <w:r>
         <w:rPr>
           <w:lang w:val="en-US"/>
         </w:rPr>
-      </w:pPr>
-      <w:r>
-        <w:t xml:space="preserve">Настоящата дипломна работа има за цел </w:t>
-      </w:r>
-      <w:r>
-        <w:t>проектирането</w:t>
-      </w:r>
-      <w:r>
-        <w:t xml:space="preserve"> на устройство</w:t>
-      </w:r>
-      <w:r>
-        <w:t xml:space="preserve"> за управление на </w:t>
-      </w:r>
-      <w:r>
-        <w:t xml:space="preserve">компресорна помпа с </w:t>
-      </w:r>
-      <w:proofErr w:type="spellStart"/>
-      <w:r>
-        <w:t>безчетков</w:t>
-      </w:r>
-      <w:proofErr w:type="spellEnd"/>
-      <w:r>
-        <w:t xml:space="preserve"> постояннотоков двигател без да се налага разработка на управляващ </w:t>
-      </w:r>
-      <w:proofErr w:type="spellStart"/>
-      <w:r>
-        <w:t>фърмуер</w:t>
-      </w:r>
-      <w:proofErr w:type="spellEnd"/>
+        <w:t xml:space="preserve">, </w:t>
+      </w:r>
+      <w:r>
+        <w:t>които имат разлики по отношение на управлението</w:t>
+      </w:r>
+      <w:r>
+        <w:t xml:space="preserve">. Ще бъдат разгледани </w:t>
+      </w:r>
+      <w:r>
+        <w:t>някои от</w:t>
+      </w:r>
+      <w:r>
+        <w:t xml:space="preserve"> </w:t>
+      </w:r>
+      <w:r>
+        <w:t>алгоритмите</w:t>
+      </w:r>
+      <w:r>
+        <w:t xml:space="preserve"> </w:t>
+      </w:r>
+      <w:r>
+        <w:t>за управление на такива двигатели.</w:t>
+      </w:r>
+      <w:r>
+        <w:t xml:space="preserve"> Ще бъдат разгледани наличните на пазара интегрирани драйвери</w:t>
+      </w:r>
+      <w:r>
+        <w:t>, подходящи за целите на дипломната работа</w:t>
+      </w:r>
       <w:r>
         <w:t>.</w:t>
       </w:r>
-    </w:p>
-    <w:p>
-      <w:r>
-        <w:t xml:space="preserve">Ще бъдат сравнени различните видове </w:t>
-      </w:r>
-      <w:r>
-        <w:t xml:space="preserve">трифазни </w:t>
-      </w:r>
-      <w:proofErr w:type="spellStart"/>
-      <w:r>
-        <w:t>безчеткови</w:t>
-      </w:r>
-      <w:proofErr w:type="spellEnd"/>
-      <w:r>
-        <w:t xml:space="preserve"> постояннотокови двигатели</w:t>
-      </w:r>
-      <w:r>
-        <w:rPr>
-          <w:lang w:val="en-US"/>
-        </w:rPr>
-        <w:t xml:space="preserve">, </w:t>
-      </w:r>
-      <w:r>
-        <w:t>които имат разлики по отношение на управлението</w:t>
-      </w:r>
-      <w:r>
-        <w:t xml:space="preserve">. Ще бъдат разгледани </w:t>
-      </w:r>
-      <w:r>
-        <w:t>някои от</w:t>
-      </w:r>
-      <w:r>
-        <w:t xml:space="preserve"> </w:t>
-      </w:r>
-      <w:r>
-        <w:t>алгоритмите</w:t>
-      </w:r>
-      <w:r>
-        <w:t xml:space="preserve"> </w:t>
-      </w:r>
-      <w:r>
-        <w:t>за управление на такива двигатели.</w:t>
-      </w:r>
-      <w:r>
-        <w:t xml:space="preserve"> Ще бъдат разгледани наличните на пазара интегрирани драйвери</w:t>
-      </w:r>
-      <w:r>
-        <w:t>, подходящи за целите на дипломната работа</w:t>
+      <w:r>
+        <w:t xml:space="preserve"> Ще бъдат разгледани подобни съществуващи </w:t>
+      </w:r>
+      <w:r>
+        <w:t>устройства</w:t>
       </w:r>
       <w:r>
         <w:t>.</w:t>
       </w:r>
-      <w:r>
-        <w:t xml:space="preserve"> Ще бъдат разгледани подобни съществуващи </w:t>
-      </w:r>
-      <w:r>
-        <w:t>устройства</w:t>
-      </w:r>
-      <w:r>
-        <w:t>.</w:t>
-      </w:r>
-    </w:p>
-    <w:p>
-      <w:r>
-        <w:t xml:space="preserve">Ще бъдат дефинирани изисквания към разработваното устройство. Ще бъде проектирана електрическа схема за управление на </w:t>
-      </w:r>
-      <w:proofErr w:type="spellStart"/>
-      <w:r>
-        <w:t>безчетков</w:t>
-      </w:r>
-      <w:proofErr w:type="spellEnd"/>
-      <w:r>
-        <w:t xml:space="preserve"> постояннотоков </w:t>
+    </w:p>
+    <w:p>
+      <w:r>
+        <w:t xml:space="preserve">Ще бъдат дефинирани изисквания към разработваното устройство. Ще бъде проектирана електрическа схема за управление на безчетков постояннотоков </w:t>
       </w:r>
       <w:r>
         <w:t>двигател</w:t>
@@ -3551,16 +3506,11 @@
         <w:t>Параметрите на</w:t>
       </w:r>
       <w:r>
-        <w:t xml:space="preserve"> </w:t>
-      </w:r>
-      <w:proofErr w:type="spellStart"/>
-      <w:r>
-        <w:t>безчетков</w:t>
+        <w:t xml:space="preserve"> безчетков</w:t>
       </w:r>
       <w:r>
         <w:t>ия</w:t>
       </w:r>
-      <w:proofErr w:type="spellEnd"/>
       <w:r>
         <w:t xml:space="preserve"> мотор, който ще бъде управляван;</w:t>
       </w:r>
@@ -3620,15 +3570,7 @@
         <w:t xml:space="preserve"> са най-подходящи за целите на разработваното устройство. </w:t>
       </w:r>
       <w:r>
-        <w:t xml:space="preserve">Тъй като компресорната помпа, която трябва да бъде управлявана от проектираното устройство използва трифазен </w:t>
-      </w:r>
-      <w:proofErr w:type="spellStart"/>
-      <w:r>
-        <w:t>безчетков</w:t>
-      </w:r>
-      <w:proofErr w:type="spellEnd"/>
-      <w:r>
-        <w:t xml:space="preserve"> мотор, от </w:t>
+        <w:t xml:space="preserve">Тъй като компресорната помпа, която трябва да бъде управлявана от проектираното устройство използва трифазен безчетков мотор, от </w:t>
       </w:r>
       <w:r>
         <w:t>тук</w:t>
@@ -3897,7 +3839,58 @@
         <w:t xml:space="preserve">. На </w:t>
       </w:r>
       <w:r>
-        <w:t>фиг. 2.1.1.</w:t>
+        <w:fldChar w:fldCharType="begin"/>
+      </w:r>
+      <w:r>
+        <w:instrText xml:space="preserve"> REF _Hlk199683984 \h </w:instrText>
+      </w:r>
+      <w:r>
+        <w:instrText xml:space="preserve"> \* MERGEFORMAT </w:instrText>
+      </w:r>
+      <w:r>
+        <w:fldChar w:fldCharType="separate"/>
+      </w:r>
+      <w:r>
+        <w:fldChar w:fldCharType="begin"/>
+      </w:r>
+      <w:r>
+        <w:instrText xml:space="preserve"> REF _Ref199684156 \h </w:instrText>
+      </w:r>
+      <w:r>
+        <w:instrText xml:space="preserve"> \* MERGEFORMAT </w:instrText>
+      </w:r>
+      <w:r>
+        <w:fldChar w:fldCharType="separate"/>
+      </w:r>
+      <w:r>
+        <w:t>фиг.</w:t>
+      </w:r>
+      <w:r>
+        <w:t xml:space="preserve"> </w:t>
+      </w:r>
+      <w:r>
+        <w:rPr>
+          <w:noProof/>
+        </w:rPr>
+        <w:t>2</w:t>
+      </w:r>
+      <w:r>
+        <w:t>.</w:t>
+      </w:r>
+      <w:r>
+        <w:rPr>
+          <w:noProof/>
+        </w:rPr>
+        <w:t>1</w:t>
+      </w:r>
+      <w:r>
+        <w:fldChar w:fldCharType="end"/>
+      </w:r>
+      <w:r>
+        <w:fldChar w:fldCharType="end"/>
+      </w:r>
+      <w:r>
+        <w:t>.</w:t>
       </w:r>
       <w:r>
         <w:t xml:space="preserve"> е показана блокова схема на разликите в управлението на тези видове мотори.</w:t>
@@ -3920,7 +3913,7 @@
           <w:lang w:val="en-US"/>
         </w:rPr>
         <w:drawing>
-          <wp:inline distT="0" distB="0" distL="0" distR="0" wp14:anchorId="6DB53E94" wp14:editId="5054C9BE">
+          <wp:inline distT="0" distB="0" distL="0" distR="0" wp14:anchorId="6DB53E94" wp14:editId="138E1E21">
             <wp:extent cx="5760720" cy="1991360"/>
             <wp:effectExtent l="0" t="0" r="0" b="0"/>
             <wp:docPr id="139262390" name="Picture 1"/>
@@ -3976,6 +3969,7 @@
           <w:szCs w:val="28"/>
         </w:rPr>
       </w:pPr>
+      <w:bookmarkStart w:id="4" w:name="_Ref199684156"/>
       <w:r>
         <w:rPr>
           <w:b/>
@@ -4010,7 +4004,7 @@
           <w:sz w:val="28"/>
           <w:szCs w:val="28"/>
         </w:rPr>
-        <w:instrText xml:space="preserve"> STYLEREF 2 \s </w:instrText>
+        <w:instrText xml:space="preserve"> STYLEREF 1 \s </w:instrText>
       </w:r>
       <w:r>
         <w:rPr>
@@ -4035,7 +4029,7 @@
           <w:sz w:val="28"/>
           <w:szCs w:val="28"/>
         </w:rPr>
-        <w:t>2.1</w:t>
+        <w:t>2</w:t>
       </w:r>
       <w:r>
         <w:rPr>
@@ -4083,7 +4077,7 @@
           <w:sz w:val="28"/>
           <w:szCs w:val="28"/>
         </w:rPr>
-        <w:instrText xml:space="preserve"> SEQ Фиг. \* ARABIC \s 2 </w:instrText>
+        <w:instrText xml:space="preserve"> SEQ Фиг. \* ARABIC \s 1 </w:instrText>
       </w:r>
       <w:r>
         <w:rPr>
@@ -4122,6 +4116,7 @@
         </w:rPr>
         <w:fldChar w:fldCharType="end"/>
       </w:r>
+      <w:bookmarkEnd w:id="4"/>
       <w:r>
         <w:rPr>
           <w:b/>
@@ -4142,29 +4137,7 @@
           <w:sz w:val="28"/>
           <w:szCs w:val="28"/>
         </w:rPr>
-        <w:t xml:space="preserve">Управление на </w:t>
-      </w:r>
-      <w:proofErr w:type="spellStart"/>
-      <w:r>
-        <w:rPr>
-          <w:i w:val="0"/>
-          <w:iCs w:val="0"/>
-          <w:color w:val="auto"/>
-          <w:sz w:val="28"/>
-          <w:szCs w:val="28"/>
-        </w:rPr>
-        <w:t>безчетков</w:t>
-      </w:r>
-      <w:proofErr w:type="spellEnd"/>
-      <w:r>
-        <w:rPr>
-          <w:i w:val="0"/>
-          <w:iCs w:val="0"/>
-          <w:color w:val="auto"/>
-          <w:sz w:val="28"/>
-          <w:szCs w:val="28"/>
-        </w:rPr>
-        <w:t xml:space="preserve"> мотор с Хол сензори (ляво) и без вградени сензори (дясно)</w:t>
+        <w:t>Управление на безчетков мотор с Хол сензори (ляво) и без вградени сензори (дясно)</w:t>
       </w:r>
     </w:p>
     <w:p>
@@ -4258,12 +4231,12 @@
       <w:pPr>
         <w:pStyle w:val="Heading3"/>
       </w:pPr>
-      <w:bookmarkStart w:id="4" w:name="_Toc199088379"/>
+      <w:bookmarkStart w:id="5" w:name="_Toc199088379"/>
       <w:r>
         <w:lastRenderedPageBreak/>
         <w:t>Спрямо броя полюси</w:t>
       </w:r>
-      <w:bookmarkEnd w:id="4"/>
+      <w:bookmarkEnd w:id="5"/>
     </w:p>
     <w:p>
       <w:pPr>
@@ -4272,73 +4245,108 @@
         </w:rPr>
       </w:pPr>
       <w:r>
-        <w:t xml:space="preserve">Роторът на </w:t>
+        <w:t>Роторът на безчеткови</w:t>
+      </w:r>
+      <w:r>
+        <w:t>я</w:t>
+      </w:r>
+      <w:r>
+        <w:t xml:space="preserve"> мотор</w:t>
+      </w:r>
+      <w:r>
+        <w:t xml:space="preserve"> </w:t>
+      </w:r>
+      <w:r>
+        <w:t xml:space="preserve">може да бъде изграден от </w:t>
+      </w:r>
+      <w:r>
+        <w:t>два</w:t>
+      </w:r>
+      <w:r>
+        <w:t xml:space="preserve"> или </w:t>
+      </w:r>
+      <w:r>
+        <w:t xml:space="preserve">повече </w:t>
+      </w:r>
+      <w:r>
+        <w:t xml:space="preserve">магнитни полюси. </w:t>
+      </w:r>
+      <w:r>
+        <w:t xml:space="preserve">На </w:t>
+      </w:r>
+      <w:r>
+        <w:fldChar w:fldCharType="begin"/>
+      </w:r>
+      <w:r>
+        <w:instrText xml:space="preserve"> REF _Ref199684213 \h </w:instrText>
+      </w:r>
+      <w:r>
+        <w:instrText xml:space="preserve"> \* MERGEFORMAT </w:instrText>
+      </w:r>
+      <w:r>
+        <w:fldChar w:fldCharType="separate"/>
+      </w:r>
+      <w:r>
+        <w:t>ф</w:t>
+      </w:r>
+      <w:r>
+        <w:t>иг</w:t>
+      </w:r>
+      <w:r>
+        <w:t>.</w:t>
+      </w:r>
+      <w:r>
+        <w:t xml:space="preserve"> </w:t>
+      </w:r>
+      <w:r>
+        <w:rPr>
+          <w:noProof/>
+        </w:rPr>
+        <w:t>2</w:t>
+      </w:r>
+      <w:r>
+        <w:t>.</w:t>
+      </w:r>
+      <w:r>
+        <w:rPr>
+          <w:noProof/>
+        </w:rPr>
+        <w:t>2</w:t>
+      </w:r>
+      <w:r>
+        <w:fldChar w:fldCharType="end"/>
+      </w:r>
+      <w:r>
+        <w:t>.</w:t>
+      </w:r>
+      <w:r>
+        <w:t xml:space="preserve"> </w:t>
+      </w:r>
+      <w:r>
+        <w:t>са</w:t>
+      </w:r>
+      <w:r>
+        <w:t xml:space="preserve"> показан</w:t>
+      </w:r>
+      <w:r>
+        <w:t xml:space="preserve">и </w:t>
+      </w:r>
+      <w:r>
+        <w:t>конструкци</w:t>
+      </w:r>
+      <w:r>
+        <w:t xml:space="preserve">ите </w:t>
+      </w:r>
+      <w:r>
+        <w:t xml:space="preserve">на двуполюсен и </w:t>
       </w:r>
       <w:proofErr w:type="spellStart"/>
       <w:r>
-        <w:t>безчеткови</w:t>
-      </w:r>
-      <w:r>
-        <w:t>я</w:t>
+        <w:t>четириполюсен</w:t>
       </w:r>
       <w:proofErr w:type="spellEnd"/>
       <w:r>
-        <w:t xml:space="preserve"> мотор</w:t>
-      </w:r>
-      <w:r>
-        <w:t xml:space="preserve"> </w:t>
-      </w:r>
-      <w:r>
-        <w:t xml:space="preserve">може да бъде изграден от </w:t>
-      </w:r>
-      <w:r>
-        <w:t>два</w:t>
-      </w:r>
-      <w:r>
-        <w:t xml:space="preserve"> или </w:t>
-      </w:r>
-      <w:r>
-        <w:t xml:space="preserve">повече </w:t>
-      </w:r>
-      <w:r>
-        <w:t xml:space="preserve">магнитни полюси. </w:t>
-      </w:r>
-      <w:r>
-        <w:t xml:space="preserve">На фиг. 2.1.2. </w:t>
-      </w:r>
-      <w:r>
-        <w:t>са</w:t>
-      </w:r>
-      <w:r>
-        <w:t xml:space="preserve"> показан</w:t>
-      </w:r>
-      <w:r>
-        <w:t xml:space="preserve">и </w:t>
-      </w:r>
-      <w:r>
-        <w:t>конструкци</w:t>
-      </w:r>
-      <w:r>
-        <w:t xml:space="preserve">ите </w:t>
-      </w:r>
-      <w:r>
-        <w:t xml:space="preserve">на двуполюсен и </w:t>
-      </w:r>
-      <w:proofErr w:type="spellStart"/>
-      <w:r>
-        <w:t>четириполюсен</w:t>
-      </w:r>
-      <w:proofErr w:type="spellEnd"/>
-      <w:r>
-        <w:t xml:space="preserve"> </w:t>
-      </w:r>
-      <w:proofErr w:type="spellStart"/>
-      <w:r>
-        <w:t>безчетков</w:t>
-      </w:r>
-      <w:proofErr w:type="spellEnd"/>
-      <w:r>
-        <w:t xml:space="preserve"> мотор.</w:t>
+        <w:t xml:space="preserve"> безчетков мотор.</w:t>
       </w:r>
       <w:r>
         <w:t xml:space="preserve"> </w:t>
@@ -4420,6 +4428,7 @@
           <w:szCs w:val="28"/>
         </w:rPr>
       </w:pPr>
+      <w:bookmarkStart w:id="6" w:name="_Ref199684213"/>
       <w:r>
         <w:rPr>
           <w:b/>
@@ -4454,7 +4463,7 @@
           <w:sz w:val="28"/>
           <w:szCs w:val="28"/>
         </w:rPr>
-        <w:instrText xml:space="preserve"> STYLEREF 2 \s </w:instrText>
+        <w:instrText xml:space="preserve"> STYLEREF 1 \s </w:instrText>
       </w:r>
       <w:r>
         <w:rPr>
@@ -4479,7 +4488,7 @@
           <w:sz w:val="28"/>
           <w:szCs w:val="28"/>
         </w:rPr>
-        <w:t>2.1</w:t>
+        <w:t>2</w:t>
       </w:r>
       <w:r>
         <w:rPr>
@@ -4527,7 +4536,7 @@
           <w:sz w:val="28"/>
           <w:szCs w:val="28"/>
         </w:rPr>
-        <w:instrText xml:space="preserve"> SEQ Фиг. \* ARABIC \s 2 </w:instrText>
+        <w:instrText xml:space="preserve"> SEQ Фиг. \* ARABIC \s 1 </w:instrText>
       </w:r>
       <w:r>
         <w:rPr>
@@ -4566,6 +4575,7 @@
         </w:rPr>
         <w:fldChar w:fldCharType="end"/>
       </w:r>
+      <w:bookmarkEnd w:id="6"/>
       <w:r>
         <w:rPr>
           <w:b/>
@@ -4578,27 +4588,15 @@
         </w:rPr>
         <w:t xml:space="preserve">. </w:t>
       </w:r>
-      <w:proofErr w:type="spellStart"/>
-      <w:r>
-        <w:rPr>
-          <w:i w:val="0"/>
-          <w:iCs w:val="0"/>
-          <w:color w:val="auto"/>
-          <w:sz w:val="28"/>
-          <w:szCs w:val="28"/>
-        </w:rPr>
-        <w:t>Безчетков</w:t>
-      </w:r>
-      <w:proofErr w:type="spellEnd"/>
-      <w:r>
-        <w:rPr>
-          <w:i w:val="0"/>
-          <w:iCs w:val="0"/>
-          <w:color w:val="auto"/>
-          <w:sz w:val="28"/>
-          <w:szCs w:val="28"/>
-        </w:rPr>
-        <w:t xml:space="preserve"> мотор с 2 полюса (ляво) и с 4 полюса (дясно)</w:t>
+      <w:r>
+        <w:rPr>
+          <w:i w:val="0"/>
+          <w:iCs w:val="0"/>
+          <w:color w:val="auto"/>
+          <w:sz w:val="28"/>
+          <w:szCs w:val="28"/>
+        </w:rPr>
+        <w:t>Безчетков мотор с 2 полюса (ляво) и с 4 полюса (дясно)</w:t>
       </w:r>
     </w:p>
     <w:p>
@@ -4638,15 +4636,7 @@
         <w:t>За да се определи позицията на ротора при</w:t>
       </w:r>
       <w:r>
-        <w:t xml:space="preserve"> </w:t>
-      </w:r>
-      <w:proofErr w:type="spellStart"/>
-      <w:r>
-        <w:t>безчетков</w:t>
-      </w:r>
-      <w:proofErr w:type="spellEnd"/>
-      <w:r>
-        <w:t xml:space="preserve"> мотор без вградени сензори</w:t>
+        <w:t xml:space="preserve"> безчетков мотор без вградени сензори</w:t>
       </w:r>
       <w:r>
         <w:t>, броят полюси трябва да е известен предварително.</w:t>
@@ -4692,24 +4682,66 @@
       <w:pPr>
         <w:pStyle w:val="Heading3"/>
       </w:pPr>
-      <w:bookmarkStart w:id="5" w:name="_Toc199088380"/>
+      <w:bookmarkStart w:id="7" w:name="_Toc199088380"/>
+      <w:bookmarkStart w:id="8" w:name="_Ref199684601"/>
       <w:r>
         <w:lastRenderedPageBreak/>
         <w:t>Спрямо формата на обратното ЕДН</w:t>
       </w:r>
-      <w:bookmarkEnd w:id="5"/>
-    </w:p>
-    <w:p>
-      <w:r>
-        <w:t xml:space="preserve">Според начина на навиване на намотките в статора, </w:t>
-      </w:r>
-      <w:proofErr w:type="spellStart"/>
-      <w:r>
-        <w:t>безчетковите</w:t>
-      </w:r>
-      <w:proofErr w:type="spellEnd"/>
-      <w:r>
-        <w:t xml:space="preserve"> мотори се разделят на такива с трапецовидно и със синусоидално обратно ЕДН. На фиг. 2.1.3. е показана разликата между двата вида.</w:t>
+      <w:bookmarkEnd w:id="7"/>
+      <w:bookmarkEnd w:id="8"/>
+    </w:p>
+    <w:p>
+      <w:r>
+        <w:t xml:space="preserve">Според начина на навиване на намотките в статора, безчетковите мотори се разделят на такива с трапецовидно и със синусоидално обратно ЕДН. На </w:t>
+      </w:r>
+      <w:r>
+        <w:fldChar w:fldCharType="begin"/>
+      </w:r>
+      <w:r>
+        <w:instrText xml:space="preserve"> REF _Ref199684247 \h </w:instrText>
+      </w:r>
+      <w:r>
+        <w:instrText xml:space="preserve"> \* MERGEFORMAT </w:instrText>
+      </w:r>
+      <w:r>
+        <w:fldChar w:fldCharType="separate"/>
+      </w:r>
+      <w:r>
+        <w:t>ф</w:t>
+      </w:r>
+      <w:r>
+        <w:t>иг.</w:t>
+      </w:r>
+      <w:r>
+        <w:t xml:space="preserve"> </w:t>
+      </w:r>
+      <w:r>
+        <w:rPr>
+          <w:noProof/>
+        </w:rPr>
+        <w:t>2</w:t>
+      </w:r>
+      <w:r>
+        <w:t>.</w:t>
+      </w:r>
+      <w:r>
+        <w:rPr>
+          <w:noProof/>
+        </w:rPr>
+        <w:t>3</w:t>
+      </w:r>
+      <w:r>
+        <w:fldChar w:fldCharType="end"/>
+      </w:r>
+      <w:r>
+        <w:t>.</w:t>
+      </w:r>
+      <w:r>
+        <w:t xml:space="preserve"> </w:t>
+      </w:r>
+      <w:r>
+        <w:t>е показана разликата между двата вида.</w:t>
       </w:r>
     </w:p>
     <w:tbl>
@@ -4737,7 +4769,7 @@
       <w:tr>
         <w:tc>
           <w:tcPr>
-            <w:tcW w:w="4644" w:type="dxa"/>
+            <w:tcW w:w="4632" w:type="dxa"/>
             <w:vAlign w:val="center"/>
           </w:tcPr>
           <w:p>
@@ -4793,7 +4825,7 @@
         </w:tc>
         <w:tc>
           <w:tcPr>
-            <w:tcW w:w="4644" w:type="dxa"/>
+            <w:tcW w:w="4440" w:type="dxa"/>
             <w:vAlign w:val="center"/>
           </w:tcPr>
           <w:p>
@@ -4863,6 +4895,7 @@
           <w:szCs w:val="28"/>
         </w:rPr>
       </w:pPr>
+      <w:bookmarkStart w:id="9" w:name="_Ref199684247"/>
       <w:r>
         <w:rPr>
           <w:b/>
@@ -4897,7 +4930,7 @@
           <w:sz w:val="28"/>
           <w:szCs w:val="28"/>
         </w:rPr>
-        <w:instrText xml:space="preserve"> STYLEREF 2 \s </w:instrText>
+        <w:instrText xml:space="preserve"> STYLEREF 1 \s </w:instrText>
       </w:r>
       <w:r>
         <w:rPr>
@@ -4922,7 +4955,7 @@
           <w:sz w:val="28"/>
           <w:szCs w:val="28"/>
         </w:rPr>
-        <w:t>2.1</w:t>
+        <w:t>2</w:t>
       </w:r>
       <w:r>
         <w:rPr>
@@ -4958,6 +4991,43 @@
           <w:sz w:val="28"/>
           <w:szCs w:val="28"/>
         </w:rPr>
+        <w:fldChar w:fldCharType="begin"/>
+      </w:r>
+      <w:r>
+        <w:rPr>
+          <w:b/>
+          <w:bCs/>
+          <w:i w:val="0"/>
+          <w:iCs w:val="0"/>
+          <w:color w:val="auto"/>
+          <w:sz w:val="28"/>
+          <w:szCs w:val="28"/>
+        </w:rPr>
+        <w:instrText xml:space="preserve"> SEQ Фиг. \* ARABIC \s 1 </w:instrText>
+      </w:r>
+      <w:r>
+        <w:rPr>
+          <w:b/>
+          <w:bCs/>
+          <w:i w:val="0"/>
+          <w:iCs w:val="0"/>
+          <w:color w:val="auto"/>
+          <w:sz w:val="28"/>
+          <w:szCs w:val="28"/>
+        </w:rPr>
+        <w:fldChar w:fldCharType="separate"/>
+      </w:r>
+      <w:r>
+        <w:rPr>
+          <w:b/>
+          <w:bCs/>
+          <w:i w:val="0"/>
+          <w:iCs w:val="0"/>
+          <w:noProof/>
+          <w:color w:val="auto"/>
+          <w:sz w:val="28"/>
+          <w:szCs w:val="28"/>
+        </w:rPr>
         <w:t>3</w:t>
       </w:r>
       <w:r>
@@ -4970,6 +5040,19 @@
           <w:sz w:val="28"/>
           <w:szCs w:val="28"/>
         </w:rPr>
+        <w:fldChar w:fldCharType="end"/>
+      </w:r>
+      <w:bookmarkEnd w:id="9"/>
+      <w:r>
+        <w:rPr>
+          <w:b/>
+          <w:bCs/>
+          <w:i w:val="0"/>
+          <w:iCs w:val="0"/>
+          <w:color w:val="auto"/>
+          <w:sz w:val="28"/>
+          <w:szCs w:val="28"/>
+        </w:rPr>
         <w:t xml:space="preserve">. </w:t>
       </w:r>
       <w:r>
@@ -4980,29 +5063,7 @@
           <w:sz w:val="28"/>
           <w:szCs w:val="28"/>
         </w:rPr>
-        <w:t xml:space="preserve">Форма на обратното ЕДН на трапецовиден (ляво) и синусоидален (дясно) </w:t>
-      </w:r>
-      <w:proofErr w:type="spellStart"/>
-      <w:r>
-        <w:rPr>
-          <w:i w:val="0"/>
-          <w:iCs w:val="0"/>
-          <w:color w:val="auto"/>
-          <w:sz w:val="28"/>
-          <w:szCs w:val="28"/>
-        </w:rPr>
-        <w:t>безчетков</w:t>
-      </w:r>
-      <w:proofErr w:type="spellEnd"/>
-      <w:r>
-        <w:rPr>
-          <w:i w:val="0"/>
-          <w:iCs w:val="0"/>
-          <w:color w:val="auto"/>
-          <w:sz w:val="28"/>
-          <w:szCs w:val="28"/>
-        </w:rPr>
-        <w:t xml:space="preserve"> мотор</w:t>
+        <w:t>Форма на обратното ЕДН на трапецовиден (ляво) и синусоидален (дясно) безчетков мотор</w:t>
       </w:r>
     </w:p>
     <w:p>
@@ -5083,13 +5144,8 @@
       </w:r>
     </w:p>
     <w:p>
-      <w:proofErr w:type="spellStart"/>
-      <w:r>
-        <w:t>Безчетковия</w:t>
-      </w:r>
-      <w:proofErr w:type="spellEnd"/>
-      <w:r>
-        <w:t xml:space="preserve"> мотор в к</w:t>
+      <w:r>
+        <w:t>Безчетковия мотор в к</w:t>
       </w:r>
       <w:r>
         <w:t>омпресорната помпа, която трябва да бъде управлявана от проектираното устройство</w:t>
@@ -5133,7 +5189,7 @@
       <w:pPr>
         <w:pStyle w:val="Heading2"/>
       </w:pPr>
-      <w:bookmarkStart w:id="6" w:name="_Toc199088381"/>
+      <w:bookmarkStart w:id="10" w:name="_Toc199088381"/>
       <w:r>
         <w:t>Алгоритми за управление</w:t>
       </w:r>
@@ -5158,7 +5214,7 @@
         </w:rPr>
         <w:t>[4]</w:t>
       </w:r>
-      <w:bookmarkEnd w:id="6"/>
+      <w:bookmarkEnd w:id="10"/>
     </w:p>
     <w:p>
       <w:pPr>
@@ -5205,11 +5261,11 @@
       <w:pPr>
         <w:pStyle w:val="Heading3"/>
       </w:pPr>
-      <w:bookmarkStart w:id="7" w:name="_Toc199088382"/>
+      <w:bookmarkStart w:id="11" w:name="_Toc199088382"/>
       <w:r>
         <w:t>Трапецовидно управление</w:t>
       </w:r>
-      <w:bookmarkEnd w:id="7"/>
+      <w:bookmarkEnd w:id="11"/>
     </w:p>
     <w:p>
       <w:r>
@@ -5284,7 +5340,58 @@
         <w:t xml:space="preserve">та </w:t>
       </w:r>
       <w:r>
-        <w:t>зависи от желаната посока на въртене на мотора. На фиг. 2.2.1. са показани управляващите сигнали и токовете през намотките при такъв вид управление.</w:t>
+        <w:t xml:space="preserve">зависи от желаната посока на въртене на мотора. На </w:t>
+      </w:r>
+      <w:r>
+        <w:fldChar w:fldCharType="begin"/>
+      </w:r>
+      <w:r>
+        <w:instrText xml:space="preserve"> REF _Ref199684272 \h </w:instrText>
+      </w:r>
+      <w:r>
+        <w:instrText xml:space="preserve"> \* MERGEFORMAT </w:instrText>
+      </w:r>
+      <w:r>
+        <w:fldChar w:fldCharType="separate"/>
+      </w:r>
+      <w:r>
+        <w:t>ф</w:t>
+      </w:r>
+      <w:r>
+        <w:t>и</w:t>
+      </w:r>
+      <w:r>
+        <w:t>г</w:t>
+      </w:r>
+      <w:r>
+        <w:t xml:space="preserve">. </w:t>
+      </w:r>
+      <w:r>
+        <w:rPr>
+          <w:noProof/>
+        </w:rPr>
+        <w:t>2</w:t>
+      </w:r>
+      <w:r>
+        <w:t>.</w:t>
+      </w:r>
+      <w:r>
+        <w:rPr>
+          <w:noProof/>
+        </w:rPr>
+        <w:t>4</w:t>
+      </w:r>
+      <w:r>
+        <w:fldChar w:fldCharType="end"/>
+      </w:r>
+      <w:r>
+        <w:t>.</w:t>
+      </w:r>
+      <w:r>
+        <w:t xml:space="preserve"> </w:t>
+      </w:r>
+      <w:r>
+        <w:t>са показани управляващите сигнали и токовете през намотките при такъв вид управление.</w:t>
       </w:r>
     </w:p>
     <w:p>
@@ -5350,6 +5457,7 @@
           <w:szCs w:val="28"/>
         </w:rPr>
       </w:pPr>
+      <w:bookmarkStart w:id="12" w:name="_Ref199684272"/>
       <w:r>
         <w:rPr>
           <w:b/>
@@ -5384,7 +5492,7 @@
           <w:sz w:val="28"/>
           <w:szCs w:val="28"/>
         </w:rPr>
-        <w:instrText xml:space="preserve"> STYLEREF 2 \s </w:instrText>
+        <w:instrText xml:space="preserve"> STYLEREF 1 \s </w:instrText>
       </w:r>
       <w:r>
         <w:rPr>
@@ -5409,7 +5517,7 @@
           <w:sz w:val="28"/>
           <w:szCs w:val="28"/>
         </w:rPr>
-        <w:t>2.2</w:t>
+        <w:t>2</w:t>
       </w:r>
       <w:r>
         <w:rPr>
@@ -5457,7 +5565,7 @@
           <w:sz w:val="28"/>
           <w:szCs w:val="28"/>
         </w:rPr>
-        <w:instrText xml:space="preserve"> SEQ Фиг. \* ARABIC \s 2 </w:instrText>
+        <w:instrText xml:space="preserve"> SEQ Фиг. \* ARABIC \s 1 </w:instrText>
       </w:r>
       <w:r>
         <w:rPr>
@@ -5482,7 +5590,7 @@
           <w:sz w:val="28"/>
           <w:szCs w:val="28"/>
         </w:rPr>
-        <w:t>1</w:t>
+        <w:t>4</w:t>
       </w:r>
       <w:r>
         <w:rPr>
@@ -5496,6 +5604,7 @@
         </w:rPr>
         <w:fldChar w:fldCharType="end"/>
       </w:r>
+      <w:bookmarkEnd w:id="12"/>
       <w:r>
         <w:rPr>
           <w:b/>
@@ -5633,16 +5742,61 @@
       <w:pPr>
         <w:pStyle w:val="Heading3"/>
       </w:pPr>
-      <w:bookmarkStart w:id="8" w:name="_Toc199088383"/>
+      <w:bookmarkStart w:id="13" w:name="_Toc199088383"/>
       <w:r>
         <w:lastRenderedPageBreak/>
         <w:t>Синусоидално управление</w:t>
       </w:r>
-      <w:bookmarkEnd w:id="8"/>
-    </w:p>
-    <w:p>
-      <w:r>
-        <w:t>При този алгоритъм за управление през целия период на електрическото поле през всяка от фазите преминава ток в една от двете възможни посоки, като той се променя плавно (синусоидално). Магнитният поток, генериран от статора, е синусоидален и това води до плавно завъртане на ротора. На фиг. 2.2.2. са показани управляващите сигнали и токовете през намотките при такъв вид управление.</w:t>
+      <w:bookmarkEnd w:id="13"/>
+    </w:p>
+    <w:p>
+      <w:r>
+        <w:t xml:space="preserve">При този алгоритъм за управление през целия период на електрическото поле през всяка от фазите преминава ток в една от двете възможни посоки, като той се променя плавно (синусоидално). Магнитният поток, генериран от статора, е синусоидален и това води до плавно завъртане на ротора. На </w:t>
+      </w:r>
+      <w:r>
+        <w:fldChar w:fldCharType="begin"/>
+      </w:r>
+      <w:r>
+        <w:instrText xml:space="preserve"> REF _Ref199684336 \h </w:instrText>
+      </w:r>
+      <w:r>
+        <w:instrText xml:space="preserve"> \* MERGEFORMAT </w:instrText>
+      </w:r>
+      <w:r>
+        <w:fldChar w:fldCharType="separate"/>
+      </w:r>
+      <w:r>
+        <w:t>ф</w:t>
+      </w:r>
+      <w:r>
+        <w:t xml:space="preserve">иг. </w:t>
+      </w:r>
+      <w:r>
+        <w:rPr>
+          <w:noProof/>
+        </w:rPr>
+        <w:t>2</w:t>
+      </w:r>
+      <w:r>
+        <w:t>.</w:t>
+      </w:r>
+      <w:r>
+        <w:rPr>
+          <w:noProof/>
+        </w:rPr>
+        <w:t>5</w:t>
+      </w:r>
+      <w:r>
+        <w:fldChar w:fldCharType="end"/>
+      </w:r>
+      <w:r>
+        <w:t>.</w:t>
+      </w:r>
+      <w:r>
+        <w:t xml:space="preserve"> </w:t>
+      </w:r>
+      <w:r>
+        <w:t>са показани управляващите сигнали и токовете през намотките при такъв вид управление.</w:t>
       </w:r>
     </w:p>
     <w:p>
@@ -5708,6 +5862,7 @@
           <w:szCs w:val="28"/>
         </w:rPr>
       </w:pPr>
+      <w:bookmarkStart w:id="14" w:name="_Ref199684336"/>
       <w:r>
         <w:rPr>
           <w:b/>
@@ -5742,7 +5897,7 @@
           <w:sz w:val="28"/>
           <w:szCs w:val="28"/>
         </w:rPr>
-        <w:instrText xml:space="preserve"> STYLEREF 2 \s </w:instrText>
+        <w:instrText xml:space="preserve"> STYLEREF 1 \s </w:instrText>
       </w:r>
       <w:r>
         <w:rPr>
@@ -5767,7 +5922,7 @@
           <w:sz w:val="28"/>
           <w:szCs w:val="28"/>
         </w:rPr>
-        <w:t>2.2</w:t>
+        <w:t>2</w:t>
       </w:r>
       <w:r>
         <w:rPr>
@@ -5815,7 +5970,7 @@
           <w:sz w:val="28"/>
           <w:szCs w:val="28"/>
         </w:rPr>
-        <w:instrText xml:space="preserve"> SEQ Фиг. \* ARABIC \s 2 </w:instrText>
+        <w:instrText xml:space="preserve"> SEQ Фиг. \* ARABIC \s 1 </w:instrText>
       </w:r>
       <w:r>
         <w:rPr>
@@ -5840,7 +5995,7 @@
           <w:sz w:val="28"/>
           <w:szCs w:val="28"/>
         </w:rPr>
-        <w:t>2</w:t>
+        <w:t>5</w:t>
       </w:r>
       <w:r>
         <w:rPr>
@@ -5854,6 +6009,7 @@
         </w:rPr>
         <w:fldChar w:fldCharType="end"/>
       </w:r>
+      <w:bookmarkEnd w:id="14"/>
       <w:r>
         <w:rPr>
           <w:b/>
@@ -5960,7 +6116,7 @@
       <w:pPr>
         <w:pStyle w:val="Heading3"/>
       </w:pPr>
-      <w:bookmarkStart w:id="9" w:name="_Toc199088384"/>
+      <w:bookmarkStart w:id="15" w:name="_Toc199088384"/>
       <w:r>
         <w:rPr>
           <w:lang w:val="en-US"/>
@@ -5971,7 +6127,7 @@
       <w:r>
         <w:t xml:space="preserve"> управление</w:t>
       </w:r>
-      <w:bookmarkEnd w:id="9"/>
+      <w:bookmarkEnd w:id="15"/>
     </w:p>
     <w:p>
       <w:r>
@@ -5987,15 +6143,7 @@
         <w:t>прецизно</w:t>
       </w:r>
       <w:r>
-        <w:t xml:space="preserve"> и ефективно управление на скоростта и въртящия момент на </w:t>
-      </w:r>
-      <w:proofErr w:type="spellStart"/>
-      <w:r>
-        <w:t>безчетков</w:t>
-      </w:r>
-      <w:proofErr w:type="spellEnd"/>
-      <w:r>
-        <w:t xml:space="preserve"> мотор. Принципът се основава на ориентиране на статорното поле по такъв начин, че то да е перпендикулярно на магнитния поток на ротора, така че да се получи максимален въртящ момент</w:t>
+        <w:t xml:space="preserve"> и ефективно управление на скоростта и въртящия момент на безчетков мотор. Принципът се основава на ориентиране на статорното поле по такъв начин, че то да е перпендикулярно на магнитния поток на ротора, така че да се получи максимален въртящ момент</w:t>
       </w:r>
       <w:r>
         <w:rPr>
@@ -6010,7 +6158,58 @@
         <w:t>всяка позиция на</w:t>
       </w:r>
       <w:r>
-        <w:t xml:space="preserve"> мотора. На фиг. 2.2.3. е показана векторна диаграма, която показва ориентацията на статорното </w:t>
+        <w:t xml:space="preserve"> мотора. На </w:t>
+      </w:r>
+      <w:r>
+        <w:fldChar w:fldCharType="begin"/>
+      </w:r>
+      <w:r>
+        <w:instrText xml:space="preserve"> REF _Ref199684464 \h </w:instrText>
+      </w:r>
+      <w:r>
+        <w:instrText xml:space="preserve"> \* MERGEFORMAT </w:instrText>
+      </w:r>
+      <w:r>
+        <w:fldChar w:fldCharType="separate"/>
+      </w:r>
+      <w:r>
+        <w:t>ф</w:t>
+      </w:r>
+      <w:r>
+        <w:t>и</w:t>
+      </w:r>
+      <w:r>
+        <w:t>г</w:t>
+      </w:r>
+      <w:r>
+        <w:t xml:space="preserve">. </w:t>
+      </w:r>
+      <w:r>
+        <w:rPr>
+          <w:noProof/>
+        </w:rPr>
+        <w:t>2</w:t>
+      </w:r>
+      <w:r>
+        <w:t>.</w:t>
+      </w:r>
+      <w:r>
+        <w:rPr>
+          <w:noProof/>
+        </w:rPr>
+        <w:t>6</w:t>
+      </w:r>
+      <w:r>
+        <w:fldChar w:fldCharType="end"/>
+      </w:r>
+      <w:r>
+        <w:t>.</w:t>
+      </w:r>
+      <w:r>
+        <w:t xml:space="preserve"> </w:t>
+      </w:r>
+      <w:r>
+        <w:t xml:space="preserve">е показана векторна диаграма, която показва ориентацията на статорното </w:t>
       </w:r>
       <w:r>
         <w:t>електрическо</w:t>
@@ -6101,6 +6300,7 @@
           <w:szCs w:val="28"/>
         </w:rPr>
       </w:pPr>
+      <w:bookmarkStart w:id="16" w:name="_Ref199684464"/>
       <w:r>
         <w:rPr>
           <w:b/>
@@ -6135,7 +6335,7 @@
           <w:sz w:val="28"/>
           <w:szCs w:val="28"/>
         </w:rPr>
-        <w:instrText xml:space="preserve"> STYLEREF 2 \s </w:instrText>
+        <w:instrText xml:space="preserve"> STYLEREF 1 \s </w:instrText>
       </w:r>
       <w:r>
         <w:rPr>
@@ -6160,7 +6360,7 @@
           <w:sz w:val="28"/>
           <w:szCs w:val="28"/>
         </w:rPr>
-        <w:t>2.2</w:t>
+        <w:t>2</w:t>
       </w:r>
       <w:r>
         <w:rPr>
@@ -6208,7 +6408,7 @@
           <w:sz w:val="28"/>
           <w:szCs w:val="28"/>
         </w:rPr>
-        <w:instrText xml:space="preserve"> SEQ Фиг. \* ARABIC \s 2 </w:instrText>
+        <w:instrText xml:space="preserve"> SEQ Фиг. \* ARABIC \s 1 </w:instrText>
       </w:r>
       <w:r>
         <w:rPr>
@@ -6233,7 +6433,7 @@
           <w:sz w:val="28"/>
           <w:szCs w:val="28"/>
         </w:rPr>
-        <w:t>3</w:t>
+        <w:t>6</w:t>
       </w:r>
       <w:r>
         <w:rPr>
@@ -6247,6 +6447,7 @@
         </w:rPr>
         <w:fldChar w:fldCharType="end"/>
       </w:r>
+      <w:bookmarkEnd w:id="16"/>
       <w:r>
         <w:rPr>
           <w:b/>
@@ -6326,16 +6527,58 @@
       <w:pPr>
         <w:pStyle w:val="Heading3"/>
       </w:pPr>
-      <w:bookmarkStart w:id="10" w:name="_Toc199088385"/>
+      <w:bookmarkStart w:id="17" w:name="_Toc199088385"/>
       <w:r>
         <w:lastRenderedPageBreak/>
         <w:t>Сравнение между трите вида управление</w:t>
       </w:r>
-      <w:bookmarkEnd w:id="10"/>
-    </w:p>
-    <w:p>
-      <w:r>
-        <w:t xml:space="preserve">В табл. 2.2.1. е дадено сравнение между трите алгоритъма за управление на трифазни </w:t>
+      <w:bookmarkEnd w:id="17"/>
+    </w:p>
+    <w:p>
+      <w:r>
+        <w:t xml:space="preserve">В </w:t>
+      </w:r>
+      <w:r>
+        <w:fldChar w:fldCharType="begin"/>
+      </w:r>
+      <w:r>
+        <w:instrText xml:space="preserve"> REF _Ref199684553 \h </w:instrText>
+      </w:r>
+      <w:r>
+        <w:instrText xml:space="preserve"> \* MERGEFORMAT </w:instrText>
+      </w:r>
+      <w:r>
+        <w:fldChar w:fldCharType="separate"/>
+      </w:r>
+      <w:r>
+        <w:t>т</w:t>
+      </w:r>
+      <w:r>
+        <w:t xml:space="preserve">абл. </w:t>
+      </w:r>
+      <w:r>
+        <w:rPr>
+          <w:noProof/>
+        </w:rPr>
+        <w:t>2</w:t>
+      </w:r>
+      <w:r>
+        <w:t>.</w:t>
+      </w:r>
+      <w:r>
+        <w:rPr>
+          <w:noProof/>
+        </w:rPr>
+        <w:t>1</w:t>
+      </w:r>
+      <w:r>
+        <w:fldChar w:fldCharType="end"/>
+      </w:r>
+      <w:r>
+        <w:t>.</w:t>
+      </w:r>
+      <w:r>
+        <w:t xml:space="preserve"> е дадено сравнение между трите алгоритъма за управление на трифазни </w:t>
       </w:r>
       <w:proofErr w:type="spellStart"/>
       <w:r>
@@ -6365,6 +6608,7 @@
           <w:szCs w:val="28"/>
         </w:rPr>
       </w:pPr>
+      <w:bookmarkStart w:id="18" w:name="_Ref199684553"/>
       <w:r>
         <w:rPr>
           <w:b/>
@@ -6399,7 +6643,7 @@
           <w:sz w:val="28"/>
           <w:szCs w:val="28"/>
         </w:rPr>
-        <w:instrText xml:space="preserve"> STYLEREF 2 \s </w:instrText>
+        <w:instrText xml:space="preserve"> STYLEREF 1 \s </w:instrText>
       </w:r>
       <w:r>
         <w:rPr>
@@ -6424,7 +6668,7 @@
           <w:sz w:val="28"/>
           <w:szCs w:val="28"/>
         </w:rPr>
-        <w:t>2.2</w:t>
+        <w:t>2</w:t>
       </w:r>
       <w:r>
         <w:rPr>
@@ -6472,7 +6716,7 @@
           <w:sz w:val="28"/>
           <w:szCs w:val="28"/>
         </w:rPr>
-        <w:instrText xml:space="preserve"> SEQ Табл. \* ARABIC \s 2 </w:instrText>
+        <w:instrText xml:space="preserve"> SEQ Табл. \* ARABIC \s 1 </w:instrText>
       </w:r>
       <w:r>
         <w:rPr>
@@ -6511,6 +6755,7 @@
         </w:rPr>
         <w:fldChar w:fldCharType="end"/>
       </w:r>
+      <w:bookmarkEnd w:id="18"/>
       <w:r>
         <w:rPr>
           <w:b/>
@@ -7200,21 +7445,34 @@
         <w:t xml:space="preserve">т. </w:t>
       </w:r>
       <w:r>
-        <w:t>2.1.3.,</w:t>
-      </w:r>
-      <w:r>
-        <w:t xml:space="preserve"> компресорната помпа, която ще бъде управлявана от проектираното устройство, </w:t>
-      </w:r>
-      <w:r>
-        <w:t xml:space="preserve">използва </w:t>
-      </w:r>
-      <w:proofErr w:type="spellStart"/>
-      <w:r>
-        <w:t>безчетков</w:t>
-      </w:r>
-      <w:proofErr w:type="spellEnd"/>
-      <w:r>
-        <w:t xml:space="preserve"> мотор с трапецовидно обратно ЕДН</w:t>
+        <w:fldChar w:fldCharType="begin"/>
+      </w:r>
+      <w:r>
+        <w:instrText xml:space="preserve"> REF _Ref199684601 \r \h </w:instrText>
+      </w:r>
+      <w:r>
+        <w:fldChar w:fldCharType="separate"/>
+      </w:r>
+      <w:r>
+        <w:t>2.</w:t>
+      </w:r>
+      <w:r>
+        <w:t>1</w:t>
+      </w:r>
+      <w:r>
+        <w:t>.3</w:t>
+      </w:r>
+      <w:r>
+        <w:fldChar w:fldCharType="end"/>
+      </w:r>
+      <w:r>
+        <w:t xml:space="preserve">. </w:t>
+      </w:r>
+      <w:r>
+        <w:t xml:space="preserve">компресорната помпа, която ще бъде управлявана от проектираното устройство, </w:t>
+      </w:r>
+      <w:r>
+        <w:t>използва безчетков мотор с трапецовидно обратно ЕДН</w:t>
       </w:r>
       <w:r>
         <w:t xml:space="preserve">. Вземайки това предвид, подходящи за целите на дипломната работа са трапецовидното и </w:t>
@@ -7289,7 +7547,7 @@
           <w:lang w:val="en-US"/>
         </w:rPr>
       </w:pPr>
-      <w:bookmarkStart w:id="11" w:name="_Toc199088386"/>
+      <w:bookmarkStart w:id="19" w:name="_Toc199088386"/>
       <w:r>
         <w:t>Интегрирани</w:t>
       </w:r>
@@ -7310,7 +7568,7 @@
       <w:r>
         <w:t>мотори</w:t>
       </w:r>
-      <w:bookmarkEnd w:id="11"/>
+      <w:bookmarkEnd w:id="19"/>
     </w:p>
     <w:p>
       <w:r>
@@ -7395,7 +7653,7 @@
           <w:lang w:val="en-US"/>
         </w:rPr>
       </w:pPr>
-      <w:bookmarkStart w:id="12" w:name="_Toc199088387"/>
+      <w:bookmarkStart w:id="20" w:name="_Toc199088387"/>
       <w:r>
         <w:rPr>
           <w:lang w:val="en-US"/>
@@ -7418,11 +7676,53 @@
         </w:rPr>
         <w:t>[5]</w:t>
       </w:r>
-      <w:bookmarkEnd w:id="12"/>
-    </w:p>
-    <w:p>
-      <w:r>
-        <w:t>На фиг. 2.3.1. е показана опростена</w:t>
+      <w:bookmarkEnd w:id="20"/>
+    </w:p>
+    <w:p>
+      <w:r>
+        <w:t xml:space="preserve">На </w:t>
+      </w:r>
+      <w:r>
+        <w:fldChar w:fldCharType="begin"/>
+      </w:r>
+      <w:r>
+        <w:instrText xml:space="preserve"> REF _Ref199684644 \h </w:instrText>
+      </w:r>
+      <w:r>
+        <w:instrText xml:space="preserve"> \* MERGEFORMAT </w:instrText>
+      </w:r>
+      <w:r>
+        <w:fldChar w:fldCharType="separate"/>
+      </w:r>
+      <w:r>
+        <w:t>ф</w:t>
+      </w:r>
+      <w:r>
+        <w:t xml:space="preserve">иг. </w:t>
+      </w:r>
+      <w:r>
+        <w:rPr>
+          <w:noProof/>
+        </w:rPr>
+        <w:t>2</w:t>
+      </w:r>
+      <w:r>
+        <w:t>.</w:t>
+      </w:r>
+      <w:r>
+        <w:rPr>
+          <w:noProof/>
+        </w:rPr>
+        <w:t>7</w:t>
+      </w:r>
+      <w:r>
+        <w:fldChar w:fldCharType="end"/>
+      </w:r>
+      <w:r>
+        <w:t>.</w:t>
+      </w:r>
+      <w:r>
+        <w:t xml:space="preserve"> е показана опростена</w:t>
       </w:r>
       <w:r>
         <w:rPr>
@@ -7503,6 +7803,7 @@
           <w:lang w:val="en-US"/>
         </w:rPr>
       </w:pPr>
+      <w:bookmarkStart w:id="21" w:name="_Ref199684644"/>
       <w:r>
         <w:rPr>
           <w:b/>
@@ -7537,7 +7838,7 @@
           <w:sz w:val="28"/>
           <w:szCs w:val="28"/>
         </w:rPr>
-        <w:instrText xml:space="preserve"> STYLEREF 2 \s </w:instrText>
+        <w:instrText xml:space="preserve"> STYLEREF 1 \s </w:instrText>
       </w:r>
       <w:r>
         <w:rPr>
@@ -7562,7 +7863,7 @@
           <w:sz w:val="28"/>
           <w:szCs w:val="28"/>
         </w:rPr>
-        <w:t>2.3</w:t>
+        <w:t>2</w:t>
       </w:r>
       <w:r>
         <w:rPr>
@@ -7610,7 +7911,7 @@
           <w:sz w:val="28"/>
           <w:szCs w:val="28"/>
         </w:rPr>
-        <w:instrText xml:space="preserve"> SEQ Фиг. \* ARABIC \s 2 </w:instrText>
+        <w:instrText xml:space="preserve"> SEQ Фиг. \* ARABIC \s 1 </w:instrText>
       </w:r>
       <w:r>
         <w:rPr>
@@ -7635,7 +7936,7 @@
           <w:sz w:val="28"/>
           <w:szCs w:val="28"/>
         </w:rPr>
-        <w:t>1</w:t>
+        <w:t>7</w:t>
       </w:r>
       <w:r>
         <w:rPr>
@@ -7649,6 +7950,7 @@
         </w:rPr>
         <w:fldChar w:fldCharType="end"/>
       </w:r>
+      <w:bookmarkEnd w:id="21"/>
       <w:r>
         <w:rPr>
           <w:b/>
@@ -7983,7 +8285,7 @@
           <w:lang w:val="en-US"/>
         </w:rPr>
       </w:pPr>
-      <w:bookmarkStart w:id="13" w:name="_Toc199088388"/>
+      <w:bookmarkStart w:id="22" w:name="_Toc199088388"/>
       <w:r>
         <w:rPr>
           <w:lang w:val="en-US"/>
@@ -8005,6 +8307,7 @@
         </w:rPr>
         <w:t>Allegro</w:t>
       </w:r>
+      <w:proofErr w:type="gramStart"/>
       <w:r>
         <w:rPr>
           <w:lang w:val="en-US"/>
@@ -8018,6 +8321,7 @@
         </w:rPr>
         <w:t>[</w:t>
       </w:r>
+      <w:proofErr w:type="gramEnd"/>
       <w:r>
         <w:rPr>
           <w:vertAlign w:val="superscript"/>
@@ -8032,20 +8336,56 @@
         </w:rPr>
         <w:t>]</w:t>
       </w:r>
-      <w:bookmarkEnd w:id="13"/>
-    </w:p>
-    <w:p>
-      <w:r>
-        <w:t>На фиг. 2.3.</w:t>
-      </w:r>
-      <w:r>
-        <w:rPr>
-          <w:lang w:val="en-US"/>
+      <w:bookmarkEnd w:id="22"/>
+    </w:p>
+    <w:p>
+      <w:r>
+        <w:t xml:space="preserve">На </w:t>
+      </w:r>
+      <w:r>
+        <w:fldChar w:fldCharType="begin"/>
+      </w:r>
+      <w:r>
+        <w:instrText xml:space="preserve"> REF _Ref199684673 \h </w:instrText>
+      </w:r>
+      <w:r>
+        <w:instrText xml:space="preserve"> \* MERGEFORMAT </w:instrText>
+      </w:r>
+      <w:r>
+        <w:fldChar w:fldCharType="separate"/>
+      </w:r>
+      <w:r>
+        <w:t>фиг</w:t>
+      </w:r>
+      <w:r>
+        <w:t>.</w:t>
+      </w:r>
+      <w:r>
+        <w:t xml:space="preserve"> </w:t>
+      </w:r>
+      <w:r>
+        <w:rPr>
+          <w:noProof/>
         </w:rPr>
         <w:t>2</w:t>
       </w:r>
       <w:r>
-        <w:t>. е показана опростена</w:t>
+        <w:t>.</w:t>
+      </w:r>
+      <w:r>
+        <w:rPr>
+          <w:noProof/>
+        </w:rPr>
+        <w:t>8</w:t>
+      </w:r>
+      <w:r>
+        <w:fldChar w:fldCharType="end"/>
+      </w:r>
+      <w:r>
+        <w:t>.</w:t>
+      </w:r>
+      <w:r>
+        <w:t xml:space="preserve"> е показана опростена</w:t>
       </w:r>
       <w:r>
         <w:rPr>
@@ -8119,6 +8459,7 @@
           <w:lang w:val="en-US"/>
         </w:rPr>
       </w:pPr>
+      <w:bookmarkStart w:id="23" w:name="_Ref199684673"/>
       <w:r>
         <w:rPr>
           <w:b/>
@@ -8153,7 +8494,7 @@
           <w:sz w:val="28"/>
           <w:szCs w:val="28"/>
         </w:rPr>
-        <w:instrText xml:space="preserve"> STYLEREF 2 \s </w:instrText>
+        <w:instrText xml:space="preserve"> STYLEREF 1 \s </w:instrText>
       </w:r>
       <w:r>
         <w:rPr>
@@ -8178,7 +8519,7 @@
           <w:sz w:val="28"/>
           <w:szCs w:val="28"/>
         </w:rPr>
-        <w:t>2.3</w:t>
+        <w:t>2</w:t>
       </w:r>
       <w:r>
         <w:rPr>
@@ -8226,7 +8567,7 @@
           <w:sz w:val="28"/>
           <w:szCs w:val="28"/>
         </w:rPr>
-        <w:instrText xml:space="preserve"> SEQ Фиг. \* ARABIC \s 2 </w:instrText>
+        <w:instrText xml:space="preserve"> SEQ Фиг. \* ARABIC \s 1 </w:instrText>
       </w:r>
       <w:r>
         <w:rPr>
@@ -8251,7 +8592,7 @@
           <w:sz w:val="28"/>
           <w:szCs w:val="28"/>
         </w:rPr>
-        <w:t>2</w:t>
+        <w:t>8</w:t>
       </w:r>
       <w:r>
         <w:rPr>
@@ -8265,6 +8606,7 @@
         </w:rPr>
         <w:fldChar w:fldCharType="end"/>
       </w:r>
+      <w:bookmarkEnd w:id="23"/>
       <w:r>
         <w:rPr>
           <w:b/>
@@ -8598,7 +8940,7 @@
           <w:lang w:val="en-US"/>
         </w:rPr>
       </w:pPr>
-      <w:bookmarkStart w:id="14" w:name="_Toc199088389"/>
+      <w:bookmarkStart w:id="24" w:name="_Toc199088389"/>
       <w:r>
         <w:rPr>
           <w:lang w:val="en-US"/>
@@ -8641,20 +8983,53 @@
         </w:rPr>
         <w:t>]</w:t>
       </w:r>
-      <w:bookmarkEnd w:id="14"/>
-    </w:p>
-    <w:p>
-      <w:r>
-        <w:t>На фиг. 2.3.</w:t>
-      </w:r>
-      <w:r>
-        <w:rPr>
-          <w:lang w:val="en-US"/>
-        </w:rPr>
-        <w:t>3</w:t>
-      </w:r>
-      <w:r>
-        <w:t>. е показана опростена</w:t>
+      <w:bookmarkEnd w:id="24"/>
+    </w:p>
+    <w:p>
+      <w:r>
+        <w:t xml:space="preserve">На </w:t>
+      </w:r>
+      <w:r>
+        <w:fldChar w:fldCharType="begin"/>
+      </w:r>
+      <w:r>
+        <w:instrText xml:space="preserve"> REF _Ref199684696 \h </w:instrText>
+      </w:r>
+      <w:r>
+        <w:instrText xml:space="preserve"> \* MERGEFORMAT </w:instrText>
+      </w:r>
+      <w:r>
+        <w:fldChar w:fldCharType="separate"/>
+      </w:r>
+      <w:r>
+        <w:t>ф</w:t>
+      </w:r>
+      <w:r>
+        <w:t xml:space="preserve">иг. </w:t>
+      </w:r>
+      <w:r>
+        <w:rPr>
+          <w:noProof/>
+        </w:rPr>
+        <w:t>2</w:t>
+      </w:r>
+      <w:r>
+        <w:t>.</w:t>
+      </w:r>
+      <w:r>
+        <w:rPr>
+          <w:noProof/>
+        </w:rPr>
+        <w:t>9</w:t>
+      </w:r>
+      <w:r>
+        <w:fldChar w:fldCharType="end"/>
+      </w:r>
+      <w:r>
+        <w:t>.</w:t>
+      </w:r>
+      <w:r>
+        <w:t xml:space="preserve"> е показана опростена</w:t>
       </w:r>
       <w:r>
         <w:rPr>
@@ -8728,6 +9103,7 @@
           <w:lang w:val="en-US"/>
         </w:rPr>
       </w:pPr>
+      <w:bookmarkStart w:id="25" w:name="_Ref199684696"/>
       <w:r>
         <w:rPr>
           <w:b/>
@@ -8762,7 +9138,7 @@
           <w:sz w:val="28"/>
           <w:szCs w:val="28"/>
         </w:rPr>
-        <w:instrText xml:space="preserve"> STYLEREF 2 \s </w:instrText>
+        <w:instrText xml:space="preserve"> STYLEREF 1 \s </w:instrText>
       </w:r>
       <w:r>
         <w:rPr>
@@ -8787,7 +9163,7 @@
           <w:sz w:val="28"/>
           <w:szCs w:val="28"/>
         </w:rPr>
-        <w:t>2.3</w:t>
+        <w:t>2</w:t>
       </w:r>
       <w:r>
         <w:rPr>
@@ -8835,7 +9211,7 @@
           <w:sz w:val="28"/>
           <w:szCs w:val="28"/>
         </w:rPr>
-        <w:instrText xml:space="preserve"> SEQ Фиг. \* ARABIC \s 2 </w:instrText>
+        <w:instrText xml:space="preserve"> SEQ Фиг. \* ARABIC \s 1 </w:instrText>
       </w:r>
       <w:r>
         <w:rPr>
@@ -8860,7 +9236,7 @@
           <w:sz w:val="28"/>
           <w:szCs w:val="28"/>
         </w:rPr>
-        <w:t>3</w:t>
+        <w:t>9</w:t>
       </w:r>
       <w:r>
         <w:rPr>
@@ -8874,6 +9250,7 @@
         </w:rPr>
         <w:fldChar w:fldCharType="end"/>
       </w:r>
+      <w:bookmarkEnd w:id="25"/>
       <w:r>
         <w:rPr>
           <w:b/>
@@ -9207,7 +9584,7 @@
           <w:lang w:val="en-US"/>
         </w:rPr>
       </w:pPr>
-      <w:bookmarkStart w:id="15" w:name="_Toc199088390"/>
+      <w:bookmarkStart w:id="26" w:name="_Toc199088390"/>
       <w:r>
         <w:rPr>
           <w:lang w:val="en-US"/>
@@ -9244,20 +9621,50 @@
         </w:rPr>
         <w:t>]</w:t>
       </w:r>
-      <w:bookmarkEnd w:id="15"/>
-    </w:p>
-    <w:p>
-      <w:r>
-        <w:t>На фиг. 2.3.</w:t>
+      <w:bookmarkEnd w:id="26"/>
+    </w:p>
+    <w:p>
+      <w:r>
+        <w:t xml:space="preserve">На </w:t>
+      </w:r>
+      <w:r>
+        <w:fldChar w:fldCharType="begin"/>
+      </w:r>
+      <w:r>
+        <w:instrText xml:space="preserve"> REF _Hlk199683984 \h </w:instrText>
+      </w:r>
+      <w:r>
+        <w:instrText xml:space="preserve"> \* MERGEFORMAT </w:instrText>
+      </w:r>
+      <w:r>
+        <w:fldChar w:fldCharType="separate"/>
+      </w:r>
+      <w:r>
+        <w:t>ф</w:t>
+      </w:r>
+      <w:r>
+        <w:t xml:space="preserve">иг. </w:t>
+      </w:r>
+      <w:r>
+        <w:rPr>
+          <w:noProof/>
+        </w:rPr>
+        <w:t>2.10</w:t>
+      </w:r>
+      <w:r>
+        <w:fldChar w:fldCharType="end"/>
+      </w:r>
+      <w:r>
+        <w:t>.</w:t>
       </w:r>
       <w:r>
         <w:rPr>
           <w:lang w:val="en-US"/>
         </w:rPr>
-        <w:t>4</w:t>
-      </w:r>
-      <w:r>
-        <w:t>. е показана опростена</w:t>
+        <w:t xml:space="preserve"> </w:t>
+      </w:r>
+      <w:r>
+        <w:t>е показана опростена</w:t>
       </w:r>
       <w:r>
         <w:rPr>
@@ -9331,6 +9738,7 @@
           <w:lang w:val="en-US"/>
         </w:rPr>
       </w:pPr>
+      <w:bookmarkStart w:id="27" w:name="_Hlk199683984"/>
       <w:r>
         <w:rPr>
           <w:b/>
@@ -9365,7 +9773,7 @@
           <w:sz w:val="28"/>
           <w:szCs w:val="28"/>
         </w:rPr>
-        <w:instrText xml:space="preserve"> STYLEREF 2 \s </w:instrText>
+        <w:instrText xml:space="preserve"> STYLEREF 1 \s </w:instrText>
       </w:r>
       <w:r>
         <w:rPr>
@@ -9390,7 +9798,7 @@
           <w:sz w:val="28"/>
           <w:szCs w:val="28"/>
         </w:rPr>
-        <w:t>2.3</w:t>
+        <w:t>2</w:t>
       </w:r>
       <w:r>
         <w:rPr>
@@ -9438,7 +9846,7 @@
           <w:sz w:val="28"/>
           <w:szCs w:val="28"/>
         </w:rPr>
-        <w:instrText xml:space="preserve"> SEQ Фиг. \* ARABIC \s 2 </w:instrText>
+        <w:instrText xml:space="preserve"> SEQ Фиг. \* ARABIC \s 1 </w:instrText>
       </w:r>
       <w:r>
         <w:rPr>
@@ -9463,7 +9871,7 @@
           <w:sz w:val="28"/>
           <w:szCs w:val="28"/>
         </w:rPr>
-        <w:t>4</w:t>
+        <w:t>10</w:t>
       </w:r>
       <w:r>
         <w:rPr>
@@ -9477,6 +9885,7 @@
         </w:rPr>
         <w:fldChar w:fldCharType="end"/>
       </w:r>
+      <w:bookmarkEnd w:id="27"/>
       <w:r>
         <w:rPr>
           <w:b/>
@@ -9950,12 +10359,12 @@
       <w:pPr>
         <w:pStyle w:val="Heading2"/>
       </w:pPr>
-      <w:bookmarkStart w:id="16" w:name="_Toc199088391"/>
+      <w:bookmarkStart w:id="28" w:name="_Toc199088391"/>
       <w:r>
         <w:lastRenderedPageBreak/>
         <w:t>Съществуващи решения</w:t>
       </w:r>
-      <w:bookmarkEnd w:id="16"/>
+      <w:bookmarkEnd w:id="28"/>
     </w:p>
     <w:p>
       <w:pPr>
@@ -9978,7 +10387,46 @@
       </w:r>
       <w:proofErr w:type="spellEnd"/>
       <w:r>
-        <w:t xml:space="preserve"> мотори. На фиг. 2.4.1. е показан модулът </w:t>
+        <w:t xml:space="preserve"> мотори. На </w:t>
+      </w:r>
+      <w:r>
+        <w:fldChar w:fldCharType="begin"/>
+      </w:r>
+      <w:r>
+        <w:instrText xml:space="preserve"> REF _Ref199684717 \h </w:instrText>
+      </w:r>
+      <w:r>
+        <w:instrText xml:space="preserve"> \* MERGEFORMAT </w:instrText>
+      </w:r>
+      <w:r>
+        <w:fldChar w:fldCharType="separate"/>
+      </w:r>
+      <w:r>
+        <w:t xml:space="preserve">фиг. </w:t>
+      </w:r>
+      <w:r>
+        <w:rPr>
+          <w:noProof/>
+        </w:rPr>
+        <w:t>2</w:t>
+      </w:r>
+      <w:r>
+        <w:t>.</w:t>
+      </w:r>
+      <w:r>
+        <w:rPr>
+          <w:noProof/>
+        </w:rPr>
+        <w:t>11</w:t>
+      </w:r>
+      <w:r>
+        <w:fldChar w:fldCharType="end"/>
+      </w:r>
+      <w:r>
+        <w:t>.</w:t>
+      </w:r>
+      <w:r>
+        <w:t xml:space="preserve"> е показан модулът </w:t>
       </w:r>
       <w:r>
         <w:t>JYQD-V8.3B</w:t>
@@ -10091,6 +10539,7 @@
           <w:szCs w:val="28"/>
         </w:rPr>
       </w:pPr>
+      <w:bookmarkStart w:id="29" w:name="_Ref199684717"/>
       <w:r>
         <w:rPr>
           <w:b/>
@@ -10125,7 +10574,7 @@
           <w:sz w:val="28"/>
           <w:szCs w:val="28"/>
         </w:rPr>
-        <w:instrText xml:space="preserve"> STYLEREF 2 \s </w:instrText>
+        <w:instrText xml:space="preserve"> STYLEREF 1 \s </w:instrText>
       </w:r>
       <w:r>
         <w:rPr>
@@ -10150,7 +10599,7 @@
           <w:sz w:val="28"/>
           <w:szCs w:val="28"/>
         </w:rPr>
-        <w:t>2.4</w:t>
+        <w:t>2</w:t>
       </w:r>
       <w:r>
         <w:rPr>
@@ -10198,7 +10647,7 @@
           <w:sz w:val="28"/>
           <w:szCs w:val="28"/>
         </w:rPr>
-        <w:instrText xml:space="preserve"> SEQ Фиг. \* ARABIC \s 2 </w:instrText>
+        <w:instrText xml:space="preserve"> SEQ Фиг. \* ARABIC \s 1 </w:instrText>
       </w:r>
       <w:r>
         <w:rPr>
@@ -10223,7 +10672,7 @@
           <w:sz w:val="28"/>
           <w:szCs w:val="28"/>
         </w:rPr>
-        <w:t>1</w:t>
+        <w:t>11</w:t>
       </w:r>
       <w:r>
         <w:rPr>
@@ -10237,6 +10686,7 @@
         </w:rPr>
         <w:fldChar w:fldCharType="end"/>
       </w:r>
+      <w:bookmarkEnd w:id="29"/>
       <w:r>
         <w:rPr>
           <w:b/>
@@ -10458,7 +10908,49 @@
         <w:t>[10]</w:t>
       </w:r>
       <w:r>
-        <w:t>. На фиг. 2.4.2. е показана компресорната помпа с предлагания от производителя модул за управление.</w:t>
+        <w:t xml:space="preserve">. На </w:t>
+      </w:r>
+      <w:r>
+        <w:fldChar w:fldCharType="begin"/>
+      </w:r>
+      <w:r>
+        <w:instrText xml:space="preserve"> REF _Ref199684736 \h </w:instrText>
+      </w:r>
+      <w:r>
+        <w:instrText xml:space="preserve"> \* MERGEFORMAT </w:instrText>
+      </w:r>
+      <w:r>
+        <w:fldChar w:fldCharType="separate"/>
+      </w:r>
+      <w:r>
+        <w:t>ф</w:t>
+      </w:r>
+      <w:r>
+        <w:t xml:space="preserve">иг. </w:t>
+      </w:r>
+      <w:r>
+        <w:rPr>
+          <w:noProof/>
+        </w:rPr>
+        <w:t>2</w:t>
+      </w:r>
+      <w:r>
+        <w:t>.</w:t>
+      </w:r>
+      <w:r>
+        <w:rPr>
+          <w:noProof/>
+        </w:rPr>
+        <w:t>12</w:t>
+      </w:r>
+      <w:r>
+        <w:fldChar w:fldCharType="end"/>
+      </w:r>
+      <w:r>
+        <w:t>.</w:t>
+      </w:r>
+      <w:r>
+        <w:t xml:space="preserve"> е показана компресорната помпа с предлагания от производителя модул за управление.</w:t>
       </w:r>
     </w:p>
     <w:p>
@@ -10538,6 +11030,7 @@
           <w:szCs w:val="28"/>
         </w:rPr>
       </w:pPr>
+      <w:bookmarkStart w:id="30" w:name="_Ref199684736"/>
       <w:r>
         <w:rPr>
           <w:b/>
@@ -10572,7 +11065,7 @@
           <w:sz w:val="28"/>
           <w:szCs w:val="28"/>
         </w:rPr>
-        <w:instrText xml:space="preserve"> STYLEREF 2 \s </w:instrText>
+        <w:instrText xml:space="preserve"> STYLEREF 1 \s </w:instrText>
       </w:r>
       <w:r>
         <w:rPr>
@@ -10597,7 +11090,7 @@
           <w:sz w:val="28"/>
           <w:szCs w:val="28"/>
         </w:rPr>
-        <w:t>2.4</w:t>
+        <w:t>2</w:t>
       </w:r>
       <w:r>
         <w:rPr>
@@ -10645,7 +11138,7 @@
           <w:sz w:val="28"/>
           <w:szCs w:val="28"/>
         </w:rPr>
-        <w:instrText xml:space="preserve"> SEQ Фиг. \* ARABIC \s 2 </w:instrText>
+        <w:instrText xml:space="preserve"> SEQ Фиг. \* ARABIC \s 1 </w:instrText>
       </w:r>
       <w:r>
         <w:rPr>
@@ -10670,7 +11163,7 @@
           <w:sz w:val="28"/>
           <w:szCs w:val="28"/>
         </w:rPr>
-        <w:t>2</w:t>
+        <w:t>12</w:t>
       </w:r>
       <w:r>
         <w:rPr>
@@ -10684,6 +11177,7 @@
         </w:rPr>
         <w:fldChar w:fldCharType="end"/>
       </w:r>
+      <w:bookmarkEnd w:id="30"/>
       <w:r>
         <w:rPr>
           <w:b/>
@@ -10824,12 +11318,12 @@
       <w:pPr>
         <w:pStyle w:val="Heading2"/>
       </w:pPr>
-      <w:bookmarkStart w:id="17" w:name="_Toc199088392"/>
+      <w:bookmarkStart w:id="31" w:name="_Toc199088392"/>
       <w:r>
         <w:lastRenderedPageBreak/>
         <w:t>Заключение</w:t>
       </w:r>
-      <w:bookmarkEnd w:id="17"/>
+      <w:bookmarkEnd w:id="31"/>
     </w:p>
     <w:p>
       <w:r>
@@ -10892,15 +11386,7 @@
         <w:t xml:space="preserve">. </w:t>
       </w:r>
       <w:r>
-        <w:t xml:space="preserve">Ще бъде експериментирано с различни скорости на въртене на </w:t>
-      </w:r>
-      <w:proofErr w:type="spellStart"/>
-      <w:r>
-        <w:t>безчетковия</w:t>
-      </w:r>
-      <w:proofErr w:type="spellEnd"/>
-      <w:r>
-        <w:t xml:space="preserve"> мотор в помпата и ще бъде избрана такава скорост, при която производителността и шума са добре балансирани.</w:t>
+        <w:t>Ще бъде експериментирано с различни скорости на въртене на безчетковия мотор в помпата и ще бъде избрана такава скорост, при която производителността и шума са добре балансирани.</w:t>
       </w:r>
     </w:p>
     <w:p>
@@ -10914,33 +11400,33 @@
           <w:szCs w:val="36"/>
         </w:rPr>
       </w:pPr>
-      <w:bookmarkStart w:id="18" w:name="_Toc153829731"/>
+      <w:bookmarkStart w:id="32" w:name="_Toc153829731"/>
     </w:p>
     <w:p>
       <w:pPr>
         <w:pStyle w:val="Heading1"/>
       </w:pPr>
-      <w:bookmarkStart w:id="19" w:name="_Toc199088393"/>
+      <w:bookmarkStart w:id="33" w:name="_Toc199088393"/>
       <w:r>
         <w:t>Техническо задание</w:t>
       </w:r>
-      <w:bookmarkStart w:id="20" w:name="_Toc153829732"/>
-      <w:bookmarkEnd w:id="18"/>
-      <w:bookmarkEnd w:id="19"/>
+      <w:bookmarkStart w:id="34" w:name="_Toc153829732"/>
+      <w:bookmarkEnd w:id="32"/>
+      <w:bookmarkEnd w:id="33"/>
     </w:p>
     <w:p>
       <w:pPr>
         <w:pStyle w:val="Heading2"/>
       </w:pPr>
-      <w:bookmarkStart w:id="21" w:name="_Toc199088394"/>
+      <w:bookmarkStart w:id="35" w:name="_Toc199088394"/>
       <w:r>
         <w:t>Цел и п</w:t>
       </w:r>
       <w:r>
         <w:t>редназначение</w:t>
       </w:r>
-      <w:bookmarkEnd w:id="20"/>
-      <w:bookmarkEnd w:id="21"/>
+      <w:bookmarkEnd w:id="34"/>
+      <w:bookmarkEnd w:id="35"/>
     </w:p>
     <w:p>
       <w:r>
@@ -10964,13 +11450,13 @@
       <w:pPr>
         <w:pStyle w:val="Heading2"/>
       </w:pPr>
-      <w:bookmarkStart w:id="22" w:name="_Toc153829733"/>
-      <w:bookmarkStart w:id="23" w:name="_Toc199088395"/>
+      <w:bookmarkStart w:id="36" w:name="_Toc153829733"/>
+      <w:bookmarkStart w:id="37" w:name="_Toc199088395"/>
       <w:r>
         <w:t>Принцип на работа</w:t>
       </w:r>
-      <w:bookmarkEnd w:id="22"/>
-      <w:bookmarkEnd w:id="23"/>
+      <w:bookmarkEnd w:id="36"/>
+      <w:bookmarkEnd w:id="37"/>
     </w:p>
     <w:p>
       <w:r>
@@ -11005,13 +11491,13 @@
       <w:pPr>
         <w:pStyle w:val="Heading2"/>
       </w:pPr>
-      <w:bookmarkStart w:id="24" w:name="_Toc153829734"/>
-      <w:bookmarkStart w:id="25" w:name="_Toc199088396"/>
+      <w:bookmarkStart w:id="38" w:name="_Toc153829734"/>
+      <w:bookmarkStart w:id="39" w:name="_Toc199088396"/>
       <w:r>
         <w:t>Параметри (характеристики)</w:t>
       </w:r>
-      <w:bookmarkEnd w:id="24"/>
-      <w:bookmarkEnd w:id="25"/>
+      <w:bookmarkEnd w:id="38"/>
+      <w:bookmarkEnd w:id="39"/>
     </w:p>
     <w:p>
       <w:pPr>
@@ -11056,13 +11542,8 @@
       <w:r>
         <w:t xml:space="preserve">управлявания </w:t>
       </w:r>
-      <w:proofErr w:type="spellStart"/>
-      <w:r>
-        <w:t>безчетковия</w:t>
-      </w:r>
-      <w:proofErr w:type="spellEnd"/>
-      <w:r>
-        <w:t xml:space="preserve"> мотор: </w:t>
+      <w:r>
+        <w:t xml:space="preserve">безчетков мотор: </w:t>
       </w:r>
       <w:r>
         <w:t>90</w:t>
@@ -11267,7 +11748,7 @@
       <w:r>
         <w:t>;</w:t>
       </w:r>
-      <w:bookmarkStart w:id="26" w:name="_Toc153829735"/>
+      <w:bookmarkStart w:id="40" w:name="_Toc153829735"/>
     </w:p>
     <w:p>
       <w:pPr>
@@ -11339,32 +11820,813 @@
       <w:pPr>
         <w:pStyle w:val="Heading1"/>
       </w:pPr>
-      <w:bookmarkStart w:id="27" w:name="_Toc199088397"/>
+      <w:bookmarkStart w:id="41" w:name="_Toc199088397"/>
       <w:r>
         <w:lastRenderedPageBreak/>
         <w:t>Блокова схема</w:t>
       </w:r>
-      <w:bookmarkEnd w:id="26"/>
-      <w:bookmarkEnd w:id="27"/>
-    </w:p>
-    <w:p>
-      <w:r>
-        <w:t xml:space="preserve">текст </w:t>
-      </w:r>
-    </w:p>
-    <w:p>
-      <w:bookmarkStart w:id="28" w:name="_Toc153829736"/>
+      <w:bookmarkEnd w:id="40"/>
+      <w:bookmarkEnd w:id="41"/>
+    </w:p>
+    <w:p>
+      <w:bookmarkStart w:id="42" w:name="_Toc153829736"/>
+      <w:r>
+        <w:t xml:space="preserve">На </w:t>
+      </w:r>
+      <w:r>
+        <w:fldChar w:fldCharType="begin"/>
+      </w:r>
+      <w:r>
+        <w:instrText xml:space="preserve"> REF _Ref199684755 \h </w:instrText>
+      </w:r>
+      <w:r>
+        <w:instrText xml:space="preserve"> \* MERGEFORMAT </w:instrText>
+      </w:r>
+      <w:r>
+        <w:fldChar w:fldCharType="separate"/>
+      </w:r>
+      <w:r>
+        <w:t>ф</w:t>
+      </w:r>
+      <w:r>
+        <w:t xml:space="preserve">иг. </w:t>
+      </w:r>
+      <w:r>
+        <w:rPr>
+          <w:noProof/>
+        </w:rPr>
+        <w:t>4</w:t>
+      </w:r>
+      <w:r>
+        <w:t>.</w:t>
+      </w:r>
+      <w:r>
+        <w:rPr>
+          <w:noProof/>
+        </w:rPr>
+        <w:t>1</w:t>
+      </w:r>
+      <w:r>
+        <w:fldChar w:fldCharType="end"/>
+      </w:r>
+      <w:r>
+        <w:t>.</w:t>
+      </w:r>
+      <w:r>
+        <w:t xml:space="preserve"> е показана блоковата схема на проектираното</w:t>
+      </w:r>
+      <w:r>
+        <w:rPr>
+          <w:lang w:val="en-US"/>
+        </w:rPr>
+        <w:t xml:space="preserve"> </w:t>
+      </w:r>
+      <w:r>
+        <w:t xml:space="preserve">устройство. Представени са </w:t>
+      </w:r>
+      <w:r>
+        <w:t>четирите</w:t>
+      </w:r>
+      <w:r>
+        <w:t xml:space="preserve"> основни съставни блока на</w:t>
+      </w:r>
+      <w:r>
+        <w:rPr>
+          <w:lang w:val="en-US"/>
+        </w:rPr>
+        <w:t xml:space="preserve"> </w:t>
+      </w:r>
+      <w:r>
+        <w:t>устройството, както и връзките между тях. С цел по-добра прегледност,</w:t>
+      </w:r>
+      <w:r>
+        <w:rPr>
+          <w:lang w:val="en-US"/>
+        </w:rPr>
+        <w:t xml:space="preserve"> </w:t>
+      </w:r>
+      <w:r>
+        <w:t>връзките от блок „Захранване“ към всички останали блокове са изпуснати.</w:t>
+      </w:r>
+      <w:r>
+        <w:rPr>
+          <w:lang w:val="en-US"/>
+        </w:rPr>
+        <w:t xml:space="preserve"> </w:t>
+      </w:r>
+    </w:p>
+    <w:p>
+      <w:r>
+        <w:t xml:space="preserve">„Управление“ </w:t>
+      </w:r>
+      <w:r>
+        <w:t>представлява</w:t>
+      </w:r>
+      <w:r>
+        <w:t xml:space="preserve"> външна</w:t>
+      </w:r>
+      <w:r>
+        <w:t>та</w:t>
+      </w:r>
+      <w:r>
+        <w:t xml:space="preserve"> печатна платка</w:t>
+      </w:r>
+      <w:r>
+        <w:t>, изработваща сигналите за управление на безчетковия мотор (пускане/спиране) и драйвера (</w:t>
+      </w:r>
+      <w:r>
+        <w:t>управление</w:t>
+      </w:r>
+      <w:r>
+        <w:t xml:space="preserve"> на грешки</w:t>
+      </w:r>
+      <w:r>
+        <w:t>).</w:t>
+      </w:r>
+      <w:r>
+        <w:t xml:space="preserve"> </w:t>
+      </w:r>
+    </w:p>
+    <w:p>
+      <w:r>
+        <w:t>„</w:t>
+      </w:r>
+      <w:r>
+        <w:rPr>
+          <w:lang w:val="en-US"/>
+        </w:rPr>
+        <w:t xml:space="preserve">BLDC </w:t>
+      </w:r>
+      <w:r>
+        <w:t xml:space="preserve">мотор“ </w:t>
+      </w:r>
+      <w:r>
+        <w:t>представлява</w:t>
+      </w:r>
+      <w:r>
+        <w:t xml:space="preserve"> компресорната помпа, която трябва да бъде управлявана от устройството.</w:t>
+      </w:r>
+    </w:p>
+    <w:p>
+      <w:pPr>
+        <w:ind w:firstLine="0"/>
+        <w:jc w:val="center"/>
+        <w:rPr>
+          <w:lang w:val="en-US"/>
+        </w:rPr>
+      </w:pPr>
+      <w:r>
+        <w:rPr>
+          <w:noProof/>
+          <w:lang w:val="en-US"/>
+        </w:rPr>
+        <w:drawing>
+          <wp:inline distT="0" distB="0" distL="0" distR="0" wp14:anchorId="2851B2B7" wp14:editId="18C48B48">
+            <wp:extent cx="5760720" cy="2293620"/>
+            <wp:effectExtent l="0" t="0" r="0" b="0"/>
+            <wp:docPr id="1340054646" name="Picture 1"/>
+            <wp:cNvGraphicFramePr>
+              <a:graphicFrameLocks xmlns:a="http://schemas.openxmlformats.org/drawingml/2006/main" noChangeAspect="1"/>
+            </wp:cNvGraphicFramePr>
+            <a:graphic xmlns:a="http://schemas.openxmlformats.org/drawingml/2006/main">
+              <a:graphicData uri="http://schemas.openxmlformats.org/drawingml/2006/picture">
+                <pic:pic xmlns:pic="http://schemas.openxmlformats.org/drawingml/2006/picture">
+                  <pic:nvPicPr>
+                    <pic:cNvPr id="1340054646" name="Picture 1340054646"/>
+                    <pic:cNvPicPr/>
+                  </pic:nvPicPr>
+                  <pic:blipFill>
+                    <a:blip r:embed="rId21" cstate="print">
+                      <a:extLst>
+                        <a:ext uri="{28A0092B-C50C-407E-A947-70E740481C1C}">
+                          <a14:useLocalDpi xmlns:a14="http://schemas.microsoft.com/office/drawing/2010/main" val="0"/>
+                        </a:ext>
+                      </a:extLst>
+                    </a:blip>
+                    <a:stretch>
+                      <a:fillRect/>
+                    </a:stretch>
+                  </pic:blipFill>
+                  <pic:spPr>
+                    <a:xfrm>
+                      <a:off x="0" y="0"/>
+                      <a:ext cx="5760720" cy="2293620"/>
+                    </a:xfrm>
+                    <a:prstGeom prst="rect">
+                      <a:avLst/>
+                    </a:prstGeom>
+                  </pic:spPr>
+                </pic:pic>
+              </a:graphicData>
+            </a:graphic>
+          </wp:inline>
+        </w:drawing>
+      </w:r>
+    </w:p>
+    <w:p>
+      <w:pPr>
+        <w:pStyle w:val="Caption"/>
+        <w:ind w:firstLine="0"/>
+        <w:jc w:val="center"/>
+        <w:rPr>
+          <w:i w:val="0"/>
+          <w:iCs w:val="0"/>
+          <w:color w:val="auto"/>
+          <w:sz w:val="28"/>
+          <w:szCs w:val="28"/>
+        </w:rPr>
+      </w:pPr>
+      <w:bookmarkStart w:id="43" w:name="_Ref199684755"/>
+      <w:r>
+        <w:rPr>
+          <w:b/>
+          <w:bCs/>
+          <w:i w:val="0"/>
+          <w:iCs w:val="0"/>
+          <w:color w:val="auto"/>
+          <w:sz w:val="28"/>
+          <w:szCs w:val="28"/>
+        </w:rPr>
+        <w:t xml:space="preserve">Фиг. </w:t>
+      </w:r>
+      <w:r>
+        <w:rPr>
+          <w:b/>
+          <w:bCs/>
+          <w:i w:val="0"/>
+          <w:iCs w:val="0"/>
+          <w:color w:val="auto"/>
+          <w:sz w:val="28"/>
+          <w:szCs w:val="28"/>
+        </w:rPr>
+        <w:fldChar w:fldCharType="begin"/>
+      </w:r>
+      <w:r>
+        <w:rPr>
+          <w:b/>
+          <w:bCs/>
+          <w:i w:val="0"/>
+          <w:iCs w:val="0"/>
+          <w:color w:val="auto"/>
+          <w:sz w:val="28"/>
+          <w:szCs w:val="28"/>
+        </w:rPr>
+        <w:instrText xml:space="preserve"> STYLEREF 1 \s </w:instrText>
+      </w:r>
+      <w:r>
+        <w:rPr>
+          <w:b/>
+          <w:bCs/>
+          <w:i w:val="0"/>
+          <w:iCs w:val="0"/>
+          <w:color w:val="auto"/>
+          <w:sz w:val="28"/>
+          <w:szCs w:val="28"/>
+        </w:rPr>
+        <w:fldChar w:fldCharType="separate"/>
+      </w:r>
+      <w:r>
+        <w:rPr>
+          <w:b/>
+          <w:bCs/>
+          <w:i w:val="0"/>
+          <w:iCs w:val="0"/>
+          <w:noProof/>
+          <w:color w:val="auto"/>
+          <w:sz w:val="28"/>
+          <w:szCs w:val="28"/>
+        </w:rPr>
+        <w:t>4</w:t>
+      </w:r>
+      <w:r>
+        <w:rPr>
+          <w:b/>
+          <w:bCs/>
+          <w:i w:val="0"/>
+          <w:iCs w:val="0"/>
+          <w:color w:val="auto"/>
+          <w:sz w:val="28"/>
+          <w:szCs w:val="28"/>
+        </w:rPr>
+        <w:fldChar w:fldCharType="end"/>
+      </w:r>
+      <w:r>
+        <w:rPr>
+          <w:b/>
+          <w:bCs/>
+          <w:i w:val="0"/>
+          <w:iCs w:val="0"/>
+          <w:color w:val="auto"/>
+          <w:sz w:val="28"/>
+          <w:szCs w:val="28"/>
+        </w:rPr>
+        <w:t>.</w:t>
+      </w:r>
+      <w:r>
+        <w:rPr>
+          <w:b/>
+          <w:bCs/>
+          <w:i w:val="0"/>
+          <w:iCs w:val="0"/>
+          <w:color w:val="auto"/>
+          <w:sz w:val="28"/>
+          <w:szCs w:val="28"/>
+        </w:rPr>
+        <w:fldChar w:fldCharType="begin"/>
+      </w:r>
+      <w:r>
+        <w:rPr>
+          <w:b/>
+          <w:bCs/>
+          <w:i w:val="0"/>
+          <w:iCs w:val="0"/>
+          <w:color w:val="auto"/>
+          <w:sz w:val="28"/>
+          <w:szCs w:val="28"/>
+        </w:rPr>
+        <w:instrText xml:space="preserve"> SEQ Фиг. \* ARABIC \s 1 </w:instrText>
+      </w:r>
+      <w:r>
+        <w:rPr>
+          <w:b/>
+          <w:bCs/>
+          <w:i w:val="0"/>
+          <w:iCs w:val="0"/>
+          <w:color w:val="auto"/>
+          <w:sz w:val="28"/>
+          <w:szCs w:val="28"/>
+        </w:rPr>
+        <w:fldChar w:fldCharType="separate"/>
+      </w:r>
+      <w:r>
+        <w:rPr>
+          <w:b/>
+          <w:bCs/>
+          <w:i w:val="0"/>
+          <w:iCs w:val="0"/>
+          <w:noProof/>
+          <w:color w:val="auto"/>
+          <w:sz w:val="28"/>
+          <w:szCs w:val="28"/>
+        </w:rPr>
+        <w:t>1</w:t>
+      </w:r>
+      <w:r>
+        <w:rPr>
+          <w:b/>
+          <w:bCs/>
+          <w:i w:val="0"/>
+          <w:iCs w:val="0"/>
+          <w:color w:val="auto"/>
+          <w:sz w:val="28"/>
+          <w:szCs w:val="28"/>
+        </w:rPr>
+        <w:fldChar w:fldCharType="end"/>
+      </w:r>
+      <w:bookmarkEnd w:id="43"/>
+      <w:r>
+        <w:rPr>
+          <w:b/>
+          <w:bCs/>
+          <w:i w:val="0"/>
+          <w:iCs w:val="0"/>
+          <w:color w:val="auto"/>
+          <w:sz w:val="28"/>
+          <w:szCs w:val="28"/>
+        </w:rPr>
+        <w:t xml:space="preserve">. </w:t>
+      </w:r>
+      <w:r>
+        <w:rPr>
+          <w:i w:val="0"/>
+          <w:iCs w:val="0"/>
+          <w:color w:val="auto"/>
+          <w:sz w:val="28"/>
+          <w:szCs w:val="28"/>
+        </w:rPr>
+        <w:t>Блокова схема на устройството</w:t>
+      </w:r>
+    </w:p>
+    <w:p>
+      <w:pPr>
+        <w:ind w:firstLine="0"/>
+        <w:rPr>
+          <w:lang w:val="en-US"/>
+        </w:rPr>
+      </w:pPr>
+    </w:p>
+    <w:p>
+      <w:r>
+        <w:t xml:space="preserve">Предназначението на всеки от </w:t>
+      </w:r>
+      <w:r>
+        <w:t>съставните блокове</w:t>
+      </w:r>
+      <w:r>
+        <w:t xml:space="preserve"> е както следва:</w:t>
+      </w:r>
+    </w:p>
+    <w:p>
+      <w:pPr>
+        <w:pStyle w:val="ListParagraph"/>
+        <w:numPr>
+          <w:ilvl w:val="0"/>
+          <w:numId w:val="59"/>
+        </w:numPr>
+      </w:pPr>
+      <w:r>
+        <w:rPr>
+          <w:b/>
+          <w:bCs/>
+        </w:rPr>
+        <w:t>Блок „Захранване“</w:t>
+      </w:r>
+      <w:r>
+        <w:t xml:space="preserve"> –</w:t>
+      </w:r>
+      <w:r>
+        <w:t xml:space="preserve"> </w:t>
+      </w:r>
+      <w:r>
+        <w:t>осигурява захранване на всички останали</w:t>
+      </w:r>
+      <w:r>
+        <w:t xml:space="preserve"> </w:t>
+      </w:r>
+      <w:r>
+        <w:t xml:space="preserve">блокове и </w:t>
+      </w:r>
+      <w:r>
+        <w:t xml:space="preserve">се грижи за плавно </w:t>
+      </w:r>
+      <w:r>
+        <w:t>пускане и спиране</w:t>
+      </w:r>
+      <w:r>
+        <w:t xml:space="preserve"> </w:t>
+      </w:r>
+      <w:r>
+        <w:t>на мотора;</w:t>
+      </w:r>
+    </w:p>
+    <w:p>
+      <w:pPr>
+        <w:pStyle w:val="ListParagraph"/>
+        <w:numPr>
+          <w:ilvl w:val="0"/>
+          <w:numId w:val="59"/>
+        </w:numPr>
+      </w:pPr>
+      <w:r>
+        <w:rPr>
+          <w:b/>
+          <w:bCs/>
+        </w:rPr>
+        <w:t>Блок „</w:t>
+      </w:r>
+      <w:r>
+        <w:rPr>
+          <w:b/>
+          <w:bCs/>
+        </w:rPr>
+        <w:t>Драйвер</w:t>
+      </w:r>
+      <w:r>
+        <w:rPr>
+          <w:b/>
+          <w:bCs/>
+        </w:rPr>
+        <w:t>“</w:t>
+      </w:r>
+      <w:r>
+        <w:t xml:space="preserve"> –</w:t>
+      </w:r>
+      <w:r>
+        <w:t xml:space="preserve"> </w:t>
+      </w:r>
+      <w:r>
+        <w:t xml:space="preserve">изчислява и изработва необходимите сигнали за управление на транзисторите </w:t>
+      </w:r>
+      <w:r>
+        <w:t>в</w:t>
+      </w:r>
+      <w:r>
+        <w:t xml:space="preserve"> блок „Инвертор“, изработва сигнали за настъпили </w:t>
+      </w:r>
+      <w:r>
+        <w:t xml:space="preserve">грешки </w:t>
+      </w:r>
+      <w:r>
+        <w:t>и ги изпраща към управляващата печатна платка посредством блок „Външни връзки“</w:t>
+      </w:r>
+      <w:r>
+        <w:t>;</w:t>
+      </w:r>
+    </w:p>
+    <w:p>
+      <w:pPr>
+        <w:pStyle w:val="ListParagraph"/>
+        <w:numPr>
+          <w:ilvl w:val="0"/>
+          <w:numId w:val="59"/>
+        </w:numPr>
+      </w:pPr>
+      <w:r>
+        <w:rPr>
+          <w:b/>
+          <w:bCs/>
+        </w:rPr>
+        <w:t>Блок „</w:t>
+      </w:r>
+      <w:r>
+        <w:rPr>
+          <w:b/>
+          <w:bCs/>
+        </w:rPr>
+        <w:t>Инвертор</w:t>
+      </w:r>
+      <w:r>
+        <w:rPr>
+          <w:b/>
+          <w:bCs/>
+        </w:rPr>
+        <w:t>“</w:t>
+      </w:r>
+      <w:r>
+        <w:t xml:space="preserve"> –</w:t>
+      </w:r>
+      <w:r>
+        <w:t xml:space="preserve"> превключва големите токове, необходими за задвижване на безчетковия мотор и филтрира високочестотните </w:t>
+      </w:r>
+      <w:r>
+        <w:lastRenderedPageBreak/>
+        <w:t xml:space="preserve">съставки в управляващите </w:t>
+      </w:r>
+      <w:r>
+        <w:t>сигнали</w:t>
+      </w:r>
+      <w:r>
+        <w:t xml:space="preserve"> и в напреженията на намотките с цел намаляване на излъчваните от устройството електромагнитни смущения;</w:t>
+      </w:r>
+    </w:p>
+    <w:p>
+      <w:pPr>
+        <w:pStyle w:val="ListParagraph"/>
+        <w:numPr>
+          <w:ilvl w:val="0"/>
+          <w:numId w:val="59"/>
+        </w:numPr>
+      </w:pPr>
+      <w:r>
+        <w:rPr>
+          <w:b/>
+          <w:bCs/>
+        </w:rPr>
+        <w:t>Блок „</w:t>
+      </w:r>
+      <w:r>
+        <w:rPr>
+          <w:b/>
+          <w:bCs/>
+        </w:rPr>
+        <w:t>Външни връзки</w:t>
+      </w:r>
+      <w:r>
+        <w:rPr>
+          <w:b/>
+          <w:bCs/>
+        </w:rPr>
+        <w:t>“</w:t>
+      </w:r>
+      <w:r>
+        <w:t xml:space="preserve"> –</w:t>
+      </w:r>
+      <w:r>
+        <w:t xml:space="preserve"> </w:t>
+      </w:r>
+      <w:r>
+        <w:t xml:space="preserve">подготвя сигналите и осигурява връзка с </w:t>
+      </w:r>
+      <w:r>
+        <w:t>външната управляваща печатна платка</w:t>
+      </w:r>
+      <w:r>
+        <w:t>.</w:t>
+      </w:r>
+    </w:p>
+    <w:p>
+      <w:pPr>
+        <w:spacing w:line="276" w:lineRule="auto"/>
+        <w:ind w:firstLine="0"/>
+        <w:jc w:val="left"/>
+        <w:rPr>
+          <w:b/>
+        </w:rPr>
+      </w:pPr>
+      <w:bookmarkStart w:id="44" w:name="_Toc199088398"/>
     </w:p>
     <w:p>
       <w:pPr>
         <w:pStyle w:val="Heading1"/>
       </w:pPr>
-      <w:bookmarkStart w:id="29" w:name="_Toc199088398"/>
       <w:r>
         <w:t>Принципна електрическа схема</w:t>
       </w:r>
-      <w:bookmarkEnd w:id="28"/>
-      <w:bookmarkEnd w:id="29"/>
+      <w:bookmarkEnd w:id="42"/>
+      <w:bookmarkEnd w:id="44"/>
+    </w:p>
+    <w:p>
+      <w:bookmarkStart w:id="45" w:name="_Toc199088399"/>
+      <w:r>
+        <w:t>При проектирането на принципната електрическа схема на</w:t>
+      </w:r>
+      <w:r>
+        <w:t xml:space="preserve"> </w:t>
+      </w:r>
+      <w:r>
+        <w:t>устройството, изборът на схемни решения и елементи е съобразен най-вече</w:t>
+      </w:r>
+      <w:r>
+        <w:t xml:space="preserve"> </w:t>
+      </w:r>
+      <w:r>
+        <w:t xml:space="preserve">с главната му функция – </w:t>
+      </w:r>
+      <w:r>
+        <w:t>управление на компресорна помпа с безчетков мотор</w:t>
+      </w:r>
+      <w:r>
+        <w:t>.</w:t>
+      </w:r>
+      <w:r>
+        <w:t xml:space="preserve"> </w:t>
+      </w:r>
+      <w:r>
+        <w:t>От особена важност е устройството да бъде подходящо за серийно производство.</w:t>
+      </w:r>
+    </w:p>
+    <w:p>
+      <w:r>
+        <w:t>За всички блокове са използвани приспособени, но иначе добре</w:t>
+      </w:r>
+      <w:r>
+        <w:t xml:space="preserve"> </w:t>
+      </w:r>
+      <w:r>
+        <w:t>познати от литературата схеми с подходящи за случая характеристики.</w:t>
+      </w:r>
+    </w:p>
+    <w:p>
+      <w:r>
+        <w:t>Всички елементи, използвани в принципната електрическа схема, са</w:t>
+      </w:r>
+      <w:r>
+        <w:t xml:space="preserve"> </w:t>
+      </w:r>
+      <w:r>
+        <w:t>стандартни и широко разпространени. При избора на елементи</w:t>
+      </w:r>
+      <w:r>
+        <w:t>,</w:t>
+      </w:r>
+      <w:r>
+        <w:t xml:space="preserve"> най-</w:t>
+      </w:r>
+      <w:r>
+        <w:t xml:space="preserve"> </w:t>
+      </w:r>
+      <w:r>
+        <w:t>важн</w:t>
+      </w:r>
+      <w:r>
+        <w:t xml:space="preserve">ите </w:t>
+      </w:r>
+      <w:r>
+        <w:t>съображени</w:t>
+      </w:r>
+      <w:r>
+        <w:t>я са</w:t>
+      </w:r>
+      <w:r>
+        <w:t xml:space="preserve"> те да бъдат налични за закупуване от компанията</w:t>
+      </w:r>
+      <w:r>
+        <w:t xml:space="preserve">, </w:t>
+      </w:r>
+      <w:r>
+        <w:t>с подходящи характеристики за конкретното приложение</w:t>
+      </w:r>
+      <w:r>
+        <w:t xml:space="preserve"> и с добър баланс между цена и качество.</w:t>
+      </w:r>
+    </w:p>
+    <w:p>
+      <w:r>
+        <w:t>С така подбраните елементи, за функциониране на схемата са</w:t>
+      </w:r>
+      <w:r>
+        <w:t xml:space="preserve"> </w:t>
+      </w:r>
+      <w:r>
+        <w:t xml:space="preserve">необходими </w:t>
+      </w:r>
+      <w:r>
+        <w:t xml:space="preserve">три постояннотокови </w:t>
+      </w:r>
+      <w:r>
+        <w:t xml:space="preserve">захранващи напрежения: </w:t>
+      </w:r>
+      <w:r>
+        <w:t>+24</w:t>
+      </w:r>
+      <w:r>
+        <w:rPr>
+          <w:lang w:val="en-US"/>
+        </w:rPr>
+        <w:t xml:space="preserve">V </w:t>
+      </w:r>
+      <w:r>
+        <w:t xml:space="preserve">(за безчетковия мотор), </w:t>
+      </w:r>
+      <w:r>
+        <w:t>+</w:t>
+      </w:r>
+      <w:r>
+        <w:t>1</w:t>
+      </w:r>
+      <w:r>
+        <w:t>5V</w:t>
+      </w:r>
+      <w:r>
+        <w:t xml:space="preserve"> (за превключване на силовите транзистори в блок „Инвертор“) </w:t>
+      </w:r>
+      <w:r>
+        <w:t>и</w:t>
+      </w:r>
+      <w:r>
+        <w:t xml:space="preserve"> </w:t>
+      </w:r>
+      <w:r>
+        <w:t>+3,3V</w:t>
+      </w:r>
+      <w:r>
+        <w:t xml:space="preserve"> (за логическата част от схемата)</w:t>
+      </w:r>
+      <w:r>
+        <w:t xml:space="preserve">. Те се изработват от блок „Захранване“, описан подробно в </w:t>
+      </w:r>
+      <w:r>
+        <w:t xml:space="preserve">т. </w:t>
+      </w:r>
+      <w:r>
+        <w:fldChar w:fldCharType="begin"/>
+      </w:r>
+      <w:r>
+        <w:instrText xml:space="preserve"> REF _Ref199688864 \r \h </w:instrText>
+      </w:r>
+      <w:r>
+        <w:fldChar w:fldCharType="separate"/>
+      </w:r>
+      <w:r>
+        <w:t>5</w:t>
+      </w:r>
+      <w:r>
+        <w:t>.</w:t>
+      </w:r>
+      <w:r>
+        <w:t>2</w:t>
+      </w:r>
+      <w:r>
+        <w:fldChar w:fldCharType="end"/>
+      </w:r>
+      <w:r>
+        <w:t>.</w:t>
+      </w:r>
+    </w:p>
+    <w:p>
+      <w:pPr>
+        <w:spacing w:line="276" w:lineRule="auto"/>
+        <w:ind w:firstLine="0"/>
+        <w:jc w:val="left"/>
+        <w:rPr>
+          <w:b/>
+          <w:sz w:val="32"/>
+          <w:szCs w:val="32"/>
+        </w:rPr>
+      </w:pPr>
+      <w:r>
+        <w:br w:type="page"/>
+      </w:r>
+    </w:p>
+    <w:p>
+      <w:pPr>
+        <w:pStyle w:val="Heading2"/>
+      </w:pPr>
+      <w:r>
+        <w:lastRenderedPageBreak/>
+        <w:t>Принципна електрическа схема в обобщен вид</w:t>
+      </w:r>
+      <w:bookmarkEnd w:id="45"/>
     </w:p>
     <w:p>
       <w:r>
@@ -11374,12 +12636,49 @@
     <w:p>
       <w:pPr>
         <w:pStyle w:val="Heading2"/>
-      </w:pPr>
-      <w:bookmarkStart w:id="30" w:name="_Toc199088399"/>
-      <w:r>
-        <w:t>Принципна електрическа схема в обобщен вид</w:t>
-      </w:r>
-      <w:bookmarkEnd w:id="30"/>
+        <w:rPr>
+          <w:rStyle w:val="hgkelc"/>
+        </w:rPr>
+      </w:pPr>
+      <w:bookmarkStart w:id="46" w:name="_Toc199088400"/>
+      <w:bookmarkStart w:id="47" w:name="_Toc153829745"/>
+      <w:bookmarkStart w:id="48" w:name="_Ref199688864"/>
+      <w:r>
+        <w:t>Блок „</w:t>
+      </w:r>
+      <w:r>
+        <w:t>Захранване</w:t>
+      </w:r>
+      <w:r>
+        <w:t>“</w:t>
+      </w:r>
+      <w:bookmarkEnd w:id="46"/>
+      <w:bookmarkEnd w:id="48"/>
+    </w:p>
+    <w:p>
+      <w:r>
+        <w:t>Т</w:t>
+      </w:r>
+      <w:r>
+        <w:t>екст</w:t>
+      </w:r>
+    </w:p>
+    <w:p>
+      <w:pPr>
+        <w:pStyle w:val="Heading2"/>
+        <w:rPr>
+          <w:rStyle w:val="hgkelc"/>
+        </w:rPr>
+      </w:pPr>
+      <w:r>
+        <w:t>Блок „</w:t>
+      </w:r>
+      <w:r>
+        <w:t>Драйвер</w:t>
+      </w:r>
+      <w:r>
+        <w:t>“</w:t>
+      </w:r>
     </w:p>
     <w:p>
       <w:r>
@@ -11393,28 +12692,53 @@
           <w:rStyle w:val="hgkelc"/>
         </w:rPr>
       </w:pPr>
-      <w:bookmarkStart w:id="31" w:name="_Toc199088400"/>
-      <w:bookmarkStart w:id="32" w:name="_Toc153829745"/>
-      <w:r>
-        <w:t>Блок „“</w:t>
-      </w:r>
-      <w:bookmarkEnd w:id="31"/>
+      <w:r>
+        <w:t>Блок „</w:t>
+      </w:r>
+      <w:r>
+        <w:t>Инвертор</w:t>
+      </w:r>
+      <w:r>
+        <w:t>“</w:t>
+      </w:r>
     </w:p>
     <w:p>
       <w:r>
         <w:t>текст</w:t>
       </w:r>
     </w:p>
+    <w:p>
+      <w:pPr>
+        <w:pStyle w:val="Heading2"/>
+        <w:rPr>
+          <w:rStyle w:val="hgkelc"/>
+        </w:rPr>
+      </w:pPr>
+      <w:r>
+        <w:t>Блок „</w:t>
+      </w:r>
+      <w:r>
+        <w:t>Външни връзки</w:t>
+      </w:r>
+      <w:r>
+        <w:t>“</w:t>
+      </w:r>
+    </w:p>
+    <w:p>
+      <w:r>
+        <w:t>текст</w:t>
+      </w:r>
+    </w:p>
     <w:p/>
     <w:p>
       <w:pPr>
         <w:pStyle w:val="Heading1"/>
       </w:pPr>
-      <w:bookmarkStart w:id="33" w:name="_Toc199088401"/>
+      <w:bookmarkStart w:id="49" w:name="_Toc199088401"/>
       <w:r>
         <w:t>Печатна платка</w:t>
       </w:r>
-      <w:bookmarkEnd w:id="33"/>
+      <w:bookmarkEnd w:id="49"/>
     </w:p>
     <w:p>
       <w:r>
@@ -11426,25 +12750,25 @@
       <w:pPr>
         <w:pStyle w:val="Heading1"/>
       </w:pPr>
-      <w:bookmarkStart w:id="34" w:name="_Toc199088402"/>
-      <w:bookmarkEnd w:id="32"/>
+      <w:bookmarkStart w:id="50" w:name="_Toc199088402"/>
+      <w:bookmarkEnd w:id="47"/>
       <w:r>
         <w:t>Конфигурация на драйвера</w:t>
       </w:r>
-      <w:bookmarkEnd w:id="34"/>
+      <w:bookmarkEnd w:id="50"/>
     </w:p>
     <w:p>
       <w:pPr>
         <w:pStyle w:val="Heading2"/>
       </w:pPr>
-      <w:bookmarkStart w:id="35" w:name="_Toc199088403"/>
+      <w:bookmarkStart w:id="51" w:name="_Toc199088403"/>
       <w:r>
         <w:t>Общ принцип на работа</w:t>
       </w:r>
-      <w:bookmarkEnd w:id="35"/>
-    </w:p>
-    <w:p>
-      <w:bookmarkStart w:id="36" w:name="_Toc153829746"/>
+      <w:bookmarkEnd w:id="51"/>
+    </w:p>
+    <w:p>
+      <w:bookmarkStart w:id="52" w:name="_Toc153829746"/>
       <w:r>
         <w:t>текст</w:t>
       </w:r>
@@ -11454,18 +12778,18 @@
       <w:pPr>
         <w:pStyle w:val="Heading1"/>
       </w:pPr>
-      <w:bookmarkStart w:id="37" w:name="_Toc199088404"/>
+      <w:bookmarkStart w:id="53" w:name="_Toc199088404"/>
       <w:r>
         <w:t>Експериментални р</w:t>
       </w:r>
       <w:r>
         <w:t>езултати</w:t>
       </w:r>
-      <w:bookmarkEnd w:id="36"/>
-      <w:bookmarkEnd w:id="37"/>
-    </w:p>
-    <w:p>
-      <w:bookmarkStart w:id="38" w:name="_Toc153829747"/>
+      <w:bookmarkEnd w:id="52"/>
+      <w:bookmarkEnd w:id="53"/>
+    </w:p>
+    <w:p>
+      <w:bookmarkStart w:id="54" w:name="_Toc153829747"/>
       <w:r>
         <w:t>текст</w:t>
       </w:r>
@@ -11475,18 +12799,18 @@
       <w:pPr>
         <w:pStyle w:val="Heading1"/>
       </w:pPr>
-      <w:bookmarkStart w:id="39" w:name="_Toc199088405"/>
+      <w:bookmarkStart w:id="55" w:name="_Toc199088405"/>
       <w:r>
         <w:t>Заключение</w:t>
       </w:r>
-      <w:bookmarkEnd w:id="38"/>
-      <w:bookmarkEnd w:id="39"/>
+      <w:bookmarkEnd w:id="54"/>
+      <w:bookmarkEnd w:id="55"/>
     </w:p>
     <w:p>
       <w:r>
         <w:t>текст</w:t>
       </w:r>
-      <w:bookmarkStart w:id="40" w:name="_Toc153829748"/>
+      <w:bookmarkStart w:id="56" w:name="_Toc153829748"/>
     </w:p>
     <w:p/>
     <w:p>
@@ -11504,17 +12828,20 @@
       <w:pPr>
         <w:pStyle w:val="Heading1"/>
       </w:pPr>
-      <w:bookmarkStart w:id="41" w:name="_Toc199088406"/>
+      <w:bookmarkStart w:id="57" w:name="_Toc199088406"/>
       <w:r>
         <w:lastRenderedPageBreak/>
         <w:t>Използвана литература</w:t>
       </w:r>
-      <w:bookmarkEnd w:id="40"/>
-      <w:bookmarkEnd w:id="41"/>
+      <w:bookmarkEnd w:id="56"/>
+      <w:bookmarkEnd w:id="57"/>
     </w:p>
     <w:p>
       <w:pPr>
         <w:ind w:firstLine="0"/>
+        <w:rPr>
+          <w:lang w:val="en-US"/>
+        </w:rPr>
       </w:pPr>
       <w:r>
         <w:t>[1]</w:t>
@@ -11522,7 +12849,7 @@
       <w:r>
         <w:t xml:space="preserve"> </w:t>
       </w:r>
-      <w:hyperlink r:id="rId21" w:history="1">
+      <w:hyperlink r:id="rId22" w:history="1">
         <w:r>
           <w:rPr>
             <w:rStyle w:val="Hyperlink"/>
@@ -11541,7 +12868,13 @@
           <w:rPr>
             <w:rStyle w:val="Hyperlink"/>
           </w:rPr>
-          <w:t xml:space="preserve">: </w:t>
+          <w:t>:</w:t>
+        </w:r>
+        <w:r>
+          <w:rPr>
+            <w:rStyle w:val="Hyperlink"/>
+          </w:rPr>
+          <w:t xml:space="preserve"> </w:t>
         </w:r>
         <w:proofErr w:type="spellStart"/>
         <w:r>
@@ -11627,7 +12960,7 @@
         </w:rPr>
         <w:t xml:space="preserve">] </w:t>
       </w:r>
-      <w:hyperlink r:id="rId22" w:history="1">
+      <w:hyperlink r:id="rId23" w:history="1">
         <w:r>
           <w:rPr>
             <w:rStyle w:val="Hyperlink"/>
@@ -11659,7 +12992,7 @@
         </w:rPr>
         <w:t xml:space="preserve">] </w:t>
       </w:r>
-      <w:hyperlink r:id="rId23" w:history="1">
+      <w:hyperlink r:id="rId24" w:history="1">
         <w:r>
           <w:rPr>
             <w:rStyle w:val="Hyperlink"/>
@@ -11682,7 +13015,7 @@
       <w:r>
         <w:t xml:space="preserve">] </w:t>
       </w:r>
-      <w:hyperlink r:id="rId24" w:history="1">
+      <w:hyperlink r:id="rId25" w:history="1">
         <w:proofErr w:type="spellStart"/>
         <w:r>
           <w:rPr>
@@ -11789,7 +13122,7 @@
         </w:rPr>
         <w:t xml:space="preserve">[5] </w:t>
       </w:r>
-      <w:hyperlink r:id="rId25" w:history="1">
+      <w:hyperlink r:id="rId26" w:history="1">
         <w:r>
           <w:rPr>
             <w:rStyle w:val="Hyperlink"/>
@@ -11826,7 +13159,7 @@
         </w:rPr>
         <w:t xml:space="preserve">[6] </w:t>
       </w:r>
-      <w:hyperlink r:id="rId26" w:history="1">
+      <w:hyperlink r:id="rId27" w:history="1">
         <w:r>
           <w:rPr>
             <w:rStyle w:val="Hyperlink"/>
@@ -11849,7 +13182,7 @@
         </w:rPr>
         <w:t xml:space="preserve">[7] </w:t>
       </w:r>
-      <w:hyperlink r:id="rId27" w:history="1">
+      <w:hyperlink r:id="rId28" w:history="1">
         <w:r>
           <w:rPr>
             <w:rStyle w:val="Hyperlink"/>
@@ -11886,7 +13219,7 @@
         </w:rPr>
         <w:t xml:space="preserve">[8] </w:t>
       </w:r>
-      <w:hyperlink r:id="rId28" w:history="1">
+      <w:hyperlink r:id="rId29" w:history="1">
         <w:r>
           <w:rPr>
             <w:rStyle w:val="Hyperlink"/>
@@ -11909,7 +13242,7 @@
         </w:rPr>
         <w:t xml:space="preserve">[9] </w:t>
       </w:r>
-      <w:hyperlink r:id="rId29" w:history="1">
+      <w:hyperlink r:id="rId30" w:history="1">
         <w:r>
           <w:rPr>
             <w:rStyle w:val="Hyperlink"/>
@@ -11932,7 +13265,7 @@
         </w:rPr>
         <w:t xml:space="preserve">[10] </w:t>
       </w:r>
-      <w:hyperlink r:id="rId30" w:history="1">
+      <w:hyperlink r:id="rId31" w:history="1">
         <w:r>
           <w:rPr>
             <w:rStyle w:val="Hyperlink"/>
@@ -11994,7 +13327,7 @@
           <w:u w:val="none"/>
         </w:rPr>
         <w:sectPr>
-          <w:footerReference w:type="default" r:id="rId31"/>
+          <w:footerReference w:type="default" r:id="rId32"/>
           <w:pgSz w:w="11909" w:h="16834"/>
           <w:pgMar w:top="1411" w:right="1138" w:bottom="1411" w:left="1699" w:header="720" w:footer="720" w:gutter="0"/>
           <w:pgNumType w:start="4"/>
@@ -12778,8 +14111,8 @@
     </w:p>
     <w:p/>
     <w:sectPr>
-      <w:footerReference w:type="default" r:id="rId32"/>
-      <w:footerReference w:type="first" r:id="rId33"/>
+      <w:footerReference w:type="default" r:id="rId33"/>
+      <w:footerReference w:type="first" r:id="rId34"/>
       <w:pgSz w:w="11909" w:h="16834"/>
       <w:pgMar w:top="1418" w:right="1134" w:bottom="1418" w:left="1701" w:header="720" w:footer="720" w:gutter="0"/>
       <w:cols w:space="720"/>
@@ -13152,6 +14485,97 @@
     </w:lvl>
   </w:abstractNum>
   <w:abstractNum w:abstractNumId="2" w15:restartNumberingAfterBreak="0">
+    <w:nsid w:val="04FB2E07"/>
+    <w:multiLevelType w:val="hybridMultilevel"/>
+    <w:tmpl w:val="3CA4B42C"/>
+    <w:lvl w:ilvl="0" w:tplc="70DC0F32">
+      <w:start w:val="1"/>
+      <w:numFmt w:val="decimal"/>
+      <w:lvlText w:val="%1)"/>
+      <w:lvlJc w:val="left"/>
+      <w:pPr>
+        <w:ind w:left="720" w:hanging="360"/>
+      </w:pPr>
+      <w:rPr>
+        <w:rFonts w:hint="default"/>
+        <w:b/>
+        <w:bCs/>
+      </w:rPr>
+    </w:lvl>
+    <w:lvl w:ilvl="1" w:tplc="10000019" w:tentative="1">
+      <w:start w:val="1"/>
+      <w:numFmt w:val="lowerLetter"/>
+      <w:lvlText w:val="%2."/>
+      <w:lvlJc w:val="left"/>
+      <w:pPr>
+        <w:ind w:left="1440" w:hanging="360"/>
+      </w:pPr>
+    </w:lvl>
+    <w:lvl w:ilvl="2" w:tplc="1000001B" w:tentative="1">
+      <w:start w:val="1"/>
+      <w:numFmt w:val="lowerRoman"/>
+      <w:lvlText w:val="%3."/>
+      <w:lvlJc w:val="right"/>
+      <w:pPr>
+        <w:ind w:left="2160" w:hanging="180"/>
+      </w:pPr>
+    </w:lvl>
+    <w:lvl w:ilvl="3" w:tplc="1000000F" w:tentative="1">
+      <w:start w:val="1"/>
+      <w:numFmt w:val="decimal"/>
+      <w:lvlText w:val="%4."/>
+      <w:lvlJc w:val="left"/>
+      <w:pPr>
+        <w:ind w:left="2880" w:hanging="360"/>
+      </w:pPr>
+    </w:lvl>
+    <w:lvl w:ilvl="4" w:tplc="10000019" w:tentative="1">
+      <w:start w:val="1"/>
+      <w:numFmt w:val="lowerLetter"/>
+      <w:lvlText w:val="%5."/>
+      <w:lvlJc w:val="left"/>
+      <w:pPr>
+        <w:ind w:left="3600" w:hanging="360"/>
+      </w:pPr>
+    </w:lvl>
+    <w:lvl w:ilvl="5" w:tplc="1000001B" w:tentative="1">
+      <w:start w:val="1"/>
+      <w:numFmt w:val="lowerRoman"/>
+      <w:lvlText w:val="%6."/>
+      <w:lvlJc w:val="right"/>
+      <w:pPr>
+        <w:ind w:left="4320" w:hanging="180"/>
+      </w:pPr>
+    </w:lvl>
+    <w:lvl w:ilvl="6" w:tplc="1000000F" w:tentative="1">
+      <w:start w:val="1"/>
+      <w:numFmt w:val="decimal"/>
+      <w:lvlText w:val="%7."/>
+      <w:lvlJc w:val="left"/>
+      <w:pPr>
+        <w:ind w:left="5040" w:hanging="360"/>
+      </w:pPr>
+    </w:lvl>
+    <w:lvl w:ilvl="7" w:tplc="10000019" w:tentative="1">
+      <w:start w:val="1"/>
+      <w:numFmt w:val="lowerLetter"/>
+      <w:lvlText w:val="%8."/>
+      <w:lvlJc w:val="left"/>
+      <w:pPr>
+        <w:ind w:left="5760" w:hanging="360"/>
+      </w:pPr>
+    </w:lvl>
+    <w:lvl w:ilvl="8" w:tplc="1000001B" w:tentative="1">
+      <w:start w:val="1"/>
+      <w:numFmt w:val="lowerRoman"/>
+      <w:lvlText w:val="%9."/>
+      <w:lvlJc w:val="right"/>
+      <w:pPr>
+        <w:ind w:left="6480" w:hanging="180"/>
+      </w:pPr>
+    </w:lvl>
+  </w:abstractNum>
+  <w:abstractNum w:abstractNumId="3" w15:restartNumberingAfterBreak="0">
     <w:nsid w:val="08735F6F"/>
     <w:multiLevelType w:val="hybridMultilevel"/>
     <w:tmpl w:val="EC588688"/>
@@ -13264,7 +14688,7 @@
       </w:rPr>
     </w:lvl>
   </w:abstractNum>
-  <w:abstractNum w:abstractNumId="3" w15:restartNumberingAfterBreak="0">
+  <w:abstractNum w:abstractNumId="4" w15:restartNumberingAfterBreak="0">
     <w:nsid w:val="08D33F91"/>
     <w:multiLevelType w:val="hybridMultilevel"/>
     <w:tmpl w:val="B7FCB166"/>
@@ -13377,7 +14801,7 @@
       </w:rPr>
     </w:lvl>
   </w:abstractNum>
-  <w:abstractNum w:abstractNumId="4" w15:restartNumberingAfterBreak="0">
+  <w:abstractNum w:abstractNumId="5" w15:restartNumberingAfterBreak="0">
     <w:nsid w:val="0A7A2652"/>
     <w:multiLevelType w:val="hybridMultilevel"/>
     <w:tmpl w:val="29C84374"/>
@@ -13490,7 +14914,7 @@
       </w:rPr>
     </w:lvl>
   </w:abstractNum>
-  <w:abstractNum w:abstractNumId="5" w15:restartNumberingAfterBreak="0">
+  <w:abstractNum w:abstractNumId="6" w15:restartNumberingAfterBreak="0">
     <w:nsid w:val="0D2D1E7D"/>
     <w:multiLevelType w:val="hybridMultilevel"/>
     <w:tmpl w:val="CFA8DF7A"/>
@@ -13603,7 +15027,7 @@
       </w:rPr>
     </w:lvl>
   </w:abstractNum>
-  <w:abstractNum w:abstractNumId="6" w15:restartNumberingAfterBreak="0">
+  <w:abstractNum w:abstractNumId="7" w15:restartNumberingAfterBreak="0">
     <w:nsid w:val="0FD87200"/>
     <w:multiLevelType w:val="hybridMultilevel"/>
     <w:tmpl w:val="98020590"/>
@@ -13716,7 +15140,7 @@
       </w:rPr>
     </w:lvl>
   </w:abstractNum>
-  <w:abstractNum w:abstractNumId="7" w15:restartNumberingAfterBreak="0">
+  <w:abstractNum w:abstractNumId="8" w15:restartNumberingAfterBreak="0">
     <w:nsid w:val="1C260223"/>
     <w:multiLevelType w:val="hybridMultilevel"/>
     <w:tmpl w:val="40C64E88"/>
@@ -13829,7 +15253,7 @@
       </w:rPr>
     </w:lvl>
   </w:abstractNum>
-  <w:abstractNum w:abstractNumId="8" w15:restartNumberingAfterBreak="0">
+  <w:abstractNum w:abstractNumId="9" w15:restartNumberingAfterBreak="0">
     <w:nsid w:val="216D0D82"/>
     <w:multiLevelType w:val="hybridMultilevel"/>
     <w:tmpl w:val="B2948FDC"/>
@@ -13942,7 +15366,7 @@
       </w:rPr>
     </w:lvl>
   </w:abstractNum>
-  <w:abstractNum w:abstractNumId="9" w15:restartNumberingAfterBreak="0">
+  <w:abstractNum w:abstractNumId="10" w15:restartNumberingAfterBreak="0">
     <w:nsid w:val="24E33FC7"/>
     <w:multiLevelType w:val="hybridMultilevel"/>
     <w:tmpl w:val="F3A251B0"/>
@@ -14055,7 +15479,7 @@
       </w:rPr>
     </w:lvl>
   </w:abstractNum>
-  <w:abstractNum w:abstractNumId="10" w15:restartNumberingAfterBreak="0">
+  <w:abstractNum w:abstractNumId="11" w15:restartNumberingAfterBreak="0">
     <w:nsid w:val="26EA1882"/>
     <w:multiLevelType w:val="hybridMultilevel"/>
     <w:tmpl w:val="99167502"/>
@@ -14170,7 +15594,7 @@
       </w:rPr>
     </w:lvl>
   </w:abstractNum>
-  <w:abstractNum w:abstractNumId="11" w15:restartNumberingAfterBreak="0">
+  <w:abstractNum w:abstractNumId="12" w15:restartNumberingAfterBreak="0">
     <w:nsid w:val="282A095F"/>
     <w:multiLevelType w:val="multilevel"/>
     <w:tmpl w:val="0CF6A51E"/>
@@ -14259,7 +15683,7 @@
       </w:pPr>
     </w:lvl>
   </w:abstractNum>
-  <w:abstractNum w:abstractNumId="12" w15:restartNumberingAfterBreak="0">
+  <w:abstractNum w:abstractNumId="13" w15:restartNumberingAfterBreak="0">
     <w:nsid w:val="29624A27"/>
     <w:multiLevelType w:val="hybridMultilevel"/>
     <w:tmpl w:val="648A7E14"/>
@@ -14348,7 +15772,7 @@
       </w:pPr>
     </w:lvl>
   </w:abstractNum>
-  <w:abstractNum w:abstractNumId="13" w15:restartNumberingAfterBreak="0">
+  <w:abstractNum w:abstractNumId="14" w15:restartNumberingAfterBreak="0">
     <w:nsid w:val="2B8B2C86"/>
     <w:multiLevelType w:val="hybridMultilevel"/>
     <w:tmpl w:val="81983A5C"/>
@@ -14462,7 +15886,7 @@
       </w:rPr>
     </w:lvl>
   </w:abstractNum>
-  <w:abstractNum w:abstractNumId="14" w15:restartNumberingAfterBreak="0">
+  <w:abstractNum w:abstractNumId="15" w15:restartNumberingAfterBreak="0">
     <w:nsid w:val="2E077FC4"/>
     <w:multiLevelType w:val="hybridMultilevel"/>
     <w:tmpl w:val="D14ABD76"/>
@@ -14575,7 +15999,7 @@
       </w:rPr>
     </w:lvl>
   </w:abstractNum>
-  <w:abstractNum w:abstractNumId="15" w15:restartNumberingAfterBreak="0">
+  <w:abstractNum w:abstractNumId="16" w15:restartNumberingAfterBreak="0">
     <w:nsid w:val="304C10A0"/>
     <w:multiLevelType w:val="hybridMultilevel"/>
     <w:tmpl w:val="0DC21054"/>
@@ -14688,7 +16112,7 @@
       </w:rPr>
     </w:lvl>
   </w:abstractNum>
-  <w:abstractNum w:abstractNumId="16" w15:restartNumberingAfterBreak="0">
+  <w:abstractNum w:abstractNumId="17" w15:restartNumberingAfterBreak="0">
     <w:nsid w:val="33AA2B4C"/>
     <w:multiLevelType w:val="hybridMultilevel"/>
     <w:tmpl w:val="6A302BAC"/>
@@ -14801,7 +16225,7 @@
       </w:rPr>
     </w:lvl>
   </w:abstractNum>
-  <w:abstractNum w:abstractNumId="17" w15:restartNumberingAfterBreak="0">
+  <w:abstractNum w:abstractNumId="18" w15:restartNumberingAfterBreak="0">
     <w:nsid w:val="36FD4012"/>
     <w:multiLevelType w:val="hybridMultilevel"/>
     <w:tmpl w:val="1180B7A2"/>
@@ -14914,7 +16338,7 @@
       </w:rPr>
     </w:lvl>
   </w:abstractNum>
-  <w:abstractNum w:abstractNumId="18" w15:restartNumberingAfterBreak="0">
+  <w:abstractNum w:abstractNumId="19" w15:restartNumberingAfterBreak="0">
     <w:nsid w:val="3AF10026"/>
     <w:multiLevelType w:val="hybridMultilevel"/>
     <w:tmpl w:val="9B522F62"/>
@@ -15027,7 +16451,7 @@
       </w:rPr>
     </w:lvl>
   </w:abstractNum>
-  <w:abstractNum w:abstractNumId="19" w15:restartNumberingAfterBreak="0">
+  <w:abstractNum w:abstractNumId="20" w15:restartNumberingAfterBreak="0">
     <w:nsid w:val="3D0F1E02"/>
     <w:multiLevelType w:val="hybridMultilevel"/>
     <w:tmpl w:val="AFAA7E02"/>
@@ -15140,7 +16564,7 @@
       </w:rPr>
     </w:lvl>
   </w:abstractNum>
-  <w:abstractNum w:abstractNumId="20" w15:restartNumberingAfterBreak="0">
+  <w:abstractNum w:abstractNumId="21" w15:restartNumberingAfterBreak="0">
     <w:nsid w:val="3D594BA1"/>
     <w:multiLevelType w:val="hybridMultilevel"/>
     <w:tmpl w:val="2B44242E"/>
@@ -15253,7 +16677,7 @@
       </w:rPr>
     </w:lvl>
   </w:abstractNum>
-  <w:abstractNum w:abstractNumId="21" w15:restartNumberingAfterBreak="0">
+  <w:abstractNum w:abstractNumId="22" w15:restartNumberingAfterBreak="0">
     <w:nsid w:val="3F7F390A"/>
     <w:multiLevelType w:val="hybridMultilevel"/>
     <w:tmpl w:val="891C91C2"/>
@@ -15342,7 +16766,7 @@
       </w:pPr>
     </w:lvl>
   </w:abstractNum>
-  <w:abstractNum w:abstractNumId="22" w15:restartNumberingAfterBreak="0">
+  <w:abstractNum w:abstractNumId="23" w15:restartNumberingAfterBreak="0">
     <w:nsid w:val="40D903A3"/>
     <w:multiLevelType w:val="hybridMultilevel"/>
     <w:tmpl w:val="5852BAD2"/>
@@ -15455,7 +16879,7 @@
       </w:rPr>
     </w:lvl>
   </w:abstractNum>
-  <w:abstractNum w:abstractNumId="23" w15:restartNumberingAfterBreak="0">
+  <w:abstractNum w:abstractNumId="24" w15:restartNumberingAfterBreak="0">
     <w:nsid w:val="42020588"/>
     <w:multiLevelType w:val="hybridMultilevel"/>
     <w:tmpl w:val="C978BF46"/>
@@ -15568,7 +16992,7 @@
       </w:rPr>
     </w:lvl>
   </w:abstractNum>
-  <w:abstractNum w:abstractNumId="24" w15:restartNumberingAfterBreak="0">
+  <w:abstractNum w:abstractNumId="25" w15:restartNumberingAfterBreak="0">
     <w:nsid w:val="457E24DB"/>
     <w:multiLevelType w:val="hybridMultilevel"/>
     <w:tmpl w:val="3F04E2D4"/>
@@ -15654,7 +17078,7 @@
       </w:pPr>
     </w:lvl>
   </w:abstractNum>
-  <w:abstractNum w:abstractNumId="25" w15:restartNumberingAfterBreak="0">
+  <w:abstractNum w:abstractNumId="26" w15:restartNumberingAfterBreak="0">
     <w:nsid w:val="4CC158A0"/>
     <w:multiLevelType w:val="multilevel"/>
     <w:tmpl w:val="B20CFFCA"/>
@@ -15772,7 +17196,7 @@
       </w:rPr>
     </w:lvl>
   </w:abstractNum>
-  <w:abstractNum w:abstractNumId="26" w15:restartNumberingAfterBreak="0">
+  <w:abstractNum w:abstractNumId="27" w15:restartNumberingAfterBreak="0">
     <w:nsid w:val="4D3B1B15"/>
     <w:multiLevelType w:val="hybridMultilevel"/>
     <w:tmpl w:val="792ADD20"/>
@@ -15885,7 +17309,7 @@
       </w:rPr>
     </w:lvl>
   </w:abstractNum>
-  <w:abstractNum w:abstractNumId="27" w15:restartNumberingAfterBreak="0">
+  <w:abstractNum w:abstractNumId="28" w15:restartNumberingAfterBreak="0">
     <w:nsid w:val="4EBC5632"/>
     <w:multiLevelType w:val="multilevel"/>
     <w:tmpl w:val="0409001F"/>
@@ -15975,7 +17399,7 @@
       </w:pPr>
     </w:lvl>
   </w:abstractNum>
-  <w:abstractNum w:abstractNumId="28" w15:restartNumberingAfterBreak="0">
+  <w:abstractNum w:abstractNumId="29" w15:restartNumberingAfterBreak="0">
     <w:nsid w:val="4F7A331D"/>
     <w:multiLevelType w:val="hybridMultilevel"/>
     <w:tmpl w:val="41641474"/>
@@ -16088,7 +17512,7 @@
       </w:rPr>
     </w:lvl>
   </w:abstractNum>
-  <w:abstractNum w:abstractNumId="29" w15:restartNumberingAfterBreak="0">
+  <w:abstractNum w:abstractNumId="30" w15:restartNumberingAfterBreak="0">
     <w:nsid w:val="50C02B5A"/>
     <w:multiLevelType w:val="hybridMultilevel"/>
     <w:tmpl w:val="AE52F5FE"/>
@@ -16201,7 +17625,7 @@
       </w:rPr>
     </w:lvl>
   </w:abstractNum>
-  <w:abstractNum w:abstractNumId="30" w15:restartNumberingAfterBreak="0">
+  <w:abstractNum w:abstractNumId="31" w15:restartNumberingAfterBreak="0">
     <w:nsid w:val="58A16325"/>
     <w:multiLevelType w:val="hybridMultilevel"/>
     <w:tmpl w:val="AD10C8A8"/>
@@ -16314,7 +17738,7 @@
       </w:rPr>
     </w:lvl>
   </w:abstractNum>
-  <w:abstractNum w:abstractNumId="31" w15:restartNumberingAfterBreak="0">
+  <w:abstractNum w:abstractNumId="32" w15:restartNumberingAfterBreak="0">
     <w:nsid w:val="5BBE414B"/>
     <w:multiLevelType w:val="hybridMultilevel"/>
     <w:tmpl w:val="616A85A4"/>
@@ -16408,7 +17832,7 @@
       </w:pPr>
     </w:lvl>
   </w:abstractNum>
-  <w:abstractNum w:abstractNumId="32" w15:restartNumberingAfterBreak="0">
+  <w:abstractNum w:abstractNumId="33" w15:restartNumberingAfterBreak="0">
     <w:nsid w:val="5EBA5491"/>
     <w:multiLevelType w:val="hybridMultilevel"/>
     <w:tmpl w:val="0EB810BC"/>
@@ -16521,7 +17945,7 @@
       </w:rPr>
     </w:lvl>
   </w:abstractNum>
-  <w:abstractNum w:abstractNumId="33" w15:restartNumberingAfterBreak="0">
+  <w:abstractNum w:abstractNumId="34" w15:restartNumberingAfterBreak="0">
     <w:nsid w:val="5EE36369"/>
     <w:multiLevelType w:val="hybridMultilevel"/>
     <w:tmpl w:val="E22EA7F0"/>
@@ -16634,7 +18058,7 @@
       </w:rPr>
     </w:lvl>
   </w:abstractNum>
-  <w:abstractNum w:abstractNumId="34" w15:restartNumberingAfterBreak="0">
+  <w:abstractNum w:abstractNumId="35" w15:restartNumberingAfterBreak="0">
     <w:nsid w:val="603362AD"/>
     <w:multiLevelType w:val="hybridMultilevel"/>
     <w:tmpl w:val="9C1A4254"/>
@@ -16748,7 +18172,7 @@
       </w:rPr>
     </w:lvl>
   </w:abstractNum>
-  <w:abstractNum w:abstractNumId="35" w15:restartNumberingAfterBreak="0">
+  <w:abstractNum w:abstractNumId="36" w15:restartNumberingAfterBreak="0">
     <w:nsid w:val="6066638C"/>
     <w:multiLevelType w:val="hybridMultilevel"/>
     <w:tmpl w:val="8A16EB22"/>
@@ -16861,7 +18285,7 @@
       </w:rPr>
     </w:lvl>
   </w:abstractNum>
-  <w:abstractNum w:abstractNumId="36" w15:restartNumberingAfterBreak="0">
+  <w:abstractNum w:abstractNumId="37" w15:restartNumberingAfterBreak="0">
     <w:nsid w:val="62FC1DD5"/>
     <w:multiLevelType w:val="hybridMultilevel"/>
     <w:tmpl w:val="8A4C0C18"/>
@@ -16952,7 +18376,7 @@
       </w:pPr>
     </w:lvl>
   </w:abstractNum>
-  <w:abstractNum w:abstractNumId="37" w15:restartNumberingAfterBreak="0">
+  <w:abstractNum w:abstractNumId="38" w15:restartNumberingAfterBreak="0">
     <w:nsid w:val="678C2DA6"/>
     <w:multiLevelType w:val="hybridMultilevel"/>
     <w:tmpl w:val="EE4A472E"/>
@@ -17065,7 +18489,7 @@
       </w:rPr>
     </w:lvl>
   </w:abstractNum>
-  <w:abstractNum w:abstractNumId="38" w15:restartNumberingAfterBreak="0">
+  <w:abstractNum w:abstractNumId="39" w15:restartNumberingAfterBreak="0">
     <w:nsid w:val="68D3344E"/>
     <w:multiLevelType w:val="hybridMultilevel"/>
     <w:tmpl w:val="80D4C256"/>
@@ -17178,7 +18602,7 @@
       </w:rPr>
     </w:lvl>
   </w:abstractNum>
-  <w:abstractNum w:abstractNumId="39" w15:restartNumberingAfterBreak="0">
+  <w:abstractNum w:abstractNumId="40" w15:restartNumberingAfterBreak="0">
     <w:nsid w:val="6AF74884"/>
     <w:multiLevelType w:val="hybridMultilevel"/>
     <w:tmpl w:val="AA064ABE"/>
@@ -17268,7 +18692,7 @@
       </w:pPr>
     </w:lvl>
   </w:abstractNum>
-  <w:abstractNum w:abstractNumId="40" w15:restartNumberingAfterBreak="0">
+  <w:abstractNum w:abstractNumId="41" w15:restartNumberingAfterBreak="0">
     <w:nsid w:val="6B352844"/>
     <w:multiLevelType w:val="hybridMultilevel"/>
     <w:tmpl w:val="C004D6CE"/>
@@ -17354,7 +18778,7 @@
       </w:pPr>
     </w:lvl>
   </w:abstractNum>
-  <w:abstractNum w:abstractNumId="41" w15:restartNumberingAfterBreak="0">
+  <w:abstractNum w:abstractNumId="42" w15:restartNumberingAfterBreak="0">
     <w:nsid w:val="6C3E65A3"/>
     <w:multiLevelType w:val="hybridMultilevel"/>
     <w:tmpl w:val="88DCD24A"/>
@@ -17440,7 +18864,7 @@
       </w:pPr>
     </w:lvl>
   </w:abstractNum>
-  <w:abstractNum w:abstractNumId="42" w15:restartNumberingAfterBreak="0">
+  <w:abstractNum w:abstractNumId="43" w15:restartNumberingAfterBreak="0">
     <w:nsid w:val="729B674A"/>
     <w:multiLevelType w:val="hybridMultilevel"/>
     <w:tmpl w:val="83EC69FA"/>
@@ -17553,7 +18977,7 @@
       </w:rPr>
     </w:lvl>
   </w:abstractNum>
-  <w:abstractNum w:abstractNumId="43" w15:restartNumberingAfterBreak="0">
+  <w:abstractNum w:abstractNumId="44" w15:restartNumberingAfterBreak="0">
     <w:nsid w:val="73612548"/>
     <w:multiLevelType w:val="hybridMultilevel"/>
     <w:tmpl w:val="D396DC5C"/>
@@ -17666,7 +19090,7 @@
       </w:rPr>
     </w:lvl>
   </w:abstractNum>
-  <w:abstractNum w:abstractNumId="44" w15:restartNumberingAfterBreak="0">
+  <w:abstractNum w:abstractNumId="45" w15:restartNumberingAfterBreak="0">
     <w:nsid w:val="740D742F"/>
     <w:multiLevelType w:val="hybridMultilevel"/>
     <w:tmpl w:val="E2D22E00"/>
@@ -17779,7 +19203,7 @@
       </w:rPr>
     </w:lvl>
   </w:abstractNum>
-  <w:abstractNum w:abstractNumId="45" w15:restartNumberingAfterBreak="0">
+  <w:abstractNum w:abstractNumId="46" w15:restartNumberingAfterBreak="0">
     <w:nsid w:val="774F6ECD"/>
     <w:multiLevelType w:val="hybridMultilevel"/>
     <w:tmpl w:val="940C0FAA"/>
@@ -17892,7 +19316,7 @@
       </w:rPr>
     </w:lvl>
   </w:abstractNum>
-  <w:abstractNum w:abstractNumId="46" w15:restartNumberingAfterBreak="0">
+  <w:abstractNum w:abstractNumId="47" w15:restartNumberingAfterBreak="0">
     <w:nsid w:val="77A66CC0"/>
     <w:multiLevelType w:val="hybridMultilevel"/>
     <w:tmpl w:val="85F8E3DA"/>
@@ -18005,7 +19429,7 @@
       </w:rPr>
     </w:lvl>
   </w:abstractNum>
-  <w:abstractNum w:abstractNumId="47" w15:restartNumberingAfterBreak="0">
+  <w:abstractNum w:abstractNumId="48" w15:restartNumberingAfterBreak="0">
     <w:nsid w:val="7AFC5ACB"/>
     <w:multiLevelType w:val="hybridMultilevel"/>
     <w:tmpl w:val="B4FE156E"/>
@@ -18118,7 +19542,7 @@
       </w:rPr>
     </w:lvl>
   </w:abstractNum>
-  <w:abstractNum w:abstractNumId="48" w15:restartNumberingAfterBreak="0">
+  <w:abstractNum w:abstractNumId="49" w15:restartNumberingAfterBreak="0">
     <w:nsid w:val="7E2F2484"/>
     <w:multiLevelType w:val="hybridMultilevel"/>
     <w:tmpl w:val="42C26808"/>
@@ -18231,7 +19655,7 @@
       </w:rPr>
     </w:lvl>
   </w:abstractNum>
-  <w:abstractNum w:abstractNumId="49" w15:restartNumberingAfterBreak="0">
+  <w:abstractNum w:abstractNumId="50" w15:restartNumberingAfterBreak="0">
     <w:nsid w:val="7FDF723F"/>
     <w:multiLevelType w:val="hybridMultilevel"/>
     <w:tmpl w:val="76F2B506"/>
@@ -18344,7 +19768,7 @@
       </w:rPr>
     </w:lvl>
   </w:abstractNum>
-  <w:abstractNum w:abstractNumId="50" w15:restartNumberingAfterBreak="0">
+  <w:abstractNum w:abstractNumId="51" w15:restartNumberingAfterBreak="0">
     <w:nsid w:val="7FFC41F0"/>
     <w:multiLevelType w:val="hybridMultilevel"/>
     <w:tmpl w:val="D28E2838"/>
@@ -18458,82 +19882,82 @@
     </w:lvl>
   </w:abstractNum>
   <w:num w:numId="1" w16cid:durableId="1780031473">
+    <w:abstractNumId w:val="26"/>
+  </w:num>
+  <w:num w:numId="2" w16cid:durableId="9991749">
+    <w:abstractNumId w:val="28"/>
+  </w:num>
+  <w:num w:numId="3" w16cid:durableId="885795797">
+    <w:abstractNumId w:val="35"/>
+  </w:num>
+  <w:num w:numId="4" w16cid:durableId="1608390290">
+    <w:abstractNumId w:val="13"/>
+  </w:num>
+  <w:num w:numId="5" w16cid:durableId="1534921763">
+    <w:abstractNumId w:val="22"/>
+  </w:num>
+  <w:num w:numId="6" w16cid:durableId="204952799">
+    <w:abstractNumId w:val="37"/>
+  </w:num>
+  <w:num w:numId="7" w16cid:durableId="2052343995">
+    <w:abstractNumId w:val="32"/>
+  </w:num>
+  <w:num w:numId="8" w16cid:durableId="353072121">
+    <w:abstractNumId w:val="18"/>
+  </w:num>
+  <w:num w:numId="9" w16cid:durableId="400833407">
+    <w:abstractNumId w:val="14"/>
+  </w:num>
+  <w:num w:numId="10" w16cid:durableId="2024550559">
     <w:abstractNumId w:val="25"/>
   </w:num>
-  <w:num w:numId="2" w16cid:durableId="9991749">
-    <w:abstractNumId w:val="27"/>
-  </w:num>
-  <w:num w:numId="3" w16cid:durableId="885795797">
-    <w:abstractNumId w:val="34"/>
-  </w:num>
-  <w:num w:numId="4" w16cid:durableId="1608390290">
-    <w:abstractNumId w:val="12"/>
-  </w:num>
-  <w:num w:numId="5" w16cid:durableId="1534921763">
-    <w:abstractNumId w:val="21"/>
-  </w:num>
-  <w:num w:numId="6" w16cid:durableId="204952799">
-    <w:abstractNumId w:val="36"/>
-  </w:num>
-  <w:num w:numId="7" w16cid:durableId="2052343995">
-    <w:abstractNumId w:val="31"/>
-  </w:num>
-  <w:num w:numId="8" w16cid:durableId="353072121">
-    <w:abstractNumId w:val="17"/>
-  </w:num>
-  <w:num w:numId="9" w16cid:durableId="400833407">
-    <w:abstractNumId w:val="13"/>
-  </w:num>
-  <w:num w:numId="10" w16cid:durableId="2024550559">
-    <w:abstractNumId w:val="24"/>
-  </w:num>
   <w:num w:numId="11" w16cid:durableId="99688698">
-    <w:abstractNumId w:val="46"/>
+    <w:abstractNumId w:val="47"/>
   </w:num>
   <w:num w:numId="12" w16cid:durableId="565918455">
-    <w:abstractNumId w:val="27"/>
+    <w:abstractNumId w:val="28"/>
     <w:lvlOverride w:ilvl="0">
       <w:startOverride w:val="1"/>
     </w:lvlOverride>
   </w:num>
   <w:num w:numId="13" w16cid:durableId="427386459">
-    <w:abstractNumId w:val="27"/>
+    <w:abstractNumId w:val="28"/>
     <w:lvlOverride w:ilvl="0">
       <w:startOverride w:val="1"/>
     </w:lvlOverride>
   </w:num>
   <w:num w:numId="14" w16cid:durableId="56127758">
-    <w:abstractNumId w:val="49"/>
+    <w:abstractNumId w:val="50"/>
   </w:num>
   <w:num w:numId="15" w16cid:durableId="1859780615">
-    <w:abstractNumId w:val="40"/>
+    <w:abstractNumId w:val="41"/>
   </w:num>
   <w:num w:numId="16" w16cid:durableId="1242374656">
-    <w:abstractNumId w:val="11"/>
+    <w:abstractNumId w:val="12"/>
   </w:num>
   <w:num w:numId="17" w16cid:durableId="1715306075">
     <w:abstractNumId w:val="1"/>
   </w:num>
   <w:num w:numId="18" w16cid:durableId="1305812972">
-    <w:abstractNumId w:val="18"/>
+    <w:abstractNumId w:val="19"/>
   </w:num>
   <w:num w:numId="19" w16cid:durableId="1276670312">
-    <w:abstractNumId w:val="7"/>
+    <w:abstractNumId w:val="8"/>
   </w:num>
   <w:num w:numId="20" w16cid:durableId="1037852411">
-    <w:abstractNumId w:val="10"/>
+    <w:abstractNumId w:val="11"/>
   </w:num>
   <w:num w:numId="21" w16cid:durableId="986979415">
-    <w:abstractNumId w:val="3"/>
+    <w:abstractNumId w:val="4"/>
   </w:num>
   <w:num w:numId="22" w16cid:durableId="1667972727">
-    <w:abstractNumId w:val="48"/>
+    <w:abstractNumId w:val="49"/>
   </w:num>
   <w:num w:numId="23" w16cid:durableId="635836446">
-    <w:abstractNumId w:val="39"/>
+    <w:abstractNumId w:val="40"/>
   </w:num>
   <w:num w:numId="24" w16cid:durableId="1204245857">
-    <w:abstractNumId w:val="11"/>
+    <w:abstractNumId w:val="12"/>
     <w:lvlOverride w:ilvl="0">
       <w:startOverride w:val="1"/>
     </w:lvlOverride>
@@ -18563,7 +19987,7 @@
     </w:lvlOverride>
   </w:num>
   <w:num w:numId="25" w16cid:durableId="408507694">
-    <w:abstractNumId w:val="11"/>
+    <w:abstractNumId w:val="12"/>
     <w:lvlOverride w:ilvl="0">
       <w:startOverride w:val="1"/>
     </w:lvlOverride>
@@ -18593,79 +20017,79 @@
     </w:lvlOverride>
   </w:num>
   <w:num w:numId="26" w16cid:durableId="980158583">
+    <w:abstractNumId w:val="45"/>
+  </w:num>
+  <w:num w:numId="27" w16cid:durableId="1416367215">
+    <w:abstractNumId w:val="21"/>
+  </w:num>
+  <w:num w:numId="28" w16cid:durableId="50925594">
+    <w:abstractNumId w:val="33"/>
+  </w:num>
+  <w:num w:numId="29" w16cid:durableId="1109088177">
+    <w:abstractNumId w:val="36"/>
+  </w:num>
+  <w:num w:numId="30" w16cid:durableId="154037724">
+    <w:abstractNumId w:val="42"/>
+  </w:num>
+  <w:num w:numId="31" w16cid:durableId="303046014">
+    <w:abstractNumId w:val="17"/>
+  </w:num>
+  <w:num w:numId="32" w16cid:durableId="68114881">
+    <w:abstractNumId w:val="6"/>
+  </w:num>
+  <w:num w:numId="33" w16cid:durableId="812406637">
+    <w:abstractNumId w:val="15"/>
+  </w:num>
+  <w:num w:numId="34" w16cid:durableId="2032222735">
     <w:abstractNumId w:val="44"/>
   </w:num>
-  <w:num w:numId="27" w16cid:durableId="1416367215">
-    <w:abstractNumId w:val="20"/>
+  <w:num w:numId="35" w16cid:durableId="704866503">
+    <w:abstractNumId w:val="39"/>
   </w:num>
-  <w:num w:numId="28" w16cid:durableId="50925594">
-    <w:abstractNumId w:val="32"/>
+  <w:num w:numId="36" w16cid:durableId="1234781451">
+    <w:abstractNumId w:val="51"/>
   </w:num>
-  <w:num w:numId="29" w16cid:durableId="1109088177">
-    <w:abstractNumId w:val="35"/>
+  <w:num w:numId="37" w16cid:durableId="1671562868">
+    <w:abstractNumId w:val="23"/>
   </w:num>
-  <w:num w:numId="30" w16cid:durableId="154037724">
-    <w:abstractNumId w:val="41"/>
+  <w:num w:numId="38" w16cid:durableId="1739278402">
+    <w:abstractNumId w:val="34"/>
   </w:num>
-  <w:num w:numId="31" w16cid:durableId="303046014">
-    <w:abstractNumId w:val="16"/>
-  </w:num>
-  <w:num w:numId="32" w16cid:durableId="68114881">
+  <w:num w:numId="39" w16cid:durableId="890534253">
     <w:abstractNumId w:val="5"/>
   </w:num>
-  <w:num w:numId="33" w16cid:durableId="812406637">
-    <w:abstractNumId w:val="14"/>
+  <w:num w:numId="40" w16cid:durableId="1498299197">
+    <w:abstractNumId w:val="29"/>
   </w:num>
-  <w:num w:numId="34" w16cid:durableId="2032222735">
-    <w:abstractNumId w:val="43"/>
+  <w:num w:numId="41" w16cid:durableId="1129739026">
+    <w:abstractNumId w:val="24"/>
   </w:num>
-  <w:num w:numId="35" w16cid:durableId="704866503">
+  <w:num w:numId="42" w16cid:durableId="1413774930">
     <w:abstractNumId w:val="38"/>
   </w:num>
-  <w:num w:numId="36" w16cid:durableId="1234781451">
-    <w:abstractNumId w:val="50"/>
-  </w:num>
-  <w:num w:numId="37" w16cid:durableId="1671562868">
-    <w:abstractNumId w:val="22"/>
-  </w:num>
-  <w:num w:numId="38" w16cid:durableId="1739278402">
-    <w:abstractNumId w:val="33"/>
-  </w:num>
-  <w:num w:numId="39" w16cid:durableId="890534253">
-    <w:abstractNumId w:val="4"/>
-  </w:num>
-  <w:num w:numId="40" w16cid:durableId="1498299197">
-    <w:abstractNumId w:val="28"/>
-  </w:num>
-  <w:num w:numId="41" w16cid:durableId="1129739026">
-    <w:abstractNumId w:val="23"/>
-  </w:num>
-  <w:num w:numId="42" w16cid:durableId="1413774930">
-    <w:abstractNumId w:val="37"/>
-  </w:num>
   <w:num w:numId="43" w16cid:durableId="1269577822">
-    <w:abstractNumId w:val="9"/>
+    <w:abstractNumId w:val="10"/>
   </w:num>
   <w:num w:numId="44" w16cid:durableId="874191603">
     <w:abstractNumId w:val="0"/>
   </w:num>
   <w:num w:numId="45" w16cid:durableId="1959985966">
-    <w:abstractNumId w:val="19"/>
+    <w:abstractNumId w:val="20"/>
   </w:num>
   <w:num w:numId="46" w16cid:durableId="1362896472">
-    <w:abstractNumId w:val="15"/>
+    <w:abstractNumId w:val="16"/>
   </w:num>
   <w:num w:numId="47" w16cid:durableId="282422118">
-    <w:abstractNumId w:val="2"/>
+    <w:abstractNumId w:val="3"/>
   </w:num>
   <w:num w:numId="48" w16cid:durableId="53546954">
-    <w:abstractNumId w:val="30"/>
+    <w:abstractNumId w:val="31"/>
   </w:num>
   <w:num w:numId="49" w16cid:durableId="822308753">
-    <w:abstractNumId w:val="26"/>
+    <w:abstractNumId w:val="27"/>
   </w:num>
   <w:num w:numId="50" w16cid:durableId="86391874">
-    <w:abstractNumId w:val="11"/>
+    <w:abstractNumId w:val="12"/>
     <w:lvlOverride w:ilvl="0">
       <w:startOverride w:val="1"/>
     </w:lvlOverride>
@@ -18695,7 +20119,7 @@
     </w:lvlOverride>
   </w:num>
   <w:num w:numId="51" w16cid:durableId="1847593370">
-    <w:abstractNumId w:val="11"/>
+    <w:abstractNumId w:val="12"/>
     <w:lvlOverride w:ilvl="0">
       <w:startOverride w:val="1"/>
     </w:lvlOverride>
@@ -18725,16 +20149,16 @@
     </w:lvlOverride>
   </w:num>
   <w:num w:numId="52" w16cid:durableId="1987470444">
-    <w:abstractNumId w:val="29"/>
+    <w:abstractNumId w:val="30"/>
   </w:num>
   <w:num w:numId="53" w16cid:durableId="1179656707">
-    <w:abstractNumId w:val="6"/>
+    <w:abstractNumId w:val="7"/>
   </w:num>
   <w:num w:numId="54" w16cid:durableId="2025591471">
-    <w:abstractNumId w:val="45"/>
+    <w:abstractNumId w:val="46"/>
   </w:num>
   <w:num w:numId="55" w16cid:durableId="1039746835">
-    <w:abstractNumId w:val="11"/>
+    <w:abstractNumId w:val="12"/>
     <w:lvlOverride w:ilvl="0">
       <w:startOverride w:val="1"/>
     </w:lvlOverride>
@@ -18764,13 +20188,16 @@
     </w:lvlOverride>
   </w:num>
   <w:num w:numId="56" w16cid:durableId="107897228">
-    <w:abstractNumId w:val="42"/>
+    <w:abstractNumId w:val="43"/>
   </w:num>
   <w:num w:numId="57" w16cid:durableId="122314280">
-    <w:abstractNumId w:val="47"/>
+    <w:abstractNumId w:val="48"/>
   </w:num>
   <w:num w:numId="58" w16cid:durableId="1098910157">
-    <w:abstractNumId w:val="8"/>
+    <w:abstractNumId w:val="9"/>
+  </w:num>
+  <w:num w:numId="59" w16cid:durableId="604312650">
+    <w:abstractNumId w:val="2"/>
   </w:num>
 </w:numbering>
 </file>
@@ -19188,6 +20615,7 @@
     <w:name w:val="heading 1"/>
     <w:basedOn w:val="ListParagraph"/>
     <w:next w:val="Normal"/>
+    <w:link w:val="Heading1Char"/>
     <w:uiPriority w:val="9"/>
     <w:qFormat/>
     <w:rsid w:val="004C75A2"/>
@@ -19734,6 +21162,69 @@
       <w:szCs w:val="18"/>
     </w:rPr>
   </w:style>
+  <w:style w:type="paragraph" w:styleId="FootnoteText">
+    <w:name w:val="footnote text"/>
+    <w:basedOn w:val="Normal"/>
+    <w:link w:val="FootnoteTextChar"/>
+    <w:uiPriority w:val="99"/>
+    <w:semiHidden/>
+    <w:unhideWhenUsed/>
+    <w:rsid w:val="00912B33"/>
+    <w:pPr>
+      <w:spacing w:line="240" w:lineRule="auto"/>
+    </w:pPr>
+    <w:rPr>
+      <w:sz w:val="20"/>
+      <w:szCs w:val="20"/>
+    </w:rPr>
+  </w:style>
+  <w:style w:type="character" w:customStyle="1" w:styleId="FootnoteTextChar">
+    <w:name w:val="Footnote Text Char"/>
+    <w:basedOn w:val="DefaultParagraphFont"/>
+    <w:link w:val="FootnoteText"/>
+    <w:uiPriority w:val="99"/>
+    <w:semiHidden/>
+    <w:rsid w:val="00912B33"/>
+    <w:rPr>
+      <w:rFonts w:eastAsia="Times New Roman"/>
+      <w:sz w:val="20"/>
+      <w:szCs w:val="20"/>
+      <w:lang w:val="bg-BG"/>
+    </w:rPr>
+  </w:style>
+  <w:style w:type="character" w:styleId="FootnoteReference">
+    <w:name w:val="footnote reference"/>
+    <w:basedOn w:val="DefaultParagraphFont"/>
+    <w:uiPriority w:val="99"/>
+    <w:semiHidden/>
+    <w:unhideWhenUsed/>
+    <w:rsid w:val="00912B33"/>
+    <w:rPr>
+      <w:vertAlign w:val="superscript"/>
+    </w:rPr>
+  </w:style>
+  <w:style w:type="paragraph" w:styleId="Bibliography">
+    <w:name w:val="Bibliography"/>
+    <w:basedOn w:val="Normal"/>
+    <w:next w:val="Normal"/>
+    <w:uiPriority w:val="37"/>
+    <w:unhideWhenUsed/>
+    <w:rsid w:val="004B28BE"/>
+  </w:style>
+  <w:style w:type="character" w:customStyle="1" w:styleId="Heading1Char">
+    <w:name w:val="Heading 1 Char"/>
+    <w:basedOn w:val="DefaultParagraphFont"/>
+    <w:link w:val="Heading1"/>
+    <w:uiPriority w:val="9"/>
+    <w:rsid w:val="004B28BE"/>
+    <w:rPr>
+      <w:rFonts w:eastAsia="Times New Roman"/>
+      <w:b/>
+      <w:sz w:val="36"/>
+      <w:szCs w:val="36"/>
+      <w:lang w:val="bg-BG"/>
+    </w:rPr>
+  </w:style>
 </w:styles>
 </file>
 
@@ -20058,11 +21549,11 @@
 </file>
 
 <file path=customXml/item1.xml><?xml version="1.0" encoding="utf-8"?>
-<b:Sources xmlns:b="http://schemas.openxmlformats.org/officeDocument/2006/bibliography" xmlns="http://schemas.openxmlformats.org/officeDocument/2006/bibliography" SelectedStyle="\APASixthEditionOfficeOnline.xsl" StyleName="APA" Version="6"/>
+<b:Sources xmlns:b="http://schemas.openxmlformats.org/officeDocument/2006/bibliography" xmlns="http://schemas.openxmlformats.org/officeDocument/2006/bibliography" SelectedStyle="\IEEE2006OfficeOnline.xsl" StyleName="IEEE" Version="2006"/>
 </file>
 
 <file path=customXml/itemProps1.xml><?xml version="1.0" encoding="utf-8"?>
-<ds:datastoreItem xmlns:ds="http://schemas.openxmlformats.org/officeDocument/2006/customXml" ds:itemID="{A5D46D8B-D0C2-4CDE-8957-048209DCB986}">
+<ds:datastoreItem xmlns:ds="http://schemas.openxmlformats.org/officeDocument/2006/customXml" ds:itemID="{8044ACCE-6276-4C51-8885-A227E119CF30}">
   <ds:schemaRefs>
     <ds:schemaRef ds:uri="http://schemas.openxmlformats.org/officeDocument/2006/bibliography"/>
   </ds:schemaRefs>

</xml_diff>